<commit_message>
Doctoraatsplan: een primair eindpunt, scoping review benoemd, papers uitgewerkt
Ulcusrecidief op 18 maanden is het enige primaire eindpunt; therapietrouw is de
vooraf vastgelegde mediator op 12 maanden zonder eigen succescriterium, met een
causale mediatieanalyse in de statistieksectie en geen multipliciteitscorrectie
meer. A3 herschreven, scoping review met titel opgenomen, en zeven geplande
manuscripten met tijdvensters in sectie 5.

Co-Authored-By: Claude Opus 5 <noreply@anthropic.com>
</commit_message>
<xml_diff>
--- a/PARADISE_provisional_doctoral_plan.docx
+++ b/PARADISE_provisional_doctoral_plan.docx
@@ -2738,28 +2738,28 @@
           <w:b/>
           <w:lang w:val="en-US"/>
         </w:rPr>
-        <w:t xml:space="preserve">A3 — Biomechanical and adherence outcomes (primary mechanistic endpoints). </w:t>
-      </w:r>
-      <w:r>
-        <w:rPr>
-          <w:rFonts w:ascii="Garamond" w:hAnsi="Garamond"/>
-          <w:lang w:val="en-GB"/>
-        </w:rPr>
-        <w:t>Determine whether PARADISE improves the proposed mechanisms underlying ulcer prevention: reducing in-shoe peak plantar pressure and increasing objectively measured footwear adherence</w:t>
-      </w:r>
-      <w:r>
-        <w:rPr>
-          <w:rFonts w:ascii="Garamond" w:hAnsi="Garamond"/>
-          <w:lang w:val="en-GB"/>
-        </w:rPr>
-        <w:t xml:space="preserve">, </w:t>
-      </w:r>
-      <w:r>
-        <w:rPr>
-          <w:rFonts w:ascii="Garamond" w:hAnsi="Garamond"/>
-          <w:lang w:val="en-GB"/>
-        </w:rPr>
-        <w:t>beyond the clinically relevant ≥80% threshold</w:t>
+        <w:t xml:space="preserve">A3 — Mechanistic pathway (pre-specified mediation). </w:t>
+      </w:r>
+      <w:r>
+        <w:rPr>
+          <w:rFonts w:ascii="Garamond" w:hAnsi="Garamond"/>
+          <w:lang w:val="en-GB"/>
+        </w:rPr>
+        <w:t>Determine whether PARADISE reduces in-shoe peak plantar pressure and increases objectively measured footwear adherence, and whether adherence mediates the effect on ulcer recurrence. Adherence is measured and reported in full but carries no success criterion of its own</w:t>
+      </w:r>
+      <w:r>
+        <w:rPr>
+          <w:rFonts w:ascii="Garamond" w:hAnsi="Garamond"/>
+          <w:lang w:val="en-GB"/>
+        </w:rPr>
+        <w:t xml:space="preserve">, with </w:t>
+      </w:r>
+      <w:r>
+        <w:rPr>
+          <w:rFonts w:ascii="Garamond" w:hAnsi="Garamond"/>
+          <w:lang w:val="en-GB"/>
+        </w:rPr>
+        <w:t>the clinically relevant ≥80% threshold as the reference</w:t>
       </w:r>
       <w:r>
         <w:rPr>
@@ -2852,7 +2852,7 @@
         <w:t xml:space="preserve">Candidate’s contribution and joint PhD. </w:t>
       </w:r>
       <w:r>
-        <w:t>This is a joint KU Leuven–VUB doctorate in which two complementary doctoral projects run on the same trial. The present candidate leads the clinical trial: protocol development, ethics and regulatory submission, multicentre coordination, investigator training and site readiness, recruitment oversight, quality and fidelity monitoring, data management, and the analyses of ulcer recurrence, plantar pressure and footwear adherence. The parallel doctorate leads the process evaluation and the health-economic evaluation. Both researchers contribute to study conduct and outputs, with authorship aligned to responsibilities. Alongside the trial, the candidate conducts a registered scoping review on «onderwerp in te vullen» and a methodological comparison of the two in-shoe pressure systems used in Belgian DFCs. Local clinical teams deliver patient care and site-level assessments.</w:t>
+        <w:t>This is a joint KU Leuven–VUB doctorate in which two complementary doctoral projects run on the same trial. The present candidate leads the clinical trial: protocol development, ethics and regulatory submission, multicentre coordination, investigator training and site readiness, recruitment oversight, quality and fidelity monitoring, data management, and the analyses of ulcer recurrence, plantar pressure and footwear adherence. The parallel doctorate leads the process evaluation and the health-economic evaluation. Both researchers contribute to study conduct and outputs, with authorship aligned to responsibilities. Alongside the trial, the candidate conducts a registered scoping review, “Patient-specific offloading insole design in diabetic foot disease: a scoping review of biomechanical, clinical and health-economic evidence”. Local clinical teams deliver patient care and site-level assessments.</w:t>
       </w:r>
     </w:p>
     <w:p>
@@ -3508,7 +3508,7 @@
           <w:rFonts w:ascii="Garamond" w:hAnsi="Garamond"/>
           <w:lang w:val="en-US"/>
         </w:rPr>
-        <w:t>PARADISE is evaluated through two co-primary outcomes, reflecting both clinical effectiveness and the proposed mechanistic pathway.</w:t>
+        <w:t>PARADISE has a single primary outcome; the proposed mechanistic pathway is analysed as a pre-specified mediator rather than as a second endpoint.</w:t>
       </w:r>
     </w:p>
     <w:p>
@@ -3525,12 +3525,75 @@
           <w:rFonts w:ascii="Garamond" w:hAnsi="Garamond"/>
           <w:lang w:val="en-GB"/>
         </w:rPr>
-        <w:t>The first co-primary outcome is plantar foot-ulcer recurrence at 18 months, defined as a new plantar ulcer occurring after enrolment and reflecting</w:t>
-      </w:r>
-      <w:r>
-        <w:rPr>
-          <w:rFonts w:ascii="Garamond" w:hAnsi="Garamond"/>
-          <w:lang w:val="en-GB"/>
+        <w:t xml:space="preserve">The primary outcome is plantar foot-ulcer recurrence at 18 months, defined as a new plantar ulcer occurring after enrolment and reflecting </w:t>
+      </w:r>
+      <w:r>
+        <w:rPr>
+          <w:rFonts w:ascii="Garamond" w:hAnsi="Garamond"/>
+          <w:lang w:val="en-GB"/>
+        </w:rPr>
+      </w:r>
+      <w:r>
+        <w:rPr>
+          <w:rFonts w:ascii="Garamond" w:hAnsi="Garamond"/>
+          <w:lang w:val="en-GB"/>
+        </w:rPr>
+        <w:t>the combined impact of pressure management, prevention strategies, and footwear adherence.</w:t>
+      </w:r>
+      <w:r>
+        <w:rPr>
+          <w:rFonts w:ascii="Garamond" w:hAnsi="Garamond"/>
+          <w:lang w:val="en-US"/>
+        </w:rPr>
+        <w:fldChar w:fldCharType="begin"/>
+      </w:r>
+      <w:r>
+        <w:rPr>
+          <w:rFonts w:ascii="Garamond" w:hAnsi="Garamond"/>
+          <w:lang w:val="en-US"/>
+        </w:rPr>
+        <w:instrText xml:space="preserve"> ADDIN ZOTERO_ITEM CSL_CITATION {"citationID":"xypz4jDH","properties":{"unsorted":false,"formattedCitation":"\\super 5,15\\nosupersub{}","plainCitation":"5,15","noteIndex":0},"citationItems":[{"id":48,"uris":["http://zotero.org/users/19619518/items/HQRWT4X4"],"itemData":{"id":48,"type":"article-journal","abstract":"OBJECTIVE\n              Custom-made footwear is the treatment of choice to prevent foot ulcer recurrence in diabetes. This footwear primarily aims to offload plantar regions at high ulcer risk. However, ulcer recurrence rates are high. We assessed the effect of offloading-improved custom-made footwear and the role of footwear adherence on plantar foot ulcer recurrence.\n            \n            \n              RESEARCH DESIGN AND METHODS\n              We randomly assigned 171 neuropathic diabetic patients with a recently healed plantar foot ulcer to custom-made footwear with improved and subsequently preserved offloading (</w:instrText>
+      </w:r>
+      <w:r>
+        <w:rPr>
+          <w:rFonts w:ascii="Cambria Math" w:hAnsi="Cambria Math" w:cs="Cambria Math"/>
+          <w:lang w:val="en-US"/>
+        </w:rPr>
+        <w:instrText>∼</w:instrText>
+      </w:r>
+      <w:r>
+        <w:rPr>
+          <w:rFonts w:ascii="Garamond" w:hAnsi="Garamond"/>
+          <w:lang w:val="en-US"/>
+        </w:rPr>
+        <w:instrText xml:space="preserve">20% peak pressure relief by modifying the footwear) or to usual care (i.e., nonimproved custom-made footwear). Primary outcome was plantar foot ulcer recurrence in 18 months. Secondary outcome was ulcer recurrence in patients with an objectively measured adherence of ≥80% of steps taken.\n            \n            \n              RESULTS\n              On the basis of intention-to-treat, 33 of 85 patients (38.8%) with improved footwear and 38 of 86 patients (44.2%) with usual care had a recurrent ulcer (relative risk −11%, odds ratio 0.80 [95% CI 0.44–1.47], P = 0.48). Ulcer-free survival curves were not significantly different between groups (P = 0.40). In the 79 patients (46% of total group) with high adherence, 9 of 35 (25.7%) with improved footwear and 21 of 44 (47.8%) with usual care had a recurrent ulcer (relative risk −46%, odds ratio 0.38 [0.15–0.99], P = 0.045).\n            \n            \n              CONCLUSIONS\n              Offloading-improved custom-made footwear does not significantly reduce the incidence of plantar foot ulcer recurrence in diabetes compared with custom-made footwear that does not undergo such improvement, unless it is worn as recommended.","container-title":"Diabetes Care","DOI":"10.2337/dc13-0996","ISSN":"0149-5992, 1935-5548","issue":"12","language":"en","page":"4109-4116","source":"DOI.org (Crossref)","title":"Effect of Custom-Made Footwear on Foot Ulcer Recurrence in Diabetes","volume":"36","author":[{"family":"Bus","given":"Sicco A."},{"family":"Waaijman","given":"Roelof"},{"family":"Arts","given":"Mark"},{"family":"De Haart","given":"Mirjam"},{"family":"Busch-Westbroek","given":"Tessa"},{"family":"Van Baal","given":"Jeff"},{"family":"Nollet","given":"Frans"}],"issued":{"date-parts":[["2013",12,1]]}}},{"id":49,"uris":["http://zotero.org/users/19619518/items/3AML47RQ"],"itemData":{"id":49,"type":"article-journal","abstract":"Abstract\n            \n              Background\n              Preventing foot ulcers in people with diabetes can increase quality of life and reduce costs. Despite the availability of various interventions to prevent foot ulcers, recurrence rates remain high. We hypothesize that a multimodal treatment approach incorporating various footwear, self-management, and education interventions that matches an individual person’s needs can reduce the risk of ulcer recurrence with beneficial cost-utility. The aim of this study is to assess the effect on foot ulcer recurrence, footwear adherence, and cost-utility of an integrated personalized assistive devices approach in high-risk people with diabetes.\n            \n            \n              Methods\n              In a parallel-group multicenter randomized controlled trial, 126 adult participants with diabetes mellitus type 1 or 2, loss of protective sensation based on the presence of peripheral neuropathy, a healed plantar foot ulcer in the preceding 4 years, and possession of any type of custom-made footwear will be included. Participants will be randomly assigned to either enhanced therapy or usual care. Enhanced therapy consists of usual care and additionally a personalized treatment approach including pressure-optimized custom-made footwear, pressure-optimized custom-made footwear for indoor use, at-home daily foot temperature monitoring, and structured education, which includes motivational interviewing and personalized feedback on adherence and self-care. Participants will be followed for 12 months. Assessments include barefoot and in-shoe plantar pressure measurements; questionnaires concerning quality of life, costs, disease, and self-care knowledge; physical activity and footwear use monitoring; and clinical monitoring for foot ulcer outcomes. The study is powered for 3 primary outcomes: foot ulcer recurrence, footwear adherence, and cost-utility, the primary clinical, patient-related, and health-economic outcome respectively.\n            \n            \n              Discussion\n              This is the first study to integrate multiple interventions for ulcer prevention into a personalized state-of-the-art treatment approach and assess their combined efficacy in a randomized controlled trial in people with diabetes at high ulcer risk. Proven effectiveness, usability, and cost-utility will facilitate implementation in healthcare, improve the quality of life of high-risk people with diabetes, and reduce treatment costs.\n            \n            \n              Trial registration\n              ClinicalTrials.gov NCT05236660. Registered on 11 February 2022.","container-title":"Trials","DOI":"10.1186/s13063-023-07635-z","ISSN":"1745-6215","issue":"1","journalAbbreviation":"Trials","language":"en","page":"663","source":"DOI.org (Crossref)","title":"An integrated personalized assistive devices approach to reduce the risk of foot ulcer recurrence in diabetes (DIASSIST): study protocol for a multicenter randomized controlled trial","title-short":"An integrated personalized assistive devices approach to reduce the risk of foot ulcer recurrence in diabetes (DIASSIST)","volume":"24","author":[{"family":"Vossen","given":"Lisa E."},{"family":"Van Netten","given":"Jaap J."},{"family":"Bakker","given":"Chantal D."},{"family":"Berendsen","given":"Heleen A."},{"family":"Busch-Westbroek","given":"Tessa E."},{"family":"Peters","given":"Edgar J. G."},{"family":"Sabelis","given":"Louise W. E."},{"family":"Dijkgraaf","given":"Marcel G. W."},{"family":"Bus","given":"Sicco A."}],"issued":{"date-parts":[["2023",10,12]]}}}],"schema":"https://github.com/citation-style-language/schema/raw/master/csl-citation.json"} </w:instrText>
+      </w:r>
+      <w:r>
+        <w:rPr>
+          <w:rFonts w:ascii="Garamond" w:hAnsi="Garamond"/>
+          <w:lang w:val="en-US"/>
+        </w:rPr>
+        <w:fldChar w:fldCharType="separate"/>
+      </w:r>
+      <w:r>
+        <w:rPr>
+          <w:rFonts w:ascii="Garamond" w:hAnsi="Garamond"/>
+          <w:vertAlign w:val="superscript"/>
+          <w:lang w:val="en-GB"/>
+        </w:rPr>
+        <w:t>5,15</w:t>
+      </w:r>
+      <w:r>
+        <w:rPr>
+          <w:rFonts w:ascii="Garamond" w:hAnsi="Garamond"/>
+          <w:lang w:val="en-US"/>
+        </w:rPr>
+        <w:fldChar w:fldCharType="end"/>
+      </w:r>
+      <w:r>
+        <w:rPr>
+          <w:rFonts w:ascii="Garamond" w:hAnsi="Garamond"/>
+          <w:lang w:val="en-US"/>
         </w:rPr>
         <w:t xml:space="preserve"> </w:t>
       </w:r>
@@ -3539,7 +3602,7 @@
           <w:rFonts w:ascii="Garamond" w:hAnsi="Garamond"/>
           <w:lang w:val="en-GB"/>
         </w:rPr>
-        <w:t>the combined impact of pressure management, prevention strategies, and footwear adherence.</w:t>
+        <w:t>Objectively measured footwear adherence is the pre-specified mediator, quantified as the proportion of ambulatory activity performed while wearing the prescribed footwear relative to the clinically relevant ≥80% threshold, and analysed at 12 months with the full 18-month profile reported as a secondary summary.</w:t>
       </w:r>
       <w:r>
         <w:rPr>
@@ -3553,21 +3616,497 @@
           <w:rFonts w:ascii="Garamond" w:hAnsi="Garamond"/>
           <w:lang w:val="en-US"/>
         </w:rPr>
-        <w:instrText xml:space="preserve"> ADDIN ZOTERO_ITEM CSL_CITATION {"citationID":"xypz4jDH","properties":{"unsorted":false,"formattedCitation":"\\super 5,15\\nosupersub{}","plainCitation":"5,15","noteIndex":0},"citationItems":[{"id":48,"uris":["http://zotero.org/users/19619518/items/HQRWT4X4"],"itemData":{"id":48,"type":"article-journal","abstract":"OBJECTIVE\n              Custom-made footwear is the treatment of choice to prevent foot ulcer recurrence in diabetes. This footwear primarily aims to offload plantar regions at high ulcer risk. However, ulcer recurrence rates are high. We assessed the effect of offloading-improved custom-made footwear and the role of footwear adherence on plantar foot ulcer recurrence.\n            \n            \n              RESEARCH DESIGN AND METHODS\n              We randomly assigned 171 neuropathic diabetic patients with a recently healed plantar foot ulcer to custom-made footwear with improved and subsequently preserved offloading (</w:instrText>
+        <w:instrText xml:space="preserve"> ADDIN ZOTERO_ITEM CSL_CITATION {"citationID":"yNaMmMq2","properties":{"unsorted":false,"formattedCitation":"\\super 6,7\\nosupersub{}","plainCitation":"6,7","noteIndex":0},"citationItems":[{"id":16,"uris":["http://zotero.org/users/19619518/items/PZIVAKCP"],"itemData":{"id":16,"type":"article-journal","abstract":"OBJECTIVE\n              Prescription custom-made footwear can only be effective in preventing diabetic foot ulcers if worn by the patient. Particularly, the high prevalence of recurrent foot ulcers focuses the attention on adherence, for which objective data are nonexisting. We objectively assessed adherence in patients with high risk of ulcer recurrence and evaluated what determines adherence.\n            \n            \n              RESEARCH DESIGN AND METHODS\n              In 107 patients with diabetes, neuropathy, a recently healed plantar foot ulcer, and custom-made footwear, footwear use was measured during 7 consecutive days using a shoe-worn, temperature-based monitor. Daily step count was measured simultaneously using an ankle-worn activity monitor. Patients logged time away from home. Adherence was calculated as the percentage of steps that prescription footwear was worn. Determinants of adherence were evaluated in multivariate linear regression analysis.\n            \n            \n              RESULTS\n              Mean ± SD adherence was 71 ± 25%. Adherence at home was 61 ± 32%, over 3,959 ± 2,594 steps, and away from home 87 ± 26%, over 2,604 ± 2,507 steps. In 35 patients with low adherence (&amp;lt;60%), adherence at home was 28 ± 24%. Lower BMI, more severe foot deformity, and more appealing footwear were significantly associated with higher adherence.\n            \n            \n              CONCLUSIONS\n              The results show that adherence to wearing custom-made footwear is insufficient, particularly at home where patients exhibit their largest walking activity. This low adherence is a major threat for reulceration. These objective findings provide directions for improvement in adherence, which could include prescribing specific off-loading footwear for indoors, and they set a reference for future comparative research on footwear adherence in diabetes.","container-title":"Diabetes Care","DOI":"10.2337/dc12-1330","ISSN":"0149-5992, 1935-5548","issue":"6","language":"en","page":"1613-1618","source":"DOI.org (Crossref)","title":"Adherence to Wearing Prescription Custom-Made Footwear in Patients With Diabetes at High Risk for Plantar Foot Ulceration","volume":"36","author":[{"family":"Waaijman","given":"Roelof"},{"family":"Keukenkamp","given":"Renske"},{"family":"De Haart","given":"Mirjam"},{"family":"Polomski","given":"Wojtek P."},{"family":"Nollet","given":"Frans"},{"family":"Bus","given":"Sicco A."}],"issued":{"date-parts":[["2013",6,1]]}}},{"id":56,"uris":["http://zotero.org/users/19619518/items/6DZPFUHJ"],"itemData":{"id":56,"type":"article-journal","abstract":"Abstract\n            \n              Background\n              Orthopaedic footwear can only be effective in preventing diabetic foot ulcers if worn by the patient. Robust data on long</w:instrText>
       </w:r>
       <w:r>
         <w:rPr>
           <w:rFonts w:ascii="Cambria Math" w:hAnsi="Cambria Math" w:cs="Cambria Math"/>
           <w:lang w:val="en-US"/>
         </w:rPr>
-        <w:instrText>∼</w:instrText>
-      </w:r>
-      <w:r>
-        <w:rPr>
-          <w:rFonts w:ascii="Garamond" w:hAnsi="Garamond"/>
-          <w:lang w:val="en-US"/>
-        </w:rPr>
-        <w:instrText xml:space="preserve">20% peak pressure relief by modifying the footwear) or to usual care (i.e., nonimproved custom-made footwear). Primary outcome was plantar foot ulcer recurrence in 18 months. Secondary outcome was ulcer recurrence in patients with an objectively measured adherence of ≥80% of steps taken.\n            \n            \n              RESULTS\n              On the basis of intention-to-treat, 33 of 85 patients (38.8%) with improved footwear and 38 of 86 patients (44.2%) with usual care had a recurrent ulcer (relative risk −11%, odds ratio 0.80 [95% CI 0.44–1.47], P = 0.48). Ulcer-free survival curves were not significantly different between groups (P = 0.40). In the 79 patients (46% of total group) with high adherence, 9 of 35 (25.7%) with improved footwear and 21 of 44 (47.8%) with usual care had a recurrent ulcer (relative risk −46%, odds ratio 0.38 [0.15–0.99], P = 0.045).\n            \n            \n              CONCLUSIONS\n              Offloading-improved custom-made footwear does not significantly reduce the incidence of plantar foot ulcer recurrence in diabetes compared with custom-made footwear that does not undergo such improvement, unless it is worn as recommended.","container-title":"Diabetes Care","DOI":"10.2337/dc13-0996","ISSN":"0149-5992, 1935-5548","issue":"12","language":"en","page":"4109-4116","source":"DOI.org (Crossref)","title":"Effect of Custom-Made Footwear on Foot Ulcer Recurrence in Diabetes","volume":"36","author":[{"family":"Bus","given":"Sicco A."},{"family":"Waaijman","given":"Roelof"},{"family":"Arts","given":"Mark"},{"family":"De Haart","given":"Mirjam"},{"family":"Busch-Westbroek","given":"Tessa"},{"family":"Van Baal","given":"Jeff"},{"family":"Nollet","given":"Frans"}],"issued":{"date-parts":[["2013",12,1]]}}},{"id":49,"uris":["http://zotero.org/users/19619518/items/3AML47RQ"],"itemData":{"id":49,"type":"article-journal","abstract":"Abstract\n            \n              Background\n              Preventing foot ulcers in people with diabetes can increase quality of life and reduce costs. Despite the availability of various interventions to prevent foot ulcers, recurrence rates remain high. We hypothesize that a multimodal treatment approach incorporating various footwear, self-management, and education interventions that matches an individual person’s needs can reduce the risk of ulcer recurrence with beneficial cost-utility. The aim of this study is to assess the effect on foot ulcer recurrence, footwear adherence, and cost-utility of an integrated personalized assistive devices approach in high-risk people with diabetes.\n            \n            \n              Methods\n              In a parallel-group multicenter randomized controlled trial, 126 adult participants with diabetes mellitus type 1 or 2, loss of protective sensation based on the presence of peripheral neuropathy, a healed plantar foot ulcer in the preceding 4 years, and possession of any type of custom-made footwear will be included. Participants will be randomly assigned to either enhanced therapy or usual care. Enhanced therapy consists of usual care and additionally a personalized treatment approach including pressure-optimized custom-made footwear, pressure-optimized custom-made footwear for indoor use, at-home daily foot temperature monitoring, and structured education, which includes motivational interviewing and personalized feedback on adherence and self-care. Participants will be followed for 12 months. Assessments include barefoot and in-shoe plantar pressure measurements; questionnaires concerning quality of life, costs, disease, and self-care knowledge; physical activity and footwear use monitoring; and clinical monitoring for foot ulcer outcomes. The study is powered for 3 primary outcomes: foot ulcer recurrence, footwear adherence, and cost-utility, the primary clinical, patient-related, and health-economic outcome respectively.\n            \n            \n              Discussion\n              This is the first study to integrate multiple interventions for ulcer prevention into a personalized state-of-the-art treatment approach and assess their combined efficacy in a randomized controlled trial in people with diabetes at high ulcer risk. Proven effectiveness, usability, and cost-utility will facilitate implementation in healthcare, improve the quality of life of high-risk people with diabetes, and reduce treatment costs.\n            \n            \n              Trial registration\n              ClinicalTrials.gov NCT05236660. Registered on 11 February 2022.","container-title":"Trials","DOI":"10.1186/s13063-023-07635-z","ISSN":"1745-6215","issue":"1","journalAbbreviation":"Trials","language":"en","page":"663","source":"DOI.org (Crossref)","title":"An integrated personalized assistive devices approach to reduce the risk of foot ulcer recurrence in diabetes (DIASSIST): study protocol for a multicenter randomized controlled trial","title-short":"An integrated personalized assistive devices approach to reduce the risk of foot ulcer recurrence in diabetes (DIASSIST)","volume":"24","author":[{"family":"Vossen","given":"Lisa E."},{"family":"Van Netten","given":"Jaap J."},{"family":"Bakker","given":"Chantal D."},{"family":"Berendsen","given":"Heleen A."},{"family":"Busch-Westbroek","given":"Tessa E."},{"family":"Peters","given":"Edgar J. G."},{"family":"Sabelis","given":"Louise W. E."},{"family":"Dijkgraaf","given":"Marcel G. W."},{"family":"Bus","given":"Sicco A."}],"issued":{"date-parts":[["2023",10,12]]}}}],"schema":"https://github.com/citation-style-language/schema/raw/master/csl-citation.json"} </w:instrText>
+        <w:instrText>‐</w:instrText>
+      </w:r>
+      <w:r>
+        <w:rPr>
+          <w:rFonts w:ascii="Garamond" w:hAnsi="Garamond"/>
+          <w:lang w:val="en-US"/>
+        </w:rPr>
+        <w:instrText>term wearing time of orthopaedic footwear are not available, and needed to gain more insights into wearing patterns and associated factors (i.e. participants' demographic, disease</w:instrText>
+      </w:r>
+      <w:r>
+        <w:rPr>
+          <w:rFonts w:ascii="Cambria Math" w:hAnsi="Cambria Math" w:cs="Cambria Math"/>
+          <w:lang w:val="en-US"/>
+        </w:rPr>
+        <w:instrText>‐</w:instrText>
+      </w:r>
+      <w:r>
+        <w:rPr>
+          <w:rFonts w:ascii="Garamond" w:hAnsi="Garamond"/>
+          <w:lang w:val="en-US"/>
+        </w:rPr>
+        <w:instrText>related characteristics, and footwear usability). We aimed to objectively assess long</w:instrText>
+      </w:r>
+      <w:r>
+        <w:rPr>
+          <w:rFonts w:ascii="Cambria Math" w:hAnsi="Cambria Math" w:cs="Cambria Math"/>
+          <w:lang w:val="en-US"/>
+        </w:rPr>
+        <w:instrText>‐</w:instrText>
+      </w:r>
+      <w:r>
+        <w:rPr>
+          <w:rFonts w:ascii="Garamond" w:hAnsi="Garamond"/>
+          <w:lang w:val="en-US"/>
+        </w:rPr>
+        <w:instrText>term wearing patterns and identify factors associated with wearing orthopaedic footwear in people with diabetes at moderate</w:instrText>
+      </w:r>
+      <w:r>
+        <w:rPr>
+          <w:rFonts w:ascii="Cambria Math" w:hAnsi="Cambria Math" w:cs="Cambria Math"/>
+          <w:lang w:val="en-US"/>
+        </w:rPr>
+        <w:instrText>‐</w:instrText>
+      </w:r>
+      <w:r>
+        <w:rPr>
+          <w:rFonts w:ascii="Garamond" w:hAnsi="Garamond"/>
+          <w:lang w:val="en-US"/>
+        </w:rPr>
+        <w:instrText>to</w:instrText>
+      </w:r>
+      <w:r>
+        <w:rPr>
+          <w:rFonts w:ascii="Cambria Math" w:hAnsi="Cambria Math" w:cs="Cambria Math"/>
+          <w:lang w:val="en-US"/>
+        </w:rPr>
+        <w:instrText>‐</w:instrText>
+      </w:r>
+      <w:r>
+        <w:rPr>
+          <w:rFonts w:ascii="Garamond" w:hAnsi="Garamond"/>
+          <w:lang w:val="en-US"/>
+        </w:rPr>
+        <w:instrText>high risk of ulceration.\n            \n            \n              Methods\n              People diagnosed with diabetes mellitus type 1 and 2 with loss of protective sensation and/or peripheral artery disease and prescribed with orthopaedic footwear were included and followed for 12 months. The primary outcome was mean daily wearing time, continuously measured using a temperature sensor inside the footwear (Orthotimer®). Adherence to wearing orthopaedic footwear was calculated as percentage of wearing time of a total assumed 16 h out</w:instrText>
+      </w:r>
+      <w:r>
+        <w:rPr>
+          <w:rFonts w:ascii="Cambria Math" w:hAnsi="Cambria Math" w:cs="Cambria Math"/>
+          <w:lang w:val="en-US"/>
+        </w:rPr>
+        <w:instrText>‐</w:instrText>
+      </w:r>
+      <w:r>
+        <w:rPr>
+          <w:rFonts w:ascii="Garamond" w:hAnsi="Garamond"/>
+          <w:lang w:val="en-US"/>
+        </w:rPr>
+        <w:instrText>of</w:instrText>
+      </w:r>
+      <w:r>
+        <w:rPr>
+          <w:rFonts w:ascii="Cambria Math" w:hAnsi="Cambria Math" w:cs="Cambria Math"/>
+          <w:lang w:val="en-US"/>
+        </w:rPr>
+        <w:instrText>‐</w:instrText>
+      </w:r>
+      <w:r>
+        <w:rPr>
+          <w:rFonts w:ascii="Garamond" w:hAnsi="Garamond"/>
+          <w:lang w:val="en-US"/>
+        </w:rPr>
+        <w:instrText>bed daytime, where adherence</w:instrText>
+      </w:r>
+      <w:r>
+        <w:rPr>
+          <w:lang w:val="en-US"/>
+        </w:rPr>
+        <w:instrText> </w:instrText>
+      </w:r>
+      <w:r>
+        <w:rPr>
+          <w:rFonts w:ascii="Garamond" w:hAnsi="Garamond"/>
+          <w:lang w:val="en-US"/>
+        </w:rPr>
+        <w:instrText>&lt;</w:instrText>
+      </w:r>
+      <w:r>
+        <w:rPr>
+          <w:lang w:val="en-US"/>
+        </w:rPr>
+        <w:instrText> </w:instrText>
+      </w:r>
+      <w:r>
+        <w:rPr>
+          <w:rFonts w:ascii="Garamond" w:hAnsi="Garamond"/>
+          <w:lang w:val="en-US"/>
+        </w:rPr>
+        <w:instrText>60% was a pre</w:instrText>
+      </w:r>
+      <w:r>
+        <w:rPr>
+          <w:rFonts w:ascii="Cambria Math" w:hAnsi="Cambria Math" w:cs="Cambria Math"/>
+          <w:lang w:val="en-US"/>
+        </w:rPr>
+        <w:instrText>‐</w:instrText>
+      </w:r>
+      <w:r>
+        <w:rPr>
+          <w:rFonts w:ascii="Garamond" w:hAnsi="Garamond"/>
+          <w:lang w:val="en-US"/>
+        </w:rPr>
+        <w:instrText>determined non</w:instrText>
+      </w:r>
+      <w:r>
+        <w:rPr>
+          <w:rFonts w:ascii="Cambria Math" w:hAnsi="Cambria Math" w:cs="Cambria Math"/>
+          <w:lang w:val="en-US"/>
+        </w:rPr>
+        <w:instrText>‐</w:instrText>
+      </w:r>
+      <w:r>
+        <w:rPr>
+          <w:rFonts w:ascii="Garamond" w:hAnsi="Garamond"/>
+          <w:lang w:val="en-US"/>
+        </w:rPr>
+        <w:instrText>adherent threshold. Wearing time patterns were assessed by calculating participants' wearing (in)consistency. One</w:instrText>
+      </w:r>
+      <w:r>
+        <w:rPr>
+          <w:rFonts w:ascii="Cambria Math" w:hAnsi="Cambria Math" w:cs="Cambria Math"/>
+          <w:lang w:val="en-US"/>
+        </w:rPr>
+        <w:instrText>‐</w:instrText>
+      </w:r>
+      <w:r>
+        <w:rPr>
+          <w:rFonts w:ascii="Garamond" w:hAnsi="Garamond"/>
+          <w:lang w:val="en-US"/>
+        </w:rPr>
+        <w:instrText xml:space="preserve">way analyses of variance tested for wearing time differences between subgroups, weekdays, and weekend days. Factors potentially associated with wearing time were collected by questionnaires and medical files. Univariately associated factors were included in multivariate linear regression analysis.\n            \n            \n              Results\n              \n                Sixty one participants were included (mean (SD) age: 68.0 (7.4) years; females:\n                n\n                </w:instrText>
+      </w:r>
+      <w:r>
+        <w:rPr>
+          <w:lang w:val="en-US"/>
+        </w:rPr>
+        <w:instrText> </w:instrText>
+      </w:r>
+      <w:r>
+        <w:rPr>
+          <w:rFonts w:ascii="Garamond" w:hAnsi="Garamond"/>
+          <w:lang w:val="en-US"/>
+        </w:rPr>
+        <w:instrText>=</w:instrText>
+      </w:r>
+      <w:r>
+        <w:rPr>
+          <w:lang w:val="en-US"/>
+        </w:rPr>
+        <w:instrText> </w:instrText>
+      </w:r>
+      <w:r>
+        <w:rPr>
+          <w:rFonts w:ascii="Garamond" w:hAnsi="Garamond"/>
+          <w:lang w:val="en-US"/>
+        </w:rPr>
+        <w:instrText xml:space="preserve">17; type 2 diabetes mellitus:\n                n\n                </w:instrText>
+      </w:r>
+      <w:r>
+        <w:rPr>
+          <w:lang w:val="en-US"/>
+        </w:rPr>
+        <w:instrText> </w:instrText>
+      </w:r>
+      <w:r>
+        <w:rPr>
+          <w:rFonts w:ascii="Garamond" w:hAnsi="Garamond"/>
+          <w:lang w:val="en-US"/>
+        </w:rPr>
+        <w:instrText>=</w:instrText>
+      </w:r>
+      <w:r>
+        <w:rPr>
+          <w:lang w:val="en-US"/>
+        </w:rPr>
+        <w:instrText> </w:instrText>
+      </w:r>
+      <w:r>
+        <w:rPr>
+          <w:rFonts w:ascii="Garamond" w:hAnsi="Garamond"/>
+          <w:lang w:val="en-US"/>
+        </w:rPr>
+        <w:instrText>54). Mean (SD) overall daily wearing time was 8.3 (6.1) hours/day. A total of 40 (66%) participants were non</w:instrText>
+      </w:r>
+      <w:r>
+        <w:rPr>
+          <w:rFonts w:ascii="Cambria Math" w:hAnsi="Cambria Math" w:cs="Cambria Math"/>
+          <w:lang w:val="en-US"/>
+        </w:rPr>
+        <w:instrText>‐</w:instrText>
+      </w:r>
+      <w:r>
+        <w:rPr>
+          <w:rFonts w:ascii="Garamond" w:hAnsi="Garamond"/>
+          <w:lang w:val="en-US"/>
+        </w:rPr>
+        <w:instrText xml:space="preserve">adherent. Participants with a consistent wearing pattern showed higher daily wearing times than participants with an inconsistent pattern. Mean (SD) wearing times were 12.7 (4.3) vs 3.6 (4.8) hours/day, respectively (\n                P\n                </w:instrText>
+      </w:r>
+      <w:r>
+        <w:rPr>
+          <w:lang w:val="en-US"/>
+        </w:rPr>
+        <w:instrText> </w:instrText>
+      </w:r>
+      <w:r>
+        <w:rPr>
+          <w:rFonts w:ascii="Garamond" w:hAnsi="Garamond"/>
+          <w:lang w:val="en-US"/>
+        </w:rPr>
+        <w:instrText>&lt;</w:instrText>
+      </w:r>
+      <w:r>
+        <w:rPr>
+          <w:lang w:val="en-US"/>
+        </w:rPr>
+        <w:instrText> </w:instrText>
+      </w:r>
+      <w:r>
+        <w:rPr>
+          <w:rFonts w:ascii="Garamond" w:hAnsi="Garamond"/>
+          <w:lang w:val="en-US"/>
+        </w:rPr>
+        <w:instrText xml:space="preserve">0.001). Mean (SD) wearing time was significantly higher (\n                P\n                </w:instrText>
+      </w:r>
+      <w:r>
+        <w:rPr>
+          <w:lang w:val="en-US"/>
+        </w:rPr>
+        <w:instrText> </w:instrText>
+      </w:r>
+      <w:r>
+        <w:rPr>
+          <w:rFonts w:ascii="Garamond" w:hAnsi="Garamond"/>
+          <w:lang w:val="en-US"/>
+        </w:rPr>
+        <w:instrText>&lt;</w:instrText>
+      </w:r>
+      <w:r>
+        <w:rPr>
+          <w:lang w:val="en-US"/>
+        </w:rPr>
+        <w:instrText> </w:instrText>
+      </w:r>
+      <w:r>
+        <w:rPr>
+          <w:rFonts w:ascii="Garamond" w:hAnsi="Garamond"/>
+          <w:lang w:val="en-US"/>
+        </w:rPr>
+        <w:instrText xml:space="preserve">0.010) during weekdays (8.7 (6.0) hours/day) compared to Saturday (8.0 (6.1) hours/day) and Sunday (6.9 (6.2) hours/day). In the multivariate model (R\n                2\n                </w:instrText>
+      </w:r>
+      <w:r>
+        <w:rPr>
+          <w:lang w:val="en-US"/>
+        </w:rPr>
+        <w:instrText> </w:instrText>
+      </w:r>
+      <w:r>
+        <w:rPr>
+          <w:rFonts w:ascii="Garamond" w:hAnsi="Garamond"/>
+          <w:lang w:val="en-US"/>
+        </w:rPr>
+        <w:instrText>=</w:instrText>
+      </w:r>
+      <w:r>
+        <w:rPr>
+          <w:lang w:val="en-US"/>
+        </w:rPr>
+        <w:instrText> </w:instrText>
+      </w:r>
+      <w:r>
+        <w:rPr>
+          <w:rFonts w:ascii="Garamond" w:hAnsi="Garamond"/>
+          <w:lang w:val="en-US"/>
+        </w:rPr>
+        <w:instrText xml:space="preserve">0.28), </w:instrText>
+      </w:r>
+      <w:r>
+        <w:rPr>
+          <w:rFonts w:ascii="Garamond" w:hAnsi="Garamond" w:cs="Garamond"/>
+          <w:lang w:val="en-US"/>
+        </w:rPr>
+        <w:instrText>“</w:instrText>
+      </w:r>
+      <w:r>
+        <w:rPr>
+          <w:rFonts w:ascii="Garamond" w:hAnsi="Garamond"/>
+          <w:lang w:val="en-US"/>
+        </w:rPr>
+        <w:instrText>satisfaction with my wear of orthopaedic footwear</w:instrText>
+      </w:r>
+      <w:r>
+        <w:rPr>
+          <w:rFonts w:ascii="Garamond" w:hAnsi="Garamond" w:cs="Garamond"/>
+          <w:lang w:val="en-US"/>
+        </w:rPr>
+        <w:instrText>”</w:instrText>
+      </w:r>
+      <w:r>
+        <w:rPr>
+          <w:rFonts w:ascii="Garamond" w:hAnsi="Garamond"/>
+          <w:lang w:val="en-US"/>
+        </w:rPr>
+        <w:instrText xml:space="preserve"> was positively associated (\n                P\n                </w:instrText>
+      </w:r>
+      <w:r>
+        <w:rPr>
+          <w:lang w:val="en-US"/>
+        </w:rPr>
+        <w:instrText> </w:instrText>
+      </w:r>
+      <w:r>
+        <w:rPr>
+          <w:rFonts w:ascii="Garamond" w:hAnsi="Garamond"/>
+          <w:lang w:val="en-US"/>
+        </w:rPr>
+        <w:instrText>&lt;</w:instrText>
+      </w:r>
+      <w:r>
+        <w:rPr>
+          <w:lang w:val="en-US"/>
+        </w:rPr>
+        <w:instrText> </w:instrText>
+      </w:r>
+      <w:r>
+        <w:rPr>
+          <w:rFonts w:ascii="Garamond" w:hAnsi="Garamond"/>
+          <w:lang w:val="en-US"/>
+        </w:rPr>
+        <w:instrText>0.001) with wearing time. The other seven multivariate model factors (four demographic variables and three footwear usability variables) were not associated with wearing time.\n              \n            \n            \n              Conclusions\n              Only one out of three people at moderate to high risk of foot ulceration were sufficiently adherent to wearing their orthopaedic footwear. Changing people's wearing behaviour to a more stable pattern seems a potential avenue to improve long</w:instrText>
+      </w:r>
+      <w:r>
+        <w:rPr>
+          <w:rFonts w:ascii="Cambria Math" w:hAnsi="Cambria Math" w:cs="Cambria Math"/>
+          <w:lang w:val="en-US"/>
+        </w:rPr>
+        <w:instrText>‐</w:instrText>
+      </w:r>
+      <w:r>
+        <w:rPr>
+          <w:rFonts w:ascii="Garamond" w:hAnsi="Garamond"/>
+          <w:lang w:val="en-US"/>
+        </w:rPr>
+        <w:instrText>term adherence to wearing orthopaedic footwear. Investigated factors are not associated with daily wearing time. Based on these factors the daily wearing time cannot be estimated in daily practice.\n            \n            \n              Trial registration\n              Netherlands Trial Register NL7710. Registered: 6 May 2019.","container-title":"Journal of Foot and Ankle Research","DOI":"10.1186/s13047-023-00656-6","ISSN":"1757-1146, 1757-1146","issue":"1","journalAbbreviation":"Journal of Foot and Ankle Research","language":"en","license":"http://creativecommons.org/licenses/by/4.0/","page":"60","source":"DOI.org (Crossref)","title":"Objectively assessed long</w:instrText>
+      </w:r>
+      <w:r>
+        <w:rPr>
+          <w:rFonts w:ascii="Cambria Math" w:hAnsi="Cambria Math" w:cs="Cambria Math"/>
+          <w:lang w:val="en-US"/>
+        </w:rPr>
+        <w:instrText>‐</w:instrText>
+      </w:r>
+      <w:r>
+        <w:rPr>
+          <w:rFonts w:ascii="Garamond" w:hAnsi="Garamond"/>
+          <w:lang w:val="en-US"/>
+        </w:rPr>
+        <w:instrText>term wearing patterns and predictors of wearing orthopaedic footwear in people with diabetes at moderate</w:instrText>
+      </w:r>
+      <w:r>
+        <w:rPr>
+          <w:rFonts w:ascii="Cambria Math" w:hAnsi="Cambria Math" w:cs="Cambria Math"/>
+          <w:lang w:val="en-US"/>
+        </w:rPr>
+        <w:instrText>‐</w:instrText>
+      </w:r>
+      <w:r>
+        <w:rPr>
+          <w:rFonts w:ascii="Garamond" w:hAnsi="Garamond"/>
+          <w:lang w:val="en-US"/>
+        </w:rPr>
+        <w:instrText>to</w:instrText>
+      </w:r>
+      <w:r>
+        <w:rPr>
+          <w:rFonts w:ascii="Cambria Math" w:hAnsi="Cambria Math" w:cs="Cambria Math"/>
+          <w:lang w:val="en-US"/>
+        </w:rPr>
+        <w:instrText>‐</w:instrText>
+      </w:r>
+      <w:r>
+        <w:rPr>
+          <w:rFonts w:ascii="Garamond" w:hAnsi="Garamond"/>
+          <w:lang w:val="en-US"/>
+        </w:rPr>
+        <w:instrText>high risk of foot ulceration: a 12 months observational study","title-short":"Objectively assessed long</w:instrText>
+      </w:r>
+      <w:r>
+        <w:rPr>
+          <w:rFonts w:ascii="Cambria Math" w:hAnsi="Cambria Math" w:cs="Cambria Math"/>
+          <w:lang w:val="en-US"/>
+        </w:rPr>
+        <w:instrText>‐</w:instrText>
+      </w:r>
+      <w:r>
+        <w:rPr>
+          <w:rFonts w:ascii="Garamond" w:hAnsi="Garamond"/>
+          <w:lang w:val="en-US"/>
+        </w:rPr>
+        <w:instrText>term wearing patterns and predictors of wearing orthopaedic footwear in people with diabetes at moderate</w:instrText>
+      </w:r>
+      <w:r>
+        <w:rPr>
+          <w:rFonts w:ascii="Cambria Math" w:hAnsi="Cambria Math" w:cs="Cambria Math"/>
+          <w:lang w:val="en-US"/>
+        </w:rPr>
+        <w:instrText>‐</w:instrText>
+      </w:r>
+      <w:r>
+        <w:rPr>
+          <w:rFonts w:ascii="Garamond" w:hAnsi="Garamond"/>
+          <w:lang w:val="en-US"/>
+        </w:rPr>
+        <w:instrText>to</w:instrText>
+      </w:r>
+      <w:r>
+        <w:rPr>
+          <w:rFonts w:ascii="Cambria Math" w:hAnsi="Cambria Math" w:cs="Cambria Math"/>
+          <w:lang w:val="en-US"/>
+        </w:rPr>
+        <w:instrText>‐</w:instrText>
+      </w:r>
+      <w:r>
+        <w:rPr>
+          <w:rFonts w:ascii="Garamond" w:hAnsi="Garamond"/>
+          <w:lang w:val="en-US"/>
+        </w:rPr>
+        <w:instrText>high risk of foot ulceration","volume":"16","author":[{"family":"Exterkate","given":"Stein H."},{"family":"Jongebloed</w:instrText>
+      </w:r>
+      <w:r>
+        <w:rPr>
+          <w:rFonts w:ascii="Cambria Math" w:hAnsi="Cambria Math" w:cs="Cambria Math"/>
+          <w:lang w:val="en-US"/>
+        </w:rPr>
+        <w:instrText>‐</w:instrText>
+      </w:r>
+      <w:r>
+        <w:rPr>
+          <w:rFonts w:ascii="Garamond" w:hAnsi="Garamond"/>
+          <w:lang w:val="en-US"/>
+        </w:rPr>
+        <w:instrText>Westra","given":"Manon"},{"family":"Ten Klooster","given":"Peter M."},{"family":"Koffijberg","given":"Hendrik"},{"family":"Bode","given":"Christina"},{"family":"Van Gemert</w:instrText>
+      </w:r>
+      <w:r>
+        <w:rPr>
+          <w:rFonts w:ascii="Cambria Math" w:hAnsi="Cambria Math" w:cs="Cambria Math"/>
+          <w:lang w:val="en-US"/>
+        </w:rPr>
+        <w:instrText>‐</w:instrText>
+      </w:r>
+      <w:r>
+        <w:rPr>
+          <w:rFonts w:ascii="Garamond" w:hAnsi="Garamond"/>
+          <w:lang w:val="en-US"/>
+        </w:rPr>
+        <w:instrText xml:space="preserve">Pijnen","given":"Julia E. W. C."},{"family":"Van Baal","given":"Josephus G."},{"family":"Van Netten","given":"Jaap J."}],"issued":{"date-parts":[["2023",1]]}}}],"schema":"https://github.com/citation-style-language/schema/raw/master/csl-citation.json"} </w:instrText>
       </w:r>
       <w:r>
         <w:rPr>
@@ -3582,7 +4121,7 @@
           <w:vertAlign w:val="superscript"/>
           <w:lang w:val="en-GB"/>
         </w:rPr>
-        <w:t>5,15</w:t>
+        <w:t>6,7</w:t>
       </w:r>
       <w:r>
         <w:rPr>
@@ -3603,554 +4142,14 @@
           <w:rFonts w:ascii="Garamond" w:hAnsi="Garamond"/>
           <w:lang w:val="en-GB"/>
         </w:rPr>
-        <w:t>The second co-primary outcome is objectively measured footwear adherence at 12 months, quantified as the proportion of ambulatory activity performed while wearing prescribed footwear relative to the clinically relevant ≥80% threshold.</w:t>
-      </w:r>
-      <w:r>
-        <w:rPr>
-          <w:rFonts w:ascii="Garamond" w:hAnsi="Garamond"/>
-          <w:lang w:val="en-US"/>
-        </w:rPr>
-        <w:fldChar w:fldCharType="begin"/>
-      </w:r>
-      <w:r>
-        <w:rPr>
-          <w:rFonts w:ascii="Garamond" w:hAnsi="Garamond"/>
-          <w:lang w:val="en-US"/>
-        </w:rPr>
-        <w:instrText xml:space="preserve"> ADDIN ZOTERO_ITEM CSL_CITATION {"citationID":"yNaMmMq2","properties":{"unsorted":false,"formattedCitation":"\\super 6,7\\nosupersub{}","plainCitation":"6,7","noteIndex":0},"citationItems":[{"id":16,"uris":["http://zotero.org/users/19619518/items/PZIVAKCP"],"itemData":{"id":16,"type":"article-journal","abstract":"OBJECTIVE\n              Prescription custom-made footwear can only be effective in preventing diabetic foot ulcers if worn by the patient. Particularly, the high prevalence of recurrent foot ulcers focuses the attention on adherence, for which objective data are nonexisting. We objectively assessed adherence in patients with high risk of ulcer recurrence and evaluated what determines adherence.\n            \n            \n              RESEARCH DESIGN AND METHODS\n              In 107 patients with diabetes, neuropathy, a recently healed plantar foot ulcer, and custom-made footwear, footwear use was measured during 7 consecutive days using a shoe-worn, temperature-based monitor. Daily step count was measured simultaneously using an ankle-worn activity monitor. Patients logged time away from home. Adherence was calculated as the percentage of steps that prescription footwear was worn. Determinants of adherence were evaluated in multivariate linear regression analysis.\n            \n            \n              RESULTS\n              Mean ± SD adherence was 71 ± 25%. Adherence at home was 61 ± 32%, over 3,959 ± 2,594 steps, and away from home 87 ± 26%, over 2,604 ± 2,507 steps. In 35 patients with low adherence (&amp;lt;60%), adherence at home was 28 ± 24%. Lower BMI, more severe foot deformity, and more appealing footwear were significantly associated with higher adherence.\n            \n            \n              CONCLUSIONS\n              The results show that adherence to wearing custom-made footwear is insufficient, particularly at home where patients exhibit their largest walking activity. This low adherence is a major threat for reulceration. These objective findings provide directions for improvement in adherence, which could include prescribing specific off-loading footwear for indoors, and they set a reference for future comparative research on footwear adherence in diabetes.","container-title":"Diabetes Care","DOI":"10.2337/dc12-1330","ISSN":"0149-5992, 1935-5548","issue":"6","language":"en","page":"1613-1618","source":"DOI.org (Crossref)","title":"Adherence to Wearing Prescription Custom-Made Footwear in Patients With Diabetes at High Risk for Plantar Foot Ulceration","volume":"36","author":[{"family":"Waaijman","given":"Roelof"},{"family":"Keukenkamp","given":"Renske"},{"family":"De Haart","given":"Mirjam"},{"family":"Polomski","given":"Wojtek P."},{"family":"Nollet","given":"Frans"},{"family":"Bus","given":"Sicco A."}],"issued":{"date-parts":[["2013",6,1]]}}},{"id":56,"uris":["http://zotero.org/users/19619518/items/6DZPFUHJ"],"itemData":{"id":56,"type":"article-journal","abstract":"Abstract\n            \n              Background\n              Orthopaedic footwear can only be effective in preventing diabetic foot ulcers if worn by the patient. Robust data on long</w:instrText>
-      </w:r>
-      <w:r>
-        <w:rPr>
-          <w:rFonts w:ascii="Cambria Math" w:hAnsi="Cambria Math" w:cs="Cambria Math"/>
-          <w:lang w:val="en-US"/>
-        </w:rPr>
-        <w:instrText>‐</w:instrText>
-      </w:r>
-      <w:r>
-        <w:rPr>
-          <w:rFonts w:ascii="Garamond" w:hAnsi="Garamond"/>
-          <w:lang w:val="en-US"/>
-        </w:rPr>
-        <w:instrText>term wearing time of orthopaedic footwear are not available, and needed to gain more insights into wearing patterns and associated factors (i.e. participants' demographic, disease</w:instrText>
-      </w:r>
-      <w:r>
-        <w:rPr>
-          <w:rFonts w:ascii="Cambria Math" w:hAnsi="Cambria Math" w:cs="Cambria Math"/>
-          <w:lang w:val="en-US"/>
-        </w:rPr>
-        <w:instrText>‐</w:instrText>
-      </w:r>
-      <w:r>
-        <w:rPr>
-          <w:rFonts w:ascii="Garamond" w:hAnsi="Garamond"/>
-          <w:lang w:val="en-US"/>
-        </w:rPr>
-        <w:instrText>related characteristics, and footwear usability). We aimed to objectively assess long</w:instrText>
-      </w:r>
-      <w:r>
-        <w:rPr>
-          <w:rFonts w:ascii="Cambria Math" w:hAnsi="Cambria Math" w:cs="Cambria Math"/>
-          <w:lang w:val="en-US"/>
-        </w:rPr>
-        <w:instrText>‐</w:instrText>
-      </w:r>
-      <w:r>
-        <w:rPr>
-          <w:rFonts w:ascii="Garamond" w:hAnsi="Garamond"/>
-          <w:lang w:val="en-US"/>
-        </w:rPr>
-        <w:instrText>term wearing patterns and identify factors associated with wearing orthopaedic footwear in people with diabetes at moderate</w:instrText>
-      </w:r>
-      <w:r>
-        <w:rPr>
-          <w:rFonts w:ascii="Cambria Math" w:hAnsi="Cambria Math" w:cs="Cambria Math"/>
-          <w:lang w:val="en-US"/>
-        </w:rPr>
-        <w:instrText>‐</w:instrText>
-      </w:r>
-      <w:r>
-        <w:rPr>
-          <w:rFonts w:ascii="Garamond" w:hAnsi="Garamond"/>
-          <w:lang w:val="en-US"/>
-        </w:rPr>
-        <w:instrText>to</w:instrText>
-      </w:r>
-      <w:r>
-        <w:rPr>
-          <w:rFonts w:ascii="Cambria Math" w:hAnsi="Cambria Math" w:cs="Cambria Math"/>
-          <w:lang w:val="en-US"/>
-        </w:rPr>
-        <w:instrText>‐</w:instrText>
-      </w:r>
-      <w:r>
-        <w:rPr>
-          <w:rFonts w:ascii="Garamond" w:hAnsi="Garamond"/>
-          <w:lang w:val="en-US"/>
-        </w:rPr>
-        <w:instrText>high risk of ulceration.\n            \n            \n              Methods\n              People diagnosed with diabetes mellitus type 1 and 2 with loss of protective sensation and/or peripheral artery disease and prescribed with orthopaedic footwear were included and followed for 12 months. The primary outcome was mean daily wearing time, continuously measured using a temperature sensor inside the footwear (Orthotimer®). Adherence to wearing orthopaedic footwear was calculated as percentage of wearing time of a total assumed 16 h out</w:instrText>
-      </w:r>
-      <w:r>
-        <w:rPr>
-          <w:rFonts w:ascii="Cambria Math" w:hAnsi="Cambria Math" w:cs="Cambria Math"/>
-          <w:lang w:val="en-US"/>
-        </w:rPr>
-        <w:instrText>‐</w:instrText>
-      </w:r>
-      <w:r>
-        <w:rPr>
-          <w:rFonts w:ascii="Garamond" w:hAnsi="Garamond"/>
-          <w:lang w:val="en-US"/>
-        </w:rPr>
-        <w:instrText>of</w:instrText>
-      </w:r>
-      <w:r>
-        <w:rPr>
-          <w:rFonts w:ascii="Cambria Math" w:hAnsi="Cambria Math" w:cs="Cambria Math"/>
-          <w:lang w:val="en-US"/>
-        </w:rPr>
-        <w:instrText>‐</w:instrText>
-      </w:r>
-      <w:r>
-        <w:rPr>
-          <w:rFonts w:ascii="Garamond" w:hAnsi="Garamond"/>
-          <w:lang w:val="en-US"/>
-        </w:rPr>
-        <w:instrText>bed daytime, where adherence</w:instrText>
-      </w:r>
-      <w:r>
-        <w:rPr>
-          <w:lang w:val="en-US"/>
-        </w:rPr>
-        <w:instrText> </w:instrText>
-      </w:r>
-      <w:r>
-        <w:rPr>
-          <w:rFonts w:ascii="Garamond" w:hAnsi="Garamond"/>
-          <w:lang w:val="en-US"/>
-        </w:rPr>
-        <w:instrText>&lt;</w:instrText>
-      </w:r>
-      <w:r>
-        <w:rPr>
-          <w:lang w:val="en-US"/>
-        </w:rPr>
-        <w:instrText> </w:instrText>
-      </w:r>
-      <w:r>
-        <w:rPr>
-          <w:rFonts w:ascii="Garamond" w:hAnsi="Garamond"/>
-          <w:lang w:val="en-US"/>
-        </w:rPr>
-        <w:instrText>60% was a pre</w:instrText>
-      </w:r>
-      <w:r>
-        <w:rPr>
-          <w:rFonts w:ascii="Cambria Math" w:hAnsi="Cambria Math" w:cs="Cambria Math"/>
-          <w:lang w:val="en-US"/>
-        </w:rPr>
-        <w:instrText>‐</w:instrText>
-      </w:r>
-      <w:r>
-        <w:rPr>
-          <w:rFonts w:ascii="Garamond" w:hAnsi="Garamond"/>
-          <w:lang w:val="en-US"/>
-        </w:rPr>
-        <w:instrText>determined non</w:instrText>
-      </w:r>
-      <w:r>
-        <w:rPr>
-          <w:rFonts w:ascii="Cambria Math" w:hAnsi="Cambria Math" w:cs="Cambria Math"/>
-          <w:lang w:val="en-US"/>
-        </w:rPr>
-        <w:instrText>‐</w:instrText>
-      </w:r>
-      <w:r>
-        <w:rPr>
-          <w:rFonts w:ascii="Garamond" w:hAnsi="Garamond"/>
-          <w:lang w:val="en-US"/>
-        </w:rPr>
-        <w:instrText>adherent threshold. Wearing time patterns were assessed by calculating participants' wearing (in)consistency. One</w:instrText>
-      </w:r>
-      <w:r>
-        <w:rPr>
-          <w:rFonts w:ascii="Cambria Math" w:hAnsi="Cambria Math" w:cs="Cambria Math"/>
-          <w:lang w:val="en-US"/>
-        </w:rPr>
-        <w:instrText>‐</w:instrText>
-      </w:r>
-      <w:r>
-        <w:rPr>
-          <w:rFonts w:ascii="Garamond" w:hAnsi="Garamond"/>
-          <w:lang w:val="en-US"/>
-        </w:rPr>
-        <w:instrText xml:space="preserve">way analyses of variance tested for wearing time differences between subgroups, weekdays, and weekend days. Factors potentially associated with wearing time were collected by questionnaires and medical files. Univariately associated factors were included in multivariate linear regression analysis.\n            \n            \n              Results\n              \n                Sixty one participants were included (mean (SD) age: 68.0 (7.4) years; females:\n                n\n                </w:instrText>
-      </w:r>
-      <w:r>
-        <w:rPr>
-          <w:lang w:val="en-US"/>
-        </w:rPr>
-        <w:instrText> </w:instrText>
-      </w:r>
-      <w:r>
-        <w:rPr>
-          <w:rFonts w:ascii="Garamond" w:hAnsi="Garamond"/>
-          <w:lang w:val="en-US"/>
-        </w:rPr>
-        <w:instrText>=</w:instrText>
-      </w:r>
-      <w:r>
-        <w:rPr>
-          <w:lang w:val="en-US"/>
-        </w:rPr>
-        <w:instrText> </w:instrText>
-      </w:r>
-      <w:r>
-        <w:rPr>
-          <w:rFonts w:ascii="Garamond" w:hAnsi="Garamond"/>
-          <w:lang w:val="en-US"/>
-        </w:rPr>
-        <w:instrText xml:space="preserve">17; type 2 diabetes mellitus:\n                n\n                </w:instrText>
-      </w:r>
-      <w:r>
-        <w:rPr>
-          <w:lang w:val="en-US"/>
-        </w:rPr>
-        <w:instrText> </w:instrText>
-      </w:r>
-      <w:r>
-        <w:rPr>
-          <w:rFonts w:ascii="Garamond" w:hAnsi="Garamond"/>
-          <w:lang w:val="en-US"/>
-        </w:rPr>
-        <w:instrText>=</w:instrText>
-      </w:r>
-      <w:r>
-        <w:rPr>
-          <w:lang w:val="en-US"/>
-        </w:rPr>
-        <w:instrText> </w:instrText>
-      </w:r>
-      <w:r>
-        <w:rPr>
-          <w:rFonts w:ascii="Garamond" w:hAnsi="Garamond"/>
-          <w:lang w:val="en-US"/>
-        </w:rPr>
-        <w:instrText>54). Mean (SD) overall daily wearing time was 8.3 (6.1) hours/day. A total of 40 (66%) participants were non</w:instrText>
-      </w:r>
-      <w:r>
-        <w:rPr>
-          <w:rFonts w:ascii="Cambria Math" w:hAnsi="Cambria Math" w:cs="Cambria Math"/>
-          <w:lang w:val="en-US"/>
-        </w:rPr>
-        <w:instrText>‐</w:instrText>
-      </w:r>
-      <w:r>
-        <w:rPr>
-          <w:rFonts w:ascii="Garamond" w:hAnsi="Garamond"/>
-          <w:lang w:val="en-US"/>
-        </w:rPr>
-        <w:instrText xml:space="preserve">adherent. Participants with a consistent wearing pattern showed higher daily wearing times than participants with an inconsistent pattern. Mean (SD) wearing times were 12.7 (4.3) vs 3.6 (4.8) hours/day, respectively (\n                P\n                </w:instrText>
-      </w:r>
-      <w:r>
-        <w:rPr>
-          <w:lang w:val="en-US"/>
-        </w:rPr>
-        <w:instrText> </w:instrText>
-      </w:r>
-      <w:r>
-        <w:rPr>
-          <w:rFonts w:ascii="Garamond" w:hAnsi="Garamond"/>
-          <w:lang w:val="en-US"/>
-        </w:rPr>
-        <w:instrText>&lt;</w:instrText>
-      </w:r>
-      <w:r>
-        <w:rPr>
-          <w:lang w:val="en-US"/>
-        </w:rPr>
-        <w:instrText> </w:instrText>
-      </w:r>
-      <w:r>
-        <w:rPr>
-          <w:rFonts w:ascii="Garamond" w:hAnsi="Garamond"/>
-          <w:lang w:val="en-US"/>
-        </w:rPr>
-        <w:instrText xml:space="preserve">0.001). Mean (SD) wearing time was significantly higher (\n                P\n                </w:instrText>
-      </w:r>
-      <w:r>
-        <w:rPr>
-          <w:lang w:val="en-US"/>
-        </w:rPr>
-        <w:instrText> </w:instrText>
-      </w:r>
-      <w:r>
-        <w:rPr>
-          <w:rFonts w:ascii="Garamond" w:hAnsi="Garamond"/>
-          <w:lang w:val="en-US"/>
-        </w:rPr>
-        <w:instrText>&lt;</w:instrText>
-      </w:r>
-      <w:r>
-        <w:rPr>
-          <w:lang w:val="en-US"/>
-        </w:rPr>
-        <w:instrText> </w:instrText>
-      </w:r>
-      <w:r>
-        <w:rPr>
-          <w:rFonts w:ascii="Garamond" w:hAnsi="Garamond"/>
-          <w:lang w:val="en-US"/>
-        </w:rPr>
-        <w:instrText xml:space="preserve">0.010) during weekdays (8.7 (6.0) hours/day) compared to Saturday (8.0 (6.1) hours/day) and Sunday (6.9 (6.2) hours/day). In the multivariate model (R\n                2\n                </w:instrText>
-      </w:r>
-      <w:r>
-        <w:rPr>
-          <w:lang w:val="en-US"/>
-        </w:rPr>
-        <w:instrText> </w:instrText>
-      </w:r>
-      <w:r>
-        <w:rPr>
-          <w:rFonts w:ascii="Garamond" w:hAnsi="Garamond"/>
-          <w:lang w:val="en-US"/>
-        </w:rPr>
-        <w:instrText>=</w:instrText>
-      </w:r>
-      <w:r>
-        <w:rPr>
-          <w:lang w:val="en-US"/>
-        </w:rPr>
-        <w:instrText> </w:instrText>
-      </w:r>
-      <w:r>
-        <w:rPr>
-          <w:rFonts w:ascii="Garamond" w:hAnsi="Garamond"/>
-          <w:lang w:val="en-US"/>
-        </w:rPr>
-        <w:instrText xml:space="preserve">0.28), </w:instrText>
-      </w:r>
-      <w:r>
-        <w:rPr>
-          <w:rFonts w:ascii="Garamond" w:hAnsi="Garamond" w:cs="Garamond"/>
-          <w:lang w:val="en-US"/>
-        </w:rPr>
-        <w:instrText>“</w:instrText>
-      </w:r>
-      <w:r>
-        <w:rPr>
-          <w:rFonts w:ascii="Garamond" w:hAnsi="Garamond"/>
-          <w:lang w:val="en-US"/>
-        </w:rPr>
-        <w:instrText>satisfaction with my wear of orthopaedic footwear</w:instrText>
-      </w:r>
-      <w:r>
-        <w:rPr>
-          <w:rFonts w:ascii="Garamond" w:hAnsi="Garamond" w:cs="Garamond"/>
-          <w:lang w:val="en-US"/>
-        </w:rPr>
-        <w:instrText>”</w:instrText>
-      </w:r>
-      <w:r>
-        <w:rPr>
-          <w:rFonts w:ascii="Garamond" w:hAnsi="Garamond"/>
-          <w:lang w:val="en-US"/>
-        </w:rPr>
-        <w:instrText xml:space="preserve"> was positively associated (\n                P\n                </w:instrText>
-      </w:r>
-      <w:r>
-        <w:rPr>
-          <w:lang w:val="en-US"/>
-        </w:rPr>
-        <w:instrText> </w:instrText>
-      </w:r>
-      <w:r>
-        <w:rPr>
-          <w:rFonts w:ascii="Garamond" w:hAnsi="Garamond"/>
-          <w:lang w:val="en-US"/>
-        </w:rPr>
-        <w:instrText>&lt;</w:instrText>
-      </w:r>
-      <w:r>
-        <w:rPr>
-          <w:lang w:val="en-US"/>
-        </w:rPr>
-        <w:instrText> </w:instrText>
-      </w:r>
-      <w:r>
-        <w:rPr>
-          <w:rFonts w:ascii="Garamond" w:hAnsi="Garamond"/>
-          <w:lang w:val="en-US"/>
-        </w:rPr>
-        <w:instrText>0.001) with wearing time. The other seven multivariate model factors (four demographic variables and three footwear usability variables) were not associated with wearing time.\n              \n            \n            \n              Conclusions\n              Only one out of three people at moderate to high risk of foot ulceration were sufficiently adherent to wearing their orthopaedic footwear. Changing people's wearing behaviour to a more stable pattern seems a potential avenue to improve long</w:instrText>
-      </w:r>
-      <w:r>
-        <w:rPr>
-          <w:rFonts w:ascii="Cambria Math" w:hAnsi="Cambria Math" w:cs="Cambria Math"/>
-          <w:lang w:val="en-US"/>
-        </w:rPr>
-        <w:instrText>‐</w:instrText>
-      </w:r>
-      <w:r>
-        <w:rPr>
-          <w:rFonts w:ascii="Garamond" w:hAnsi="Garamond"/>
-          <w:lang w:val="en-US"/>
-        </w:rPr>
-        <w:instrText>term adherence to wearing orthopaedic footwear. Investigated factors are not associated with daily wearing time. Based on these factors the daily wearing time cannot be estimated in daily practice.\n            \n            \n              Trial registration\n              Netherlands Trial Register NL7710. Registered: 6 May 2019.","container-title":"Journal of Foot and Ankle Research","DOI":"10.1186/s13047-023-00656-6","ISSN":"1757-1146, 1757-1146","issue":"1","journalAbbreviation":"Journal of Foot and Ankle Research","language":"en","license":"http://creativecommons.org/licenses/by/4.0/","page":"60","source":"DOI.org (Crossref)","title":"Objectively assessed long</w:instrText>
-      </w:r>
-      <w:r>
-        <w:rPr>
-          <w:rFonts w:ascii="Cambria Math" w:hAnsi="Cambria Math" w:cs="Cambria Math"/>
-          <w:lang w:val="en-US"/>
-        </w:rPr>
-        <w:instrText>‐</w:instrText>
-      </w:r>
-      <w:r>
-        <w:rPr>
-          <w:rFonts w:ascii="Garamond" w:hAnsi="Garamond"/>
-          <w:lang w:val="en-US"/>
-        </w:rPr>
-        <w:instrText>term wearing patterns and predictors of wearing orthopaedic footwear in people with diabetes at moderate</w:instrText>
-      </w:r>
-      <w:r>
-        <w:rPr>
-          <w:rFonts w:ascii="Cambria Math" w:hAnsi="Cambria Math" w:cs="Cambria Math"/>
-          <w:lang w:val="en-US"/>
-        </w:rPr>
-        <w:instrText>‐</w:instrText>
-      </w:r>
-      <w:r>
-        <w:rPr>
-          <w:rFonts w:ascii="Garamond" w:hAnsi="Garamond"/>
-          <w:lang w:val="en-US"/>
-        </w:rPr>
-        <w:instrText>to</w:instrText>
-      </w:r>
-      <w:r>
-        <w:rPr>
-          <w:rFonts w:ascii="Cambria Math" w:hAnsi="Cambria Math" w:cs="Cambria Math"/>
-          <w:lang w:val="en-US"/>
-        </w:rPr>
-        <w:instrText>‐</w:instrText>
-      </w:r>
-      <w:r>
-        <w:rPr>
-          <w:rFonts w:ascii="Garamond" w:hAnsi="Garamond"/>
-          <w:lang w:val="en-US"/>
-        </w:rPr>
-        <w:instrText>high risk of foot ulceration: a 12 months observational study","title-short":"Objectively assessed long</w:instrText>
-      </w:r>
-      <w:r>
-        <w:rPr>
-          <w:rFonts w:ascii="Cambria Math" w:hAnsi="Cambria Math" w:cs="Cambria Math"/>
-          <w:lang w:val="en-US"/>
-        </w:rPr>
-        <w:instrText>‐</w:instrText>
-      </w:r>
-      <w:r>
-        <w:rPr>
-          <w:rFonts w:ascii="Garamond" w:hAnsi="Garamond"/>
-          <w:lang w:val="en-US"/>
-        </w:rPr>
-        <w:instrText>term wearing patterns and predictors of wearing orthopaedic footwear in people with diabetes at moderate</w:instrText>
-      </w:r>
-      <w:r>
-        <w:rPr>
-          <w:rFonts w:ascii="Cambria Math" w:hAnsi="Cambria Math" w:cs="Cambria Math"/>
-          <w:lang w:val="en-US"/>
-        </w:rPr>
-        <w:instrText>‐</w:instrText>
-      </w:r>
-      <w:r>
-        <w:rPr>
-          <w:rFonts w:ascii="Garamond" w:hAnsi="Garamond"/>
-          <w:lang w:val="en-US"/>
-        </w:rPr>
-        <w:instrText>to</w:instrText>
-      </w:r>
-      <w:r>
-        <w:rPr>
-          <w:rFonts w:ascii="Cambria Math" w:hAnsi="Cambria Math" w:cs="Cambria Math"/>
-          <w:lang w:val="en-US"/>
-        </w:rPr>
-        <w:instrText>‐</w:instrText>
-      </w:r>
-      <w:r>
-        <w:rPr>
-          <w:rFonts w:ascii="Garamond" w:hAnsi="Garamond"/>
-          <w:lang w:val="en-US"/>
-        </w:rPr>
-        <w:instrText>high risk of foot ulceration","volume":"16","author":[{"family":"Exterkate","given":"Stein H."},{"family":"Jongebloed</w:instrText>
-      </w:r>
-      <w:r>
-        <w:rPr>
-          <w:rFonts w:ascii="Cambria Math" w:hAnsi="Cambria Math" w:cs="Cambria Math"/>
-          <w:lang w:val="en-US"/>
-        </w:rPr>
-        <w:instrText>‐</w:instrText>
-      </w:r>
-      <w:r>
-        <w:rPr>
-          <w:rFonts w:ascii="Garamond" w:hAnsi="Garamond"/>
-          <w:lang w:val="en-US"/>
-        </w:rPr>
-        <w:instrText>Westra","given":"Manon"},{"family":"Ten Klooster","given":"Peter M."},{"family":"Koffijberg","given":"Hendrik"},{"family":"Bode","given":"Christina"},{"family":"Van Gemert</w:instrText>
-      </w:r>
-      <w:r>
-        <w:rPr>
-          <w:rFonts w:ascii="Cambria Math" w:hAnsi="Cambria Math" w:cs="Cambria Math"/>
-          <w:lang w:val="en-US"/>
-        </w:rPr>
-        <w:instrText>‐</w:instrText>
-      </w:r>
-      <w:r>
-        <w:rPr>
-          <w:rFonts w:ascii="Garamond" w:hAnsi="Garamond"/>
-          <w:lang w:val="en-US"/>
-        </w:rPr>
-        <w:instrText xml:space="preserve">Pijnen","given":"Julia E. W. C."},{"family":"Van Baal","given":"Josephus G."},{"family":"Van Netten","given":"Jaap J."}],"issued":{"date-parts":[["2023",1]]}}}],"schema":"https://github.com/citation-style-language/schema/raw/master/csl-citation.json"} </w:instrText>
-      </w:r>
-      <w:r>
-        <w:rPr>
-          <w:rFonts w:ascii="Garamond" w:hAnsi="Garamond"/>
-          <w:lang w:val="en-US"/>
-        </w:rPr>
-        <w:fldChar w:fldCharType="separate"/>
-      </w:r>
-      <w:r>
-        <w:rPr>
-          <w:rFonts w:ascii="Garamond" w:hAnsi="Garamond"/>
-          <w:vertAlign w:val="superscript"/>
-          <w:lang w:val="en-GB"/>
-        </w:rPr>
-        <w:t>6,7</w:t>
-      </w:r>
-      <w:r>
-        <w:rPr>
-          <w:rFonts w:ascii="Garamond" w:hAnsi="Garamond"/>
-          <w:lang w:val="en-US"/>
-        </w:rPr>
-        <w:fldChar w:fldCharType="end"/>
-      </w:r>
-      <w:r>
-        <w:rPr>
-          <w:rFonts w:ascii="Garamond" w:hAnsi="Garamond"/>
-          <w:lang w:val="en-US"/>
+        <w:t>Exploratory analyses will compare indoor and outdoor footwear use,</w:t>
+      </w:r>
+      <w:r>
+        <w:rPr>
+          <w:rFonts w:ascii="Garamond" w:hAnsi="Garamond"/>
+          <w:lang w:val="en-GB"/>
         </w:rPr>
         <w:t xml:space="preserve"> </w:t>
-      </w:r>
-      <w:r>
-        <w:rPr>
-          <w:rFonts w:ascii="Garamond" w:hAnsi="Garamond"/>
-          <w:lang w:val="en-GB"/>
-        </w:rPr>
-        <w:t>Exploratory analyses will compare indoor and outdoor footwear use,</w:t>
-      </w:r>
-      <w:r>
-        <w:rPr>
-          <w:rFonts w:ascii="Garamond" w:hAnsi="Garamond"/>
-          <w:lang w:val="en-GB"/>
-        </w:rPr>
-        <w:t xml:space="preserve">  </w:t>
       </w:r>
       <w:r>
         <w:rPr>
@@ -4210,7 +4209,7 @@
           <w:rFonts w:ascii="Garamond" w:hAnsi="Garamond"/>
           <w:lang w:val="en-GB"/>
         </w:rPr>
-        <w:t>Secondary outcomes comprise ulcer-free survival, recurrence characteristics, plantar-pressure change at 6, 12, and 18 months, foot-care behaviour (NAFF), self-reported adherence (7-day recall), health-related quality of life (EQ-5D-5L), and healthcare resource utilisation.</w:t>
+        <w:t>Secondary outcomes comprise ulcer-free survival, recurrence characteristics, plantar-pressure change at 6, 12, and 18 months, foot-care behaviour (NAFF), objectively measured adherence over the full 18 months, self-reported adherence (7-day recall), health-related quality of life (EQ-5D-5L), and healthcare resource utilisation.</w:t>
       </w:r>
     </w:p>
     <w:p>
@@ -4248,7 +4247,7 @@
           <w:rFonts w:ascii="Garamond" w:hAnsi="Garamond"/>
           <w:lang w:val="en-GB"/>
         </w:rPr>
-        <w:t xml:space="preserve"> of 0.05 for both co-primary outcomes. Assuming a reduction in 18-month ulcer recurrence from 50% to 25%, informed by prior footwear and offloading studies</w:t>
+        <w:t xml:space="preserve"> of 0.05 for the single primary outcome, so no multiplicity correction is required. Assuming a reduction in 18-month ulcer recurrence from 50% to 25%, informed by prior footwear and offloading studies</w:t>
       </w:r>
       <w:r>
         <w:rPr>
@@ -4326,7 +4325,6 @@
           <w:rFonts w:ascii="Garamond" w:hAnsi="Garamond"/>
           <w:lang w:val="en-GB"/>
         </w:rPr>
-        <w:t>The recurrence endpoint determines overall sample size.</w:t>
       </w:r>
     </w:p>
     <w:p>
@@ -4343,7 +4341,7 @@
           <w:rFonts w:ascii="Garamond" w:hAnsi="Garamond"/>
           <w:lang w:val="en-GB"/>
         </w:rPr>
-        <w:t>All analyses follow the intention-to-treat principle. Recurrence outcomes will account for competing mortality risk using appropriate competing-risk methods; longitudinal biomechanical and adherence outcomes will be analysed using mixed-effects models accounting for centre- and participant-level variability. Missing data will be addressed using multiple imputation by chained equations.</w:t>
+        <w:t>All analyses follow the intention-to-treat principle. Recurrence outcomes will account for competing mortality risk using appropriate competing-risk methods; longitudinal biomechanical and adherence outcomes will be analysed using mixed-effects models accounting for centre- and participant-level variability. The mediating role of footwear adherence will be examined in a pre-specified causal mediation analysis. Missing data will be addressed using multiple imputation by chained equations.</w:t>
       </w:r>
       <w:r>
         <w:rPr>
@@ -4777,7 +4775,7 @@
           <w:rFonts w:ascii="Garamond" w:hAnsi="Garamond"/>
           <w:lang w:val="en-GB"/>
         </w:rPr>
-        <w:t>During months 43–48, database closure, analyses, manuscript preparation, and thesis completion will be performed. Manuscript development will occur throughout the project, with four manuscripts targeted: (1) plantar pressure redistribution using custom-made foot orthoses in people with and without diabetes; (2) plantar pressure benchmarks in people with diabetes based on low- and high-resolution measurements; (3) clinical effectiveness of PARADISE on ulcer recurrence; and (4) clinical effectiveness of PARADISE on footwear adherence.</w:t>
+        <w:t>During months 43–48, database closure, analyses, manuscript preparation and thesis completion will be performed. Manuscript development runs throughout the project; the planned outputs are listed in section 5.</w:t>
       </w:r>
     </w:p>
     <w:p>
@@ -5227,10 +5225,16 @@
       </w:pPr>
       <w:r>
         <w:rPr>
-          <w:rFonts w:ascii="Garamond" w:hAnsi="Garamond"/>
-          <w:lang w:val="en-GB"/>
-        </w:rPr>
-        <w:t>All trial publications will be reported according to CONSORT recommendations.</w:t>
+          <w:b/>
+        </w:rPr>
+        <w:t xml:space="preserve">Planned outputs. </w:t>
+      </w:r>
+      <w:r>
+        <w:rPr>
+          <w:rFonts w:ascii="Garamond" w:hAnsi="Garamond"/>
+          <w:lang w:val="en-GB"/>
+        </w:rPr>
+        <w:t>Seven manuscripts are planned. (1) The scoping review “Patient-specific offloading insole design in diabetic foot disease: a scoping review of biomechanical, clinical and health-economic evidence”, with the protocol registered before searching and reporting according to PRISMA-ScR (months 1–12). (2) The trial protocol paper, reported according to SPIRIT 2025 and TIDieR (months 1–9). (3) A method-comparison paper quantifying agreement and inter-rater reliability between the two in-shoe pressure systems used in Belgian DFCs (months 6–18). (4) Regional peak plantar-pressure reference values in people with diabetes, derived from low- and high-resolution in-shoe measurements (months 12–30). (5) Plantar-pressure redistribution achieved with custom-made foot orthoses in people with and without diabetes (months 18–36). (6) The primary effectiveness analysis of ulcer recurrence at 18 months (months 43–48). (7) The pre-specified mediation analysis of footwear adherence, including the full 18-month adherence profile (months 43–48). Trial publications will be reported according to CONSORT recommendations.</w:t>
       </w:r>
       <w:proofErr w:type="spellStart"/>
       <w:r>

</xml_diff>

<commit_message>
Doctoraatsplan: 3D-geprinte zolen als studie 4, en beide figuren opnieuw getekend
De methodevergelijking tussen de twee drukmeetsystemen vervalt als apart
manuscript; in de plaats komt de vergelijking tussen conventionele en
3D-geprinte voetorthesen, uitgevoerd buiten de trial. Zes manuscripten in
totaal. Figuur 1 toont nu een primair eindpunt met de vooraf vastgelegde
mediator in plaats van twee co-primaire uitkomsten. Figuur 2 is herbouwd zonder
werkpakkettaal, met de zes manuscripten en de mijlpalen erin.

Co-Authored-By: Claude Opus 5 <noreply@anthropic.com>
</commit_message>
<xml_diff>
--- a/PARADISE_provisional_doctoral_plan.docx
+++ b/PARADISE_provisional_doctoral_plan.docx
@@ -2852,7 +2852,7 @@
         <w:t xml:space="preserve">Candidate’s contribution and joint PhD. </w:t>
       </w:r>
       <w:r>
-        <w:t>This is a joint KU Leuven–VUB doctorate in which two complementary doctoral projects run on the same trial. The present candidate leads the clinical trial: protocol development, ethics and regulatory submission, multicentre coordination, investigator training and site readiness, recruitment oversight, quality and fidelity monitoring, data management, and the analyses of ulcer recurrence, plantar pressure and footwear adherence. The parallel doctorate leads the process evaluation and the health-economic evaluation. Both researchers contribute to study conduct and outputs, with authorship aligned to responsibilities. Alongside the trial, the candidate conducts a registered scoping review, “Patient-specific offloading insole design in diabetic foot disease: a scoping review of biomechanical, clinical and health-economic evidence”. Local clinical teams deliver patient care and site-level assessments.</w:t>
+        <w:t>This is a joint KU Leuven–VUB doctorate in which two complementary doctoral projects run on the same trial. The present candidate leads the clinical trial: protocol development, ethics and regulatory submission, multicentre coordination, investigator training and site readiness, recruitment oversight, quality and fidelity monitoring, data management, and the analyses of ulcer recurrence, plantar pressure and footwear adherence. The parallel doctorate leads the process evaluation and the health-economic evaluation. Both researchers contribute to study conduct and outputs, with authorship aligned to responsibilities. Alongside the trial, the candidate conducts a registered scoping review, “Patient-specific offloading insole design in diabetic foot disease: a scoping review of biomechanical, clinical and health-economic evidence”, and a comparison of conventionally manufactured and 3D-printed custom-made foot orthoses carried out independently of the trial. Local clinical teams deliver patient care and site-level assessments.</w:t>
       </w:r>
     </w:p>
     <w:p>
@@ -3358,67 +3358,32 @@
         </w:rPr>
       </w:pPr>
       <w:r>
-        <w:rPr>
-          <w:rFonts w:ascii="Garamond" w:hAnsi="Garamond"/>
-          <w:noProof/>
-          <w:lang w:val="en-US"/>
-        </w:rPr>
         <w:drawing>
-          <wp:inline distT="0" distB="0" distL="0" distR="0" wp14:anchorId="319B8BE2" wp14:editId="517D8FF2">
-            <wp:extent cx="5648325" cy="3189463"/>
-            <wp:effectExtent l="0" t="0" r="0" b="0"/>
-            <wp:docPr id="1306014982" name="Afbeelding 19"/>
+          <wp:inline xmlns:a="http://schemas.openxmlformats.org/drawingml/2006/main" xmlns:pic="http://schemas.openxmlformats.org/drawingml/2006/picture">
+            <wp:extent cx="5652000" cy="3532500"/>
+            <wp:docPr id="1709217644" name="Picture 1709217644"/>
             <wp:cNvGraphicFramePr>
-              <a:graphicFrameLocks xmlns:a="http://schemas.openxmlformats.org/drawingml/2006/main" noChangeAspect="1"/>
+              <a:graphicFrameLocks noChangeAspect="1"/>
             </wp:cNvGraphicFramePr>
-            <a:graphic xmlns:a="http://schemas.openxmlformats.org/drawingml/2006/main">
+            <a:graphic>
               <a:graphicData uri="http://schemas.openxmlformats.org/drawingml/2006/picture">
-                <pic:pic xmlns:pic="http://schemas.openxmlformats.org/drawingml/2006/picture">
+                <pic:pic>
                   <pic:nvPicPr>
-                    <pic:cNvPr id="0" name="Picture 3"/>
-                    <pic:cNvPicPr>
-                      <a:picLocks noChangeAspect="1" noChangeArrowheads="1"/>
-                    </pic:cNvPicPr>
+                    <pic:cNvPr id="0" name="fig1_nieuw.png"/>
+                    <pic:cNvPicPr/>
                   </pic:nvPicPr>
-                  <pic:blipFill rotWithShape="1">
-                    <a:blip r:embed="rId12" cstate="print">
-                      <a:extLst>
-                        <a:ext uri="{BEBA8EAE-BF5A-486C-A8C5-ECC9F3942E4B}">
-                          <a14:imgProps xmlns:a14="http://schemas.microsoft.com/office/drawing/2010/main">
-                            <a14:imgLayer r:embed="rId13">
-                              <a14:imgEffect>
-                                <a14:saturation sat="400000"/>
-                              </a14:imgEffect>
-                            </a14:imgLayer>
-                          </a14:imgProps>
-                        </a:ext>
-                        <a:ext uri="{28A0092B-C50C-407E-A947-70E740481C1C}">
-                          <a14:useLocalDpi xmlns:a14="http://schemas.microsoft.com/office/drawing/2010/main" val="0"/>
-                        </a:ext>
-                      </a:extLst>
-                    </a:blip>
-                    <a:srcRect b="10074"/>
+                  <pic:blipFill>
+                    <a:blip r:embed="rId21"/>
                     <a:stretch>
                       <a:fillRect/>
                     </a:stretch>
                   </pic:blipFill>
-                  <pic:spPr bwMode="auto">
+                  <pic:spPr>
                     <a:xfrm>
                       <a:off x="0" y="0"/>
-                      <a:ext cx="5696204" cy="3216499"/>
+                      <a:ext cx="5652000" cy="3532500"/>
                     </a:xfrm>
-                    <a:prstGeom prst="rect">
-                      <a:avLst/>
-                    </a:prstGeom>
-                    <a:noFill/>
-                    <a:ln>
-                      <a:noFill/>
-                    </a:ln>
-                    <a:extLst>
-                      <a:ext uri="{53640926-AAD7-44D8-BBD7-CCE9431645EC}">
-                        <a14:shadowObscured xmlns:a14="http://schemas.microsoft.com/office/drawing/2010/main"/>
-                      </a:ext>
-                    </a:extLst>
+                    <a:prstGeom prst="rect"/>
                   </pic:spPr>
                 </pic:pic>
               </a:graphicData>
@@ -3484,7 +3449,7 @@
           <w:i/>
           <w:lang w:val="en-US"/>
         </w:rPr>
-        <w:t xml:space="preserve"> (WP1).</w:t>
+        <w:t>.</w:t>
       </w:r>
     </w:p>
     <w:p>
@@ -4788,52 +4753,32 @@
         </w:rPr>
       </w:pPr>
       <w:r>
-        <w:rPr>
-          <w:rFonts w:ascii="Garamond" w:hAnsi="Garamond"/>
-          <w:noProof/>
-        </w:rPr>
         <w:drawing>
-          <wp:inline distT="0" distB="0" distL="0" distR="0" wp14:anchorId="6ED026D2" wp14:editId="3F744569">
-            <wp:extent cx="6188710" cy="2425700"/>
-            <wp:effectExtent l="0" t="0" r="2540" b="0"/>
-            <wp:docPr id="1709217643" name="Afbeelding 1"/>
+          <wp:inline xmlns:a="http://schemas.openxmlformats.org/drawingml/2006/main" xmlns:pic="http://schemas.openxmlformats.org/drawingml/2006/picture">
+            <wp:extent cx="6192000" cy="3490036"/>
+            <wp:docPr id="1709217645" name="Picture 1709217645"/>
             <wp:cNvGraphicFramePr>
-              <a:graphicFrameLocks xmlns:a="http://schemas.openxmlformats.org/drawingml/2006/main" noChangeAspect="1"/>
+              <a:graphicFrameLocks noChangeAspect="1"/>
             </wp:cNvGraphicFramePr>
-            <a:graphic xmlns:a="http://schemas.openxmlformats.org/drawingml/2006/main">
+            <a:graphic>
               <a:graphicData uri="http://schemas.openxmlformats.org/drawingml/2006/picture">
-                <pic:pic xmlns:pic="http://schemas.openxmlformats.org/drawingml/2006/picture">
+                <pic:pic>
                   <pic:nvPicPr>
-                    <pic:cNvPr id="0" name="Picture 1"/>
-                    <pic:cNvPicPr>
-                      <a:picLocks noChangeAspect="1" noChangeArrowheads="1"/>
-                    </pic:cNvPicPr>
+                    <pic:cNvPr id="0" name="fig2_nieuw.png"/>
+                    <pic:cNvPicPr/>
                   </pic:nvPicPr>
                   <pic:blipFill>
-                    <a:blip r:embed="rId14">
-                      <a:extLst>
-                        <a:ext uri="{28A0092B-C50C-407E-A947-70E740481C1C}">
-                          <a14:useLocalDpi xmlns:a14="http://schemas.microsoft.com/office/drawing/2010/main" val="0"/>
-                        </a:ext>
-                      </a:extLst>
-                    </a:blip>
-                    <a:srcRect/>
+                    <a:blip r:embed="rId22"/>
                     <a:stretch>
                       <a:fillRect/>
                     </a:stretch>
                   </pic:blipFill>
-                  <pic:spPr bwMode="auto">
+                  <pic:spPr>
                     <a:xfrm>
                       <a:off x="0" y="0"/>
-                      <a:ext cx="6188710" cy="2425700"/>
+                      <a:ext cx="6192000" cy="3490036"/>
                     </a:xfrm>
-                    <a:prstGeom prst="rect">
-                      <a:avLst/>
-                    </a:prstGeom>
-                    <a:noFill/>
-                    <a:ln>
-                      <a:noFill/>
-                    </a:ln>
+                    <a:prstGeom prst="rect"/>
                   </pic:spPr>
                 </pic:pic>
               </a:graphicData>
@@ -4866,7 +4811,7 @@
           <w:i/>
           <w:lang w:val="en-US"/>
         </w:rPr>
-        <w:t>Indicative 48-month PhD timeline mapped to consortium milestones MS1–MS5</w:t>
+        <w:t>Indicative 48-month PhD timeline, with the manuscripts led by the candidate and the key milestones</w:t>
       </w:r>
     </w:p>
     <w:p>
@@ -5234,7 +5179,7 @@
           <w:rFonts w:ascii="Garamond" w:hAnsi="Garamond"/>
           <w:lang w:val="en-GB"/>
         </w:rPr>
-        <w:t>Seven manuscripts are planned. (1) The scoping review “Patient-specific offloading insole design in diabetic foot disease: a scoping review of biomechanical, clinical and health-economic evidence”, with the protocol registered before searching and reporting according to PRISMA-ScR (months 1–12). (2) The trial protocol paper, reported according to SPIRIT 2025 and TIDieR (months 1–9). (3) A method-comparison paper quantifying agreement and inter-rater reliability between the two in-shoe pressure systems used in Belgian DFCs (months 6–18). (4) Regional peak plantar-pressure reference values in people with diabetes, derived from low- and high-resolution in-shoe measurements (months 12–30). (5) Plantar-pressure redistribution achieved with custom-made foot orthoses in people with and without diabetes (months 18–36). (6) The primary effectiveness analysis of ulcer recurrence at 18 months (months 43–48). (7) The pre-specified mediation analysis of footwear adherence, including the full 18-month adherence profile (months 43–48). Trial publications will be reported according to CONSORT recommendations.</w:t>
+        <w:t>Six manuscripts are planned. (1) The scoping review “Patient-specific offloading insole design in diabetic foot disease: a scoping review of biomechanical, clinical and health-economic evidence”, with the protocol registered before searching and reporting according to PRISMA-ScR (months 1–12). (2) The trial protocol paper, reported according to SPIRIT 2025 and TIDieR (months 1–9). (3) Regional peak plantar-pressure reference values in people with diabetes, derived from low- and high-resolution in-shoe measurements (months 12–24). (4) A comparison of plantar-pressure redistribution achieved with conventionally manufactured and 3D-printed custom-made foot orthoses in people with and without diabetes; this study runs outside the PARADISE trial but informs orthosis design within the doctoral trajectory (months 18–36). (5) The primary effectiveness analysis of ulcer recurrence at 18 months (months 43–48). (6) The pre-specified mediation analysis of footwear adherence, including the full 18-month adherence profile (months 43–48). Trial publications will be reported according to CONSORT recommendations.</w:t>
       </w:r>
       <w:proofErr w:type="spellStart"/>
       <w:r>

</xml_diff>

<commit_message>
Doctoraatsplan: foutencontrole, zeven correcties
De 25%-drukreductie stond nog tegen een baseline in plaats van tegen de meting
zonder zool in dezelfde sessie. A4 claimde de gezondheidseconomische uitkomst
die bij het parallelle doctoraat ligt. De kop van sectie 5 verwees nog naar een
paragraaf die verhuisd is. De piloot stond in maanden 1-6 terwijl hij in maand 8
valt. Adherentiedrempel overal op minstens 80 procent. Toestelnamen recht:
Novel pedar en F-Scan GO. Bijschrift figuur 2 afgepunt.

Co-Authored-By: Claude Opus 5 <noreply@anthropic.com>
</commit_message>
<xml_diff>
--- a/PARADISE_provisional_doctoral_plan.docx
+++ b/PARADISE_provisional_doctoral_plan.docx
@@ -1686,7 +1686,7 @@
           <w:rFonts w:ascii="Garamond" w:hAnsi="Garamond"/>
           <w:lang w:val="en-GB"/>
         </w:rPr>
-        <w:t>Adherence remains a major barrier: objective monitoring shows that patients spend approximately 29% of their steps outside prescribed footwear, while only a minority achieve the &gt;80% weight-bearing threshold associated with improved outcomes</w:t>
+        <w:t>Adherence remains a major barrier: objective monitoring shows that patients spend approximately 29% of their steps outside prescribed footwear, while only a minority achieve the ≥80% threshold associated with improved outcomes</w:t>
       </w:r>
       <w:r>
         <w:rPr>
@@ -2831,7 +2831,7 @@
           <w:rFonts w:ascii="Garamond" w:hAnsi="Garamond"/>
           <w:lang w:val="en-GB"/>
         </w:rPr>
-        <w:t>Evaluate the broader clinical and patient-centred impact of PARADISE by assessing recurrence characteristics, ulcer-free survival, foot-care behaviour (Nottingham Assessment of Functional Footcare, NAFF), health-related quality of life (EQ-5D-5L), and health-economic outcome</w:t>
+        <w:t>Evaluate the broader clinical and patient-centred impact of PARADISE by assessing recurrence characteristics, ulcer-free survival, foot-care behaviour (Nottingham Assessment of Functional Footcare, NAFF), health-related quality of life (EQ-5D-5L), and, jointly with the parallel doctorate, health-economic outcomes</w:t>
       </w:r>
       <w:r>
         <w:rPr>
@@ -3011,7 +3011,7 @@
           <w:rFonts w:ascii="Garamond" w:hAnsi="Garamond"/>
           <w:lang w:val="en-GB"/>
         </w:rPr>
-        <w:t>Existing in-shoe plantar-pressure systems (Novel/</w:t>
+        <w:t xml:space="preserve">Existing in-shoe plantar-pressure systems (Novel </w:t>
       </w:r>
       <w:proofErr w:type="spellStart"/>
       <w:r>
@@ -3019,7 +3019,7 @@
           <w:rFonts w:ascii="Garamond" w:hAnsi="Garamond"/>
           <w:lang w:val="en-GB"/>
         </w:rPr>
-        <w:t>Pedar</w:t>
+        <w:t>pedar</w:t>
       </w:r>
       <w:proofErr w:type="spellEnd"/>
       <w:r>
@@ -3027,7 +3027,7 @@
           <w:rFonts w:ascii="Garamond" w:hAnsi="Garamond"/>
           <w:lang w:val="en-GB"/>
         </w:rPr>
-        <w:t>) identify peak plantar pressure and guide iterative orthosis optimisation towards a target peak pressure &lt;200 kPa or ≥25% reduction from baseline.</w:t>
+        <w:t>) identify peak plantar pressure and guide iterative orthosis optimisation towards a target peak pressure below 200 kPa or a reduction of at least 25% relative to the measurement without the orthosis in the same session.</w:t>
       </w:r>
       <w:r>
         <w:rPr>
@@ -3322,14 +3322,13 @@
           <w:rFonts w:ascii="Garamond" w:hAnsi="Garamond"/>
           <w:lang w:val="en-GB"/>
         </w:rPr>
-        <w:t xml:space="preserve"> will assess concordance between Novel</w:t>
-      </w:r>
-      <w:r>
-        <w:rPr>
-          <w:rFonts w:ascii="Garamond" w:hAnsi="Garamond"/>
-          <w:lang w:val="en-GB"/>
-        </w:rPr>
-        <w:t xml:space="preserve">: </w:t>
+        <w:t xml:space="preserve"> will assess concordance between the Novel </w:t>
+      </w:r>
+      <w:r>
+        <w:rPr>
+          <w:rFonts w:ascii="Garamond" w:hAnsi="Garamond"/>
+          <w:lang w:val="en-GB"/>
+        </w:rPr>
       </w:r>
       <w:proofErr w:type="spellStart"/>
       <w:r>
@@ -3337,7 +3336,7 @@
           <w:rFonts w:ascii="Garamond" w:hAnsi="Garamond"/>
           <w:lang w:val="en-GB"/>
         </w:rPr>
-        <w:t>Pedar</w:t>
+        <w:t>pedar</w:t>
       </w:r>
       <w:proofErr w:type="spellEnd"/>
       <w:r>
@@ -3345,7 +3344,7 @@
           <w:rFonts w:ascii="Garamond" w:hAnsi="Garamond"/>
           <w:lang w:val="en-GB"/>
         </w:rPr>
-        <w:t xml:space="preserve"> and F-scan GO measurements with technical partners.</w:t>
+        <w:t xml:space="preserve"> and F-Scan GO systems, with technical partners.</w:t>
       </w:r>
     </w:p>
     <w:p>
@@ -4663,7 +4662,7 @@
           <w:rFonts w:ascii="Garamond" w:hAnsi="Garamond"/>
           <w:lang w:val="en-GB"/>
         </w:rPr>
-        <w:t>During months 1–6, the candidate will finalise the trial protocol, clinical assessment booklet, electronic case-report forms, and ethics and regulatory submissions in accordance with SPIRIT recommendations for randomised trial protocols</w:t>
+        <w:t>During months 1–8, the candidate will finalise the trial protocol, clinical assessment booklet, electronic case-report forms, and ethics and regulatory submissions in accordance with SPIRIT recommendations for randomised trial protocols</w:t>
       </w:r>
       <w:r>
         <w:rPr>
@@ -4706,7 +4705,7 @@
           <w:rFonts w:ascii="Garamond" w:hAnsi="Garamond"/>
           <w:lang w:val="en-US"/>
         </w:rPr>
-        <w:t>; a final operational pilot will verify workflow feasibility and data capture before trial initiation.</w:t>
+        <w:t>; a final operational pilot in month 8 will verify workflow feasibility and data capture before trial initiation.</w:t>
       </w:r>
     </w:p>
     <w:p>
@@ -4723,7 +4722,7 @@
           <w:rFonts w:ascii="Garamond" w:hAnsi="Garamond"/>
           <w:lang w:val="en-GB"/>
         </w:rPr>
-        <w:t>Between months 6–24, recruitment and randomisation of 144 participants will proceed across six participating DFCs. Intervention delivery and follow-up will continue until month 42, with quality control and intervention-fidelity monitoring throughout.</w:t>
+        <w:t>Between months 8 and 24, recruitment and randomisation of 144 participants will proceed across six participating DFCs. Intervention delivery and follow-up will continue until month 42, with quality control and intervention-fidelity monitoring throughout.</w:t>
       </w:r>
     </w:p>
     <w:p>
@@ -4811,7 +4810,7 @@
           <w:i/>
           <w:lang w:val="en-US"/>
         </w:rPr>
-        <w:t>Indicative 48-month PhD timeline, with the manuscripts led by the candidate and the key milestones</w:t>
+        <w:t>Indicative 48-month PhD timeline, with the manuscripts led by the candidate and the key milestones.</w:t>
       </w:r>
     </w:p>
     <w:p>
@@ -5131,7 +5130,7 @@
           <w:szCs w:val="28"/>
           <w:lang w:val="en-US"/>
         </w:rPr>
-        <w:t>: deliverables, related PhDs and pre-existing data</w:t>
+        <w:t>: deliverables, planned outputs and pre-existing data</w:t>
       </w:r>
     </w:p>
     <w:p>

</xml_diff>

<commit_message>
Doctoraatsplan terug op vijf pagina s, referenties inbegrepen
Beide figuren compacter getekend en kleiner geplaatst, de drie tijdlijnalinea s
samengevoegd omdat ze figuur 2 herhaalden, de dubbele zin over de twee armen
geschrapt, de outputlijst ingekort met de timing in de figuur, en de afstand
tussen de referenties op nul.

Co-Authored-By: Claude Opus 5 <noreply@anthropic.com>
</commit_message>
<xml_diff>
--- a/PARADISE_provisional_doctoral_plan.docx
+++ b/PARADISE_provisional_doctoral_plan.docx
@@ -2528,7 +2528,7 @@
           <w:rFonts w:ascii="Garamond" w:hAnsi="Garamond"/>
           <w:lang w:val="en-GB"/>
         </w:rPr>
-        <w:t>Building on evidence for pressure-guided footwear optimisation, adherence monitoring, and behavioural interventions, PARADISE extends this approach through personalised behavioural feedback, prolonged follow-up, and integration into routine Belgian multidisciplinary care. This doctoral project will evaluate the clinical effectiveness of PARADISE within Belgian DFCs, generating evidence for sustainable integration of personalised diabetic-foot prevention into routine practice.</w:t>
+        <w:t>Building on evidence for pressure-guided footwear optimisation, adherence monitoring, and behavioural interventions, PARADISE extends this approach through personalised behavioural feedback, prolonged follow-up, and integration into routine Belgian multidisciplinary care. This doctoral project will evaluate the clinical effectiveness of PARADISE within Belgian DFCs.</w:t>
       </w:r>
     </w:p>
     <w:p>
@@ -2852,7 +2852,7 @@
         <w:t xml:space="preserve">Candidate’s contribution and joint PhD. </w:t>
       </w:r>
       <w:r>
-        <w:t>This is a joint KU Leuven–VUB doctorate in which two complementary doctoral projects run on the same trial. The present candidate leads the clinical trial: protocol development, ethics and regulatory submission, multicentre coordination, investigator training and site readiness, recruitment oversight, quality and fidelity monitoring, data management, and the analyses of ulcer recurrence, plantar pressure and footwear adherence. The parallel doctorate leads the process evaluation and the health-economic evaluation. Both researchers contribute to study conduct and outputs, with authorship aligned to responsibilities. Alongside the trial, the candidate conducts a registered scoping review, “Patient-specific offloading insole design in diabetic foot disease: a scoping review of biomechanical, clinical and health-economic evidence”, and a comparison of conventionally manufactured and 3D-printed custom-made foot orthoses carried out independently of the trial. Local clinical teams deliver patient care and site-level assessments.</w:t>
+        <w:t>This is a joint KU Leuven–VUB doctorate in which two complementary doctoral projects run on the same trial. The present candidate leads the clinical trial: protocol development, ethics and regulatory submission, multicentre coordination, investigator training and site readiness, recruitment oversight, quality and fidelity monitoring, data management, and the analyses of ulcer recurrence, plantar pressure and footwear adherence. The parallel doctorate leads the process evaluation and the health-economic evaluation. Both researchers contribute to study conduct and outputs, with authorship aligned to responsibilities. Alongside the trial, the candidate conducts a registered scoping review on patient-specific offloading insole design, and a comparison of conventionally manufactured and 3D-printed custom-made foot orthoses carried out independently of the trial. Local clinical teams deliver patient care and site-level assessments.</w:t>
       </w:r>
     </w:p>
     <w:p>
@@ -2932,9 +2932,17 @@
       <w:r>
         <w:rPr>
           <w:rFonts w:ascii="Garamond" w:hAnsi="Garamond"/>
-          <w:lang w:val="en-GB"/>
-        </w:rPr>
-        <w:t>Participants will be allocated to Usual Care, representing current Belgian diabetic-foot care, or Optimal Care, comprising Usual Care supplemented with PARADISE.</w:t>
+          <w:b/>
+          <w:lang w:val="en-US"/>
+        </w:rPr>
+        <w:t xml:space="preserve">Interventions. </w:t>
+      </w:r>
+      <w:r>
+        <w:rPr>
+          <w:rFonts w:ascii="Garamond" w:hAnsi="Garamond"/>
+          <w:lang w:val="en-GB"/>
+        </w:rPr>
+        <w:t>PARADISE integrates three evidence-based components addressing the main determinants of diabetic foot-ulcer recurrence: biomechanical risk, footwear adherence, and adequate foot care.</w:t>
       </w:r>
     </w:p>
     <w:p>
@@ -2943,7 +2951,8 @@
         <w:jc w:val="both"/>
         <w:rPr>
           <w:rFonts w:ascii="Garamond" w:hAnsi="Garamond"/>
-          <w:lang w:val="en-GB"/>
+          <w:vertAlign w:val="superscript"/>
+          <w:lang w:val="en-US"/>
         </w:rPr>
       </w:pPr>
       <w:r>
@@ -2952,14 +2961,128 @@
           <w:b/>
           <w:lang w:val="en-US"/>
         </w:rPr>
-        <w:t xml:space="preserve">Interventions. </w:t>
-      </w:r>
-      <w:r>
-        <w:rPr>
-          <w:rFonts w:ascii="Garamond" w:hAnsi="Garamond"/>
-          <w:lang w:val="en-GB"/>
-        </w:rPr>
-        <w:t>PARADISE integrates three evidence-based components addressing the main determinants of diabetic foot-ulcer recurrence: biomechanical risk, footwear adherence, and adequate foot care.</w:t>
+        <w:t xml:space="preserve">(1) </w:t>
+      </w:r>
+      <w:r>
+        <w:rPr>
+          <w:rFonts w:ascii="Garamond" w:hAnsi="Garamond"/>
+          <w:b/>
+          <w:lang w:val="en-US"/>
+        </w:rPr>
+        <w:t xml:space="preserve">Pressure-driven orthosis </w:t>
+      </w:r>
+      <w:proofErr w:type="spellStart"/>
+      <w:r>
+        <w:rPr>
+          <w:rFonts w:ascii="Garamond" w:hAnsi="Garamond"/>
+          <w:b/>
+          <w:lang w:val="en-US"/>
+        </w:rPr>
+        <w:t>optimisation</w:t>
+      </w:r>
+      <w:proofErr w:type="spellEnd"/>
+      <w:r>
+        <w:rPr>
+          <w:rFonts w:ascii="Garamond" w:hAnsi="Garamond"/>
+          <w:b/>
+          <w:lang w:val="en-US"/>
+        </w:rPr>
+        <w:t xml:space="preserve">. </w:t>
+      </w:r>
+      <w:r>
+        <w:rPr>
+          <w:rFonts w:ascii="Garamond" w:hAnsi="Garamond"/>
+          <w:lang w:val="en-GB"/>
+        </w:rPr>
+        <w:t xml:space="preserve">Existing in-shoe plantar-pressure systems (Novel </w:t>
+      </w:r>
+      <w:proofErr w:type="spellStart"/>
+      <w:r>
+        <w:rPr>
+          <w:rFonts w:ascii="Garamond" w:hAnsi="Garamond"/>
+          <w:lang w:val="en-GB"/>
+        </w:rPr>
+        <w:t>pedar</w:t>
+      </w:r>
+      <w:proofErr w:type="spellEnd"/>
+      <w:r>
+        <w:rPr>
+          <w:rFonts w:ascii="Garamond" w:hAnsi="Garamond"/>
+          <w:lang w:val="en-GB"/>
+        </w:rPr>
+        <w:t>) identify peak plantar pressure and guide iterative orthosis optimisation towards a target peak pressure below 200 kPa or a reduction of at least 25% relative to the measurement without the orthosis in the same session.</w:t>
+      </w:r>
+      <w:r>
+        <w:rPr>
+          <w:rFonts w:ascii="Garamond" w:hAnsi="Garamond"/>
+          <w:vertAlign w:val="superscript"/>
+          <w:lang w:val="en-US"/>
+        </w:rPr>
+        <w:fldChar w:fldCharType="begin"/>
+      </w:r>
+      <w:r>
+        <w:rPr>
+          <w:rFonts w:ascii="Garamond" w:hAnsi="Garamond"/>
+          <w:vertAlign w:val="superscript"/>
+          <w:lang w:val="en-US"/>
+        </w:rPr>
+        <w:instrText xml:space="preserve"> ADDIN ZOTERO_ITEM CSL_CITATION {"citationID":"zvZSRODa","properties":{"unsorted":false,"formattedCitation":"\\super 5\\nosupersub{}","plainCitation":"5","noteIndex":0},"citationItems":[{"id":48,"uris":["http://zotero.org/users/19619518/items/HQRWT4X4"],"itemData":{"id":48,"type":"article-journal","abstract":"OBJECTIVE\n              Custom-made footwear is the treatment of choice to prevent foot ulcer recurrence in diabetes. This footwear primarily aims to offload plantar regions at high ulcer risk. However, ulcer recurrence rates are high. We assessed the effect of offloading-improved custom-made footwear and the role of footwear adherence on plantar foot ulcer recurrence.\n            \n            \n              RESEARCH DESIGN AND METHODS\n              We randomly assigned 171 neuropathic diabetic patients with a recently healed plantar foot ulcer to custom-made footwear with improved and subsequently preserved offloading (</w:instrText>
+      </w:r>
+      <w:r>
+        <w:rPr>
+          <w:rFonts w:ascii="Cambria Math" w:hAnsi="Cambria Math" w:cs="Cambria Math"/>
+          <w:vertAlign w:val="superscript"/>
+          <w:lang w:val="en-US"/>
+        </w:rPr>
+        <w:instrText>∼</w:instrText>
+      </w:r>
+      <w:r>
+        <w:rPr>
+          <w:rFonts w:ascii="Garamond" w:hAnsi="Garamond"/>
+          <w:vertAlign w:val="superscript"/>
+          <w:lang w:val="en-US"/>
+        </w:rPr>
+        <w:instrText xml:space="preserve">20% peak pressure relief by modifying the footwear) or to usual care (i.e., nonimproved custom-made footwear). Primary outcome was plantar foot ulcer recurrence in 18 months. Secondary outcome was ulcer recurrence in patients with an objectively measured adherence of </w:instrText>
+      </w:r>
+      <w:r>
+        <w:rPr>
+          <w:rFonts w:ascii="Garamond" w:hAnsi="Garamond" w:cs="Garamond"/>
+          <w:vertAlign w:val="superscript"/>
+          <w:lang w:val="en-US"/>
+        </w:rPr>
+        <w:instrText>≥</w:instrText>
+      </w:r>
+      <w:r>
+        <w:rPr>
+          <w:rFonts w:ascii="Garamond" w:hAnsi="Garamond"/>
+          <w:vertAlign w:val="superscript"/>
+          <w:lang w:val="en-US"/>
+        </w:rPr>
+        <w:instrText xml:space="preserve">80% of steps taken.\n            \n            \n              RESULTS\n              On the basis of intention-to-treat, 33 of 85 patients (38.8%) with improved footwear and 38 of 86 patients (44.2%) with usual care had a recurrent ulcer (relative risk −11%, odds ratio 0.80 [95% CI 0.44–1.47], P = 0.48). Ulcer-free survival curves were not significantly different between groups (P = 0.40). In the 79 patients (46% of total group) with high adherence, 9 of 35 (25.7%) with improved footwear and 21 of 44 (47.8%) with usual care had a recurrent ulcer (relative risk −46%, odds ratio 0.38 [0.15–0.99], P = 0.045).\n            \n            \n              CONCLUSIONS\n              Offloading-improved custom-made footwear does not significantly reduce the incidence of plantar foot ulcer recurrence in diabetes compared with custom-made footwear that does not undergo such improvement, unless it is worn as recommended.","container-title":"Diabetes Care","DOI":"10.2337/dc13-0996","ISSN":"0149-5992, 1935-5548","issue":"12","language":"en","page":"4109-4116","source":"DOI.org (Crossref)","title":"Effect of Custom-Made Footwear on Foot Ulcer Recurrence in Diabetes","volume":"36","author":[{"family":"Bus","given":"Sicco A."},{"family":"Waaijman","given":"Roelof"},{"family":"Arts","given":"Mark"},{"family":"De Haart","given":"Mirjam"},{"family":"Busch-Westbroek","given":"Tessa"},{"family":"Van Baal","given":"Jeff"},{"family":"Nollet","given":"Frans"}],"issued":{"date-parts":[["2013",12,1]]}}}],"schema":"https://github.com/citation-style-language/schema/raw/master/csl-citation.json"} </w:instrText>
+      </w:r>
+      <w:r>
+        <w:rPr>
+          <w:rFonts w:ascii="Garamond" w:hAnsi="Garamond"/>
+          <w:vertAlign w:val="superscript"/>
+          <w:lang w:val="en-US"/>
+        </w:rPr>
+        <w:fldChar w:fldCharType="separate"/>
+      </w:r>
+      <w:r>
+        <w:rPr>
+          <w:rFonts w:ascii="Garamond" w:hAnsi="Garamond"/>
+          <w:vertAlign w:val="superscript"/>
+          <w:lang w:val="en-GB"/>
+        </w:rPr>
+        <w:t>5</w:t>
+      </w:r>
+      <w:r>
+        <w:rPr>
+          <w:rFonts w:ascii="Garamond" w:hAnsi="Garamond"/>
+          <w:vertAlign w:val="superscript"/>
+          <w:lang w:val="en-US"/>
+        </w:rPr>
+        <w:fldChar w:fldCharType="end"/>
       </w:r>
     </w:p>
     <w:p>
@@ -2978,125 +3101,71 @@
           <w:b/>
           <w:lang w:val="en-US"/>
         </w:rPr>
-        <w:t xml:space="preserve">(1) </w:t>
-      </w:r>
-      <w:r>
-        <w:rPr>
-          <w:rFonts w:ascii="Garamond" w:hAnsi="Garamond"/>
-          <w:b/>
-          <w:lang w:val="en-US"/>
-        </w:rPr>
-        <w:t xml:space="preserve">Pressure-driven orthosis </w:t>
+        <w:lastRenderedPageBreak/>
+        <w:t xml:space="preserve">(2) Objective footwear-adherence monitoring. </w:t>
+      </w:r>
+      <w:r>
+        <w:rPr>
+          <w:rFonts w:ascii="Garamond" w:hAnsi="Garamond"/>
+          <w:lang w:val="en-GB"/>
+        </w:rPr>
+        <w:t xml:space="preserve">Sensor-based technologies (Orthotimer and </w:t>
       </w:r>
       <w:proofErr w:type="spellStart"/>
       <w:r>
         <w:rPr>
           <w:rFonts w:ascii="Garamond" w:hAnsi="Garamond"/>
-          <w:b/>
-          <w:lang w:val="en-US"/>
-        </w:rPr>
-        <w:t>optimisation</w:t>
+          <w:lang w:val="en-GB"/>
+        </w:rPr>
+        <w:t>MoveMonitor</w:t>
       </w:r>
       <w:proofErr w:type="spellEnd"/>
       <w:r>
         <w:rPr>
           <w:rFonts w:ascii="Garamond" w:hAnsi="Garamond"/>
-          <w:b/>
-          <w:lang w:val="en-US"/>
-        </w:rPr>
-        <w:t xml:space="preserve">. </w:t>
-      </w:r>
-      <w:r>
-        <w:rPr>
-          <w:rFonts w:ascii="Garamond" w:hAnsi="Garamond"/>
-          <w:lang w:val="en-GB"/>
-        </w:rPr>
-        <w:t xml:space="preserve">Existing in-shoe plantar-pressure systems (Novel </w:t>
-      </w:r>
-      <w:proofErr w:type="spellStart"/>
-      <w:r>
-        <w:rPr>
-          <w:rFonts w:ascii="Garamond" w:hAnsi="Garamond"/>
-          <w:lang w:val="en-GB"/>
-        </w:rPr>
-        <w:t>pedar</w:t>
-      </w:r>
-      <w:proofErr w:type="spellEnd"/>
-      <w:r>
-        <w:rPr>
-          <w:rFonts w:ascii="Garamond" w:hAnsi="Garamond"/>
-          <w:lang w:val="en-GB"/>
-        </w:rPr>
-        <w:t>) identify peak plantar pressure and guide iterative orthosis optimisation towards a target peak pressure below 200 kPa or a reduction of at least 25% relative to the measurement without the orthosis in the same session.</w:t>
+          <w:lang w:val="en-GB"/>
+        </w:rPr>
+        <w:t>) quantify footwear wearing time and contextualise adherence against daily activity exposure, addressing the limitations of self-reported footwear use</w:t>
+      </w:r>
+      <w:r>
+        <w:rPr>
+          <w:rFonts w:ascii="Garamond" w:hAnsi="Garamond"/>
+          <w:lang w:val="en-US"/>
+        </w:rPr>
+        <w:t>.</w:t>
+      </w:r>
+      <w:r>
+        <w:rPr>
+          <w:rFonts w:ascii="Garamond" w:hAnsi="Garamond"/>
+          <w:lang w:val="en-US"/>
+        </w:rPr>
+        <w:fldChar w:fldCharType="begin"/>
+      </w:r>
+      <w:r>
+        <w:rPr>
+          <w:rFonts w:ascii="Garamond" w:hAnsi="Garamond"/>
+          <w:lang w:val="en-US"/>
+        </w:rPr>
+        <w:instrText xml:space="preserve"> ADDIN ZOTERO_ITEM CSL_CITATION {"citationID":"5H9hUGmg","properties":{"unsorted":false,"formattedCitation":"\\super 6,12,13\\nosupersub{}","plainCitation":"6,12,13","noteIndex":0},"citationItems":[{"id":16,"uris":["http://zotero.org/users/19619518/items/PZIVAKCP"],"itemData":{"id":16,"type":"article-journal","abstract":"OBJECTIVE\n              Prescription custom-made footwear can only be effective in preventing diabetic foot ulcers if worn by the patient. Particularly, the high prevalence of recurrent foot ulcers focuses the attention on adherence, for which objective data are nonexisting. We objectively assessed adherence in patients with high risk of ulcer recurrence and evaluated what determines adherence.\n            \n            \n              RESEARCH DESIGN AND METHODS\n              In 107 patients with diabetes, neuropathy, a recently healed plantar foot ulcer, and custom-made footwear, footwear use was measured during 7 consecutive days using a shoe-worn, temperature-based monitor. Daily step count was measured simultaneously using an ankle-worn activity monitor. Patients logged time away from home. Adherence was calculated as the percentage of steps that prescription footwear was worn. Determinants of adherence were evaluated in multivariate linear regression analysis.\n            \n            \n              RESULTS\n              Mean ± SD adherence was 71 ± 25%. Adherence at home was 61 ± 32%, over 3,959 ± 2,594 steps, and away from home 87 ± 26%, over 2,604 ± 2,507 steps. In 35 patients with low adherence (&amp;lt;60%), adherence at home was 28 ± 24%. Lower BMI, more severe foot deformity, and more appealing footwear were significantly associated with higher adherence.\n            \n            \n              CONCLUSIONS\n              The results show that adherence to wearing custom-made footwear is insufficient, particularly at home where patients exhibit their largest walking activity. This low adherence is a major threat for reulceration. These objective findings provide directions for improvement in adherence, which could include prescribing specific off-loading footwear for indoors, and they set a reference for future comparative research on footwear adherence in diabetes.","container-title":"Diabetes Care","DOI":"10.2337/dc12-1330","ISSN":"0149-5992, 1935-5548","issue":"6","language":"en","page":"1613-1618","source":"DOI.org (Crossref)","title":"Adherence to Wearing Prescription Custom-Made Footwear in Patients With Diabetes at High Risk for Plantar Foot Ulceration","volume":"36","author":[{"family":"Waaijman","given":"Roelof"},{"family":"Keukenkamp","given":"Renske"},{"family":"De Haart","given":"Mirjam"},{"family":"Polomski","given":"Wojtek P."},{"family":"Nollet","given":"Frans"},{"family":"Bus","given":"Sicco A."}],"issued":{"date-parts":[["2013",6,1]]}}},{"id":42,"uris":["http://zotero.org/users/19619518/items/D8ULXF23"],"itemData":{"id":42,"type":"article-journal","abstract":"Therapeutic footwear (TF) has been demonstrated to decrease the rate of recurrence in patients in remission. TF adherence determines the real effect of such treatment and, therefore, an appropriate evaluation of TF adherence is critical to decrease recurrence. The aim of this systematic review was to determine the usability of different methods of assessing adherence to TF in patients with diabetic foot ulcers under remission. The search strategy retrieved 506 articles. Title and abstract review excluded 472, while the full-text review excluded an additional 18 articles because the included data did not meet the selection criteria. Finally, we included 16 articles in this systematic review. Six (37.5%) of the 16 studies combined objective (OM) and subjective methods (SM). Only five (31.25%) evaluated OM and six (37.5%) studies only evaluated SM. Objective methods (temperature sensor, activity monitor) and subjective methods (survey, questionnaire) have successfully been used in the literature to evaluate TF adherence. Objective methods provided accurate data, whereas subjective methods led to response bias or missing data. Methods of evaluation showed that patients use the TF more frequently outdoors and on weekdays than indoors or on the weekend. In conclusion, objective methods are the most usable way to measure adherence to TF.","container-title":"The International Journal of Lower Extremity Wounds","DOI":"10.1177/15347346231190680","ISSN":"1534-7346, 1552-6941","issue":"1","journalAbbreviation":"The International Journal of Lower Extremity Wounds","language":"en","page":"55-64","source":"DOI.org (Crossref)","title":"Usability of Different Methods to Assess and Improve Adherence to Therapeutic Footwear in Persons with the Diabetic Foot in Remission. A Systematic Review","volume":"25","author":[{"family":"López-Moral","given":"Mateo"},{"family":"Molines-Barroso","given":"Raúl J."},{"family":"Herrera-Casamayor","given":"María"},{"family":"García-Madrid","given":"Marta"},{"family":"García-Morales","given":"Esther"},{"family":"Lázaro-Martínez","given":"José Luis"}],"issued":{"date-parts":[["2026",3]]}}},{"id":43,"uris":["http://zotero.org/users/19619518/items/FWKZCSUG"],"itemData":{"id":43,"type":"article-journal","container-title":"Journal of Rehabilitation Medicine","DOI":"10.2340/16501977-2759","ISSN":"1651-2081","issue":"11","journalAbbreviation":"J Rehabil Med","language":"en","page":"jrm00127","source":"DOI.org (Crossref)","title":"Effect of awareness of being monitored on wearing of orthopaedic footwear","volume":"52","author":[{"family":"Lutjeboer","given":"T"},{"family":"Netten","given":"J"},{"family":"Postema","given":"K"},{"family":"Hijmans","given":"J"}],"issued":{"date-parts":[["2020"]]}}}],"schema":"https://github.com/citation-style-language/schema/raw/master/csl-citation.json"} </w:instrText>
+      </w:r>
+      <w:r>
+        <w:rPr>
+          <w:rFonts w:ascii="Garamond" w:hAnsi="Garamond"/>
+          <w:lang w:val="en-US"/>
+        </w:rPr>
+        <w:fldChar w:fldCharType="separate"/>
       </w:r>
       <w:r>
         <w:rPr>
           <w:rFonts w:ascii="Garamond" w:hAnsi="Garamond"/>
           <w:vertAlign w:val="superscript"/>
-          <w:lang w:val="en-US"/>
-        </w:rPr>
-        <w:fldChar w:fldCharType="begin"/>
-      </w:r>
-      <w:r>
-        <w:rPr>
-          <w:rFonts w:ascii="Garamond" w:hAnsi="Garamond"/>
-          <w:vertAlign w:val="superscript"/>
-          <w:lang w:val="en-US"/>
-        </w:rPr>
-        <w:instrText xml:space="preserve"> ADDIN ZOTERO_ITEM CSL_CITATION {"citationID":"zvZSRODa","properties":{"unsorted":false,"formattedCitation":"\\super 5\\nosupersub{}","plainCitation":"5","noteIndex":0},"citationItems":[{"id":48,"uris":["http://zotero.org/users/19619518/items/HQRWT4X4"],"itemData":{"id":48,"type":"article-journal","abstract":"OBJECTIVE\n              Custom-made footwear is the treatment of choice to prevent foot ulcer recurrence in diabetes. This footwear primarily aims to offload plantar regions at high ulcer risk. However, ulcer recurrence rates are high. We assessed the effect of offloading-improved custom-made footwear and the role of footwear adherence on plantar foot ulcer recurrence.\n            \n            \n              RESEARCH DESIGN AND METHODS\n              We randomly assigned 171 neuropathic diabetic patients with a recently healed plantar foot ulcer to custom-made footwear with improved and subsequently preserved offloading (</w:instrText>
-      </w:r>
-      <w:r>
-        <w:rPr>
-          <w:rFonts w:ascii="Cambria Math" w:hAnsi="Cambria Math" w:cs="Cambria Math"/>
-          <w:vertAlign w:val="superscript"/>
-          <w:lang w:val="en-US"/>
-        </w:rPr>
-        <w:instrText>∼</w:instrText>
-      </w:r>
-      <w:r>
-        <w:rPr>
-          <w:rFonts w:ascii="Garamond" w:hAnsi="Garamond"/>
-          <w:vertAlign w:val="superscript"/>
-          <w:lang w:val="en-US"/>
-        </w:rPr>
-        <w:instrText xml:space="preserve">20% peak pressure relief by modifying the footwear) or to usual care (i.e., nonimproved custom-made footwear). Primary outcome was plantar foot ulcer recurrence in 18 months. Secondary outcome was ulcer recurrence in patients with an objectively measured adherence of </w:instrText>
-      </w:r>
-      <w:r>
-        <w:rPr>
-          <w:rFonts w:ascii="Garamond" w:hAnsi="Garamond" w:cs="Garamond"/>
-          <w:vertAlign w:val="superscript"/>
-          <w:lang w:val="en-US"/>
-        </w:rPr>
-        <w:instrText>≥</w:instrText>
-      </w:r>
-      <w:r>
-        <w:rPr>
-          <w:rFonts w:ascii="Garamond" w:hAnsi="Garamond"/>
-          <w:vertAlign w:val="superscript"/>
-          <w:lang w:val="en-US"/>
-        </w:rPr>
-        <w:instrText xml:space="preserve">80% of steps taken.\n            \n            \n              RESULTS\n              On the basis of intention-to-treat, 33 of 85 patients (38.8%) with improved footwear and 38 of 86 patients (44.2%) with usual care had a recurrent ulcer (relative risk −11%, odds ratio 0.80 [95% CI 0.44–1.47], P = 0.48). Ulcer-free survival curves were not significantly different between groups (P = 0.40). In the 79 patients (46% of total group) with high adherence, 9 of 35 (25.7%) with improved footwear and 21 of 44 (47.8%) with usual care had a recurrent ulcer (relative risk −46%, odds ratio 0.38 [0.15–0.99], P = 0.045).\n            \n            \n              CONCLUSIONS\n              Offloading-improved custom-made footwear does not significantly reduce the incidence of plantar foot ulcer recurrence in diabetes compared with custom-made footwear that does not undergo such improvement, unless it is worn as recommended.","container-title":"Diabetes Care","DOI":"10.2337/dc13-0996","ISSN":"0149-5992, 1935-5548","issue":"12","language":"en","page":"4109-4116","source":"DOI.org (Crossref)","title":"Effect of Custom-Made Footwear on Foot Ulcer Recurrence in Diabetes","volume":"36","author":[{"family":"Bus","given":"Sicco A."},{"family":"Waaijman","given":"Roelof"},{"family":"Arts","given":"Mark"},{"family":"De Haart","given":"Mirjam"},{"family":"Busch-Westbroek","given":"Tessa"},{"family":"Van Baal","given":"Jeff"},{"family":"Nollet","given":"Frans"}],"issued":{"date-parts":[["2013",12,1]]}}}],"schema":"https://github.com/citation-style-language/schema/raw/master/csl-citation.json"} </w:instrText>
-      </w:r>
-      <w:r>
-        <w:rPr>
-          <w:rFonts w:ascii="Garamond" w:hAnsi="Garamond"/>
-          <w:vertAlign w:val="superscript"/>
-          <w:lang w:val="en-US"/>
-        </w:rPr>
-        <w:fldChar w:fldCharType="separate"/>
-      </w:r>
-      <w:r>
-        <w:rPr>
-          <w:rFonts w:ascii="Garamond" w:hAnsi="Garamond"/>
-          <w:vertAlign w:val="superscript"/>
-          <w:lang w:val="en-GB"/>
-        </w:rPr>
-        <w:t>5</w:t>
-      </w:r>
-      <w:r>
-        <w:rPr>
-          <w:rFonts w:ascii="Garamond" w:hAnsi="Garamond"/>
-          <w:vertAlign w:val="superscript"/>
+          <w:lang w:val="en-GB"/>
+        </w:rPr>
+        <w:t>6,12,13</w:t>
+      </w:r>
+      <w:r>
+        <w:rPr>
+          <w:rFonts w:ascii="Garamond" w:hAnsi="Garamond"/>
           <w:lang w:val="en-US"/>
         </w:rPr>
         <w:fldChar w:fldCharType="end"/>
@@ -3118,31 +3187,30 @@
           <w:b/>
           <w:lang w:val="en-US"/>
         </w:rPr>
-        <w:lastRenderedPageBreak/>
-        <w:t xml:space="preserve">(2) Objective footwear-adherence monitoring. </w:t>
-      </w:r>
-      <w:r>
-        <w:rPr>
-          <w:rFonts w:ascii="Garamond" w:hAnsi="Garamond"/>
-          <w:lang w:val="en-GB"/>
-        </w:rPr>
-        <w:t xml:space="preserve">Sensor-based technologies (Orthotimer and </w:t>
+        <w:t xml:space="preserve">(3) Structured education and behavioural support. </w:t>
       </w:r>
       <w:proofErr w:type="spellStart"/>
       <w:r>
         <w:rPr>
           <w:rFonts w:ascii="Garamond" w:hAnsi="Garamond"/>
-          <w:lang w:val="en-GB"/>
-        </w:rPr>
-        <w:t>MoveMonitor</w:t>
+          <w:b/>
+          <w:lang w:val="en-US"/>
+        </w:rPr>
       </w:r>
       <w:proofErr w:type="spellEnd"/>
       <w:r>
         <w:rPr>
           <w:rFonts w:ascii="Garamond" w:hAnsi="Garamond"/>
-          <w:lang w:val="en-GB"/>
-        </w:rPr>
-        <w:t>) quantify footwear wearing time and contextualise adherence against daily activity exposure, addressing the limitations of self-reported footwear use</w:t>
+          <w:b/>
+          <w:lang w:val="en-US"/>
+        </w:rPr>
+      </w:r>
+      <w:r>
+        <w:rPr>
+          <w:rFonts w:ascii="Garamond" w:hAnsi="Garamond"/>
+          <w:lang w:val="en-GB"/>
+        </w:rPr>
+        <w:t>Education covers adequate daily foot care and the rationale for wearing the prescribed orthoses and footwear. Behavioural support, delivered through SEBIA, draws on motivational interviewing, solution-focused brief therapy and behaviour change wheel principles, among other evidence-based behavioural change methods, to identify and address individual barriers to adherence</w:t>
       </w:r>
       <w:r>
         <w:rPr>
@@ -3154,6 +3222,7 @@
       <w:r>
         <w:rPr>
           <w:rFonts w:ascii="Garamond" w:hAnsi="Garamond"/>
+          <w:vertAlign w:val="superscript"/>
           <w:lang w:val="en-US"/>
         </w:rPr>
         <w:fldChar w:fldCharType="begin"/>
@@ -3161,13 +3230,30 @@
       <w:r>
         <w:rPr>
           <w:rFonts w:ascii="Garamond" w:hAnsi="Garamond"/>
-          <w:lang w:val="en-US"/>
-        </w:rPr>
-        <w:instrText xml:space="preserve"> ADDIN ZOTERO_ITEM CSL_CITATION {"citationID":"5H9hUGmg","properties":{"unsorted":false,"formattedCitation":"\\super 6,12,13\\nosupersub{}","plainCitation":"6,12,13","noteIndex":0},"citationItems":[{"id":16,"uris":["http://zotero.org/users/19619518/items/PZIVAKCP"],"itemData":{"id":16,"type":"article-journal","abstract":"OBJECTIVE\n              Prescription custom-made footwear can only be effective in preventing diabetic foot ulcers if worn by the patient. Particularly, the high prevalence of recurrent foot ulcers focuses the attention on adherence, for which objective data are nonexisting. We objectively assessed adherence in patients with high risk of ulcer recurrence and evaluated what determines adherence.\n            \n            \n              RESEARCH DESIGN AND METHODS\n              In 107 patients with diabetes, neuropathy, a recently healed plantar foot ulcer, and custom-made footwear, footwear use was measured during 7 consecutive days using a shoe-worn, temperature-based monitor. Daily step count was measured simultaneously using an ankle-worn activity monitor. Patients logged time away from home. Adherence was calculated as the percentage of steps that prescription footwear was worn. Determinants of adherence were evaluated in multivariate linear regression analysis.\n            \n            \n              RESULTS\n              Mean ± SD adherence was 71 ± 25%. Adherence at home was 61 ± 32%, over 3,959 ± 2,594 steps, and away from home 87 ± 26%, over 2,604 ± 2,507 steps. In 35 patients with low adherence (&amp;lt;60%), adherence at home was 28 ± 24%. Lower BMI, more severe foot deformity, and more appealing footwear were significantly associated with higher adherence.\n            \n            \n              CONCLUSIONS\n              The results show that adherence to wearing custom-made footwear is insufficient, particularly at home where patients exhibit their largest walking activity. This low adherence is a major threat for reulceration. These objective findings provide directions for improvement in adherence, which could include prescribing specific off-loading footwear for indoors, and they set a reference for future comparative research on footwear adherence in diabetes.","container-title":"Diabetes Care","DOI":"10.2337/dc12-1330","ISSN":"0149-5992, 1935-5548","issue":"6","language":"en","page":"1613-1618","source":"DOI.org (Crossref)","title":"Adherence to Wearing Prescription Custom-Made Footwear in Patients With Diabetes at High Risk for Plantar Foot Ulceration","volume":"36","author":[{"family":"Waaijman","given":"Roelof"},{"family":"Keukenkamp","given":"Renske"},{"family":"De Haart","given":"Mirjam"},{"family":"Polomski","given":"Wojtek P."},{"family":"Nollet","given":"Frans"},{"family":"Bus","given":"Sicco A."}],"issued":{"date-parts":[["2013",6,1]]}}},{"id":42,"uris":["http://zotero.org/users/19619518/items/D8ULXF23"],"itemData":{"id":42,"type":"article-journal","abstract":"Therapeutic footwear (TF) has been demonstrated to decrease the rate of recurrence in patients in remission. TF adherence determines the real effect of such treatment and, therefore, an appropriate evaluation of TF adherence is critical to decrease recurrence. The aim of this systematic review was to determine the usability of different methods of assessing adherence to TF in patients with diabetic foot ulcers under remission. The search strategy retrieved 506 articles. Title and abstract review excluded 472, while the full-text review excluded an additional 18 articles because the included data did not meet the selection criteria. Finally, we included 16 articles in this systematic review. Six (37.5%) of the 16 studies combined objective (OM) and subjective methods (SM). Only five (31.25%) evaluated OM and six (37.5%) studies only evaluated SM. Objective methods (temperature sensor, activity monitor) and subjective methods (survey, questionnaire) have successfully been used in the literature to evaluate TF adherence. Objective methods provided accurate data, whereas subjective methods led to response bias or missing data. Methods of evaluation showed that patients use the TF more frequently outdoors and on weekdays than indoors or on the weekend. In conclusion, objective methods are the most usable way to measure adherence to TF.","container-title":"The International Journal of Lower Extremity Wounds","DOI":"10.1177/15347346231190680","ISSN":"1534-7346, 1552-6941","issue":"1","journalAbbreviation":"The International Journal of Lower Extremity Wounds","language":"en","page":"55-64","source":"DOI.org (Crossref)","title":"Usability of Different Methods to Assess and Improve Adherence to Therapeutic Footwear in Persons with the Diabetic Foot in Remission. A Systematic Review","volume":"25","author":[{"family":"López-Moral","given":"Mateo"},{"family":"Molines-Barroso","given":"Raúl J."},{"family":"Herrera-Casamayor","given":"María"},{"family":"García-Madrid","given":"Marta"},{"family":"García-Morales","given":"Esther"},{"family":"Lázaro-Martínez","given":"José Luis"}],"issued":{"date-parts":[["2026",3]]}}},{"id":43,"uris":["http://zotero.org/users/19619518/items/FWKZCSUG"],"itemData":{"id":43,"type":"article-journal","container-title":"Journal of Rehabilitation Medicine","DOI":"10.2340/16501977-2759","ISSN":"1651-2081","issue":"11","journalAbbreviation":"J Rehabil Med","language":"en","page":"jrm00127","source":"DOI.org (Crossref)","title":"Effect of awareness of being monitored on wearing of orthopaedic footwear","volume":"52","author":[{"family":"Lutjeboer","given":"T"},{"family":"Netten","given":"J"},{"family":"Postema","given":"K"},{"family":"Hijmans","given":"J"}],"issued":{"date-parts":[["2020"]]}}}],"schema":"https://github.com/citation-style-language/schema/raw/master/csl-citation.json"} </w:instrText>
-      </w:r>
-      <w:r>
-        <w:rPr>
-          <w:rFonts w:ascii="Garamond" w:hAnsi="Garamond"/>
+          <w:vertAlign w:val="superscript"/>
+          <w:lang w:val="en-US"/>
+        </w:rPr>
+        <w:instrText xml:space="preserve"> ADDIN ZOTERO_ITEM CSL_CITATION {"citationID":"0QQT9vJY","properties":{"unsorted":false,"formattedCitation":"\\super 9,10,14\\nosupersub{}","plainCitation":"9,10,14","noteIndex":0},"citationItems":[{"id":14,"uris":["http://zotero.org/users/19619518/items/54DKJVW9"],"itemData":{"id":14,"type":"article-journal","container-title":"Implementation Science","DOI":"10.1186/1748-5908-6-42","ISSN":"1748-5908","issue":"1","journalAbbreviation":"Implementation Sci","language":"en","license":"http://www.springer.com/tdm","page":"42","source":"DOI.org (Crossref)","title":"The behaviour change wheel: A new method for characterising and designing behaviour change interventions","title-short":"The behaviour change wheel","volume":"6","author":[{"family":"Michie","given":"Susan"},{"family":"Van Stralen","given":"Maartje M"},{"family":"West","given":"Robert"}],"issued":{"date-parts":[["2011",12]]}}},{"id":13,"uris":["http://zotero.org/users/19619518/items/ZEQZLJXL"],"itemData":{"id":13,"type":"article-journal","container-title":"Annals of Behavioral Medicine","DOI":"10.1007/s12160-013-9486-6","ISSN":"0883-6612, 1532-4796","issue":"1","journalAbbreviation":"ann. behav. med.","language":"en","page":"81-95","source":"DOI.org (Crossref)","title":"The Behavior Change Technique Taxonomy (v1) of 93 Hierarchically Clustered Techniques: Building an International Consensus for the Reporting of Behavior Change Interventions","title-short":"The Behavior Change Technique Taxonomy (v1) of 93 Hierarchically Clustered Techniques","volume":"46","author":[{"family":"Michie","given":"Susan"},{"family":"Richardson","given":"Michelle"},{"family":"Johnston","given":"Marie"},{"family":"Abraham","given":"Charles"},{"family":"Francis","given":"Jill"},{"family":"Hardeman","given":"Wendy"},{"family":"Eccles","given":"Martin P."},{"family":"Cane","given":"James"},{"family":"Wood","given":"Caroline E."}],"issued":{"date-parts":[["2013",8]]}}},{"id":41,"uris":["http://zotero.org/users/19619518/items/9CV6ZUVG"],"itemData":{"id":41,"type":"article-journal","abstract":"Abstract\n            \n              Background\n              Diabetic foot ulcers have a high impact on mobility and daily functioning and lead to high treatment costs, for example, by hospitalization and amputation. To prevent (re)ulcerations, custom-made orthopedic shoes are considered essential. However, adherence to wearing the orthopedic shoes is low, and improving adherence was not successful in the past. We propose a novel care approach that combines motivational interviewing (MI) with a digital shoe-fitting procedure to improve adherence to orthopedic shoes. The aim of this trial is to assess the (cost-)effectiveness of this novel care approach compared to usual care (no MI and casting-based shoe-fitting) in promoting footwear adherence and ulcer prevention.\n            \n            \n              Methods\n              The trial will include people with diabetes, with IWGDF Risk categories 1–3, who have been prescribed orthopedic shoes. Participants will be randomized at the level of the podiatrist to the novel care approach or usual care. The primary outcome is the proportion of participants who adhere to the use of their orthopedic shoes, that is, who take at least 80% of their total daily steps with orthopedic shoes. A temperature microsensor will be built into the participants’ orthopedic shoes to measure wearing time continuously over 12</w:instrText>
+      </w:r>
+      <w:r>
+        <w:rPr>
+          <w:vertAlign w:val="superscript"/>
+          <w:lang w:val="en-US"/>
+        </w:rPr>
+        <w:instrText> </w:instrText>
+      </w:r>
+      <w:r>
+        <w:rPr>
+          <w:rFonts w:ascii="Garamond" w:hAnsi="Garamond"/>
+          <w:vertAlign w:val="superscript"/>
+          <w:lang w:val="en-US"/>
+        </w:rPr>
+        <w:instrText xml:space="preserve">months. In addition, daily activity will be measured periodically using log data with an activity monitor. Data from the temperature microsensor and activity monitor will be combined to calculate adherence. (Re-)experienced complications after receiving orthopedic shoes will be registered. Questionnaires and interviews will measure the experiences of participants regarding orthopedic shoes, experiences of podiatrists regarding motivational interviewing, care consumption, and quality of life. Differences in costs and quality of life will be determined in a cost-effectiveness analysis.\n            \n            \n              Discussion\n              This trial will generate novel insights into the socio-economic and well-being impact and the clinical effectiveness of the novel care approach on adherence to wearing orthopedic shoes.\n            \n            \n              Trial registration\n              \n                Netherlands Trial Register\n                NL7710\n                . Registered on 6 May 2019","container-title":"Trials","DOI":"10.1186/s13063-021-05680-0","ISSN":"1745-6215","issue":"1","journalAbbreviation":"Trials","language":"en","page":"750","source":"DOI.org (Crossref)","title":"Using motivational interviewing combined with digital shoe-fitting to improve adherence to wearing orthopedic shoes in people with diabetes at risk of foot ulceration: study protocol for a cluster-randomized controlled trial","title-short":"Using motivational interviewing combined with digital shoe-fitting to improve adherence to wearing orthopedic shoes in people with diabetes at risk of foot ulceration","volume":"22","author":[{"family":"Jongebloed-Westra","given":"M."},{"family":"Bode","given":"C."},{"family":"Van Netten","given":"J. J."},{"family":"Ten Klooster","given":"P. M."},{"family":"Exterkate","given":"S. H."},{"family":"Koffijberg","given":"H."},{"family":"Van Gemert-Pijnen","given":"J. E. W. C."}],"issued":{"date-parts":[["2021",12]]}}}],"schema":"https://github.com/citation-style-language/schema/raw/master/csl-citation.json"} </w:instrText>
+      </w:r>
+      <w:r>
+        <w:rPr>
+          <w:rFonts w:ascii="Garamond" w:hAnsi="Garamond"/>
+          <w:vertAlign w:val="superscript"/>
           <w:lang w:val="en-US"/>
         </w:rPr>
         <w:fldChar w:fldCharType="separate"/>
@@ -3178,11 +3264,12 @@
           <w:vertAlign w:val="superscript"/>
           <w:lang w:val="en-GB"/>
         </w:rPr>
-        <w:t>6,12,13</w:t>
-      </w:r>
-      <w:r>
-        <w:rPr>
-          <w:rFonts w:ascii="Garamond" w:hAnsi="Garamond"/>
+        <w:t>9,10,14</w:t>
+      </w:r>
+      <w:r>
+        <w:rPr>
+          <w:rFonts w:ascii="Garamond" w:hAnsi="Garamond"/>
+          <w:vertAlign w:val="superscript"/>
           <w:lang w:val="en-US"/>
         </w:rPr>
         <w:fldChar w:fldCharType="end"/>
@@ -3194,102 +3281,53 @@
         <w:jc w:val="both"/>
         <w:rPr>
           <w:rFonts w:ascii="Garamond" w:hAnsi="Garamond"/>
-          <w:vertAlign w:val="superscript"/>
-          <w:lang w:val="en-US"/>
-        </w:rPr>
-      </w:pPr>
-      <w:r>
-        <w:rPr>
-          <w:rFonts w:ascii="Garamond" w:hAnsi="Garamond"/>
-          <w:b/>
-          <w:lang w:val="en-US"/>
-        </w:rPr>
-        <w:t xml:space="preserve">(3) Structured education and behavioural support. </w:t>
+          <w:lang w:val="en-GB"/>
+        </w:rPr>
+      </w:pPr>
+      <w:r>
+        <w:rPr>
+          <w:rFonts w:ascii="Garamond" w:hAnsi="Garamond"/>
+          <w:lang w:val="en-GB"/>
+        </w:rPr>
+        <w:t xml:space="preserve">Plantar-pressure and adherence-monitoring technologies are validated techniques already used within participating centres; no new measurement technology will be developed. A methodological </w:t>
       </w:r>
       <w:proofErr w:type="spellStart"/>
       <w:r>
         <w:rPr>
           <w:rFonts w:ascii="Garamond" w:hAnsi="Garamond"/>
-          <w:b/>
-          <w:lang w:val="en-US"/>
-        </w:rPr>
+          <w:lang w:val="en-GB"/>
+        </w:rPr>
+        <w:t>substudy</w:t>
       </w:r>
       <w:proofErr w:type="spellEnd"/>
       <w:r>
         <w:rPr>
           <w:rFonts w:ascii="Garamond" w:hAnsi="Garamond"/>
-          <w:b/>
-          <w:lang w:val="en-US"/>
-        </w:rPr>
-      </w:r>
-      <w:r>
-        <w:rPr>
-          <w:rFonts w:ascii="Garamond" w:hAnsi="Garamond"/>
-          <w:lang w:val="en-GB"/>
-        </w:rPr>
-        <w:t>Education covers adequate daily foot care and the rationale for wearing the prescribed orthoses and footwear. Behavioural support, delivered through SEBIA, draws on motivational interviewing, solution-focused brief therapy and behaviour change wheel principles, among other evidence-based behavioural change methods, to identify and address individual barriers to adherence</w:t>
-      </w:r>
-      <w:r>
-        <w:rPr>
-          <w:rFonts w:ascii="Garamond" w:hAnsi="Garamond"/>
-          <w:lang w:val="en-US"/>
-        </w:rPr>
-        <w:t>.</w:t>
-      </w:r>
-      <w:r>
-        <w:rPr>
-          <w:rFonts w:ascii="Garamond" w:hAnsi="Garamond"/>
-          <w:vertAlign w:val="superscript"/>
-          <w:lang w:val="en-US"/>
-        </w:rPr>
-        <w:fldChar w:fldCharType="begin"/>
-      </w:r>
-      <w:r>
-        <w:rPr>
-          <w:rFonts w:ascii="Garamond" w:hAnsi="Garamond"/>
-          <w:vertAlign w:val="superscript"/>
-          <w:lang w:val="en-US"/>
-        </w:rPr>
-        <w:instrText xml:space="preserve"> ADDIN ZOTERO_ITEM CSL_CITATION {"citationID":"0QQT9vJY","properties":{"unsorted":false,"formattedCitation":"\\super 9,10,14\\nosupersub{}","plainCitation":"9,10,14","noteIndex":0},"citationItems":[{"id":14,"uris":["http://zotero.org/users/19619518/items/54DKJVW9"],"itemData":{"id":14,"type":"article-journal","container-title":"Implementation Science","DOI":"10.1186/1748-5908-6-42","ISSN":"1748-5908","issue":"1","journalAbbreviation":"Implementation Sci","language":"en","license":"http://www.springer.com/tdm","page":"42","source":"DOI.org (Crossref)","title":"The behaviour change wheel: A new method for characterising and designing behaviour change interventions","title-short":"The behaviour change wheel","volume":"6","author":[{"family":"Michie","given":"Susan"},{"family":"Van Stralen","given":"Maartje M"},{"family":"West","given":"Robert"}],"issued":{"date-parts":[["2011",12]]}}},{"id":13,"uris":["http://zotero.org/users/19619518/items/ZEQZLJXL"],"itemData":{"id":13,"type":"article-journal","container-title":"Annals of Behavioral Medicine","DOI":"10.1007/s12160-013-9486-6","ISSN":"0883-6612, 1532-4796","issue":"1","journalAbbreviation":"ann. behav. med.","language":"en","page":"81-95","source":"DOI.org (Crossref)","title":"The Behavior Change Technique Taxonomy (v1) of 93 Hierarchically Clustered Techniques: Building an International Consensus for the Reporting of Behavior Change Interventions","title-short":"The Behavior Change Technique Taxonomy (v1) of 93 Hierarchically Clustered Techniques","volume":"46","author":[{"family":"Michie","given":"Susan"},{"family":"Richardson","given":"Michelle"},{"family":"Johnston","given":"Marie"},{"family":"Abraham","given":"Charles"},{"family":"Francis","given":"Jill"},{"family":"Hardeman","given":"Wendy"},{"family":"Eccles","given":"Martin P."},{"family":"Cane","given":"James"},{"family":"Wood","given":"Caroline E."}],"issued":{"date-parts":[["2013",8]]}}},{"id":41,"uris":["http://zotero.org/users/19619518/items/9CV6ZUVG"],"itemData":{"id":41,"type":"article-journal","abstract":"Abstract\n            \n              Background\n              Diabetic foot ulcers have a high impact on mobility and daily functioning and lead to high treatment costs, for example, by hospitalization and amputation. To prevent (re)ulcerations, custom-made orthopedic shoes are considered essential. However, adherence to wearing the orthopedic shoes is low, and improving adherence was not successful in the past. We propose a novel care approach that combines motivational interviewing (MI) with a digital shoe-fitting procedure to improve adherence to orthopedic shoes. The aim of this trial is to assess the (cost-)effectiveness of this novel care approach compared to usual care (no MI and casting-based shoe-fitting) in promoting footwear adherence and ulcer prevention.\n            \n            \n              Methods\n              The trial will include people with diabetes, with IWGDF Risk categories 1–3, who have been prescribed orthopedic shoes. Participants will be randomized at the level of the podiatrist to the novel care approach or usual care. The primary outcome is the proportion of participants who adhere to the use of their orthopedic shoes, that is, who take at least 80% of their total daily steps with orthopedic shoes. A temperature microsensor will be built into the participants’ orthopedic shoes to measure wearing time continuously over 12</w:instrText>
-      </w:r>
-      <w:r>
-        <w:rPr>
-          <w:vertAlign w:val="superscript"/>
-          <w:lang w:val="en-US"/>
-        </w:rPr>
-        <w:instrText> </w:instrText>
-      </w:r>
-      <w:r>
-        <w:rPr>
-          <w:rFonts w:ascii="Garamond" w:hAnsi="Garamond"/>
-          <w:vertAlign w:val="superscript"/>
-          <w:lang w:val="en-US"/>
-        </w:rPr>
-        <w:instrText xml:space="preserve">months. In addition, daily activity will be measured periodically using log data with an activity monitor. Data from the temperature microsensor and activity monitor will be combined to calculate adherence. (Re-)experienced complications after receiving orthopedic shoes will be registered. Questionnaires and interviews will measure the experiences of participants regarding orthopedic shoes, experiences of podiatrists regarding motivational interviewing, care consumption, and quality of life. Differences in costs and quality of life will be determined in a cost-effectiveness analysis.\n            \n            \n              Discussion\n              This trial will generate novel insights into the socio-economic and well-being impact and the clinical effectiveness of the novel care approach on adherence to wearing orthopedic shoes.\n            \n            \n              Trial registration\n              \n                Netherlands Trial Register\n                NL7710\n                . Registered on 6 May 2019","container-title":"Trials","DOI":"10.1186/s13063-021-05680-0","ISSN":"1745-6215","issue":"1","journalAbbreviation":"Trials","language":"en","page":"750","source":"DOI.org (Crossref)","title":"Using motivational interviewing combined with digital shoe-fitting to improve adherence to wearing orthopedic shoes in people with diabetes at risk of foot ulceration: study protocol for a cluster-randomized controlled trial","title-short":"Using motivational interviewing combined with digital shoe-fitting to improve adherence to wearing orthopedic shoes in people with diabetes at risk of foot ulceration","volume":"22","author":[{"family":"Jongebloed-Westra","given":"M."},{"family":"Bode","given":"C."},{"family":"Van Netten","given":"J. J."},{"family":"Ten Klooster","given":"P. M."},{"family":"Exterkate","given":"S. H."},{"family":"Koffijberg","given":"H."},{"family":"Van Gemert-Pijnen","given":"J. E. W. C."}],"issued":{"date-parts":[["2021",12]]}}}],"schema":"https://github.com/citation-style-language/schema/raw/master/csl-citation.json"} </w:instrText>
-      </w:r>
-      <w:r>
-        <w:rPr>
-          <w:rFonts w:ascii="Garamond" w:hAnsi="Garamond"/>
-          <w:vertAlign w:val="superscript"/>
-          <w:lang w:val="en-US"/>
-        </w:rPr>
-        <w:fldChar w:fldCharType="separate"/>
-      </w:r>
-      <w:r>
-        <w:rPr>
-          <w:rFonts w:ascii="Garamond" w:hAnsi="Garamond"/>
-          <w:vertAlign w:val="superscript"/>
-          <w:lang w:val="en-GB"/>
-        </w:rPr>
-        <w:t>9,10,14</w:t>
-      </w:r>
-      <w:r>
-        <w:rPr>
-          <w:rFonts w:ascii="Garamond" w:hAnsi="Garamond"/>
-          <w:vertAlign w:val="superscript"/>
-          <w:lang w:val="en-US"/>
-        </w:rPr>
-        <w:fldChar w:fldCharType="end"/>
+          <w:lang w:val="en-GB"/>
+        </w:rPr>
+        <w:t xml:space="preserve"> will assess concordance between the Novel </w:t>
+      </w:r>
+      <w:r>
+        <w:rPr>
+          <w:rFonts w:ascii="Garamond" w:hAnsi="Garamond"/>
+          <w:lang w:val="en-GB"/>
+        </w:rPr>
+      </w:r>
+      <w:proofErr w:type="spellStart"/>
+      <w:r>
+        <w:rPr>
+          <w:rFonts w:ascii="Garamond" w:hAnsi="Garamond"/>
+          <w:lang w:val="en-GB"/>
+        </w:rPr>
+        <w:t>pedar</w:t>
+      </w:r>
+      <w:proofErr w:type="spellEnd"/>
+      <w:r>
+        <w:rPr>
+          <w:rFonts w:ascii="Garamond" w:hAnsi="Garamond"/>
+          <w:lang w:val="en-GB"/>
+        </w:rPr>
+        <w:t xml:space="preserve"> and F-Scan GO systems, with technical partners.</w:t>
       </w:r>
     </w:p>
     <w:p>
@@ -3302,65 +3340,10 @@
         </w:rPr>
       </w:pPr>
       <w:r>
-        <w:rPr>
-          <w:rFonts w:ascii="Garamond" w:hAnsi="Garamond"/>
-          <w:lang w:val="en-GB"/>
-        </w:rPr>
-        <w:t xml:space="preserve">Plantar-pressure and adherence-monitoring technologies are validated techniques already used within participating centres; no new measurement technology will be developed. A methodological </w:t>
-      </w:r>
-      <w:proofErr w:type="spellStart"/>
-      <w:r>
-        <w:rPr>
-          <w:rFonts w:ascii="Garamond" w:hAnsi="Garamond"/>
-          <w:lang w:val="en-GB"/>
-        </w:rPr>
-        <w:t>substudy</w:t>
-      </w:r>
-      <w:proofErr w:type="spellEnd"/>
-      <w:r>
-        <w:rPr>
-          <w:rFonts w:ascii="Garamond" w:hAnsi="Garamond"/>
-          <w:lang w:val="en-GB"/>
-        </w:rPr>
-        <w:t xml:space="preserve"> will assess concordance between the Novel </w:t>
-      </w:r>
-      <w:r>
-        <w:rPr>
-          <w:rFonts w:ascii="Garamond" w:hAnsi="Garamond"/>
-          <w:lang w:val="en-GB"/>
-        </w:rPr>
-      </w:r>
-      <w:proofErr w:type="spellStart"/>
-      <w:r>
-        <w:rPr>
-          <w:rFonts w:ascii="Garamond" w:hAnsi="Garamond"/>
-          <w:lang w:val="en-GB"/>
-        </w:rPr>
-        <w:t>pedar</w:t>
-      </w:r>
-      <w:proofErr w:type="spellEnd"/>
-      <w:r>
-        <w:rPr>
-          <w:rFonts w:ascii="Garamond" w:hAnsi="Garamond"/>
-          <w:lang w:val="en-GB"/>
-        </w:rPr>
-        <w:t xml:space="preserve"> and F-Scan GO systems, with technical partners.</w:t>
-      </w:r>
-    </w:p>
-    <w:p>
-      <w:pPr>
-        <w:spacing w:after="60"/>
-        <w:jc w:val="both"/>
-        <w:rPr>
-          <w:rFonts w:ascii="Garamond" w:hAnsi="Garamond"/>
-          <w:lang w:val="en-GB"/>
-        </w:rPr>
-      </w:pPr>
-      <w:r>
         <w:drawing>
           <wp:inline xmlns:a="http://schemas.openxmlformats.org/drawingml/2006/main" xmlns:pic="http://schemas.openxmlformats.org/drawingml/2006/picture">
-            <wp:extent cx="5652000" cy="3532500"/>
-            <wp:docPr id="1709217644" name="Picture 1709217644"/>
+            <wp:extent cx="4896000" cy="2741760"/>
+            <wp:docPr id="1709217646" name="Picture 1709217646"/>
             <wp:cNvGraphicFramePr>
               <a:graphicFrameLocks noChangeAspect="1"/>
             </wp:cNvGraphicFramePr>
@@ -3372,7 +3355,7 @@
                     <pic:cNvPicPr/>
                   </pic:nvPicPr>
                   <pic:blipFill>
-                    <a:blip r:embed="rId21"/>
+                    <a:blip r:embed="rId23"/>
                     <a:stretch>
                       <a:fillRect/>
                     </a:stretch>
@@ -3380,7 +3363,7 @@
                   <pic:spPr>
                     <a:xfrm>
                       <a:off x="0" y="0"/>
-                      <a:ext cx="5652000" cy="3532500"/>
+                      <a:ext cx="4896000" cy="2741760"/>
                     </a:xfrm>
                     <a:prstGeom prst="rect"/>
                   </pic:spPr>
@@ -4513,8 +4496,7 @@
           <w:b/>
           <w:lang w:val="en-US"/>
         </w:rPr>
-        <w:lastRenderedPageBreak/>
-        <w:t xml:space="preserve">Techniques, collaborations and ethics. </w:t>
+        <w:t xml:space="preserve">Assessments and collaborations. </w:t>
       </w:r>
       <w:r>
         <w:rPr>
@@ -4587,7 +4569,6 @@
           <w:rFonts w:ascii="Garamond" w:hAnsi="Garamond"/>
           <w:lang w:val="en-GB"/>
         </w:rPr>
-        <w:t>The candidate will co-develop multicentre protocols, assessment materials, SEBIA intervention materials, the REDCap data-management system, and the investigator training and monitoring workflows.</w:t>
       </w:r>
     </w:p>
     <w:p>
@@ -4662,7 +4643,7 @@
           <w:rFonts w:ascii="Garamond" w:hAnsi="Garamond"/>
           <w:lang w:val="en-GB"/>
         </w:rPr>
-        <w:t>During months 1–8, the candidate will finalise the trial protocol, clinical assessment booklet, electronic case-report forms, and ethics and regulatory submissions in accordance with SPIRIT recommendations for randomised trial protocols</w:t>
+        <w:t>Months 1–8 cover the protocol, clinical assessment booklet, case-report forms and the ethics and regulatory submissions, following SPIRIT,</w:t>
       </w:r>
       <w:r>
         <w:rPr>
@@ -4705,7 +4686,7 @@
           <w:rFonts w:ascii="Garamond" w:hAnsi="Garamond"/>
           <w:lang w:val="en-US"/>
         </w:rPr>
-        <w:t>; a final operational pilot in month 8 will verify workflow feasibility and data capture before trial initiation.</w:t>
+        <w:t xml:space="preserve"> and close with an operational pilot that verifies workflow feasibility and data capture. Recruitment and randomisation of 144 participants run from month 8 to month 24; intervention delivery, follow-up and fidelity monitoring continue to month 42. Months 43–48 cover database closure, analyses and the thesis, while manuscript development runs throughout.</w:t>
       </w:r>
     </w:p>
     <w:p>
@@ -4714,48 +4695,14 @@
         <w:jc w:val="both"/>
         <w:rPr>
           <w:rFonts w:ascii="Garamond" w:hAnsi="Garamond"/>
-          <w:lang w:val="en-US"/>
-        </w:rPr>
-      </w:pPr>
-      <w:r>
-        <w:rPr>
-          <w:rFonts w:ascii="Garamond" w:hAnsi="Garamond"/>
-          <w:lang w:val="en-GB"/>
-        </w:rPr>
-        <w:t>Between months 8 and 24, recruitment and randomisation of 144 participants will proceed across six participating DFCs. Intervention delivery and follow-up will continue until month 42, with quality control and intervention-fidelity monitoring throughout.</w:t>
-      </w:r>
-    </w:p>
-    <w:p>
-      <w:pPr>
-        <w:spacing w:after="60"/>
-        <w:jc w:val="both"/>
-        <w:rPr>
-          <w:rFonts w:ascii="Garamond" w:hAnsi="Garamond"/>
-          <w:lang w:val="en-US"/>
-        </w:rPr>
-      </w:pPr>
-      <w:r>
-        <w:rPr>
-          <w:rFonts w:ascii="Garamond" w:hAnsi="Garamond"/>
-          <w:lang w:val="en-GB"/>
-        </w:rPr>
-        <w:t>During months 43–48, database closure, analyses, manuscript preparation and thesis completion will be performed. Manuscript development runs throughout the project; the planned outputs are listed in section 5.</w:t>
-      </w:r>
-    </w:p>
-    <w:p>
-      <w:pPr>
-        <w:spacing w:after="60"/>
-        <w:jc w:val="both"/>
-        <w:rPr>
-          <w:rFonts w:ascii="Garamond" w:hAnsi="Garamond"/>
           <w:lang w:val="en-GB"/>
         </w:rPr>
       </w:pPr>
       <w:r>
         <w:drawing>
           <wp:inline xmlns:a="http://schemas.openxmlformats.org/drawingml/2006/main" xmlns:pic="http://schemas.openxmlformats.org/drawingml/2006/picture">
-            <wp:extent cx="6192000" cy="3490036"/>
-            <wp:docPr id="1709217645" name="Picture 1709217645"/>
+            <wp:extent cx="5400000" cy="2258181"/>
+            <wp:docPr id="1709217647" name="Picture 1709217647"/>
             <wp:cNvGraphicFramePr>
               <a:graphicFrameLocks noChangeAspect="1"/>
             </wp:cNvGraphicFramePr>
@@ -4767,7 +4714,7 @@
                     <pic:cNvPicPr/>
                   </pic:nvPicPr>
                   <pic:blipFill>
-                    <a:blip r:embed="rId22"/>
+                    <a:blip r:embed="rId24"/>
                     <a:stretch>
                       <a:fillRect/>
                     </a:stretch>
@@ -4775,7 +4722,7 @@
                   <pic:spPr>
                     <a:xfrm>
                       <a:off x="0" y="0"/>
-                      <a:ext cx="6192000" cy="3490036"/>
+                      <a:ext cx="5400000" cy="2258181"/>
                     </a:xfrm>
                     <a:prstGeom prst="rect"/>
                   </pic:spPr>
@@ -5155,7 +5102,7 @@
           <w:rFonts w:ascii="Garamond" w:hAnsi="Garamond"/>
           <w:lang w:val="en-GB"/>
         </w:rPr>
-        <w:t>The project will deliver the first multicentre RCT evaluating PARADISE for diabetic foot-ulcer recurrence prevention within Belgian multidisciplinary DFCs.</w:t>
+        <w:t>The project delivers the first multicentre RCT of PARADISE within Belgian multidisciplinary DFCs.</w:t>
       </w:r>
     </w:p>
     <w:p>
@@ -5178,7 +5125,7 @@
           <w:rFonts w:ascii="Garamond" w:hAnsi="Garamond"/>
           <w:lang w:val="en-GB"/>
         </w:rPr>
-        <w:t>Six manuscripts are planned. (1) The scoping review “Patient-specific offloading insole design in diabetic foot disease: a scoping review of biomechanical, clinical and health-economic evidence”, with the protocol registered before searching and reporting according to PRISMA-ScR (months 1–12). (2) The trial protocol paper, reported according to SPIRIT 2025 and TIDieR (months 1–9). (3) Regional peak plantar-pressure reference values in people with diabetes, derived from low- and high-resolution in-shoe measurements (months 12–24). (4) A comparison of plantar-pressure redistribution achieved with conventionally manufactured and 3D-printed custom-made foot orthoses in people with and without diabetes; this study runs outside the PARADISE trial but informs orthosis design within the doctoral trajectory (months 18–36). (5) The primary effectiveness analysis of ulcer recurrence at 18 months (months 43–48). (6) The pre-specified mediation analysis of footwear adherence, including the full 18-month adherence profile (months 43–48). Trial publications will be reported according to CONSORT recommendations.</w:t>
+        <w:t>Six manuscripts are planned: (1) the scoping review “Patient-specific offloading insole design in diabetic foot disease”; (2) the trial protocol paper, following SPIRIT 2025 and TIDieR; (3) regional peak plantar-pressure reference values in people with diabetes, from low- and high-resolution in-shoe measurements; (4) a comparison of plantar-pressure redistribution with conventionally manufactured and 3D-printed custom-made foot orthoses, conducted outside the trial; (5) the primary effectiveness analysis of ulcer recurrence at 18 months; and (6) the pre-specified mediation analysis of footwear adherence. Timing is shown in Figure 2, and trial publications follow CONSORT.</w:t>
       </w:r>
       <w:proofErr w:type="spellStart"/>
       <w:r>
@@ -5291,7 +5238,7 @@
     <w:p>
       <w:pPr>
         <w:pStyle w:val="Bibliografie"/>
-        <w:spacing w:after="60"/>
+        <w:spacing w:after="0"/>
         <w:ind w:left="0" w:firstLine="0"/>
         <w:rPr>
           <w:rFonts w:ascii="Garamond" w:hAnsi="Garamond"/>
@@ -5332,7 +5279,7 @@
     <w:p>
       <w:pPr>
         <w:pStyle w:val="Bibliografie"/>
-        <w:spacing w:after="60"/>
+        <w:spacing w:after="0"/>
         <w:rPr>
           <w:sz w:val="16"/>
           <w:szCs w:val="16"/>
@@ -5387,7 +5334,7 @@
     <w:p>
       <w:pPr>
         <w:pStyle w:val="Bibliografie"/>
-        <w:spacing w:after="60"/>
+        <w:spacing w:after="0"/>
         <w:rPr>
           <w:sz w:val="16"/>
           <w:szCs w:val="16"/>
@@ -5415,7 +5362,7 @@
     <w:p>
       <w:pPr>
         <w:pStyle w:val="Bibliografie"/>
-        <w:spacing w:after="60"/>
+        <w:spacing w:after="0"/>
         <w:rPr>
           <w:sz w:val="16"/>
           <w:szCs w:val="16"/>
@@ -5443,7 +5390,7 @@
     <w:p>
       <w:pPr>
         <w:pStyle w:val="Bibliografie"/>
-        <w:spacing w:after="60"/>
+        <w:spacing w:after="0"/>
         <w:rPr>
           <w:sz w:val="16"/>
           <w:szCs w:val="16"/>
@@ -5471,7 +5418,7 @@
     <w:p>
       <w:pPr>
         <w:pStyle w:val="Bibliografie"/>
-        <w:spacing w:after="60"/>
+        <w:spacing w:after="0"/>
         <w:rPr>
           <w:sz w:val="16"/>
           <w:szCs w:val="16"/>
@@ -5505,7 +5452,7 @@
     <w:p>
       <w:pPr>
         <w:pStyle w:val="Bibliografie"/>
-        <w:spacing w:after="60"/>
+        <w:spacing w:after="0"/>
         <w:rPr>
           <w:sz w:val="16"/>
           <w:szCs w:val="16"/>
@@ -5539,7 +5486,7 @@
     <w:p>
       <w:pPr>
         <w:pStyle w:val="Bibliografie"/>
-        <w:spacing w:after="60"/>
+        <w:spacing w:after="0"/>
         <w:rPr>
           <w:sz w:val="16"/>
           <w:szCs w:val="16"/>
@@ -5567,7 +5514,7 @@
     <w:p>
       <w:pPr>
         <w:pStyle w:val="Bibliografie"/>
-        <w:spacing w:after="60"/>
+        <w:spacing w:after="0"/>
         <w:rPr>
           <w:sz w:val="16"/>
           <w:szCs w:val="16"/>
@@ -5595,7 +5542,7 @@
     <w:p>
       <w:pPr>
         <w:pStyle w:val="Bibliografie"/>
-        <w:spacing w:after="60"/>
+        <w:spacing w:after="0"/>
         <w:rPr>
           <w:sz w:val="16"/>
           <w:szCs w:val="16"/>
@@ -5623,7 +5570,7 @@
     <w:p>
       <w:pPr>
         <w:pStyle w:val="Bibliografie"/>
-        <w:spacing w:after="60"/>
+        <w:spacing w:after="0"/>
         <w:rPr>
           <w:sz w:val="16"/>
           <w:szCs w:val="16"/>
@@ -5651,7 +5598,7 @@
     <w:p>
       <w:pPr>
         <w:pStyle w:val="Bibliografie"/>
-        <w:spacing w:after="60"/>
+        <w:spacing w:after="0"/>
         <w:rPr>
           <w:sz w:val="16"/>
           <w:szCs w:val="16"/>
@@ -5679,7 +5626,7 @@
     <w:p>
       <w:pPr>
         <w:pStyle w:val="Bibliografie"/>
-        <w:spacing w:after="60"/>
+        <w:spacing w:after="0"/>
         <w:rPr>
           <w:sz w:val="16"/>
           <w:szCs w:val="16"/>
@@ -5715,7 +5662,7 @@
     <w:p>
       <w:pPr>
         <w:pStyle w:val="Bibliografie"/>
-        <w:spacing w:after="60"/>
+        <w:spacing w:after="0"/>
         <w:rPr>
           <w:sz w:val="16"/>
           <w:szCs w:val="16"/>
@@ -5743,7 +5690,7 @@
     <w:p>
       <w:pPr>
         <w:pStyle w:val="Bibliografie"/>
-        <w:spacing w:after="60"/>
+        <w:spacing w:after="0"/>
         <w:rPr>
           <w:sz w:val="16"/>
           <w:szCs w:val="16"/>
@@ -5771,7 +5718,7 @@
     <w:p>
       <w:pPr>
         <w:pStyle w:val="Bibliografie"/>
-        <w:spacing w:after="60"/>
+        <w:spacing w:after="0"/>
         <w:rPr>
           <w:sz w:val="16"/>
           <w:szCs w:val="16"/>
@@ -5799,7 +5746,7 @@
     <w:p>
       <w:pPr>
         <w:pStyle w:val="Bibliografie"/>
-        <w:spacing w:after="60"/>
+        <w:spacing w:after="0"/>
         <w:rPr>
           <w:sz w:val="16"/>
           <w:szCs w:val="16"/>
@@ -5827,7 +5774,7 @@
     <w:p>
       <w:pPr>
         <w:pStyle w:val="Bibliografie"/>
-        <w:spacing w:after="60"/>
+        <w:spacing w:after="0"/>
         <w:rPr>
           <w:sz w:val="16"/>
           <w:szCs w:val="16"/>
@@ -5855,7 +5802,7 @@
     <w:p>
       <w:pPr>
         <w:pStyle w:val="Bibliografie"/>
-        <w:spacing w:after="60"/>
+        <w:spacing w:after="0"/>
         <w:rPr>
           <w:sz w:val="16"/>
           <w:szCs w:val="16"/>
@@ -5883,7 +5830,7 @@
     <w:p>
       <w:pPr>
         <w:pStyle w:val="Bibliografie"/>
-        <w:spacing w:after="60"/>
+        <w:spacing w:after="0"/>
         <w:rPr>
           <w:sz w:val="16"/>
           <w:szCs w:val="16"/>
@@ -5911,7 +5858,7 @@
     <w:p>
       <w:pPr>
         <w:pStyle w:val="Bibliografie"/>
-        <w:spacing w:after="60"/>
+        <w:spacing w:after="0"/>
         <w:rPr>
           <w:sz w:val="16"/>
           <w:szCs w:val="16"/>
@@ -5939,7 +5886,7 @@
     <w:p>
       <w:pPr>
         <w:pStyle w:val="Bibliografie"/>
-        <w:spacing w:after="60"/>
+        <w:spacing w:after="0"/>
         <w:rPr>
           <w:sz w:val="16"/>
           <w:szCs w:val="16"/>
@@ -5967,7 +5914,7 @@
     <w:p>
       <w:pPr>
         <w:pStyle w:val="Bibliografie"/>
-        <w:spacing w:after="60"/>
+        <w:spacing w:after="0"/>
         <w:rPr>
           <w:sz w:val="16"/>
           <w:szCs w:val="16"/>
@@ -5995,7 +5942,7 @@
     <w:p>
       <w:pPr>
         <w:pStyle w:val="Bibliografie"/>
-        <w:spacing w:after="60"/>
+        <w:spacing w:after="0"/>
         <w:rPr>
           <w:sz w:val="16"/>
           <w:szCs w:val="16"/>

</xml_diff>

<commit_message>
Doctoraatsplan: A3 en de alinea over assessments herschreven
A3 eindigde in een bijzin die nergens aan vasthing en verantwoordde zich over
het ontbreken van een succescriterium; dat hoort in de uitkomstensectie, niet in
een doelstelling. De alinea over assessments was een stomp van een regel met een
kop die samenwerking beloofde. Ruimte gehaald uit de inleiding, de haalbaarheid
en de samengevoegde deliverables, zodat het op vijf pagina s blijft.

Co-Authored-By: Claude Opus 5 <noreply@anthropic.com>
</commit_message>
<xml_diff>
--- a/PARADISE_provisional_doctoral_plan.docx
+++ b/PARADISE_provisional_doctoral_plan.docx
@@ -1404,7 +1404,7 @@
           <w:rFonts w:ascii="Garamond" w:hAnsi="Garamond"/>
           <w:lang w:val="en-US"/>
         </w:rPr>
-        <w:t>Diabetes constitutes a growing global health burden;</w:t>
+        <w:t>Diabetes is a growing global health burden;</w:t>
       </w:r>
       <w:r>
         <w:rPr>
@@ -1490,14 +1490,14 @@
           <w:rFonts w:ascii="Garamond" w:hAnsi="Garamond"/>
           <w:lang w:val="en-US"/>
         </w:rPr>
-        <w:t xml:space="preserve"> Among people with diabetes, recurrent diabetic foot ulcers (DFUs) remain a leading cause of morbidity, reduced quality of life, and healthcare expenditure: approximately 40% of healed ulcers recur within one year, </w:t>
-      </w:r>
-      <w:r>
-        <w:rPr>
-          <w:rFonts w:ascii="Garamond" w:hAnsi="Garamond"/>
-          <w:lang w:val="en-US"/>
-        </w:rPr>
-        <w:t>making recurrence prevention a central priority in diabetic-foot management</w:t>
+        <w:t xml:space="preserve"> Recurrent diabetic foot ulcers (DFUs) remain a leading cause of morbidity, reduced quality of life and healthcare expenditure: about 40% of healed ulcers recur within one year, </w:t>
+      </w:r>
+      <w:r>
+        <w:rPr>
+          <w:rFonts w:ascii="Garamond" w:hAnsi="Garamond"/>
+          <w:lang w:val="en-US"/>
+        </w:rPr>
+        <w:t>making recurrence prevention a central priority</w:t>
       </w:r>
       <w:r>
         <w:rPr>
@@ -2362,6 +2362,7 @@
           <w:rFonts w:ascii="Garamond" w:hAnsi="Garamond"/>
           <w:lang w:val="en-GB"/>
         </w:rPr>
+        <w:lastRenderedPageBreak/>
         <w:t>PARADISE (Pressure-, Adherence-, and Education-Driven Service) addresses this translational gap through an integrated intervention combining pressure-guided optimisation of therapeutic footwear and foot orthoses, structured education on adequate foot care and footwear use, and sensor-based adherence monitoring.</w:t>
       </w:r>
       <w:r>
@@ -2528,7 +2529,7 @@
           <w:rFonts w:ascii="Garamond" w:hAnsi="Garamond"/>
           <w:lang w:val="en-GB"/>
         </w:rPr>
-        <w:t>Building on evidence for pressure-guided footwear optimisation, adherence monitoring, and behavioural interventions, PARADISE extends this approach through personalised behavioural feedback, prolonged follow-up, and integration into routine Belgian multidisciplinary care. This doctoral project will evaluate the clinical effectiveness of PARADISE within Belgian DFCs.</w:t>
+        <w:t>PARADISE extends this approach through personalised behavioural feedback, prolonged follow-up, and integration into routine Belgian multidisciplinary care. This doctoral project will evaluate the clinical effectiveness of PARADISE within Belgian DFCs.</w:t>
       </w:r>
     </w:p>
     <w:p>
@@ -2745,21 +2746,19 @@
           <w:rFonts w:ascii="Garamond" w:hAnsi="Garamond"/>
           <w:lang w:val="en-GB"/>
         </w:rPr>
-        <w:t>Determine whether PARADISE reduces in-shoe peak plantar pressure and increases objectively measured footwear adherence, and whether adherence mediates the effect on ulcer recurrence. Adherence is measured and reported in full but carries no success criterion of its own</w:t>
-      </w:r>
-      <w:r>
-        <w:rPr>
-          <w:rFonts w:ascii="Garamond" w:hAnsi="Garamond"/>
-          <w:lang w:val="en-GB"/>
-        </w:rPr>
-        <w:t xml:space="preserve">, with </w:t>
-      </w:r>
-      <w:r>
-        <w:rPr>
-          <w:rFonts w:ascii="Garamond" w:hAnsi="Garamond"/>
-          <w:lang w:val="en-GB"/>
-        </w:rPr>
-        <w:t>the clinically relevant ≥80% threshold as the reference</w:t>
+        <w:t>Determine whether PARADISE reduces in-shoe peak plantar pressure and raises objectively measured footwear adherence beyond the clinically relevant ≥80% threshold, and whether adherence mediates the effect of PARADISE on ulcer recurrence</w:t>
+      </w:r>
+      <w:r>
+        <w:rPr>
+          <w:rFonts w:ascii="Garamond" w:hAnsi="Garamond"/>
+          <w:lang w:val="en-GB"/>
+        </w:rPr>
+      </w:r>
+      <w:r>
+        <w:rPr>
+          <w:rFonts w:ascii="Garamond" w:hAnsi="Garamond"/>
+          <w:lang w:val="en-GB"/>
+        </w:rPr>
       </w:r>
       <w:r>
         <w:rPr>
@@ -2844,15 +2843,46 @@
     <w:p>
       <w:pPr>
         <w:spacing w:after="60"/>
+        <w:rPr>
+          <w:lang w:val="en-GB"/>
+        </w:rPr>
       </w:pPr>
       <w:r>
         <w:rPr>
           <w:b/>
+          <w:lang w:val="en-GB"/>
         </w:rPr>
         <w:t xml:space="preserve">Candidate’s contribution and joint PhD. </w:t>
       </w:r>
       <w:r>
-        <w:t>This is a joint KU Leuven–VUB doctorate in which two complementary doctoral projects run on the same trial. The present candidate leads the clinical trial: protocol development, ethics and regulatory submission, multicentre coordination, investigator training and site readiness, recruitment oversight, quality and fidelity monitoring, data management, and the analyses of ulcer recurrence, plantar pressure and footwear adherence. The parallel doctorate leads the process evaluation and the health-economic evaluation. Both researchers contribute to study conduct and outputs, with authorship aligned to responsibilities. Alongside the trial, the candidate conducts a registered scoping review on patient-specific offloading insole design, and a comparison of conventionally manufactured and 3D-printed custom-made foot orthoses carried out independently of the trial. Local clinical teams deliver patient care and site-level assessments.</w:t>
+        <w:rPr>
+          <w:lang w:val="en-GB"/>
+        </w:rPr>
+        <w:t>This is a joint KU Leuven–VUB doctorate in which two complementary doctoral projects run on the same trial. The present candidate leads the clinical trial: protocol development, ethics and regulatory submission, multicentre coordination, investigator training and site readiness, recruitment oversight, quality and fidelity monitoring, data management, and the analyses of ulcer recurrence, plantar pressure and footwear adherence. The parallel doctorate leads the process evaluation and the health-economic eval</w:t>
+      </w:r>
+      <w:r>
+        <w:rPr>
+          <w:lang w:val="en-GB"/>
+        </w:rPr>
+        <w:t xml:space="preserve">uation. Both researchers contribute to study conduct and outputs, with authorship aligned to responsibilities. Alongside the trial, </w:t>
+      </w:r>
+      <w:r>
+        <w:rPr>
+          <w:lang w:val="en-GB"/>
+        </w:rPr>
+        <w:t>I</w:t>
+      </w:r>
+      <w:r>
+        <w:rPr>
+          <w:lang w:val="en-GB"/>
+        </w:rPr>
+        <w:t xml:space="preserve"> will conduct</w:t>
+      </w:r>
+      <w:r>
+        <w:rPr>
+          <w:lang w:val="en-GB"/>
+        </w:rPr>
+        <w:t xml:space="preserve"> a registered scoping review on patient-specific offloading insole design, and a comparison of conventionally manufactured and 3D-printed custom-made foot orthoses carried out independently of the trial. Local clinical teams deliver patient care and site-level assessments.</w:t>
       </w:r>
     </w:p>
     <w:p>
@@ -2917,7 +2947,15 @@
           <w:rFonts w:ascii="Garamond" w:hAnsi="Garamond"/>
           <w:lang w:val="en-GB"/>
         </w:rPr>
-        <w:t>A prospective, multicentre, parallel-group randomised controlled trial (RCT) will randomise 144 adults with diabetes and an IWGDF category 3 high-risk foot in a 1:1 ratio, stratified by centre, across six Belgian RIZIV–INAMI-recognised DFCs in academic and non-academic settings. Participants will be followed for 18 months. Eligible participants have type 1 or type 2 diabetes with a plantar ulcer healed within the preceding 18 months or a partial foot amputation, and use, or are willing to use, prescribed therapeutic footwear.</w:t>
+        <w:t xml:space="preserve">A prospective, multicentre, parallel-group randomised controlled trial (RCT) will randomise 144 adults with diabetes and an IWGDF category 3 high-risk foot in a 1:1 ratio, stratified </w:t>
+      </w:r>
+      <w:r>
+        <w:rPr>
+          <w:rFonts w:ascii="Garamond" w:hAnsi="Garamond"/>
+          <w:lang w:val="en-GB"/>
+        </w:rPr>
+        <w:lastRenderedPageBreak/>
+        <w:t>by centre, across six Belgian RIZIV–INAMI-recognised DFCs in academic and non-academic settings. Participants will be followed for 18 months. Eligible participants have type 1 or type 2 diabetes with a plantar ulcer healed within the preceding 18 months or a partial foot amputation, and use, or are willing to use, prescribed therapeutic footwear.</w:t>
       </w:r>
     </w:p>
     <w:p>
@@ -3101,7 +3139,6 @@
           <w:b/>
           <w:lang w:val="en-US"/>
         </w:rPr>
-        <w:lastRenderedPageBreak/>
         <w:t xml:space="preserve">(2) Objective footwear-adherence monitoring. </w:t>
       </w:r>
       <w:r>
@@ -3189,22 +3226,6 @@
         </w:rPr>
         <w:t xml:space="preserve">(3) Structured education and behavioural support. </w:t>
       </w:r>
-      <w:proofErr w:type="spellStart"/>
-      <w:r>
-        <w:rPr>
-          <w:rFonts w:ascii="Garamond" w:hAnsi="Garamond"/>
-          <w:b/>
-          <w:lang w:val="en-US"/>
-        </w:rPr>
-      </w:r>
-      <w:proofErr w:type="spellEnd"/>
-      <w:r>
-        <w:rPr>
-          <w:rFonts w:ascii="Garamond" w:hAnsi="Garamond"/>
-          <w:b/>
-          <w:lang w:val="en-US"/>
-        </w:rPr>
-      </w:r>
       <w:r>
         <w:rPr>
           <w:rFonts w:ascii="Garamond" w:hAnsi="Garamond"/>
@@ -3307,12 +3328,6 @@
         </w:rPr>
         <w:t xml:space="preserve"> will assess concordance between the Novel </w:t>
       </w:r>
-      <w:r>
-        <w:rPr>
-          <w:rFonts w:ascii="Garamond" w:hAnsi="Garamond"/>
-          <w:lang w:val="en-GB"/>
-        </w:rPr>
-      </w:r>
       <w:proofErr w:type="spellStart"/>
       <w:r>
         <w:rPr>
@@ -3340,22 +3355,26 @@
         </w:rPr>
       </w:pPr>
       <w:r>
+        <w:rPr>
+          <w:noProof/>
+        </w:rPr>
         <w:drawing>
-          <wp:inline xmlns:a="http://schemas.openxmlformats.org/drawingml/2006/main" xmlns:pic="http://schemas.openxmlformats.org/drawingml/2006/picture">
-            <wp:extent cx="4896000" cy="2741760"/>
+          <wp:inline distT="0" distB="0" distL="0" distR="0" wp14:anchorId="2CC07533" wp14:editId="433D8AB4">
+            <wp:extent cx="5323795" cy="2981325"/>
+            <wp:effectExtent l="0" t="0" r="0" b="0"/>
             <wp:docPr id="1709217646" name="Picture 1709217646"/>
             <wp:cNvGraphicFramePr>
-              <a:graphicFrameLocks noChangeAspect="1"/>
+              <a:graphicFrameLocks xmlns:a="http://schemas.openxmlformats.org/drawingml/2006/main" noChangeAspect="1"/>
             </wp:cNvGraphicFramePr>
-            <a:graphic>
+            <a:graphic xmlns:a="http://schemas.openxmlformats.org/drawingml/2006/main">
               <a:graphicData uri="http://schemas.openxmlformats.org/drawingml/2006/picture">
-                <pic:pic>
+                <pic:pic xmlns:pic="http://schemas.openxmlformats.org/drawingml/2006/picture">
                   <pic:nvPicPr>
                     <pic:cNvPr id="0" name="fig1_nieuw.png"/>
                     <pic:cNvPicPr/>
                   </pic:nvPicPr>
                   <pic:blipFill>
-                    <a:blip r:embed="rId23"/>
+                    <a:blip r:embed="rId12"/>
                     <a:stretch>
                       <a:fillRect/>
                     </a:stretch>
@@ -3363,9 +3382,11 @@
                   <pic:spPr>
                     <a:xfrm>
                       <a:off x="0" y="0"/>
-                      <a:ext cx="4896000" cy="2741760"/>
+                      <a:ext cx="5339885" cy="2990335"/>
                     </a:xfrm>
-                    <a:prstGeom prst="rect"/>
+                    <a:prstGeom prst="rect">
+                      <a:avLst/>
+                    </a:prstGeom>
                   </pic:spPr>
                 </pic:pic>
               </a:graphicData>
@@ -3472,20 +3493,7 @@
           <w:rFonts w:ascii="Garamond" w:hAnsi="Garamond"/>
           <w:lang w:val="en-GB"/>
         </w:rPr>
-        <w:t xml:space="preserve">The primary outcome is plantar foot-ulcer recurrence at 18 months, defined as a new plantar ulcer occurring after enrolment and reflecting </w:t>
-      </w:r>
-      <w:r>
-        <w:rPr>
-          <w:rFonts w:ascii="Garamond" w:hAnsi="Garamond"/>
-          <w:lang w:val="en-GB"/>
-        </w:rPr>
-      </w:r>
-      <w:r>
-        <w:rPr>
-          <w:rFonts w:ascii="Garamond" w:hAnsi="Garamond"/>
-          <w:lang w:val="en-GB"/>
-        </w:rPr>
-        <w:t>the combined impact of pressure management, prevention strategies, and footwear adherence.</w:t>
+        <w:t>The primary outcome is plantar foot-ulcer recurrence at 18 months, defined as a new plantar ulcer occurring after enrolment and reflecting the combined impact of pressure management, prevention strategies, and footwear adherence.</w:t>
       </w:r>
       <w:r>
         <w:rPr>
@@ -4156,6 +4164,7 @@
           <w:rFonts w:ascii="Garamond" w:hAnsi="Garamond"/>
           <w:lang w:val="en-GB"/>
         </w:rPr>
+        <w:lastRenderedPageBreak/>
         <w:t>Secondary outcomes comprise ulcer-free survival, recurrence characteristics, plantar-pressure change at 6, 12, and 18 months, foot-care behaviour (NAFF), objectively measured adherence over the full 18 months, self-reported adherence (7-day recall), health-related quality of life (EQ-5D-5L), and healthcare resource utilisation.</w:t>
       </w:r>
     </w:p>
@@ -4267,12 +4276,6 @@
         </w:rPr>
         <w:t xml:space="preserve">62 evaluable participants per arm are required; accounting for 15% loss to follow-up, the target sample size is 144 participants (~24 per centre). </w:t>
       </w:r>
-      <w:r>
-        <w:rPr>
-          <w:rFonts w:ascii="Garamond" w:hAnsi="Garamond"/>
-          <w:lang w:val="en-GB"/>
-        </w:rPr>
-      </w:r>
     </w:p>
     <w:p>
       <w:pPr>
@@ -4503,7 +4506,7 @@
           <w:rFonts w:ascii="Garamond" w:hAnsi="Garamond"/>
           <w:lang w:val="en-US"/>
         </w:rPr>
-        <w:t>Patient-</w:t>
+        <w:t>Patient-centred outcomes are captured with validated instruments — the NAFF for foot-care behaviour and the EQ-5D-5L for health-related quality of life</w:t>
       </w:r>
       <w:proofErr w:type="spellStart"/>
       <w:r>
@@ -4511,7 +4514,6 @@
           <w:rFonts w:ascii="Garamond" w:hAnsi="Garamond"/>
           <w:lang w:val="en-US"/>
         </w:rPr>
-        <w:t>centred</w:t>
       </w:r>
       <w:proofErr w:type="spellEnd"/>
       <w:r>
@@ -4519,7 +4521,6 @@
           <w:rFonts w:ascii="Garamond" w:hAnsi="Garamond"/>
           <w:lang w:val="en-US"/>
         </w:rPr>
-        <w:t xml:space="preserve"> assessments comprise NAFF and EQ-5D-5L.</w:t>
       </w:r>
       <w:r>
         <w:rPr>
@@ -4562,13 +4563,7 @@
           <w:rFonts w:ascii="Garamond" w:hAnsi="Garamond"/>
           <w:lang w:val="en-US"/>
         </w:rPr>
-        <w:t xml:space="preserve"> </w:t>
-      </w:r>
-      <w:r>
-        <w:rPr>
-          <w:rFonts w:ascii="Garamond" w:hAnsi="Garamond"/>
-          <w:lang w:val="en-GB"/>
-        </w:rPr>
+        <w:t xml:space="preserve"> — alongside device-derived measures of plantar pressure, footwear wearing time and daily activity. The trial is conducted with the six participating DFCs, with the VUB partners responsible for the process and health-economic evaluation, and with the technical partners supporting the pressure-measurement systems.</w:t>
       </w:r>
     </w:p>
     <w:p>
@@ -4583,13 +4578,13 @@
       <w:r>
         <w:rPr>
           <w:b/>
+          <w:lang w:val="en-GB"/>
         </w:rPr>
         <w:t xml:space="preserve">Ethics and regulatory submission. </w:t>
       </w:r>
       <w:r>
         <w:rPr>
           <w:rFonts w:ascii="Garamond" w:hAnsi="Garamond"/>
-          <w:b w:val="0"/>
           <w:lang w:val="en-GB"/>
         </w:rPr>
         <w:t>Central submission to the EC Research UZ/KU Leuven and the FAMHP is scheduled for October 2026, with the six local approvals expected between November 2026 and January 2027. The trial will be prospectively registered and conducted under a GDPR-compliant data-management framework. Ulcer recurrence is ascertained by the multidisciplinary clinical team; the absence of an independent blinded adjudication committee is acknowledged as a limitation.</w:t>
@@ -4699,22 +4694,26 @@
         </w:rPr>
       </w:pPr>
       <w:r>
+        <w:rPr>
+          <w:noProof/>
+        </w:rPr>
         <w:drawing>
-          <wp:inline xmlns:a="http://schemas.openxmlformats.org/drawingml/2006/main" xmlns:pic="http://schemas.openxmlformats.org/drawingml/2006/picture">
-            <wp:extent cx="5400000" cy="2258181"/>
+          <wp:inline distT="0" distB="0" distL="0" distR="0" wp14:anchorId="6E5CFF10" wp14:editId="4C737931">
+            <wp:extent cx="6104285" cy="2552700"/>
+            <wp:effectExtent l="0" t="0" r="0" b="0"/>
             <wp:docPr id="1709217647" name="Picture 1709217647"/>
             <wp:cNvGraphicFramePr>
-              <a:graphicFrameLocks noChangeAspect="1"/>
+              <a:graphicFrameLocks xmlns:a="http://schemas.openxmlformats.org/drawingml/2006/main" noChangeAspect="1"/>
             </wp:cNvGraphicFramePr>
-            <a:graphic>
+            <a:graphic xmlns:a="http://schemas.openxmlformats.org/drawingml/2006/main">
               <a:graphicData uri="http://schemas.openxmlformats.org/drawingml/2006/picture">
-                <pic:pic>
+                <pic:pic xmlns:pic="http://schemas.openxmlformats.org/drawingml/2006/picture">
                   <pic:nvPicPr>
                     <pic:cNvPr id="0" name="fig2_nieuw.png"/>
                     <pic:cNvPicPr/>
                   </pic:nvPicPr>
                   <pic:blipFill>
-                    <a:blip r:embed="rId24"/>
+                    <a:blip r:embed="rId13"/>
                     <a:stretch>
                       <a:fillRect/>
                     </a:stretch>
@@ -4722,9 +4721,11 @@
                   <pic:spPr>
                     <a:xfrm>
                       <a:off x="0" y="0"/>
-                      <a:ext cx="5400000" cy="2258181"/>
+                      <a:ext cx="6115368" cy="2557335"/>
                     </a:xfrm>
-                    <a:prstGeom prst="rect"/>
+                    <a:prstGeom prst="rect">
+                      <a:avLst/>
+                    </a:prstGeom>
                   </pic:spPr>
                 </pic:pic>
               </a:graphicData>
@@ -4782,7 +4783,7 @@
           <w:rFonts w:ascii="Garamond" w:hAnsi="Garamond"/>
           <w:lang w:val="en-GB"/>
         </w:rPr>
-        <w:t>Recruitment is feasible: each participating DFC treats at least 52 eligible high-risk patients annually, supporting a recruitment rate of 1–2 participants per centre per month. Comparable rates have been achieved in previous multicentre diabetic-foot trials within specialised networks.</w:t>
+        <w:t>Recruitment is feasible: each participating DFC treats at least 52 eligible high-risk patients annually, supporting a recruitment rate of 1–2 participants per centre per month. This is consistent with previous multicentre diabetic-foot trials.</w:t>
       </w:r>
       <w:r>
         <w:rPr>
@@ -4998,6 +4999,7 @@
         <w:rPr>
           <w:rFonts w:ascii="Garamond" w:hAnsi="Garamond"/>
           <w:vertAlign w:val="superscript"/>
+          <w:lang w:val="en-GB"/>
         </w:rPr>
         <w:t>22</w:t>
       </w:r>
@@ -5008,26 +5010,6 @@
         </w:rPr>
         <w:fldChar w:fldCharType="end"/>
       </w:r>
-    </w:p>
-    <w:p>
-      <w:pPr>
-        <w:spacing w:after="60"/>
-        <w:jc w:val="both"/>
-        <w:rPr>
-          <w:rFonts w:ascii="Garamond" w:hAnsi="Garamond"/>
-          <w:lang w:val="en-US"/>
-        </w:rPr>
-      </w:pPr>
-    </w:p>
-    <w:p>
-      <w:pPr>
-        <w:spacing w:after="60"/>
-        <w:jc w:val="both"/>
-        <w:rPr>
-          <w:rFonts w:ascii="Garamond" w:hAnsi="Garamond"/>
-          <w:lang w:val="en-US"/>
-        </w:rPr>
-      </w:pPr>
     </w:p>
     <w:p>
       <w:pPr>
@@ -5086,37 +5068,13 @@
         <w:jc w:val="both"/>
         <w:rPr>
           <w:rFonts w:ascii="Garamond" w:hAnsi="Garamond"/>
-          <w:lang w:val="en-GB"/>
-        </w:rPr>
-      </w:pPr>
-      <w:r>
-        <w:rPr>
-          <w:rFonts w:ascii="Garamond" w:hAnsi="Garamond"/>
+          <w:lang w:val="en-US"/>
+        </w:rPr>
+      </w:pPr>
+      <w:r>
+        <w:rPr>
           <w:b/>
-          <w:lang w:val="en-US"/>
-        </w:rPr>
-        <w:t xml:space="preserve">Expected deliverables. </w:t>
-      </w:r>
-      <w:r>
-        <w:rPr>
-          <w:rFonts w:ascii="Garamond" w:hAnsi="Garamond"/>
-          <w:lang w:val="en-GB"/>
-        </w:rPr>
-        <w:t>The project delivers the first multicentre RCT of PARADISE within Belgian multidisciplinary DFCs.</w:t>
-      </w:r>
-    </w:p>
-    <w:p>
-      <w:pPr>
-        <w:spacing w:after="60"/>
-        <w:jc w:val="both"/>
-        <w:rPr>
-          <w:rFonts w:ascii="Garamond" w:hAnsi="Garamond"/>
-          <w:lang w:val="en-US"/>
-        </w:rPr>
-      </w:pPr>
-      <w:r>
-        <w:rPr>
-          <w:b/>
+          <w:lang w:val="en-GB"/>
         </w:rPr>
         <w:t xml:space="preserve">Planned outputs. </w:t>
       </w:r>
@@ -5125,27 +5083,7 @@
           <w:rFonts w:ascii="Garamond" w:hAnsi="Garamond"/>
           <w:lang w:val="en-GB"/>
         </w:rPr>
-        <w:t>Six manuscripts are planned: (1) the scoping review “Patient-specific offloading insole design in diabetic foot disease”; (2) the trial protocol paper, following SPIRIT 2025 and TIDieR; (3) regional peak plantar-pressure reference values in people with diabetes, from low- and high-resolution in-shoe measurements; (4) a comparison of plantar-pressure redistribution with conventionally manufactured and 3D-printed custom-made foot orthoses, conducted outside the trial; (5) the primary effectiveness analysis of ulcer recurrence at 18 months; and (6) the pre-specified mediation analysis of footwear adherence. Timing is shown in Figure 2, and trial publications follow CONSORT.</w:t>
-      </w:r>
-      <w:proofErr w:type="spellStart"/>
-      <w:r>
-        <w:rPr>
-          <w:rFonts w:ascii="Garamond" w:hAnsi="Garamond"/>
-          <w:lang w:val="en-GB"/>
-        </w:rPr>
-      </w:r>
-      <w:proofErr w:type="spellEnd"/>
-      <w:r>
-        <w:rPr>
-          <w:rFonts w:ascii="Garamond" w:hAnsi="Garamond"/>
-          <w:lang w:val="en-GB"/>
-        </w:rPr>
-      </w:r>
-      <w:r>
-        <w:rPr>
-          <w:rFonts w:ascii="Garamond" w:hAnsi="Garamond"/>
-          <w:lang w:val="en-US"/>
-        </w:rPr>
+        <w:t>The project delivers the first multicentre RCT of PARADISE within Belgian multidisciplinary DFCs. Six manuscripts are planned: (1) the scoping review “Patient-specific offloading insole design in diabetic foot disease”; (2) the trial protocol paper, following SPIRIT 2025 and TIDieR; (3) regional peak plantar-pressure reference values in people with diabetes, from low- and high-resolution in-shoe measurements; (4) a comparison of plantar-pressure redistribution with conventionally manufactured and 3D-printed custom-made foot orthoses, conducted outside the trial; (5) the primary effectiveness analysis of ulcer recurrence at 18 months; and (6) the pre-specified mediation analysis of footwear adherence. Timing is shown in Figure 2, and trial publications follow CONSORT.</w:t>
       </w:r>
       <w:r>
         <w:rPr>
@@ -5245,10 +5183,10 @@
           <w:lang w:val="en-US"/>
         </w:rPr>
         <w:sectPr>
-          <w:headerReference w:type="default" r:id="rId15"/>
-          <w:footerReference w:type="default" r:id="rId16"/>
-          <w:headerReference w:type="first" r:id="rId17"/>
-          <w:footerReference w:type="first" r:id="rId18"/>
+          <w:headerReference w:type="default" r:id="rId14"/>
+          <w:footerReference w:type="default" r:id="rId15"/>
+          <w:headerReference w:type="first" r:id="rId16"/>
+          <w:footerReference w:type="first" r:id="rId17"/>
           <w:pgSz w:w="11906" w:h="16838"/>
           <w:pgMar w:top="1440" w:right="1080" w:bottom="1440" w:left="1080" w:header="708" w:footer="708" w:gutter="0"/>
           <w:cols w:space="708"/>
@@ -5422,6 +5360,7 @@
         <w:rPr>
           <w:sz w:val="16"/>
           <w:szCs w:val="16"/>
+          <w:lang w:val="en-GB"/>
         </w:rPr>
       </w:pPr>
       <w:r>
@@ -5445,8 +5384,27 @@
         <w:rPr>
           <w:sz w:val="16"/>
           <w:szCs w:val="16"/>
-        </w:rPr>
-        <w:t>Diabetes Care. 2013;36:4109-16.</w:t>
+          <w:lang w:val="en-GB"/>
+        </w:rPr>
+        <w:t xml:space="preserve">Diabetes Care. </w:t>
+      </w:r>
+      <w:proofErr w:type="gramStart"/>
+      <w:r>
+        <w:rPr>
+          <w:sz w:val="16"/>
+          <w:szCs w:val="16"/>
+          <w:lang w:val="en-GB"/>
+        </w:rPr>
+        <w:t>2013;36:4109</w:t>
+      </w:r>
+      <w:proofErr w:type="gramEnd"/>
+      <w:r>
+        <w:rPr>
+          <w:sz w:val="16"/>
+          <w:szCs w:val="16"/>
+          <w:lang w:val="en-GB"/>
+        </w:rPr>
+        <w:t>-16.</w:t>
       </w:r>
     </w:p>
     <w:p>
@@ -5463,6 +5421,7 @@
         <w:rPr>
           <w:sz w:val="16"/>
           <w:szCs w:val="16"/>
+          <w:lang w:val="en-GB"/>
         </w:rPr>
         <w:t>6.</w:t>
       </w:r>
@@ -5470,16 +5429,52 @@
         <w:rPr>
           <w:sz w:val="16"/>
           <w:szCs w:val="16"/>
+          <w:lang w:val="en-GB"/>
         </w:rPr>
         <w:tab/>
-        <w:t xml:space="preserve">Waaijman R, Keukenkamp R, De Haart M, Polomski WP, Nollet F, Bus SA. </w:t>
-      </w:r>
+      </w:r>
+      <w:proofErr w:type="spellStart"/>
       <w:r>
         <w:rPr>
           <w:sz w:val="16"/>
           <w:szCs w:val="16"/>
           <w:lang w:val="en-GB"/>
         </w:rPr>
+        <w:t>Waaijman</w:t>
+      </w:r>
+      <w:proofErr w:type="spellEnd"/>
+      <w:r>
+        <w:rPr>
+          <w:sz w:val="16"/>
+          <w:szCs w:val="16"/>
+          <w:lang w:val="en-GB"/>
+        </w:rPr>
+        <w:t xml:space="preserve"> R, </w:t>
+      </w:r>
+      <w:proofErr w:type="spellStart"/>
+      <w:r>
+        <w:rPr>
+          <w:sz w:val="16"/>
+          <w:szCs w:val="16"/>
+          <w:lang w:val="en-GB"/>
+        </w:rPr>
+        <w:t>Keukenkamp</w:t>
+      </w:r>
+      <w:proofErr w:type="spellEnd"/>
+      <w:r>
+        <w:rPr>
+          <w:sz w:val="16"/>
+          <w:szCs w:val="16"/>
+          <w:lang w:val="en-GB"/>
+        </w:rPr>
+        <w:t xml:space="preserve"> R, De Haart M, Polomski WP, Nollet F, Bus SA. </w:t>
+      </w:r>
+      <w:r>
+        <w:rPr>
+          <w:sz w:val="16"/>
+          <w:szCs w:val="16"/>
+          <w:lang w:val="en-GB"/>
+        </w:rPr>
         <w:t>Adherence to Wearing Prescription Custom-Made Footwear in Patients With Diabetes at High Risk for Plantar Foot Ulceration. Diabetes Care. 2013;36:1613-8.</w:t>
       </w:r>
     </w:p>
@@ -5648,15 +5643,7 @@
           <w:lang w:val="en-GB"/>
         </w:rPr>
         <w:tab/>
-        <w:t xml:space="preserve">López-Moral M, Molines-Barroso RJ, Herrera-Casamayor M, García-Madrid M, García-Morales E, Lázaro-Martínez JL. Usability of Different Methods to Assess and Improve Adherence to Therapeutic Footwear in Persons with the Diabetic Foot in </w:t>
-      </w:r>
-      <w:r>
-        <w:rPr>
-          <w:sz w:val="16"/>
-          <w:szCs w:val="16"/>
-          <w:lang w:val="en-GB"/>
-        </w:rPr>
-        <w:t>Remission. A Systematic Review. Int J Low Extrem Wounds. 2026;25:55-64.</w:t>
+        <w:t>López-Moral M, Molines-Barroso RJ, Herrera-Casamayor M, García-Madrid M, García-Morales E, Lázaro-Martínez JL. Usability of Different Methods to Assess and Improve Adherence to Therapeutic Footwear in Persons with the Diabetic Foot in Remission. A Systematic Review. Int J Low Extrem Wounds. 2026;25:55-64.</w:t>
       </w:r>
     </w:p>
     <w:p>

</xml_diff>

<commit_message>
Doctoraatsplan: zeven consistentiecorrecties na de doorloop
A4 beloofde in de kop een geintegreerde effectiviteitsanalyse die er niet staat.
A2 en de hypothese zeiden foot-ulcer recurrence terwijl het eindpunt en figuur 1
plantar zeggen. A2 heette primary clinical endpoint terwijl er nog maar een
primair eindpunt is. A1 herhaalde zijn eigen kop. De kop van sectie 5 noemde
deliverables en planned outputs als twee dingen. En een proportie kan niet
relatief aan een drempel zijn.
</commit_message>
<xml_diff>
--- a/PARADISE_provisional_doctoral_plan.docx
+++ b/PARADISE_provisional_doctoral_plan.docx
@@ -2606,7 +2606,7 @@
           <w:rFonts w:ascii="Garamond" w:hAnsi="Garamond"/>
           <w:lang w:val="en-GB"/>
         </w:rPr>
-        <w:t>In adults with diabetes and a high-risk foot, adding PARADISE to standard care (Optimal Care) will reduce biomechanical risk factors, improve objectively measured footwear adherence, and decrease 18-month foot-ulcer recurrence compared with standard care alone (Usual Care).</w:t>
+        <w:t>In adults with diabetes and a high-risk foot, adding PARADISE to standard care (Optimal Care) will reduce biomechanical risk factors, improve objectively measured footwear adherence, and decrease 18-month plantar foot-ulcer recurrence compared with standard care alone (Usual Care).</w:t>
       </w:r>
     </w:p>
     <w:p>
@@ -2688,7 +2688,7 @@
           <w:rFonts w:ascii="Garamond" w:hAnsi="Garamond"/>
           <w:lang w:val="en-GB"/>
         </w:rPr>
-        <w:t>Standardise and pilot PARADISE across six DFCs by finalising protocols, assessment procedures, workflows and documentation pathways, ensuring trial readiness.</w:t>
+        <w:t>Standardise and pilot PARADISE across six DFCs by finalising protocols, assessment procedures, workflows and documentation pathways.</w:t>
       </w:r>
     </w:p>
     <w:p>
@@ -2710,14 +2710,14 @@
           <w:b/>
           <w:lang w:val="en-US"/>
         </w:rPr>
-        <w:t xml:space="preserve">A2 — Ulcer recurrence (primary clinical endpoint). </w:t>
-      </w:r>
-      <w:r>
-        <w:rPr>
-          <w:rFonts w:ascii="Garamond" w:hAnsi="Garamond"/>
-          <w:lang w:val="en-GB"/>
-        </w:rPr>
-        <w:t>Determine whether adding PARADISE to usual care reduces 18-month foot-ulcer recurrence compared with usual care alone.</w:t>
+        <w:t xml:space="preserve">A2 — Ulcer recurrence (primary endpoint). </w:t>
+      </w:r>
+      <w:r>
+        <w:rPr>
+          <w:rFonts w:ascii="Garamond" w:hAnsi="Garamond"/>
+          <w:lang w:val="en-GB"/>
+        </w:rPr>
+        <w:t>Determine whether adding PARADISE to usual care reduces 18-month plantar foot-ulcer recurrence compared with usual care alone.</w:t>
       </w:r>
     </w:p>
     <w:p>
@@ -2823,7 +2823,7 @@
           <w:b/>
           <w:lang w:val="en-US"/>
         </w:rPr>
-        <w:t xml:space="preserve">A4 — Secondary outcomes, health impact, and integrated effectiveness analysis. </w:t>
+        <w:t xml:space="preserve">A4 — Secondary outcomes and health impact. </w:t>
       </w:r>
       <w:r>
         <w:rPr>
@@ -3557,7 +3557,7 @@
           <w:rFonts w:ascii="Garamond" w:hAnsi="Garamond"/>
           <w:lang w:val="en-GB"/>
         </w:rPr>
-        <w:t>Objectively measured footwear adherence is the pre-specified mediator, quantified as the proportion of ambulatory activity performed while wearing the prescribed footwear relative to the clinically relevant ≥80% threshold, and analysed at 12 months with the full 18-month profile reported as a secondary summary.</w:t>
+        <w:t>Objectively measured footwear adherence is the pre-specified mediator, quantified as the proportion of ambulatory activity performed while wearing the prescribed footwear, with ≥80% as the clinically relevant threshold, and analysed at 12 months with the full 18-month profile reported as a secondary summary.</w:t>
       </w:r>
       <w:r>
         <w:rPr>
@@ -5059,7 +5059,7 @@
           <w:szCs w:val="28"/>
           <w:lang w:val="en-US"/>
         </w:rPr>
-        <w:t>: deliverables, planned outputs and pre-existing data</w:t>
+        <w:t>: planned outputs and pre-existing data</w:t>
       </w:r>
     </w:p>
     <w:p>

</xml_diff>

<commit_message>
Doctoraatsplan: referentielijst stond in een Nederlandse locale
Twaalf keer e.a. in plaats van et al., geciteerd in plaats van cited, en de
Nederlandse tussenvoegsels met hoofdletter. Referentie 2 had admin-sciensano als
auteur en de titel achter de raadpleegdatum. Referentie 13 schreef dezelfde
auteur als Netten J terwijl hij elders van Netten JJ heet.
</commit_message>
<xml_diff>
--- a/PARADISE_provisional_doctoral_plan.docx
+++ b/PARADISE_provisional_doctoral_plan.docx
@@ -598,27 +598,7 @@
                 <w:bCs/>
                 <w:color w:val="20415A"/>
               </w:rPr>
-              <w:t>(</w:t>
-            </w:r>
-            <w:proofErr w:type="gramStart"/>
-            <w:r>
-              <w:rPr>
-                <w:rFonts w:ascii="Garamond" w:eastAsia="Calibri" w:hAnsi="Garamond"/>
-                <w:b/>
-                <w:bCs/>
-                <w:color w:val="20415A"/>
-              </w:rPr>
-              <w:t>for</w:t>
-            </w:r>
-            <w:proofErr w:type="gramEnd"/>
-            <w:r>
-              <w:rPr>
-                <w:rFonts w:ascii="Garamond" w:eastAsia="Calibri" w:hAnsi="Garamond"/>
-                <w:b/>
-                <w:bCs/>
-                <w:color w:val="20415A"/>
-              </w:rPr>
-              <w:t xml:space="preserve"> </w:t>
+              <w:t xml:space="preserve">(for </w:t>
             </w:r>
             <w:proofErr w:type="spellStart"/>
             <w:r>
@@ -1361,9 +1341,1164 @@
           <w:szCs w:val="28"/>
           <w:lang w:val="en-US"/>
         </w:rPr>
+        <w:t>1.  Introduction and background</w:t>
+      </w:r>
+    </w:p>
+    <w:p>
+      <w:pPr>
+        <w:spacing w:after="60"/>
+        <w:jc w:val="both"/>
+        <w:rPr>
+          <w:rFonts w:ascii="Garamond" w:hAnsi="Garamond"/>
+          <w:lang w:val="en-US"/>
+        </w:rPr>
+      </w:pPr>
+      <w:r>
+        <w:rPr>
+          <w:rFonts w:ascii="Garamond" w:hAnsi="Garamond"/>
+          <w:lang w:val="en-US"/>
+        </w:rPr>
+        <w:t>Diabetes is a growing global health burden;</w:t>
+      </w:r>
+      <w:r>
+        <w:rPr>
+          <w:rFonts w:ascii="Garamond" w:hAnsi="Garamond"/>
+          <w:lang w:val="en-US"/>
+        </w:rPr>
+        <w:fldChar w:fldCharType="begin"/>
+      </w:r>
+      <w:r>
+        <w:rPr>
+          <w:rFonts w:ascii="Garamond" w:hAnsi="Garamond"/>
+          <w:lang w:val="en-US"/>
+        </w:rPr>
+        <w:instrText xml:space="preserve"> ADDIN ZOTERO_ITEM CSL_CITATION {"citationID":"9owaccPK","properties":{"unsorted":false,"formattedCitation":"\\super 1\\nosupersub{}","plainCitation":"1","noteIndex":0},"citationItems":[{"id":60,"uris":["http://zotero.org/users/19619518/items/VKMWXAKI"],"itemData":{"id":60,"type":"article-journal","abstract":"Diabetic foot ulcers (DFUs) are a common complication of diabetes, significantly impairing patients' quality of life (QoL) and imposing a heavy economic burden. Previous reviews on the prevention of DFUs and their recurrence have indicated that educational interventions alone cannot definitively reduce the incidence of new DFUs or lower limb amputation rates and that non-pharmacological therapies using medical devices face challenges such as cost, the need for technical training, and infrastructure development. This study systematically mapped the existing literature on non-pharmacological therapies, excluding medical devices and medications. Specifically, interventions involving machinery were excluded. The aim was to identify strategies that prevent delayed progression and recurrence of diabetic foot ulcers (DFU) in patients with type 2 diabetes. The review focused on interventions with high feasibility, cost-effectiveness, and sustainability, such as patient education, behavior modification, monitoring, and multidisciplinary collaboration. These approaches are expected to contribute to the development of comprehensive and practical strategies that address current knowledge gaps, improve patient outcomes, reduce healthcare costs, and enhance the quality of life for individuals with diabetes. An exploratory review was conducted using a combination of controlled vocabulary and free text terms related to \"type 2 diabetes,\" \"ulcer,\" \"intervention,\" and \"prevention.\" Data were collected from PubMed, the Cochrane Central Register of Controlled Trials, and Ichushi-Web. Eleven studies were evaluated. The intervention methods used were face-to-face methods by healthcare professionals and methods utilizing information and communication technology (ICT). The outcome measures of the interventions varied, including changes in patients' cognitive behavior, assessment of quality of life, examination of the condition of the lower limbs, such as ulcer healing and skin condition of the feet, and evaluation of diabetes management. This review emphasizes that non-pharmacological therapies, particularly those incorporating multidisciplinary educational interventions involving nurses, may be effective in preventing diabetic foot ulcers (DFUs) and preventing their recurrence. Future research should aim to establish standardized outcome measures and evidence-based guidelines for integrating face-to-face and ICT-based multidisciplinary educational interventions.","container-title":"Cureus","DOI":"10.7759/cureus.100710","ISSN":"2168-8184","issue":"1","journalAbbreviation":"Cureus","language":"eng","page":"e100710","PMID":"41635327","PMCID":"PMC12863961","source":"PubMed","title":"Non-pharmacological Interventions for the Prevention and Progression of Diabetic Foot Ulcers in Individuals With Type 2 Diabetes Mellitus: A Scoping Review","title-short":"Non-pharmacological Interventions for the Prevention and Progression of Diabetic Foot Ulcers in Individuals With Type 2 Diabetes Mellitus","volume":"18","author":[{"family":"Kamogawa","given":"Megumi"},{"family":"Kajiwara","given":"Kohei"},{"family":"Sakuramoto","given":"Hideaki"},{"family":"Yamamoto","given":"Koji"}],"issued":{"date-parts":[["2026",1]]}}}],"schema":"https://github.com/citation-style-language/schema/raw/master/csl-citation.json"} </w:instrText>
+      </w:r>
+      <w:r>
+        <w:rPr>
+          <w:rFonts w:ascii="Garamond" w:hAnsi="Garamond"/>
+          <w:lang w:val="en-US"/>
+        </w:rPr>
+        <w:fldChar w:fldCharType="separate"/>
+      </w:r>
+      <w:r>
+        <w:rPr>
+          <w:rFonts w:ascii="Garamond" w:hAnsi="Garamond"/>
+          <w:vertAlign w:val="superscript"/>
+          <w:lang w:val="en-GB"/>
+        </w:rPr>
         <w:t>1</w:t>
       </w:r>
-      <w:proofErr w:type="gramStart"/>
+      <w:r>
+        <w:rPr>
+          <w:rFonts w:ascii="Garamond" w:hAnsi="Garamond"/>
+          <w:lang w:val="en-US"/>
+        </w:rPr>
+        <w:fldChar w:fldCharType="end"/>
+      </w:r>
+      <w:r>
+        <w:rPr>
+          <w:rFonts w:ascii="Garamond" w:hAnsi="Garamond"/>
+          <w:lang w:val="en-US"/>
+        </w:rPr>
+        <w:t xml:space="preserve"> in Belgium, diagnosed prevalence reached 7.6% in 2023 and continues to rise with an ageing population.</w:t>
+      </w:r>
+      <w:r>
+        <w:rPr>
+          <w:rFonts w:ascii="Garamond" w:hAnsi="Garamond"/>
+          <w:lang w:val="en-US"/>
+        </w:rPr>
+        <w:fldChar w:fldCharType="begin"/>
+      </w:r>
+      <w:r>
+        <w:rPr>
+          <w:rFonts w:ascii="Garamond" w:hAnsi="Garamond"/>
+          <w:lang w:val="en-US"/>
+        </w:rPr>
+        <w:instrText xml:space="preserve"> ADDIN ZOTERO_ITEM CSL_CITATION {"citationID":"QZsvqEtg","properties":{"unsorted":false,"formattedCitation":"\\super 2\\nosupersub{}","plainCitation":"2","noteIndex":0},"citationItems":[{"id":50,"uris":["http://zotero.org/users/19619518/items/K3HEZTLV"],"itemData":{"id":50,"type":"webpage","abstract":"For a healthy Belgium: indicators of health and care","container-title":"For a Healthy Belgium","language":"en-gb","title":"Diabetes","URL":"https://www.healthybelgium.be/en/health-status/non-communicable-diseases/diabetes","author":[{"family":"admin-sciensano","given":""}],"accessed":{"date-parts":[["2026",6,4]]},"issued":{"date-parts":[["2025",9,30]]}}}],"schema":"https://github.com/citation-style-language/schema/raw/master/csl-citation.json"} </w:instrText>
+      </w:r>
+      <w:r>
+        <w:rPr>
+          <w:rFonts w:ascii="Garamond" w:hAnsi="Garamond"/>
+          <w:lang w:val="en-US"/>
+        </w:rPr>
+        <w:fldChar w:fldCharType="separate"/>
+      </w:r>
+      <w:r>
+        <w:rPr>
+          <w:rFonts w:ascii="Garamond" w:hAnsi="Garamond"/>
+          <w:vertAlign w:val="superscript"/>
+          <w:lang w:val="en-GB"/>
+        </w:rPr>
+        <w:t>2</w:t>
+      </w:r>
+      <w:r>
+        <w:rPr>
+          <w:rFonts w:ascii="Garamond" w:hAnsi="Garamond"/>
+          <w:lang w:val="en-US"/>
+        </w:rPr>
+        <w:fldChar w:fldCharType="end"/>
+      </w:r>
+      <w:r>
+        <w:rPr>
+          <w:rFonts w:ascii="Garamond" w:hAnsi="Garamond"/>
+          <w:lang w:val="en-US"/>
+        </w:rPr>
+        <w:t xml:space="preserve"> Recurrent diabetic foot ulcers (DFUs) remain a leading cause of morbidity, reduced quality of life and healthcare expenditure: about 40% of healed ulcers recur within one year, </w:t>
+      </w:r>
+      <w:r>
+        <w:rPr>
+          <w:rFonts w:ascii="Garamond" w:hAnsi="Garamond"/>
+          <w:lang w:val="en-US"/>
+        </w:rPr>
+        <w:t>making recurrence prevention a central priority</w:t>
+      </w:r>
+      <w:r>
+        <w:rPr>
+          <w:rFonts w:ascii="Garamond" w:hAnsi="Garamond"/>
+          <w:lang w:val="en-US"/>
+        </w:rPr>
+        <w:t>.</w:t>
+      </w:r>
+      <w:r>
+        <w:rPr>
+          <w:rFonts w:ascii="Garamond" w:hAnsi="Garamond"/>
+          <w:lang w:val="en-US"/>
+        </w:rPr>
+        <w:fldChar w:fldCharType="begin"/>
+      </w:r>
+      <w:r>
+        <w:rPr>
+          <w:rFonts w:ascii="Garamond" w:hAnsi="Garamond"/>
+          <w:lang w:val="en-US"/>
+        </w:rPr>
+        <w:instrText xml:space="preserve"> ADDIN ZOTERO_ITEM CSL_CITATION {"citationID":"bQVpjHK6","properties":{"unsorted":false,"formattedCitation":"\\super 3,4\\nosupersub{}","plainCitation":"3,4","noteIndex":0},"citationItems":[{"id":59,"uris":["http://zotero.org/users/19619518/items/AA95SBQV"],"itemData":{"id":59,"type":"article-journal","abstract":"OBJECTIVE\n              Recurrence of plantar foot ulcers is a common and major problem in diabetes but not well understood. Foot biomechanics and patient behavior may be important. The aim was to identify risk factors for ulcer recurrence and to establish targets for ulcer prevention.\n            \n            \n              RESEARCH DESIGN AND METHODS\n              As part of a footwear trial, 171 neuropathic diabetic patients with a recently healed plantar foot ulcer and custom-made footwear were followed for 18 months or until ulceration. Demographic data, disease-related parameters, presence of minor lesions, barefoot and in-shoe plantar peak pressures, footwear adherence, and daily stride count were entered in a multivariate multilevel logistic regression model of plantar foot ulcer recurrence.\n            \n            \n              RESULTS\n              A total of 71 patients had a recurrent ulcer. Significant independent predictors were presence of minor lesions (odds ratio 9.06 [95% CI 2.98–27.57]), day-to-day variation in stride count (0.93 [0.89–0.99]), and cumulative duration of past foot ulcers (1.03 [1.00–1.06]). Significant independent predictors for those 41 recurrences suggested to be the result of unrecognized repetitive trauma were presence of minor lesions (10.95 [5.01–23.96]), in-shoe peak pressure &amp;lt;200 kPa with footwear adherence &amp;gt;80% (0.43 [0.20–0.94]), barefoot peak pressure (1.11 [1.00–1.22]), and day-to-day variation in stride count (0.91 [0.86–0.96]).\n            \n            \n              CONCLUSIONS\n              The presence of a minor lesion was clearly the strongest predictor, while recommended use of adequately offloading footwear was a strong protector against ulcer recurrence from unrecognized repetitive trauma. These outcomes define clear targets for diabetic foot screening and ulcer prevention.","container-title":"Diabetes Care","DOI":"10.2337/dc13-2470","ISSN":"0149-5992, 1935-5548","issue":"6","language":"en","page":"1697-1705","source":"DOI.org (Crossref)","title":"Risk Factors for Plantar Foot Ulcer Recurrence in Neuropathic Diabetic Patients","volume":"37","author":[{"family":"Waaijman","given":"Roelof"},{"family":"De Haart","given":"Mirjam"},{"family":"Arts","given":"Mark L.J."},{"family":"Wever","given":"Daniel"},{"family":"Verlouw","given":"Anke J.W.E."},{"family":"Nollet","given":"Frans"},{"family":"Bus","given":"Sicco A."}],"issued":{"date-parts":[["2014",6,1]]}}},{"id":58,"uris":["http://zotero.org/users/19619518/items/BNUN34AS"],"itemData":{"id":58,"type":"article-journal","abstract":"Background: Diabetic foot disease is a public health problem. The challenges of its management lie in the complexity of wound healing and, in particular, the high rate of lesion recurrence. Objectives: The primary objective of the study was to evaluate whether optimized post-healing follow-up by a multidisciplinary team can reduce the recurrence rate of foot ulcers in people living with diabetes. The secondary objectives were to assess patient needs in terms of hospitalization for recurrence, the number of amputations, pedicure care, and the use of adapted footwear. Participants: The study included 129 patients with diabetes presenting a healed foot ulcer. A total of 38 patients underwent an annual post-healing follow-up visit with a multidisciplinary team (optimized follow-up), while 91 had a visit every 2 years (minimum follow-up). Results: Of the 38 patients with optimal follow-up, 8 presented a wound recurrence (21.1%) compared with 38 out of 91 patients (41.8%) receiving minimum follow-up. The recurrence rate decreased significantly between the two groups (p &lt; 0.05). The use of adapted shoes was also significantly better in the group with optimized follow-up (p = 0.02). Conclusions: Regular post-healing follow-up with a multidisciplinary team seems to be a contributing factor to reducing the recurrence of diabetic foot ulcers among people living with diabetes.","container-title":"Journal of Clinical Medicine","DOI":"10.3390/jcm14144975","ISSN":"2077-0383","issue":"14","journalAbbreviation":"JCM","language":"en","page":"4975","source":"DOI.org (Crossref)","title":"The Post-Healing Follow-Up of Diabetic Foot Ulcers by a Multidisciplinary Team to Reduce Their Recurrence: An Observational Retrospective Study","title-short":"The Post-Healing Follow-Up of Diabetic Foot Ulcers by a Multidisciplinary Team to Reduce Their Recurrence","volume":"14","author":[{"family":"Bouly","given":"Marie"},{"family":"Laborne","given":"Francois-Xavier"},{"family":"Tourte","given":"Caroline"},{"family":"Henry","given":"Elodie"},{"family":"Penfornis","given":"Alfred"},{"family":"Dardari","given":"Dured"}],"issued":{"date-parts":[["2025",7,14]]}}}],"schema":"https://github.com/citation-style-language/schema/raw/master/csl-citation.json"} </w:instrText>
+      </w:r>
+      <w:r>
+        <w:rPr>
+          <w:rFonts w:ascii="Garamond" w:hAnsi="Garamond"/>
+          <w:lang w:val="en-US"/>
+        </w:rPr>
+        <w:fldChar w:fldCharType="separate"/>
+      </w:r>
+      <w:r>
+        <w:rPr>
+          <w:rFonts w:ascii="Garamond" w:hAnsi="Garamond"/>
+          <w:vertAlign w:val="superscript"/>
+          <w:lang w:val="en-GB"/>
+        </w:rPr>
+        <w:t>3,4</w:t>
+      </w:r>
+      <w:r>
+        <w:rPr>
+          <w:rFonts w:ascii="Garamond" w:hAnsi="Garamond"/>
+          <w:lang w:val="en-US"/>
+        </w:rPr>
+        <w:fldChar w:fldCharType="end"/>
+      </w:r>
+    </w:p>
+    <w:p>
+      <w:pPr>
+        <w:spacing w:after="60"/>
+        <w:jc w:val="both"/>
+        <w:rPr>
+          <w:rFonts w:ascii="Garamond" w:hAnsi="Garamond"/>
+          <w:lang w:val="en-US"/>
+        </w:rPr>
+      </w:pPr>
+      <w:r>
+        <w:rPr>
+          <w:rFonts w:ascii="Garamond" w:hAnsi="Garamond"/>
+          <w:lang w:val="en-US"/>
+        </w:rPr>
+        <w:t xml:space="preserve">In Belgium, high-risk patients are managed within multidisciplinary Diabetic Foot Clinics (DFCs) </w:t>
+      </w:r>
+      <w:proofErr w:type="spellStart"/>
+      <w:r>
+        <w:rPr>
+          <w:rFonts w:ascii="Garamond" w:hAnsi="Garamond"/>
+          <w:lang w:val="en-US"/>
+        </w:rPr>
+        <w:t>recognised</w:t>
+      </w:r>
+      <w:proofErr w:type="spellEnd"/>
+      <w:r>
+        <w:rPr>
+          <w:rFonts w:ascii="Garamond" w:hAnsi="Garamond"/>
+          <w:lang w:val="en-US"/>
+        </w:rPr>
+        <w:t xml:space="preserve"> by the national health insurer (RIZIV–INAMI). Although this model provides </w:t>
+      </w:r>
+      <w:proofErr w:type="spellStart"/>
+      <w:r>
+        <w:rPr>
+          <w:rFonts w:ascii="Garamond" w:hAnsi="Garamond"/>
+          <w:lang w:val="en-US"/>
+        </w:rPr>
+        <w:t>specialised</w:t>
+      </w:r>
+      <w:proofErr w:type="spellEnd"/>
+      <w:r>
+        <w:rPr>
+          <w:rFonts w:ascii="Garamond" w:hAnsi="Garamond"/>
+          <w:lang w:val="en-US"/>
+        </w:rPr>
+        <w:t xml:space="preserve"> care, a persistent gap remains between evidence-based prevention and routine practice: pressure-</w:t>
+      </w:r>
+      <w:proofErr w:type="spellStart"/>
+      <w:r>
+        <w:rPr>
+          <w:rFonts w:ascii="Garamond" w:hAnsi="Garamond"/>
+          <w:lang w:val="en-US"/>
+        </w:rPr>
+        <w:t>optimised</w:t>
+      </w:r>
+      <w:proofErr w:type="spellEnd"/>
+      <w:r>
+        <w:rPr>
+          <w:rFonts w:ascii="Garamond" w:hAnsi="Garamond"/>
+          <w:lang w:val="en-US"/>
+        </w:rPr>
+        <w:t xml:space="preserve"> therapeutic footwear and objective adherence monitoring have demonstrated value separately, but are not systematically integrated into Belgian diabetic-foot pathways.</w:t>
+      </w:r>
+      <w:r>
+        <w:rPr>
+          <w:rFonts w:ascii="Garamond" w:hAnsi="Garamond"/>
+          <w:lang w:val="en-US"/>
+        </w:rPr>
+        <w:fldChar w:fldCharType="begin"/>
+      </w:r>
+      <w:r>
+        <w:rPr>
+          <w:rFonts w:ascii="Garamond" w:hAnsi="Garamond"/>
+          <w:lang w:val="en-US"/>
+        </w:rPr>
+        <w:instrText xml:space="preserve"> ADDIN ZOTERO_ITEM CSL_CITATION {"citationID":"W0QB53aM","properties":{"unsorted":false,"formattedCitation":"\\super 5\\nosupersub{}","plainCitation":"5","noteIndex":0},"citationItems":[{"id":48,"uris":["http://zotero.org/users/19619518/items/HQRWT4X4"],"itemData":{"id":48,"type":"article-journal","abstract":"OBJECTIVE\n              Custom-made footwear is the treatment of choice to prevent foot ulcer recurrence in diabetes. This footwear primarily aims to offload plantar regions at high ulcer risk. However, ulcer recurrence rates are high. We assessed the effect of offloading-improved custom-made footwear and the role of footwear adherence on plantar foot ulcer recurrence.\n            \n            \n              RESEARCH DESIGN AND METHODS\n              We randomly assigned 171 neuropathic diabetic patients with a recently healed plantar foot ulcer to custom-made footwear with improved and subsequently preserved offloading (</w:instrText>
+      </w:r>
+      <w:r>
+        <w:rPr>
+          <w:rFonts w:ascii="Cambria Math" w:hAnsi="Cambria Math" w:cs="Cambria Math"/>
+          <w:lang w:val="en-US"/>
+        </w:rPr>
+        <w:instrText>∼</w:instrText>
+      </w:r>
+      <w:r>
+        <w:rPr>
+          <w:rFonts w:ascii="Garamond" w:hAnsi="Garamond"/>
+          <w:lang w:val="en-US"/>
+        </w:rPr>
+        <w:instrText xml:space="preserve">20% peak pressure relief by modifying the footwear) or to usual care (i.e., nonimproved custom-made footwear). Primary outcome was plantar foot ulcer recurrence in 18 months. Secondary outcome was ulcer recurrence in patients with an objectively measured adherence of </w:instrText>
+      </w:r>
+      <w:r>
+        <w:rPr>
+          <w:rFonts w:ascii="Garamond" w:hAnsi="Garamond" w:cs="Garamond"/>
+          <w:lang w:val="en-US"/>
+        </w:rPr>
+        <w:instrText>≥</w:instrText>
+      </w:r>
+      <w:r>
+        <w:rPr>
+          <w:rFonts w:ascii="Garamond" w:hAnsi="Garamond"/>
+          <w:lang w:val="en-US"/>
+        </w:rPr>
+        <w:instrText xml:space="preserve">80% of steps taken.\n            \n            \n              RESULTS\n              On the basis of intention-to-treat, 33 of 85 patients (38.8%) with improved footwear and 38 of 86 patients (44.2%) with usual care had a recurrent ulcer (relative risk −11%, odds ratio 0.80 [95% CI 0.44–1.47], P = 0.48). Ulcer-free survival curves were not significantly different between groups (P = 0.40). In the 79 patients (46% of total group) with high adherence, 9 of 35 (25.7%) with improved footwear and 21 of 44 (47.8%) with usual care had a recurrent ulcer (relative risk −46%, odds ratio 0.38 [0.15–0.99], P = 0.045).\n            \n            \n              CONCLUSIONS\n              Offloading-improved custom-made footwear does not significantly reduce the incidence of plantar foot ulcer recurrence in diabetes compared with custom-made footwear that does not undergo such improvement, unless it is worn as recommended.","container-title":"Diabetes Care","DOI":"10.2337/dc13-0996","ISSN":"0149-5992, 1935-5548","issue":"12","language":"en","page":"4109-4116","source":"DOI.org (Crossref)","title":"Effect of Custom-Made Footwear on Foot Ulcer Recurrence in Diabetes","volume":"36","author":[{"family":"Bus","given":"Sicco A."},{"family":"Waaijman","given":"Roelof"},{"family":"Arts","given":"Mark"},{"family":"De Haart","given":"Mirjam"},{"family":"Busch-Westbroek","given":"Tessa"},{"family":"Van Baal","given":"Jeff"},{"family":"Nollet","given":"Frans"}],"issued":{"date-parts":[["2013",12,1]]}}}],"schema":"https://github.com/citation-style-language/schema/raw/master/csl-citation.json"} </w:instrText>
+      </w:r>
+      <w:r>
+        <w:rPr>
+          <w:rFonts w:ascii="Garamond" w:hAnsi="Garamond"/>
+          <w:lang w:val="en-US"/>
+        </w:rPr>
+        <w:fldChar w:fldCharType="separate"/>
+      </w:r>
+      <w:r>
+        <w:rPr>
+          <w:rFonts w:ascii="Garamond" w:hAnsi="Garamond"/>
+          <w:vertAlign w:val="superscript"/>
+          <w:lang w:val="en-GB"/>
+        </w:rPr>
+        <w:t>5</w:t>
+      </w:r>
+      <w:r>
+        <w:rPr>
+          <w:rFonts w:ascii="Garamond" w:hAnsi="Garamond"/>
+          <w:lang w:val="en-US"/>
+        </w:rPr>
+        <w:fldChar w:fldCharType="end"/>
+      </w:r>
+    </w:p>
+    <w:p>
+      <w:pPr>
+        <w:spacing w:after="60"/>
+        <w:jc w:val="both"/>
+        <w:rPr>
+          <w:rFonts w:ascii="Garamond" w:hAnsi="Garamond"/>
+          <w:lang w:val="en-US"/>
+        </w:rPr>
+      </w:pPr>
+      <w:r>
+        <w:rPr>
+          <w:rFonts w:ascii="Garamond" w:hAnsi="Garamond"/>
+          <w:lang w:val="en-GB"/>
+        </w:rPr>
+        <w:t>Adherence remains a major barrier: objective monitoring shows that patients spend approximately 29% of their steps outside prescribed footwear, while only a minority achieve the ≥80% threshold associated with improved outcomes</w:t>
+      </w:r>
+      <w:r>
+        <w:rPr>
+          <w:rFonts w:ascii="Garamond" w:hAnsi="Garamond"/>
+          <w:lang w:val="en-US"/>
+        </w:rPr>
+        <w:t>.</w:t>
+      </w:r>
+      <w:r>
+        <w:rPr>
+          <w:rFonts w:ascii="Garamond" w:hAnsi="Garamond"/>
+          <w:lang w:val="en-US"/>
+        </w:rPr>
+        <w:fldChar w:fldCharType="begin"/>
+      </w:r>
+      <w:r>
+        <w:rPr>
+          <w:rFonts w:ascii="Garamond" w:hAnsi="Garamond"/>
+          <w:lang w:val="en-US"/>
+        </w:rPr>
+        <w:instrText xml:space="preserve"> ADDIN ZOTERO_ITEM CSL_CITATION {"citationID":"nPBM9hoA","properties":{"unsorted":false,"formattedCitation":"\\super 6\\nosupersub{}","plainCitation":"6","noteIndex":0},"citationItems":[{"id":16,"uris":["http://zotero.org/users/19619518/items/PZIVAKCP"],"itemData":{"id":16,"type":"article-journal","abstract":"OBJECTIVE\n              Prescription custom-made footwear can only be effective in preventing diabetic foot ulcers if worn by the patient. Particularly, the high prevalence of recurrent foot ulcers focuses the attention on adherence, for which objective data are nonexisting. We objectively assessed adherence in patients with high risk of ulcer recurrence and evaluated what determines adherence.\n            \n            \n              RESEARCH DESIGN AND METHODS\n              In 107 patients with diabetes, neuropathy, a recently healed plantar foot ulcer, and custom-made footwear, footwear use was measured during 7 consecutive days using a shoe-worn, temperature-based monitor. Daily step count was measured simultaneously using an ankle-worn activity monitor. Patients logged time away from home. Adherence was calculated as the percentage of steps that prescription footwear was worn. Determinants of adherence were evaluated in multivariate linear regression analysis.\n            \n            \n              RESULTS\n              Mean ± SD adherence was 71 ± 25%. Adherence at home was 61 ± 32%, over 3,959 ± 2,594 steps, and away from home 87 ± 26%, over 2,604 ± 2,507 steps. In 35 patients with low adherence (&amp;lt;60%), adherence at home was 28 ± 24%. Lower BMI, more severe foot deformity, and more appealing footwear were significantly associated with higher adherence.\n            \n            \n              CONCLUSIONS\n              The results show that adherence to wearing custom-made footwear is insufficient, particularly at home where patients exhibit their largest walking activity. This low adherence is a major threat for reulceration. These objective findings provide directions for improvement in adherence, which could include prescribing specific off-loading footwear for indoors, and they set a reference for future comparative research on footwear adherence in diabetes.","container-title":"Diabetes Care","DOI":"10.2337/dc12-1330","ISSN":"0149-5992, 1935-5548","issue":"6","language":"en","page":"1613-1618","source":"DOI.org (Crossref)","title":"Adherence to Wearing Prescription Custom-Made Footwear in Patients With Diabetes at High Risk for Plantar Foot Ulceration","volume":"36","author":[{"family":"Waaijman","given":"Roelof"},{"family":"Keukenkamp","given":"Renske"},{"family":"De Haart","given":"Mirjam"},{"family":"Polomski","given":"Wojtek P."},{"family":"Nollet","given":"Frans"},{"family":"Bus","given":"Sicco A."}],"issued":{"date-parts":[["2013",6,1]]}}}],"schema":"https://github.com/citation-style-language/schema/raw/master/csl-citation.json"} </w:instrText>
+      </w:r>
+      <w:r>
+        <w:rPr>
+          <w:rFonts w:ascii="Garamond" w:hAnsi="Garamond"/>
+          <w:lang w:val="en-US"/>
+        </w:rPr>
+        <w:fldChar w:fldCharType="separate"/>
+      </w:r>
+      <w:r>
+        <w:rPr>
+          <w:rFonts w:ascii="Garamond" w:hAnsi="Garamond"/>
+          <w:vertAlign w:val="superscript"/>
+          <w:lang w:val="en-GB"/>
+        </w:rPr>
+        <w:t>6</w:t>
+      </w:r>
+      <w:r>
+        <w:rPr>
+          <w:rFonts w:ascii="Garamond" w:hAnsi="Garamond"/>
+          <w:lang w:val="en-US"/>
+        </w:rPr>
+        <w:fldChar w:fldCharType="end"/>
+      </w:r>
+      <w:r>
+        <w:rPr>
+          <w:rFonts w:ascii="Garamond" w:hAnsi="Garamond"/>
+          <w:lang w:val="en-US"/>
+        </w:rPr>
+        <w:t xml:space="preserve"> Existing education strategies</w:t>
+      </w:r>
+      <w:r>
+        <w:rPr>
+          <w:rFonts w:ascii="Garamond" w:hAnsi="Garamond"/>
+          <w:lang w:val="en-US"/>
+        </w:rPr>
+        <w:t xml:space="preserve"> </w:t>
+      </w:r>
+      <w:proofErr w:type="spellStart"/>
+      <w:r>
+        <w:rPr>
+          <w:rFonts w:ascii="Garamond" w:hAnsi="Garamond"/>
+          <w:lang w:val="en-US"/>
+        </w:rPr>
+        <w:t>prioritise</w:t>
+      </w:r>
+      <w:proofErr w:type="spellEnd"/>
+      <w:r>
+        <w:rPr>
+          <w:rFonts w:ascii="Garamond" w:hAnsi="Garamond"/>
+          <w:lang w:val="en-US"/>
+        </w:rPr>
+        <w:t xml:space="preserve"> knowledge transfer over sustained </w:t>
+      </w:r>
+      <w:proofErr w:type="spellStart"/>
+      <w:r>
+        <w:rPr>
+          <w:rFonts w:ascii="Garamond" w:hAnsi="Garamond"/>
+          <w:lang w:val="en-US"/>
+        </w:rPr>
+        <w:t>behavioural</w:t>
+      </w:r>
+      <w:proofErr w:type="spellEnd"/>
+      <w:r>
+        <w:rPr>
+          <w:rFonts w:ascii="Garamond" w:hAnsi="Garamond"/>
+          <w:lang w:val="en-US"/>
+        </w:rPr>
+        <w:t xml:space="preserve"> change, and objective adherence data are seldom fed back into </w:t>
+      </w:r>
+      <w:proofErr w:type="spellStart"/>
+      <w:r>
+        <w:rPr>
+          <w:rFonts w:ascii="Garamond" w:hAnsi="Garamond"/>
+          <w:lang w:val="en-US"/>
+        </w:rPr>
+        <w:t>personalised</w:t>
+      </w:r>
+      <w:proofErr w:type="spellEnd"/>
+      <w:r>
+        <w:rPr>
+          <w:rFonts w:ascii="Garamond" w:hAnsi="Garamond"/>
+          <w:lang w:val="en-US"/>
+        </w:rPr>
+        <w:t xml:space="preserve"> or clinical decision-making.</w:t>
+      </w:r>
+      <w:r>
+        <w:rPr>
+          <w:rFonts w:ascii="Garamond" w:hAnsi="Garamond"/>
+          <w:lang w:val="en-US"/>
+        </w:rPr>
+        <w:fldChar w:fldCharType="begin"/>
+      </w:r>
+      <w:r>
+        <w:rPr>
+          <w:rFonts w:ascii="Garamond" w:hAnsi="Garamond"/>
+          <w:lang w:val="en-US"/>
+        </w:rPr>
+        <w:instrText xml:space="preserve"> ADDIN ZOTERO_ITEM CSL_CITATION {"citationID":"b21m0kgR","properties":{"unsorted":false,"formattedCitation":"\\super 7\\nosupersub{}","plainCitation":"7","noteIndex":0},"citationItems":[{"id":56,"uris":["http://zotero.org/users/19619518/items/6DZPFUHJ"],"itemData":{"id":56,"type":"article-journal","abstract":"Abstract\n            \n              Background\n              Orthopaedic footwear can only be effective in preventing diabetic foot ulcers if worn by the patient. Robust data on long</w:instrText>
+      </w:r>
+      <w:r>
+        <w:rPr>
+          <w:rFonts w:ascii="Cambria Math" w:hAnsi="Cambria Math" w:cs="Cambria Math"/>
+          <w:lang w:val="en-US"/>
+        </w:rPr>
+        <w:instrText>‐</w:instrText>
+      </w:r>
+      <w:r>
+        <w:rPr>
+          <w:rFonts w:ascii="Garamond" w:hAnsi="Garamond"/>
+          <w:lang w:val="en-US"/>
+        </w:rPr>
+        <w:instrText>term wearing time of orthopaedic footwear are not available, and needed to gain more insights into wearing patterns and associated factors (i.e. participants' demographic, disease</w:instrText>
+      </w:r>
+      <w:r>
+        <w:rPr>
+          <w:rFonts w:ascii="Cambria Math" w:hAnsi="Cambria Math" w:cs="Cambria Math"/>
+          <w:lang w:val="en-US"/>
+        </w:rPr>
+        <w:instrText>‐</w:instrText>
+      </w:r>
+      <w:r>
+        <w:rPr>
+          <w:rFonts w:ascii="Garamond" w:hAnsi="Garamond"/>
+          <w:lang w:val="en-US"/>
+        </w:rPr>
+        <w:instrText>related characteristics, and footwear usability). We aimed to objectively assess long</w:instrText>
+      </w:r>
+      <w:r>
+        <w:rPr>
+          <w:rFonts w:ascii="Cambria Math" w:hAnsi="Cambria Math" w:cs="Cambria Math"/>
+          <w:lang w:val="en-US"/>
+        </w:rPr>
+        <w:instrText>‐</w:instrText>
+      </w:r>
+      <w:r>
+        <w:rPr>
+          <w:rFonts w:ascii="Garamond" w:hAnsi="Garamond"/>
+          <w:lang w:val="en-US"/>
+        </w:rPr>
+        <w:instrText>term wearing patterns and identify factors associated with wearing orthopaedic footwear in people with diabetes at moderate</w:instrText>
+      </w:r>
+      <w:r>
+        <w:rPr>
+          <w:rFonts w:ascii="Cambria Math" w:hAnsi="Cambria Math" w:cs="Cambria Math"/>
+          <w:lang w:val="en-US"/>
+        </w:rPr>
+        <w:instrText>‐</w:instrText>
+      </w:r>
+      <w:r>
+        <w:rPr>
+          <w:rFonts w:ascii="Garamond" w:hAnsi="Garamond"/>
+          <w:lang w:val="en-US"/>
+        </w:rPr>
+        <w:instrText>to</w:instrText>
+      </w:r>
+      <w:r>
+        <w:rPr>
+          <w:rFonts w:ascii="Cambria Math" w:hAnsi="Cambria Math" w:cs="Cambria Math"/>
+          <w:lang w:val="en-US"/>
+        </w:rPr>
+        <w:instrText>‐</w:instrText>
+      </w:r>
+      <w:r>
+        <w:rPr>
+          <w:rFonts w:ascii="Garamond" w:hAnsi="Garamond"/>
+          <w:lang w:val="en-US"/>
+        </w:rPr>
+        <w:instrText>high risk of ulceration.\n            \n            \n              Methods\n              People diagnosed with diabetes mellitus type 1 and 2 with loss of protective sensation and/or peripheral artery disease and prescribed with orthopaedic footwear were included and followed for 12</w:instrText>
+      </w:r>
+      <w:r>
+        <w:rPr>
+          <w:rFonts w:ascii="Garamond" w:hAnsi="Garamond" w:cs="Garamond"/>
+          <w:lang w:val="en-US"/>
+        </w:rPr>
+        <w:instrText> </w:instrText>
+      </w:r>
+      <w:r>
+        <w:rPr>
+          <w:rFonts w:ascii="Garamond" w:hAnsi="Garamond"/>
+          <w:lang w:val="en-US"/>
+        </w:rPr>
+        <w:instrText>months. The primary outcome was mean daily wearing time, continuously measured using a temperature sensor inside the footwear (Orthotimer®). Adherence to wearing orthopaedic footwear was calculated as percentage of wearing time of a total assumed 16 h out</w:instrText>
+      </w:r>
+      <w:r>
+        <w:rPr>
+          <w:rFonts w:ascii="Cambria Math" w:hAnsi="Cambria Math" w:cs="Cambria Math"/>
+          <w:lang w:val="en-US"/>
+        </w:rPr>
+        <w:instrText>‐</w:instrText>
+      </w:r>
+      <w:r>
+        <w:rPr>
+          <w:rFonts w:ascii="Garamond" w:hAnsi="Garamond"/>
+          <w:lang w:val="en-US"/>
+        </w:rPr>
+        <w:instrText>of</w:instrText>
+      </w:r>
+      <w:r>
+        <w:rPr>
+          <w:rFonts w:ascii="Cambria Math" w:hAnsi="Cambria Math" w:cs="Cambria Math"/>
+          <w:lang w:val="en-US"/>
+        </w:rPr>
+        <w:instrText>‐</w:instrText>
+      </w:r>
+      <w:r>
+        <w:rPr>
+          <w:rFonts w:ascii="Garamond" w:hAnsi="Garamond"/>
+          <w:lang w:val="en-US"/>
+        </w:rPr>
+        <w:instrText>bed daytime, where adherence</w:instrText>
+      </w:r>
+      <w:r>
+        <w:rPr>
+          <w:lang w:val="en-US"/>
+        </w:rPr>
+        <w:instrText> </w:instrText>
+      </w:r>
+      <w:r>
+        <w:rPr>
+          <w:rFonts w:ascii="Garamond" w:hAnsi="Garamond"/>
+          <w:lang w:val="en-US"/>
+        </w:rPr>
+        <w:instrText>&lt;</w:instrText>
+      </w:r>
+      <w:r>
+        <w:rPr>
+          <w:lang w:val="en-US"/>
+        </w:rPr>
+        <w:instrText> </w:instrText>
+      </w:r>
+      <w:r>
+        <w:rPr>
+          <w:rFonts w:ascii="Garamond" w:hAnsi="Garamond"/>
+          <w:lang w:val="en-US"/>
+        </w:rPr>
+        <w:instrText>60% was a pre</w:instrText>
+      </w:r>
+      <w:r>
+        <w:rPr>
+          <w:rFonts w:ascii="Cambria Math" w:hAnsi="Cambria Math" w:cs="Cambria Math"/>
+          <w:lang w:val="en-US"/>
+        </w:rPr>
+        <w:instrText>‐</w:instrText>
+      </w:r>
+      <w:r>
+        <w:rPr>
+          <w:rFonts w:ascii="Garamond" w:hAnsi="Garamond"/>
+          <w:lang w:val="en-US"/>
+        </w:rPr>
+        <w:instrText>determined non</w:instrText>
+      </w:r>
+      <w:r>
+        <w:rPr>
+          <w:rFonts w:ascii="Cambria Math" w:hAnsi="Cambria Math" w:cs="Cambria Math"/>
+          <w:lang w:val="en-US"/>
+        </w:rPr>
+        <w:instrText>‐</w:instrText>
+      </w:r>
+      <w:r>
+        <w:rPr>
+          <w:rFonts w:ascii="Garamond" w:hAnsi="Garamond"/>
+          <w:lang w:val="en-US"/>
+        </w:rPr>
+        <w:instrText>adherent threshold. Wearing time patterns were assessed by calculating participants' wearing (in)consistency. One</w:instrText>
+      </w:r>
+      <w:r>
+        <w:rPr>
+          <w:rFonts w:ascii="Cambria Math" w:hAnsi="Cambria Math" w:cs="Cambria Math"/>
+          <w:lang w:val="en-US"/>
+        </w:rPr>
+        <w:instrText>‐</w:instrText>
+      </w:r>
+      <w:r>
+        <w:rPr>
+          <w:rFonts w:ascii="Garamond" w:hAnsi="Garamond"/>
+          <w:lang w:val="en-US"/>
+        </w:rPr>
+        <w:instrText xml:space="preserve">way analyses of variance tested for wearing time differences between subgroups, weekdays, and weekend days. Factors potentially associated with wearing time were collected by questionnaires and medical files. Univariately associated factors were included in multivariate linear regression analysis.\n            \n            \n              Results\n              \n                Sixty one participants were included (mean (SD) age: 68.0 (7.4) years; females:\n                n\n                </w:instrText>
+      </w:r>
+      <w:r>
+        <w:rPr>
+          <w:lang w:val="en-US"/>
+        </w:rPr>
+        <w:instrText> </w:instrText>
+      </w:r>
+      <w:r>
+        <w:rPr>
+          <w:rFonts w:ascii="Garamond" w:hAnsi="Garamond"/>
+          <w:lang w:val="en-US"/>
+        </w:rPr>
+        <w:instrText>=</w:instrText>
+      </w:r>
+      <w:r>
+        <w:rPr>
+          <w:lang w:val="en-US"/>
+        </w:rPr>
+        <w:instrText> </w:instrText>
+      </w:r>
+      <w:r>
+        <w:rPr>
+          <w:rFonts w:ascii="Garamond" w:hAnsi="Garamond"/>
+          <w:lang w:val="en-US"/>
+        </w:rPr>
+        <w:instrText xml:space="preserve">17; type 2 diabetes mellitus:\n                n\n                </w:instrText>
+      </w:r>
+      <w:r>
+        <w:rPr>
+          <w:lang w:val="en-US"/>
+        </w:rPr>
+        <w:instrText> </w:instrText>
+      </w:r>
+      <w:r>
+        <w:rPr>
+          <w:rFonts w:ascii="Garamond" w:hAnsi="Garamond"/>
+          <w:lang w:val="en-US"/>
+        </w:rPr>
+        <w:instrText>=</w:instrText>
+      </w:r>
+      <w:r>
+        <w:rPr>
+          <w:lang w:val="en-US"/>
+        </w:rPr>
+        <w:instrText> </w:instrText>
+      </w:r>
+      <w:r>
+        <w:rPr>
+          <w:rFonts w:ascii="Garamond" w:hAnsi="Garamond"/>
+          <w:lang w:val="en-US"/>
+        </w:rPr>
+        <w:instrText>54). Mean (SD) overall daily wearing time was 8.3 (6.1) hours/day. A total of 40 (66%) participants were non</w:instrText>
+      </w:r>
+      <w:r>
+        <w:rPr>
+          <w:rFonts w:ascii="Cambria Math" w:hAnsi="Cambria Math" w:cs="Cambria Math"/>
+          <w:lang w:val="en-US"/>
+        </w:rPr>
+        <w:instrText>‐</w:instrText>
+      </w:r>
+      <w:r>
+        <w:rPr>
+          <w:rFonts w:ascii="Garamond" w:hAnsi="Garamond"/>
+          <w:lang w:val="en-US"/>
+        </w:rPr>
+        <w:instrText xml:space="preserve">adherent. Participants with a consistent wearing pattern showed higher daily wearing times than participants with an inconsistent pattern. Mean (SD) wearing times were 12.7 (4.3) vs 3.6 (4.8) hours/day, respectively (\n                P\n                </w:instrText>
+      </w:r>
+      <w:r>
+        <w:rPr>
+          <w:lang w:val="en-US"/>
+        </w:rPr>
+        <w:instrText> </w:instrText>
+      </w:r>
+      <w:r>
+        <w:rPr>
+          <w:rFonts w:ascii="Garamond" w:hAnsi="Garamond"/>
+          <w:lang w:val="en-US"/>
+        </w:rPr>
+        <w:instrText>&lt;</w:instrText>
+      </w:r>
+      <w:r>
+        <w:rPr>
+          <w:lang w:val="en-US"/>
+        </w:rPr>
+        <w:instrText> </w:instrText>
+      </w:r>
+      <w:r>
+        <w:rPr>
+          <w:rFonts w:ascii="Garamond" w:hAnsi="Garamond"/>
+          <w:lang w:val="en-US"/>
+        </w:rPr>
+        <w:instrText xml:space="preserve">0.001). Mean (SD) wearing time was significantly higher (\n                P\n                </w:instrText>
+      </w:r>
+      <w:r>
+        <w:rPr>
+          <w:lang w:val="en-US"/>
+        </w:rPr>
+        <w:instrText> </w:instrText>
+      </w:r>
+      <w:r>
+        <w:rPr>
+          <w:rFonts w:ascii="Garamond" w:hAnsi="Garamond"/>
+          <w:lang w:val="en-US"/>
+        </w:rPr>
+        <w:instrText>&lt;</w:instrText>
+      </w:r>
+      <w:r>
+        <w:rPr>
+          <w:lang w:val="en-US"/>
+        </w:rPr>
+        <w:instrText> </w:instrText>
+      </w:r>
+      <w:r>
+        <w:rPr>
+          <w:rFonts w:ascii="Garamond" w:hAnsi="Garamond"/>
+          <w:lang w:val="en-US"/>
+        </w:rPr>
+        <w:instrText xml:space="preserve">0.010) during weekdays (8.7 (6.0) hours/day) compared to Saturday (8.0 (6.1) hours/day) and Sunday (6.9 (6.2) hours/day). In the multivariate model (R\n                2\n                </w:instrText>
+      </w:r>
+      <w:r>
+        <w:rPr>
+          <w:lang w:val="en-US"/>
+        </w:rPr>
+        <w:instrText> </w:instrText>
+      </w:r>
+      <w:r>
+        <w:rPr>
+          <w:rFonts w:ascii="Garamond" w:hAnsi="Garamond"/>
+          <w:lang w:val="en-US"/>
+        </w:rPr>
+        <w:instrText>=</w:instrText>
+      </w:r>
+      <w:r>
+        <w:rPr>
+          <w:lang w:val="en-US"/>
+        </w:rPr>
+        <w:instrText> </w:instrText>
+      </w:r>
+      <w:r>
+        <w:rPr>
+          <w:rFonts w:ascii="Garamond" w:hAnsi="Garamond"/>
+          <w:lang w:val="en-US"/>
+        </w:rPr>
+        <w:instrText xml:space="preserve">0.28), </w:instrText>
+      </w:r>
+      <w:r>
+        <w:rPr>
+          <w:rFonts w:ascii="Garamond" w:hAnsi="Garamond" w:cs="Garamond"/>
+          <w:lang w:val="en-US"/>
+        </w:rPr>
+        <w:instrText>“</w:instrText>
+      </w:r>
+      <w:r>
+        <w:rPr>
+          <w:rFonts w:ascii="Garamond" w:hAnsi="Garamond"/>
+          <w:lang w:val="en-US"/>
+        </w:rPr>
+        <w:instrText>satisfaction with my wear of orthopaedic footwear</w:instrText>
+      </w:r>
+      <w:r>
+        <w:rPr>
+          <w:rFonts w:ascii="Garamond" w:hAnsi="Garamond" w:cs="Garamond"/>
+          <w:lang w:val="en-US"/>
+        </w:rPr>
+        <w:instrText>”</w:instrText>
+      </w:r>
+      <w:r>
+        <w:rPr>
+          <w:rFonts w:ascii="Garamond" w:hAnsi="Garamond"/>
+          <w:lang w:val="en-US"/>
+        </w:rPr>
+        <w:instrText xml:space="preserve"> was positively associated (\n                P\n                </w:instrText>
+      </w:r>
+      <w:r>
+        <w:rPr>
+          <w:lang w:val="en-US"/>
+        </w:rPr>
+        <w:instrText> </w:instrText>
+      </w:r>
+      <w:r>
+        <w:rPr>
+          <w:rFonts w:ascii="Garamond" w:hAnsi="Garamond"/>
+          <w:lang w:val="en-US"/>
+        </w:rPr>
+        <w:instrText>&lt;</w:instrText>
+      </w:r>
+      <w:r>
+        <w:rPr>
+          <w:lang w:val="en-US"/>
+        </w:rPr>
+        <w:instrText> </w:instrText>
+      </w:r>
+      <w:r>
+        <w:rPr>
+          <w:rFonts w:ascii="Garamond" w:hAnsi="Garamond"/>
+          <w:lang w:val="en-US"/>
+        </w:rPr>
+        <w:instrText>0.001) with wearing time. The other seven multivariate model factors (four demographic variables and three footwear usability variables) were not associated with wearing time.\n              \n            \n            \n              Conclusions\n              Only one out of three people at moderate to high risk of foot ulceration were sufficiently adherent to wearing their orthopaedic footwear. Changing people's wearing behaviour to a more stable pattern seems a potential avenue to improve long</w:instrText>
+      </w:r>
+      <w:r>
+        <w:rPr>
+          <w:rFonts w:ascii="Cambria Math" w:hAnsi="Cambria Math" w:cs="Cambria Math"/>
+          <w:lang w:val="en-US"/>
+        </w:rPr>
+        <w:instrText>‐</w:instrText>
+      </w:r>
+      <w:r>
+        <w:rPr>
+          <w:rFonts w:ascii="Garamond" w:hAnsi="Garamond"/>
+          <w:lang w:val="en-US"/>
+        </w:rPr>
+        <w:instrText>term adherence to wearing orthopaedic footwear. Investigated factors are not associated with daily wearing time. Based on these factors the daily wearing time cannot be estimated in daily practice.\n            \n            \n              Trial registration\n              Netherlands Trial Register NL7710. Registered: 6</w:instrText>
+      </w:r>
+      <w:r>
+        <w:rPr>
+          <w:rFonts w:ascii="Garamond" w:hAnsi="Garamond" w:cs="Garamond"/>
+          <w:lang w:val="en-US"/>
+        </w:rPr>
+        <w:instrText> </w:instrText>
+      </w:r>
+      <w:r>
+        <w:rPr>
+          <w:rFonts w:ascii="Garamond" w:hAnsi="Garamond"/>
+          <w:lang w:val="en-US"/>
+        </w:rPr>
+        <w:instrText>May 2019.","container-title":"Journal of Foot and Ankle Research","DOI":"10.1186/s13047-023-00656-6","ISSN":"1757-1146, 1757-1146","issue":"1","journalAbbreviation":"Journal of Foot and Ankle Research","language":"en","license":"http://creativecommons.org/licenses/by/4.0/","page":"60","source":"DOI.org (Crossref)","title":"Objectively assessed long</w:instrText>
+      </w:r>
+      <w:r>
+        <w:rPr>
+          <w:rFonts w:ascii="Cambria Math" w:hAnsi="Cambria Math" w:cs="Cambria Math"/>
+          <w:lang w:val="en-US"/>
+        </w:rPr>
+        <w:instrText>‐</w:instrText>
+      </w:r>
+      <w:r>
+        <w:rPr>
+          <w:rFonts w:ascii="Garamond" w:hAnsi="Garamond"/>
+          <w:lang w:val="en-US"/>
+        </w:rPr>
+        <w:instrText>term wearing patterns and predictors of wearing orthopaedic footwear in people with diabetes at moderate</w:instrText>
+      </w:r>
+      <w:r>
+        <w:rPr>
+          <w:rFonts w:ascii="Cambria Math" w:hAnsi="Cambria Math" w:cs="Cambria Math"/>
+          <w:lang w:val="en-US"/>
+        </w:rPr>
+        <w:instrText>‐</w:instrText>
+      </w:r>
+      <w:r>
+        <w:rPr>
+          <w:rFonts w:ascii="Garamond" w:hAnsi="Garamond"/>
+          <w:lang w:val="en-US"/>
+        </w:rPr>
+        <w:instrText>to</w:instrText>
+      </w:r>
+      <w:r>
+        <w:rPr>
+          <w:rFonts w:ascii="Cambria Math" w:hAnsi="Cambria Math" w:cs="Cambria Math"/>
+          <w:lang w:val="en-US"/>
+        </w:rPr>
+        <w:instrText>‐</w:instrText>
+      </w:r>
+      <w:r>
+        <w:rPr>
+          <w:rFonts w:ascii="Garamond" w:hAnsi="Garamond"/>
+          <w:lang w:val="en-US"/>
+        </w:rPr>
+        <w:instrText>high risk of foot ulceration: a 12 months observational study","title-short":"Objectively assessed long</w:instrText>
+      </w:r>
+      <w:r>
+        <w:rPr>
+          <w:rFonts w:ascii="Cambria Math" w:hAnsi="Cambria Math" w:cs="Cambria Math"/>
+          <w:lang w:val="en-US"/>
+        </w:rPr>
+        <w:instrText>‐</w:instrText>
+      </w:r>
+      <w:r>
+        <w:rPr>
+          <w:rFonts w:ascii="Garamond" w:hAnsi="Garamond"/>
+          <w:lang w:val="en-US"/>
+        </w:rPr>
+        <w:instrText>term wearing patterns and predictors of wearing orthopaedic footwear in people with diabetes at moderate</w:instrText>
+      </w:r>
+      <w:r>
+        <w:rPr>
+          <w:rFonts w:ascii="Cambria Math" w:hAnsi="Cambria Math" w:cs="Cambria Math"/>
+          <w:lang w:val="en-US"/>
+        </w:rPr>
+        <w:instrText>‐</w:instrText>
+      </w:r>
+      <w:r>
+        <w:rPr>
+          <w:rFonts w:ascii="Garamond" w:hAnsi="Garamond"/>
+          <w:lang w:val="en-US"/>
+        </w:rPr>
+        <w:instrText>to</w:instrText>
+      </w:r>
+      <w:r>
+        <w:rPr>
+          <w:rFonts w:ascii="Cambria Math" w:hAnsi="Cambria Math" w:cs="Cambria Math"/>
+          <w:lang w:val="en-US"/>
+        </w:rPr>
+        <w:instrText>‐</w:instrText>
+      </w:r>
+      <w:r>
+        <w:rPr>
+          <w:rFonts w:ascii="Garamond" w:hAnsi="Garamond"/>
+          <w:lang w:val="en-US"/>
+        </w:rPr>
+        <w:instrText>high risk of foot ulceration","volume":"16","author":[{"family":"Exterkate","given":"Stein H."},{"family":"Jongebloed</w:instrText>
+      </w:r>
+      <w:r>
+        <w:rPr>
+          <w:rFonts w:ascii="Cambria Math" w:hAnsi="Cambria Math" w:cs="Cambria Math"/>
+          <w:lang w:val="en-US"/>
+        </w:rPr>
+        <w:instrText>‐</w:instrText>
+      </w:r>
+      <w:r>
+        <w:rPr>
+          <w:rFonts w:ascii="Garamond" w:hAnsi="Garamond"/>
+          <w:lang w:val="en-US"/>
+        </w:rPr>
+        <w:instrText>Westra","given":"Manon"},{"family":"Ten Klooster","given":"Peter M."},{"family":"Koffijberg","given":"Hendrik"},{"family":"Bode","given":"Christina"},{"family":"Van Gemert</w:instrText>
+      </w:r>
+      <w:r>
+        <w:rPr>
+          <w:rFonts w:ascii="Cambria Math" w:hAnsi="Cambria Math" w:cs="Cambria Math"/>
+          <w:lang w:val="en-US"/>
+        </w:rPr>
+        <w:instrText>‐</w:instrText>
+      </w:r>
+      <w:r>
+        <w:rPr>
+          <w:rFonts w:ascii="Garamond" w:hAnsi="Garamond"/>
+          <w:lang w:val="en-US"/>
+        </w:rPr>
+        <w:instrText xml:space="preserve">Pijnen","given":"Julia E. W. C."},{"family":"Van Baal","given":"Josephus G."},{"family":"Van Netten","given":"Jaap J."}],"issued":{"date-parts":[["2023",1]]}}}],"schema":"https://github.com/citation-style-language/schema/raw/master/csl-citation.json"} </w:instrText>
+      </w:r>
+      <w:r>
+        <w:rPr>
+          <w:rFonts w:ascii="Garamond" w:hAnsi="Garamond"/>
+          <w:lang w:val="en-US"/>
+        </w:rPr>
+        <w:fldChar w:fldCharType="separate"/>
+      </w:r>
+      <w:r>
+        <w:rPr>
+          <w:rFonts w:ascii="Garamond" w:hAnsi="Garamond"/>
+          <w:vertAlign w:val="superscript"/>
+          <w:lang w:val="en-GB"/>
+        </w:rPr>
+        <w:t>7</w:t>
+      </w:r>
+      <w:r>
+        <w:rPr>
+          <w:rFonts w:ascii="Garamond" w:hAnsi="Garamond"/>
+          <w:lang w:val="en-US"/>
+        </w:rPr>
+        <w:fldChar w:fldCharType="end"/>
+      </w:r>
+    </w:p>
+    <w:p>
+      <w:pPr>
+        <w:spacing w:after="60"/>
+        <w:jc w:val="both"/>
+        <w:rPr>
+          <w:rFonts w:ascii="Garamond" w:hAnsi="Garamond"/>
+          <w:lang w:val="en-US"/>
+        </w:rPr>
+      </w:pPr>
+      <w:r>
+        <w:rPr>
+          <w:rFonts w:ascii="Garamond" w:hAnsi="Garamond"/>
+          <w:lang w:val="en-GB"/>
+        </w:rPr>
+        <w:lastRenderedPageBreak/>
+        <w:t>PARADISE (Pressure-, Adherence-, and Education-Driven Service) addresses this translational gap through an integrated intervention combining pressure-guided optimisation of therapeutic footwear and foot orthoses, structured education on adequate foot care and footwear use, and sensor-based adherence monitoring.</w:t>
+      </w:r>
+      <w:r>
+        <w:rPr>
+          <w:rFonts w:ascii="Garamond" w:hAnsi="Garamond"/>
+          <w:lang w:val="en-GB"/>
+        </w:rPr>
+        <w:t xml:space="preserve"> </w:t>
+      </w:r>
+      <w:r>
+        <w:rPr>
+          <w:rFonts w:ascii="Garamond" w:hAnsi="Garamond"/>
+          <w:lang w:val="en-GB"/>
+        </w:rPr>
+        <w:t>Education and behavioural support are delivered as two distinct components within the Structured Education and Behavioural Intervention Approach (SEBIA): education addresses knowledge and skills for adequate foot care and for the prescribed orthoses, while behavioural support draws on motivational interviewing, solution-focused brief therapy and behaviour change wheel principles, among other evidence-based behavioural change methods, to identify and address individual barriers</w:t>
+      </w:r>
+      <w:r>
+        <w:rPr>
+          <w:rFonts w:ascii="Garamond" w:hAnsi="Garamond"/>
+          <w:lang w:val="en-US"/>
+        </w:rPr>
+        <w:t>.</w:t>
+      </w:r>
+      <w:r>
+        <w:rPr>
+          <w:rFonts w:ascii="Garamond" w:hAnsi="Garamond"/>
+          <w:lang w:val="en-US"/>
+        </w:rPr>
+        <w:fldChar w:fldCharType="begin"/>
+      </w:r>
+      <w:r>
+        <w:rPr>
+          <w:rFonts w:ascii="Garamond" w:hAnsi="Garamond"/>
+          <w:lang w:val="en-US"/>
+        </w:rPr>
+        <w:instrText xml:space="preserve"> ADDIN ZOTERO_ITEM CSL_CITATION {"citationID":"TILrK4jz","properties":{"unsorted":false,"formattedCitation":"\\super 5,8\\uc0\\u8211{}10\\nosupersub{}","plainCitation":"5,8–10","noteIndex":0},"citationItems":[{"id":48,"uris":["http://zotero.org/users/19619518/items/HQRWT4X4"],"itemData":{"id":48,"type":"article-journal","abstract":"OBJECTIVE\n              Custom-made footwear is the treatment of choice to prevent foot ulcer recurrence in diabetes. This footwear primarily aims to offload plantar regions at high ulcer risk. However, ulcer recurrence rates are high. We assessed the effect of offloading-improved custom-made footwear and the role of footwear adherence on plantar foot ulcer recurrence.\n            \n            \n              RESEARCH DESIGN AND METHODS\n              We randomly assigned 171 neuropathic diabetic patients with a recently healed plantar foot ulcer to custom-made footwear with improved and subsequently preserved offloading (</w:instrText>
+      </w:r>
+      <w:r>
+        <w:rPr>
+          <w:rFonts w:ascii="Cambria Math" w:hAnsi="Cambria Math" w:cs="Cambria Math"/>
+          <w:lang w:val="en-US"/>
+        </w:rPr>
+        <w:instrText>∼</w:instrText>
+      </w:r>
+      <w:r>
+        <w:rPr>
+          <w:rFonts w:ascii="Garamond" w:hAnsi="Garamond"/>
+          <w:lang w:val="en-US"/>
+        </w:rPr>
+        <w:instrText xml:space="preserve">20% peak pressure relief by modifying the footwear) or to usual care (i.e., nonimproved custom-made footwear). Primary outcome was plantar foot ulcer recurrence in 18 months. Secondary outcome was ulcer recurrence in patients with an objectively measured adherence of </w:instrText>
+      </w:r>
+      <w:r>
+        <w:rPr>
+          <w:rFonts w:ascii="Garamond" w:hAnsi="Garamond" w:cs="Garamond"/>
+          <w:lang w:val="en-US"/>
+        </w:rPr>
+        <w:instrText>≥</w:instrText>
+      </w:r>
+      <w:r>
+        <w:rPr>
+          <w:rFonts w:ascii="Garamond" w:hAnsi="Garamond"/>
+          <w:lang w:val="en-US"/>
+        </w:rPr>
+        <w:instrText xml:space="preserve">80% of steps taken.\n            \n            \n              RESULTS\n              On the basis of intention-to-treat, 33 of 85 patients (38.8%) with improved footwear and 38 of 86 patients (44.2%) with usual care had a recurrent ulcer (relative risk −11%, odds ratio 0.80 [95% CI 0.44–1.47], P = 0.48). Ulcer-free survival curves were not significantly different between groups (P = 0.40). In the 79 patients (46% of total group) with high adherence, 9 of 35 (25.7%) with improved footwear and 21 of 44 (47.8%) with usual care had a recurrent ulcer (relative risk −46%, odds ratio 0.38 [0.15–0.99], P = 0.045).\n            \n            \n              CONCLUSIONS\n              Offloading-improved custom-made footwear does not significantly reduce the incidence of plantar foot ulcer recurrence in diabetes compared with custom-made footwear that does not undergo such improvement, unless it is worn as recommended.","container-title":"Diabetes Care","DOI":"10.2337/dc13-0996","ISSN":"0149-5992, 1935-5548","issue":"12","language":"en","page":"4109-4116","source":"DOI.org (Crossref)","title":"Effect of Custom-Made Footwear on Foot Ulcer Recurrence in Diabetes","volume":"36","author":[{"family":"Bus","given":"Sicco A."},{"family":"Waaijman","given":"Roelof"},{"family":"Arts","given":"Mark"},{"family":"De Haart","given":"Mirjam"},{"family":"Busch-Westbroek","given":"Tessa"},{"family":"Van Baal","given":"Jeff"},{"family":"Nollet","given":"Frans"}],"issued":{"date-parts":[["2013",12,1]]}}},{"id":15,"uris":["http://zotero.org/users/19619518/items/BJNTEA29"],"itemData":{"id":15,"type":"article-journal","container-title":"European Journal of Vascular and Endovascular Surgery","DOI":"10.1016/j.ejvs.2020.03.053","ISSN":"10785884","issue":"2","journalAbbreviation":"European Journal of Vascular and Endovascular Surgery","language":"en","page":"282-292","source":"DOI.org (Crossref)","title":"A Systematic Review of the Impact of Foot Care Education on Self Efficacy and Self Care in Patients With Diabetes","volume":"60","author":[{"family":"Goodall","given":"Richard J."},{"family":"Ellauzi","given":"Juan"},{"family":"Tan","given":"Matthew K.H."},{"family":"Onida","given":"Sarah"},{"family":"Davies","given":"Alun H."},{"family":"Shalhoub","given":"Joseph"}],"issued":{"date-parts":[["2020",8]]}}},{"id":14,"uris":["http://zotero.org/users/19619518/items/54DKJVW9"],"itemData":{"id":14,"type":"article-journal","container-title":"Implementation Science","DOI":"10.1186/1748-5908-6-42","ISSN":"1748-5908","issue":"1","journalAbbreviation":"Implementation Sci","language":"en","license":"http://www.springer.com/tdm","page":"42","source":"DOI.org (Crossref)","title":"The behaviour change wheel: A new method for characterising and designing behaviour change interventions","title-short":"The behaviour change wheel","volume":"6","author":[{"family":"Michie","given":"Susan"},{"family":"Van Stralen","given":"Maartje M"},{"family":"West","given":"Robert"}],"issued":{"date-parts":[["2011",12]]}}},{"id":13,"uris":["http://zotero.org/users/19619518/items/ZEQZLJXL"],"itemData":{"id":13,"type":"article-journal","container-title":"Annals of Behavioral Medicine","DOI":"10.1007/s12160-013-9486-6","ISSN":"0883-6612, 1532-4796","issue":"1","journalAbbreviation":"ann. behav. med.","language":"en","page":"81-95","source":"DOI.org (Crossref)","title":"The Behavior Change Technique Taxonomy (v1) of 93 Hierarchically Clustered Techniques: Building an International Consensus for the Reporting of Behavior Change Interventions","title-short":"The Behavior Change Technique Taxonomy (v1) of 93 Hierarchically Clustered Techniques","volume":"46","author":[{"family":"Michie","given":"Susan"},{"family":"Richardson","given":"Michelle"},{"family":"Johnston","given":"Marie"},{"family":"Abraham","given":"Charles"},{"family":"Francis","given":"Jill"},{"family":"Hardeman","given":"Wendy"},{"family":"Eccles","given":"Martin P."},{"family":"Cane","given":"James"},{"family":"Wood","given":"Caroline E."}],"issued":{"date-parts":[["2013",8]]}}}],"schema":"https://github.com/citation-style-language/schema/raw/master/csl-citation.json"} </w:instrText>
+      </w:r>
+      <w:r>
+        <w:rPr>
+          <w:rFonts w:ascii="Garamond" w:hAnsi="Garamond"/>
+          <w:lang w:val="en-US"/>
+        </w:rPr>
+        <w:fldChar w:fldCharType="separate"/>
+      </w:r>
+      <w:r>
+        <w:rPr>
+          <w:rFonts w:ascii="Garamond" w:hAnsi="Garamond"/>
+          <w:vertAlign w:val="superscript"/>
+          <w:lang w:val="en-GB"/>
+        </w:rPr>
+        <w:t>5,8–10</w:t>
+      </w:r>
+      <w:r>
+        <w:rPr>
+          <w:rFonts w:ascii="Garamond" w:hAnsi="Garamond"/>
+          <w:lang w:val="en-US"/>
+        </w:rPr>
+        <w:fldChar w:fldCharType="end"/>
+      </w:r>
+    </w:p>
+    <w:p>
+      <w:pPr>
+        <w:spacing w:after="60"/>
+        <w:jc w:val="both"/>
+        <w:rPr>
+          <w:rFonts w:ascii="Garamond" w:hAnsi="Garamond"/>
+          <w:lang w:val="en-US"/>
+        </w:rPr>
+      </w:pPr>
+      <w:r>
+        <w:rPr>
+          <w:rFonts w:ascii="Garamond" w:hAnsi="Garamond"/>
+          <w:lang w:val="en-GB"/>
+        </w:rPr>
+        <w:t>PARADISE has been piloted in one Belgian DFC but has not yet undergone large-scale clinical validation. A Dutch precursor combining education, motivational interviewing, and adherence monitoring demonstrated feasibility</w:t>
+      </w:r>
+      <w:r>
+        <w:rPr>
+          <w:rFonts w:ascii="Garamond" w:hAnsi="Garamond"/>
+          <w:lang w:val="en-GB"/>
+        </w:rPr>
+        <w:t xml:space="preserve">, </w:t>
+      </w:r>
+      <w:r>
+        <w:rPr>
+          <w:rFonts w:ascii="Garamond" w:hAnsi="Garamond"/>
+          <w:lang w:val="en-GB"/>
+        </w:rPr>
+        <w:t>but showed limited effects on overall wear time after three months, with improvements mainly observed for indoor footwear use.</w:t>
+      </w:r>
+      <w:r>
+        <w:rPr>
+          <w:rFonts w:ascii="Garamond" w:hAnsi="Garamond"/>
+          <w:lang w:val="en-US"/>
+        </w:rPr>
+        <w:fldChar w:fldCharType="begin"/>
+      </w:r>
+      <w:r>
+        <w:rPr>
+          <w:rFonts w:ascii="Garamond" w:hAnsi="Garamond"/>
+          <w:lang w:val="en-US"/>
+        </w:rPr>
+        <w:instrText xml:space="preserve"> ADDIN ZOTERO_ITEM CSL_CITATION {"citationID":"ZwJskDOt","properties":{"unsorted":false,"formattedCitation":"\\super 11\\nosupersub{}","plainCitation":"11","noteIndex":0},"citationItems":[{"id":52,"uris":["http://zotero.org/users/19619518/items/NSK33Z7U"],"itemData":{"id":52,"type":"article-journal","abstract":"Background: Wearing custom-made footwear is key in diabetes-related foot ulcer prevention. However, adhering to wearing footwear is challenging, in particular at home. Evidence-based interventions with proven effect are needed, but scarce. We developed a multi-modal intervention to improve custom-made footwear use, and investigated short-term efficacy. Methods: We used a multidisciplinary multiphase approach to develop a three-modality intervention: structured education, motivational interviewing, and custom-made indoor footwear. To assess efficacy, we measured mean 2-week wearing time of custom-made footwear with a validated sensor, at baseline and after three months (primary outcome), and in the two weeks directly before and after each modality was administered (secondary outcomes). We assessed differences between timepoints using within-subjects paired t-tests. Results: 53 participants with high risk for ulceration were included: 30 with low [&lt;8 h/day] baseline adherence), 17% females, mean age 66 (SD: 10) years, all with peripheral neuropathy and a recent foot ulcer (mean time since healing: 6 (SD: 9) months). Wearing time increased non-significantly from 4.0 (SD: 2.5) at baseline to 5.5 (SD: 4.3) after three months in the low adherence group (p = 0.068); this was 11.9 (SD: 2.3) to 12.0 (SD: 2.8) in the high adherence group (p = 0.898). Following provision of indoor footwear, wearing time increased significantly for low baseline adherence (∆2.7 h/day (95% CI: 1.0–4.4; p = 0.004) and high baseline adherence (∆2.0 h/day (95% CI: 0.5–3.4; p = 0.010). Following structured education, wearing time increased non-significantly in those with low baseline adherence (∆1.0 h/day (95% CI: −0.2–2.2; p = 0.098). Following motivational interviewing, wearing time remained similar in both groups. Conclusions: The multi-modal intervention program combining structured education, motivational interviewing and custom-made indoor footwear did not result in a statistically significant improvement in the wearing time of custom-made footwear after three months. However, significant improvements followed the provision of indoor footwear, and clinically relevant improvements followed structured education in people with low adherence, providing avenues for implementation and research.","container-title":"Journal of Clinical Medicine","DOI":"10.3390/jcm14113635","ISSN":"2077-0383","issue":"11","journalAbbreviation":"JCM","language":"en","page":"3635","source":"DOI.org (Crossref)","title":"Short-Term Efficacy of a Multi-Modal Intervention Program to Improve Custom-Made Footwear Use in People at High Risk of Diabetes-Related Foot Ulceration","volume":"14","author":[{"family":"Van Netten","given":"Jaap J."},{"family":"Vossen","given":"Lisa E."},{"family":"Driebergen","given":"Faye M."},{"family":"Wolthuis","given":"Danne"},{"family":"Merkx","given":"Maarten J. M."},{"family":"Bus","given":"Sicco A."}],"issued":{"date-parts":[["2025",5,22]]}}}],"schema":"https://github.com/citation-style-language/schema/raw/master/csl-citation.json"} </w:instrText>
+      </w:r>
+      <w:r>
+        <w:rPr>
+          <w:rFonts w:ascii="Garamond" w:hAnsi="Garamond"/>
+          <w:lang w:val="en-US"/>
+        </w:rPr>
+        <w:fldChar w:fldCharType="separate"/>
+      </w:r>
+      <w:r>
+        <w:rPr>
+          <w:rFonts w:ascii="Garamond" w:hAnsi="Garamond"/>
+          <w:vertAlign w:val="superscript"/>
+          <w:lang w:val="en-GB"/>
+        </w:rPr>
+        <w:t>11</w:t>
+      </w:r>
+      <w:r>
+        <w:rPr>
+          <w:rFonts w:ascii="Garamond" w:hAnsi="Garamond"/>
+          <w:lang w:val="en-US"/>
+        </w:rPr>
+        <w:fldChar w:fldCharType="end"/>
+      </w:r>
+      <w:r>
+        <w:rPr>
+          <w:rFonts w:ascii="Garamond" w:hAnsi="Garamond"/>
+          <w:lang w:val="en-US"/>
+        </w:rPr>
+        <w:t xml:space="preserve"> </w:t>
+      </w:r>
+      <w:r>
+        <w:rPr>
+          <w:rFonts w:ascii="Garamond" w:hAnsi="Garamond"/>
+          <w:lang w:val="en-GB"/>
+        </w:rPr>
+        <w:t>PARADISE extends this approach through personalised behavioural feedback, prolonged follow-up, and integration into routine Belgian multidisciplinary care. This doctoral project will evaluate the clinical effectiveness of PARADISE within Belgian DFCs.</w:t>
+      </w:r>
+    </w:p>
+    <w:p>
+      <w:pPr>
+        <w:pBdr>
+          <w:bottom w:val="single" w:sz="6" w:space="2" w:color="2A7F8E"/>
+        </w:pBdr>
+        <w:spacing w:after="60"/>
+        <w:rPr>
+          <w:rFonts w:ascii="Garamond" w:hAnsi="Garamond"/>
+          <w:sz w:val="28"/>
+          <w:szCs w:val="28"/>
+          <w:lang w:val="en-US"/>
+        </w:rPr>
+      </w:pPr>
       <w:r>
         <w:rPr>
           <w:rFonts w:ascii="Garamond" w:eastAsia="Calibri" w:hAnsi="Garamond"/>
@@ -1374,9 +2509,317 @@
           <w:szCs w:val="28"/>
           <w:lang w:val="en-US"/>
         </w:rPr>
-        <w:t>.  Introduction</w:t>
-      </w:r>
-      <w:proofErr w:type="gramEnd"/>
+        <w:t>2.  General hypothesis and specific aims</w:t>
+      </w:r>
+    </w:p>
+    <w:p>
+      <w:pPr>
+        <w:spacing w:after="60"/>
+        <w:jc w:val="both"/>
+        <w:rPr>
+          <w:rFonts w:ascii="Garamond" w:hAnsi="Garamond"/>
+          <w:lang w:val="en-GB"/>
+        </w:rPr>
+      </w:pPr>
+      <w:r>
+        <w:rPr>
+          <w:rFonts w:ascii="Garamond" w:hAnsi="Garamond"/>
+          <w:b/>
+          <w:lang w:val="en-US"/>
+        </w:rPr>
+        <w:t xml:space="preserve">General hypothesis. </w:t>
+      </w:r>
+      <w:r>
+        <w:rPr>
+          <w:rFonts w:ascii="Garamond" w:hAnsi="Garamond"/>
+          <w:lang w:val="en-GB"/>
+        </w:rPr>
+        <w:t>In adults with diabetes and a high-risk foot, adding PARADISE to standard care (Optimal Care) will reduce biomechanical risk factors, improve objectively measured footwear adherence, and decrease 18-month plantar foot-ulcer recurrence compared with standard care alone (Usual Care).</w:t>
+      </w:r>
+    </w:p>
+    <w:p>
+      <w:pPr>
+        <w:spacing w:after="60"/>
+        <w:jc w:val="both"/>
+        <w:rPr>
+          <w:rFonts w:ascii="Garamond" w:hAnsi="Garamond"/>
+          <w:lang w:val="en-GB"/>
+        </w:rPr>
+      </w:pPr>
+      <w:r>
+        <w:rPr>
+          <w:rFonts w:ascii="Garamond" w:hAnsi="Garamond"/>
+          <w:b/>
+          <w:bCs/>
+          <w:color w:val="1B2A33"/>
+          <w:lang w:val="en-US"/>
+        </w:rPr>
+        <w:t>Specific aims</w:t>
+      </w:r>
+    </w:p>
+    <w:p>
+      <w:pPr>
+        <w:numPr>
+          <w:ilvl w:val="0"/>
+          <w:numId w:val="9"/>
+        </w:numPr>
+        <w:spacing w:after="60"/>
+        <w:jc w:val="both"/>
+        <w:rPr>
+          <w:rFonts w:ascii="Garamond" w:eastAsia="Arial" w:hAnsi="Garamond"/>
+          <w:lang w:val="en-US"/>
+        </w:rPr>
+      </w:pPr>
+      <w:r>
+        <w:rPr>
+          <w:rFonts w:ascii="Garamond" w:hAnsi="Garamond"/>
+          <w:b/>
+          <w:lang w:val="en-US"/>
+        </w:rPr>
+        <w:t xml:space="preserve">A1 — Trial </w:t>
+      </w:r>
+      <w:proofErr w:type="spellStart"/>
+      <w:r>
+        <w:rPr>
+          <w:rFonts w:ascii="Garamond" w:hAnsi="Garamond"/>
+          <w:b/>
+          <w:lang w:val="en-US"/>
+        </w:rPr>
+        <w:t>operationalisation</w:t>
+      </w:r>
+      <w:proofErr w:type="spellEnd"/>
+      <w:r>
+        <w:rPr>
+          <w:rFonts w:ascii="Garamond" w:hAnsi="Garamond"/>
+          <w:b/>
+          <w:lang w:val="en-US"/>
+        </w:rPr>
+        <w:t xml:space="preserve"> and site </w:t>
+      </w:r>
+      <w:r>
+        <w:rPr>
+          <w:rFonts w:ascii="Garamond" w:hAnsi="Garamond"/>
+          <w:b/>
+          <w:lang w:val="en-US"/>
+        </w:rPr>
+        <w:t>readiness.</w:t>
+      </w:r>
+      <w:r>
+        <w:rPr>
+          <w:rFonts w:ascii="Garamond" w:hAnsi="Garamond"/>
+          <w:lang w:val="en-GB"/>
+        </w:rPr>
+        <w:t xml:space="preserve"> </w:t>
+      </w:r>
+      <w:r>
+        <w:rPr>
+          <w:rFonts w:ascii="Garamond" w:hAnsi="Garamond"/>
+          <w:lang w:val="en-GB"/>
+        </w:rPr>
+        <w:t>Standardise and pilot PARADISE across six DFCs by finalising protocols, assessment procedures, workflows and documentation pathways.</w:t>
+      </w:r>
+    </w:p>
+    <w:p>
+      <w:pPr>
+        <w:numPr>
+          <w:ilvl w:val="0"/>
+          <w:numId w:val="9"/>
+        </w:numPr>
+        <w:spacing w:after="60"/>
+        <w:jc w:val="both"/>
+        <w:rPr>
+          <w:rFonts w:ascii="Garamond" w:eastAsia="Arial" w:hAnsi="Garamond"/>
+          <w:lang w:val="en-US"/>
+        </w:rPr>
+      </w:pPr>
+      <w:r>
+        <w:rPr>
+          <w:rFonts w:ascii="Garamond" w:hAnsi="Garamond"/>
+          <w:b/>
+          <w:lang w:val="en-US"/>
+        </w:rPr>
+        <w:t xml:space="preserve">A2 — Ulcer recurrence (primary endpoint). </w:t>
+      </w:r>
+      <w:r>
+        <w:rPr>
+          <w:rFonts w:ascii="Garamond" w:hAnsi="Garamond"/>
+          <w:lang w:val="en-GB"/>
+        </w:rPr>
+        <w:t>Determine whether adding PARADISE to usual care reduces 18-month plantar foot-ulcer recurrence compared with usual care alone.</w:t>
+      </w:r>
+    </w:p>
+    <w:p>
+      <w:pPr>
+        <w:numPr>
+          <w:ilvl w:val="0"/>
+          <w:numId w:val="9"/>
+        </w:numPr>
+        <w:spacing w:after="60"/>
+        <w:jc w:val="both"/>
+        <w:rPr>
+          <w:rFonts w:ascii="Garamond" w:eastAsia="Arial" w:hAnsi="Garamond"/>
+          <w:lang w:val="en-US"/>
+        </w:rPr>
+      </w:pPr>
+      <w:r>
+        <w:rPr>
+          <w:rFonts w:ascii="Garamond" w:hAnsi="Garamond"/>
+          <w:b/>
+          <w:lang w:val="en-US"/>
+        </w:rPr>
+        <w:t xml:space="preserve">A3 — Mechanistic pathway (pre-specified mediation). </w:t>
+      </w:r>
+      <w:r>
+        <w:rPr>
+          <w:rFonts w:ascii="Garamond" w:hAnsi="Garamond"/>
+          <w:lang w:val="en-GB"/>
+        </w:rPr>
+        <w:t>Determine whether PARADISE reduces in-shoe peak plantar pressure and raises objectively measured footwear adherence beyond the clinically relevant ≥80% threshold, and whether adherence mediates the effect of PARADISE on ulcer recurrence</w:t>
+      </w:r>
+      <w:r>
+        <w:rPr>
+          <w:rFonts w:ascii="Garamond" w:hAnsi="Garamond"/>
+          <w:lang w:val="en-US"/>
+        </w:rPr>
+        <w:t>.</w:t>
+      </w:r>
+      <w:r>
+        <w:rPr>
+          <w:rFonts w:ascii="Garamond" w:hAnsi="Garamond"/>
+          <w:lang w:val="en-US"/>
+        </w:rPr>
+        <w:fldChar w:fldCharType="begin"/>
+      </w:r>
+      <w:r>
+        <w:rPr>
+          <w:rFonts w:ascii="Garamond" w:hAnsi="Garamond"/>
+          <w:lang w:val="en-US"/>
+        </w:rPr>
+        <w:instrText xml:space="preserve"> ADDIN ZOTERO_ITEM CSL_CITATION {"citationID":"UqqWZ1M2","properties":{"unsorted":false,"formattedCitation":"\\super 6\\nosupersub{}","plainCitation":"6","noteIndex":0},"citationItems":[{"id":16,"uris":["http://zotero.org/users/19619518/items/PZIVAKCP"],"itemData":{"id":16,"type":"article-journal","abstract":"OBJECTIVE\n              Prescription custom-made footwear can only be effective in preventing diabetic foot ulcers if worn by the patient. Particularly, the high prevalence of recurrent foot ulcers focuses the attention on adherence, for which objective data are nonexisting. We objectively assessed adherence in patients with high risk of ulcer recurrence and evaluated what determines adherence.\n            \n            \n              RESEARCH DESIGN AND METHODS\n              In 107 patients with diabetes, neuropathy, a recently healed plantar foot ulcer, and custom-made footwear, footwear use was measured during 7 consecutive days using a shoe-worn, temperature-based monitor. Daily step count was measured simultaneously using an ankle-worn activity monitor. Patients logged time away from home. Adherence was calculated as the percentage of steps that prescription footwear was worn. Determinants of adherence were evaluated in multivariate linear regression analysis.\n            \n            \n              RESULTS\n              Mean ± SD adherence was 71 ± 25%. Adherence at home was 61 ± 32%, over 3,959 ± 2,594 steps, and away from home 87 ± 26%, over 2,604 ± 2,507 steps. In 35 patients with low adherence (&amp;lt;60%), adherence at home was 28 ± 24%. Lower BMI, more severe foot deformity, and more appealing footwear were significantly associated with higher adherence.\n            \n            \n              CONCLUSIONS\n              The results show that adherence to wearing custom-made footwear is insufficient, particularly at home where patients exhibit their largest walking activity. This low adherence is a major threat for reulceration. These objective findings provide directions for improvement in adherence, which could include prescribing specific off-loading footwear for indoors, and they set a reference for future comparative research on footwear adherence in diabetes.","container-title":"Diabetes Care","DOI":"10.2337/dc12-1330","ISSN":"0149-5992, 1935-5548","issue":"6","language":"en","page":"1613-1618","source":"DOI.org (Crossref)","title":"Adherence to Wearing Prescription Custom-Made Footwear in Patients With Diabetes at High Risk for Plantar Foot Ulceration","volume":"36","author":[{"family":"Waaijman","given":"Roelof"},{"family":"Keukenkamp","given":"Renske"},{"family":"De Haart","given":"Mirjam"},{"family":"Polomski","given":"Wojtek P."},{"family":"Nollet","given":"Frans"},{"family":"Bus","given":"Sicco A."}],"issued":{"date-parts":[["2013",6,1]]}}}],"schema":"https://github.com/citation-style-language/schema/raw/master/csl-citation.json"} </w:instrText>
+      </w:r>
+      <w:r>
+        <w:rPr>
+          <w:rFonts w:ascii="Garamond" w:hAnsi="Garamond"/>
+          <w:lang w:val="en-US"/>
+        </w:rPr>
+        <w:fldChar w:fldCharType="separate"/>
+      </w:r>
+      <w:r>
+        <w:rPr>
+          <w:rFonts w:ascii="Garamond" w:hAnsi="Garamond"/>
+          <w:vertAlign w:val="superscript"/>
+          <w:lang w:val="en-GB"/>
+        </w:rPr>
+        <w:t>6</w:t>
+      </w:r>
+      <w:r>
+        <w:rPr>
+          <w:rFonts w:ascii="Garamond" w:hAnsi="Garamond"/>
+          <w:lang w:val="en-US"/>
+        </w:rPr>
+        <w:fldChar w:fldCharType="end"/>
+      </w:r>
+    </w:p>
+    <w:p>
+      <w:pPr>
+        <w:numPr>
+          <w:ilvl w:val="0"/>
+          <w:numId w:val="9"/>
+        </w:numPr>
+        <w:spacing w:after="60"/>
+        <w:jc w:val="both"/>
+        <w:rPr>
+          <w:rFonts w:ascii="Garamond" w:eastAsia="Arial" w:hAnsi="Garamond"/>
+          <w:lang w:val="en-US"/>
+        </w:rPr>
+      </w:pPr>
+      <w:r>
+        <w:rPr>
+          <w:rFonts w:ascii="Garamond" w:hAnsi="Garamond"/>
+          <w:b/>
+          <w:lang w:val="en-US"/>
+        </w:rPr>
+        <w:t xml:space="preserve">A4 — Secondary outcomes and health impact. </w:t>
+      </w:r>
+      <w:r>
+        <w:rPr>
+          <w:rFonts w:ascii="Garamond" w:hAnsi="Garamond"/>
+          <w:lang w:val="en-GB"/>
+        </w:rPr>
+        <w:t>Evaluate the broader clinical and patient-centred impact of PARADISE by assessing recurrence characteristics, ulcer-free survival, foot-care behaviour (Nottingham Assessment of Functional Footcare, NAFF), health-related quality of life (EQ-5D-5L), and, jointly with the parallel doctorate, health-economic outcomes</w:t>
+      </w:r>
+      <w:r>
+        <w:rPr>
+          <w:rFonts w:ascii="Garamond" w:hAnsi="Garamond"/>
+          <w:lang w:val="en-GB"/>
+        </w:rPr>
+        <w:t>.</w:t>
+      </w:r>
+    </w:p>
+    <w:p>
+      <w:pPr>
+        <w:spacing w:after="60"/>
+        <w:rPr>
+          <w:lang w:val="en-GB"/>
+        </w:rPr>
+      </w:pPr>
+      <w:r>
+        <w:rPr>
+          <w:b/>
+          <w:lang w:val="en-GB"/>
+        </w:rPr>
+        <w:t xml:space="preserve">Candidate’s contribution and joint PhD. </w:t>
+      </w:r>
+      <w:r>
+        <w:rPr>
+          <w:lang w:val="en-GB"/>
+        </w:rPr>
+        <w:t xml:space="preserve">This is a joint KU Leuven–VUB doctorate in which two complementary doctoral projects run on the same trial. The present candidate leads the clinical trial: protocol development, ethics and regulatory submission, multicentre coordination, investigator training and site readiness, recruitment oversight, quality and fidelity monitoring, data management, and the analyses of ulcer recurrence, plantar pressure and footwear adherence. The parallel doctorate leads the process evaluation and the health-economic evaluation. Both researchers contribute to study conduct and outputs, with authorship aligned to responsibilities. Alongside the trial, </w:t>
+      </w:r>
+      <w:r>
+        <w:rPr>
+          <w:lang w:val="en-GB"/>
+        </w:rPr>
+        <w:t>the PhD candidate</w:t>
+      </w:r>
+      <w:r>
+        <w:rPr>
+          <w:lang w:val="en-GB"/>
+        </w:rPr>
+        <w:t xml:space="preserve"> will conduct</w:t>
+      </w:r>
+      <w:r>
+        <w:rPr>
+          <w:lang w:val="en-GB"/>
+        </w:rPr>
+        <w:t xml:space="preserve"> a registered scoping review on patient-specific offloading insole design, and a comparison of 3D-printed custom-made foot orthoses</w:t>
+      </w:r>
+      <w:r>
+        <w:rPr>
+          <w:lang w:val="en-GB"/>
+        </w:rPr>
+        <w:t xml:space="preserve"> in a healthy and diabetic population,</w:t>
+      </w:r>
+      <w:r>
+        <w:rPr>
+          <w:lang w:val="en-GB"/>
+        </w:rPr>
+        <w:t xml:space="preserve"> carried out independently of the trial. Local clinical teams deliver patient care and site-level assessments.</w:t>
+      </w:r>
+    </w:p>
+    <w:p>
+      <w:pPr>
+        <w:pBdr>
+          <w:bottom w:val="single" w:sz="6" w:space="2" w:color="2A7F8E"/>
+        </w:pBdr>
+        <w:spacing w:after="60"/>
+        <w:rPr>
+          <w:rFonts w:ascii="Garamond" w:hAnsi="Garamond"/>
+          <w:sz w:val="28"/>
+          <w:szCs w:val="28"/>
+          <w:lang w:val="en-US"/>
+        </w:rPr>
+      </w:pPr>
       <w:r>
         <w:rPr>
           <w:rFonts w:ascii="Garamond" w:eastAsia="Calibri" w:hAnsi="Garamond"/>
@@ -1387,7 +2830,7 @@
           <w:szCs w:val="28"/>
           <w:lang w:val="en-US"/>
         </w:rPr>
-        <w:t xml:space="preserve"> and background</w:t>
+        <w:t>3.  Methodology</w:t>
       </w:r>
     </w:p>
     <w:p>
@@ -1396,151 +2839,31 @@
         <w:jc w:val="both"/>
         <w:rPr>
           <w:rFonts w:ascii="Garamond" w:hAnsi="Garamond"/>
-          <w:lang w:val="en-US"/>
-        </w:rPr>
-      </w:pPr>
-      <w:r>
-        <w:rPr>
-          <w:rFonts w:ascii="Garamond" w:hAnsi="Garamond"/>
-          <w:lang w:val="en-US"/>
-        </w:rPr>
-        <w:t>Diabetes is a growing global health burden;</w:t>
-      </w:r>
-      <w:r>
-        <w:rPr>
-          <w:rFonts w:ascii="Garamond" w:hAnsi="Garamond"/>
-          <w:lang w:val="en-US"/>
-        </w:rPr>
-        <w:fldChar w:fldCharType="begin"/>
-      </w:r>
-      <w:r>
-        <w:rPr>
-          <w:rFonts w:ascii="Garamond" w:hAnsi="Garamond"/>
-          <w:lang w:val="en-US"/>
-        </w:rPr>
-        <w:instrText xml:space="preserve"> ADDIN ZOTERO_ITEM CSL_CITATION {"citationID":"9owaccPK","properties":{"unsorted":false,"formattedCitation":"\\super 1\\nosupersub{}","plainCitation":"1","noteIndex":0},"citationItems":[{"id":60,"uris":["http://zotero.org/users/19619518/items/VKMWXAKI"],"itemData":{"id":60,"type":"article-journal","abstract":"Diabetic foot ulcers (DFUs) are a common complication of diabetes, significantly impairing patients' quality of life (QoL) and imposing a heavy economic burden. Previous reviews on the prevention of DFUs and their recurrence have indicated that educational interventions alone cannot definitively reduce the incidence of new DFUs or lower limb amputation rates and that non-pharmacological therapies using medical devices face challenges such as cost, the need for technical training, and infrastructure development. This study systematically mapped the existing literature on non-pharmacological therapies, excluding medical devices and medications. Specifically, interventions involving machinery were excluded. The aim was to identify strategies that prevent delayed progression and recurrence of diabetic foot ulcers (DFU) in patients with type 2 diabetes. The review focused on interventions with high feasibility, cost-effectiveness, and sustainability, such as patient education, behavior modification, monitoring, and multidisciplinary collaboration. These approaches are expected to contribute to the development of comprehensive and practical strategies that address current knowledge gaps, improve patient outcomes, reduce healthcare costs, and enhance the quality of life for individuals with diabetes. An exploratory review was conducted using a combination of controlled vocabulary and free text terms related to \"type 2 diabetes,\" \"ulcer,\" \"intervention,\" and \"prevention.\" Data were collected from PubMed, the Cochrane Central Register of Controlled Trials, and Ichushi-Web. Eleven studies were evaluated. The intervention methods used were face-to-face methods by healthcare professionals and methods utilizing information and communication technology (ICT). The outcome measures of the interventions varied, including changes in patients' cognitive behavior, assessment of quality of life, examination of the condition of the lower limbs, such as ulcer healing and skin condition of the feet, and evaluation of diabetes management. This review emphasizes that non-pharmacological therapies, particularly those incorporating multidisciplinary educational interventions involving nurses, may be effective in preventing diabetic foot ulcers (DFUs) and preventing their recurrence. Future research should aim to establish standardized outcome measures and evidence-based guidelines for integrating face-to-face and ICT-based multidisciplinary educational interventions.","container-title":"Cureus","DOI":"10.7759/cureus.100710","ISSN":"2168-8184","issue":"1","journalAbbreviation":"Cureus","language":"eng","page":"e100710","PMID":"41635327","PMCID":"PMC12863961","source":"PubMed","title":"Non-pharmacological Interventions for the Prevention and Progression of Diabetic Foot Ulcers in Individuals With Type 2 Diabetes Mellitus: A Scoping Review","title-short":"Non-pharmacological Interventions for the Prevention and Progression of Diabetic Foot Ulcers in Individuals With Type 2 Diabetes Mellitus","volume":"18","author":[{"family":"Kamogawa","given":"Megumi"},{"family":"Kajiwara","given":"Kohei"},{"family":"Sakuramoto","given":"Hideaki"},{"family":"Yamamoto","given":"Koji"}],"issued":{"date-parts":[["2026",1]]}}}],"schema":"https://github.com/citation-style-language/schema/raw/master/csl-citation.json"} </w:instrText>
-      </w:r>
-      <w:r>
-        <w:rPr>
-          <w:rFonts w:ascii="Garamond" w:hAnsi="Garamond"/>
-          <w:lang w:val="en-US"/>
-        </w:rPr>
-        <w:fldChar w:fldCharType="separate"/>
-      </w:r>
-      <w:r>
-        <w:rPr>
-          <w:rFonts w:ascii="Garamond" w:hAnsi="Garamond"/>
-          <w:vertAlign w:val="superscript"/>
-          <w:lang w:val="en-GB"/>
-        </w:rPr>
-        <w:t>1</w:t>
-      </w:r>
-      <w:r>
-        <w:rPr>
-          <w:rFonts w:ascii="Garamond" w:hAnsi="Garamond"/>
-          <w:lang w:val="en-US"/>
-        </w:rPr>
-        <w:fldChar w:fldCharType="end"/>
-      </w:r>
-      <w:r>
-        <w:rPr>
-          <w:rFonts w:ascii="Garamond" w:hAnsi="Garamond"/>
-          <w:lang w:val="en-US"/>
-        </w:rPr>
-        <w:t xml:space="preserve"> in Belgium, diagnosed prevalence reached 7.6% in 2023 and continues to rise with an ageing population.</w:t>
-      </w:r>
-      <w:r>
-        <w:rPr>
-          <w:rFonts w:ascii="Garamond" w:hAnsi="Garamond"/>
-          <w:lang w:val="en-US"/>
-        </w:rPr>
-        <w:fldChar w:fldCharType="begin"/>
-      </w:r>
-      <w:r>
-        <w:rPr>
-          <w:rFonts w:ascii="Garamond" w:hAnsi="Garamond"/>
-          <w:lang w:val="en-US"/>
-        </w:rPr>
-        <w:instrText xml:space="preserve"> ADDIN ZOTERO_ITEM CSL_CITATION {"citationID":"QZsvqEtg","properties":{"unsorted":false,"formattedCitation":"\\super 2\\nosupersub{}","plainCitation":"2","noteIndex":0},"citationItems":[{"id":50,"uris":["http://zotero.org/users/19619518/items/K3HEZTLV"],"itemData":{"id":50,"type":"webpage","abstract":"For a healthy Belgium: indicators of health and care","container-title":"For a Healthy Belgium","language":"en-gb","title":"Diabetes","URL":"https://www.healthybelgium.be/en/health-status/non-communicable-diseases/diabetes","author":[{"family":"admin-sciensano","given":""}],"accessed":{"date-parts":[["2026",6,4]]},"issued":{"date-parts":[["2025",9,30]]}}}],"schema":"https://github.com/citation-style-language/schema/raw/master/csl-citation.json"} </w:instrText>
-      </w:r>
-      <w:r>
-        <w:rPr>
-          <w:rFonts w:ascii="Garamond" w:hAnsi="Garamond"/>
-          <w:lang w:val="en-US"/>
-        </w:rPr>
-        <w:fldChar w:fldCharType="separate"/>
-      </w:r>
-      <w:r>
-        <w:rPr>
-          <w:rFonts w:ascii="Garamond" w:hAnsi="Garamond"/>
-          <w:vertAlign w:val="superscript"/>
-          <w:lang w:val="en-GB"/>
-        </w:rPr>
-        <w:t>2</w:t>
-      </w:r>
-      <w:r>
-        <w:rPr>
-          <w:rFonts w:ascii="Garamond" w:hAnsi="Garamond"/>
-          <w:lang w:val="en-US"/>
-        </w:rPr>
-        <w:fldChar w:fldCharType="end"/>
-      </w:r>
-      <w:r>
-        <w:rPr>
-          <w:rFonts w:ascii="Garamond" w:hAnsi="Garamond"/>
-          <w:lang w:val="en-US"/>
-        </w:rPr>
-        <w:t xml:space="preserve"> Recurrent diabetic foot ulcers (DFUs) remain a leading cause of morbidity, reduced quality of life and healthcare expenditure: about 40% of healed ulcers recur within one year, </w:t>
-      </w:r>
-      <w:r>
-        <w:rPr>
-          <w:rFonts w:ascii="Garamond" w:hAnsi="Garamond"/>
-          <w:lang w:val="en-US"/>
-        </w:rPr>
-        <w:t>making recurrence prevention a central priority</w:t>
-      </w:r>
-      <w:r>
-        <w:rPr>
-          <w:rFonts w:ascii="Garamond" w:hAnsi="Garamond"/>
-          <w:lang w:val="en-US"/>
-        </w:rPr>
-        <w:t>.</w:t>
-      </w:r>
-      <w:r>
-        <w:rPr>
-          <w:rFonts w:ascii="Garamond" w:hAnsi="Garamond"/>
-          <w:lang w:val="en-US"/>
-        </w:rPr>
-        <w:fldChar w:fldCharType="begin"/>
-      </w:r>
-      <w:r>
-        <w:rPr>
-          <w:rFonts w:ascii="Garamond" w:hAnsi="Garamond"/>
-          <w:lang w:val="en-US"/>
-        </w:rPr>
-        <w:instrText xml:space="preserve"> ADDIN ZOTERO_ITEM CSL_CITATION {"citationID":"bQVpjHK6","properties":{"unsorted":false,"formattedCitation":"\\super 3,4\\nosupersub{}","plainCitation":"3,4","noteIndex":0},"citationItems":[{"id":59,"uris":["http://zotero.org/users/19619518/items/AA95SBQV"],"itemData":{"id":59,"type":"article-journal","abstract":"OBJECTIVE\n              Recurrence of plantar foot ulcers is a common and major problem in diabetes but not well understood. Foot biomechanics and patient behavior may be important. The aim was to identify risk factors for ulcer recurrence and to establish targets for ulcer prevention.\n            \n            \n              RESEARCH DESIGN AND METHODS\n              As part of a footwear trial, 171 neuropathic diabetic patients with a recently healed plantar foot ulcer and custom-made footwear were followed for 18 months or until ulceration. Demographic data, disease-related parameters, presence of minor lesions, barefoot and in-shoe plantar peak pressures, footwear adherence, and daily stride count were entered in a multivariate multilevel logistic regression model of plantar foot ulcer recurrence.\n            \n            \n              RESULTS\n              A total of 71 patients had a recurrent ulcer. Significant independent predictors were presence of minor lesions (odds ratio 9.06 [95% CI 2.98–27.57]), day-to-day variation in stride count (0.93 [0.89–0.99]), and cumulative duration of past foot ulcers (1.03 [1.00–1.06]). Significant independent predictors for those 41 recurrences suggested to be the result of unrecognized repetitive trauma were presence of minor lesions (10.95 [5.01–23.96]), in-shoe peak pressure &amp;lt;200 kPa with footwear adherence &amp;gt;80% (0.43 [0.20–0.94]), barefoot peak pressure (1.11 [1.00–1.22]), and day-to-day variation in stride count (0.91 [0.86–0.96]).\n            \n            \n              CONCLUSIONS\n              The presence of a minor lesion was clearly the strongest predictor, while recommended use of adequately offloading footwear was a strong protector against ulcer recurrence from unrecognized repetitive trauma. These outcomes define clear targets for diabetic foot screening and ulcer prevention.","container-title":"Diabetes Care","DOI":"10.2337/dc13-2470","ISSN":"0149-5992, 1935-5548","issue":"6","language":"en","page":"1697-1705","source":"DOI.org (Crossref)","title":"Risk Factors for Plantar Foot Ulcer Recurrence in Neuropathic Diabetic Patients","volume":"37","author":[{"family":"Waaijman","given":"Roelof"},{"family":"De Haart","given":"Mirjam"},{"family":"Arts","given":"Mark L.J."},{"family":"Wever","given":"Daniel"},{"family":"Verlouw","given":"Anke J.W.E."},{"family":"Nollet","given":"Frans"},{"family":"Bus","given":"Sicco A."}],"issued":{"date-parts":[["2014",6,1]]}}},{"id":58,"uris":["http://zotero.org/users/19619518/items/BNUN34AS"],"itemData":{"id":58,"type":"article-journal","abstract":"Background: Diabetic foot disease is a public health problem. The challenges of its management lie in the complexity of wound healing and, in particular, the high rate of lesion recurrence. Objectives: The primary objective of the study was to evaluate whether optimized post-healing follow-up by a multidisciplinary team can reduce the recurrence rate of foot ulcers in people living with diabetes. The secondary objectives were to assess patient needs in terms of hospitalization for recurrence, the number of amputations, pedicure care, and the use of adapted footwear. Participants: The study included 129 patients with diabetes presenting a healed foot ulcer. A total of 38 patients underwent an annual post-healing follow-up visit with a multidisciplinary team (optimized follow-up), while 91 had a visit every 2 years (minimum follow-up). Results: Of the 38 patients with optimal follow-up, 8 presented a wound recurrence (21.1%) compared with 38 out of 91 patients (41.8%) receiving minimum follow-up. The recurrence rate decreased significantly between the two groups (p &lt; 0.05). The use of adapted shoes was also significantly better in the group with optimized follow-up (p = 0.02). Conclusions: Regular post-healing follow-up with a multidisciplinary team seems to be a contributing factor to reducing the recurrence of diabetic foot ulcers among people living with diabetes.","container-title":"Journal of Clinical Medicine","DOI":"10.3390/jcm14144975","ISSN":"2077-0383","issue":"14","journalAbbreviation":"JCM","language":"en","page":"4975","source":"DOI.org (Crossref)","title":"The Post-Healing Follow-Up of Diabetic Foot Ulcers by a Multidisciplinary Team to Reduce Their Recurrence: An Observational Retrospective Study","title-short":"The Post-Healing Follow-Up of Diabetic Foot Ulcers by a Multidisciplinary Team to Reduce Their Recurrence","volume":"14","author":[{"family":"Bouly","given":"Marie"},{"family":"Laborne","given":"Francois-Xavier"},{"family":"Tourte","given":"Caroline"},{"family":"Henry","given":"Elodie"},{"family":"Penfornis","given":"Alfred"},{"family":"Dardari","given":"Dured"}],"issued":{"date-parts":[["2025",7,14]]}}}],"schema":"https://github.com/citation-style-language/schema/raw/master/csl-citation.json"} </w:instrText>
-      </w:r>
-      <w:r>
-        <w:rPr>
-          <w:rFonts w:ascii="Garamond" w:hAnsi="Garamond"/>
-          <w:lang w:val="en-US"/>
-        </w:rPr>
-        <w:fldChar w:fldCharType="separate"/>
-      </w:r>
-      <w:r>
-        <w:rPr>
-          <w:rFonts w:ascii="Garamond" w:hAnsi="Garamond"/>
-          <w:vertAlign w:val="superscript"/>
-          <w:lang w:val="en-GB"/>
-        </w:rPr>
-        <w:t>3,4</w:t>
-      </w:r>
-      <w:r>
-        <w:rPr>
-          <w:rFonts w:ascii="Garamond" w:hAnsi="Garamond"/>
-          <w:lang w:val="en-US"/>
-        </w:rPr>
-        <w:fldChar w:fldCharType="end"/>
+          <w:lang w:val="en-GB"/>
+        </w:rPr>
+      </w:pPr>
+      <w:r>
+        <w:rPr>
+          <w:rFonts w:ascii="Garamond" w:hAnsi="Garamond"/>
+          <w:b/>
+          <w:lang w:val="en-US"/>
+        </w:rPr>
+        <w:t xml:space="preserve">Design and participants. </w:t>
+      </w:r>
+      <w:r>
+        <w:rPr>
+          <w:rFonts w:ascii="Garamond" w:hAnsi="Garamond"/>
+          <w:lang w:val="en-GB"/>
+        </w:rPr>
+        <w:t xml:space="preserve">A prospective, multicentre, parallel-group randomised controlled trial (RCT) will randomise 144 adults with diabetes and an IWGDF category 3 high-risk foot in a 1:1 ratio, stratified by centre, across six Belgian RIZIV–INAMI-recognised DFCs in academic and non-academic settings. Participants will be followed for 18 months. Eligible participants have type 1 or type 2 diabetes with a </w:t>
+      </w:r>
+      <w:r>
+        <w:rPr>
+          <w:rFonts w:ascii="Garamond" w:hAnsi="Garamond"/>
+          <w:lang w:val="en-GB"/>
+        </w:rPr>
+        <w:lastRenderedPageBreak/>
+        <w:t>plantar ulcer healed within the preceding 18 months or a partial foot amputation, and use, or are willing to use, prescribed therapeutic footwear.</w:t>
       </w:r>
     </w:p>
     <w:p>
@@ -1549,127 +2872,23 @@
         <w:jc w:val="both"/>
         <w:rPr>
           <w:rFonts w:ascii="Garamond" w:hAnsi="Garamond"/>
-          <w:lang w:val="en-US"/>
-        </w:rPr>
-      </w:pPr>
-      <w:r>
-        <w:rPr>
-          <w:rFonts w:ascii="Garamond" w:hAnsi="Garamond"/>
-          <w:lang w:val="en-US"/>
-        </w:rPr>
-        <w:t xml:space="preserve">In Belgium, high-risk patients are managed within multidisciplinary Diabetic Foot Clinics (DFCs) </w:t>
-      </w:r>
-      <w:proofErr w:type="spellStart"/>
-      <w:r>
-        <w:rPr>
-          <w:rFonts w:ascii="Garamond" w:hAnsi="Garamond"/>
-          <w:lang w:val="en-US"/>
-        </w:rPr>
-        <w:t>recognised</w:t>
-      </w:r>
-      <w:proofErr w:type="spellEnd"/>
-      <w:r>
-        <w:rPr>
-          <w:rFonts w:ascii="Garamond" w:hAnsi="Garamond"/>
-          <w:lang w:val="en-US"/>
-        </w:rPr>
-        <w:t xml:space="preserve"> by the national health insurer (RIZIV–INAMI). Although this model provides </w:t>
-      </w:r>
-      <w:proofErr w:type="spellStart"/>
-      <w:r>
-        <w:rPr>
-          <w:rFonts w:ascii="Garamond" w:hAnsi="Garamond"/>
-          <w:lang w:val="en-US"/>
-        </w:rPr>
-        <w:t>specialised</w:t>
-      </w:r>
-      <w:proofErr w:type="spellEnd"/>
-      <w:r>
-        <w:rPr>
-          <w:rFonts w:ascii="Garamond" w:hAnsi="Garamond"/>
-          <w:lang w:val="en-US"/>
-        </w:rPr>
-        <w:t xml:space="preserve"> care, a persistent gap remains between evidence-based prevention and routine practice: pressure-</w:t>
-      </w:r>
-      <w:proofErr w:type="spellStart"/>
-      <w:r>
-        <w:rPr>
-          <w:rFonts w:ascii="Garamond" w:hAnsi="Garamond"/>
-          <w:lang w:val="en-US"/>
-        </w:rPr>
-        <w:t>optimised</w:t>
-      </w:r>
-      <w:proofErr w:type="spellEnd"/>
-      <w:r>
-        <w:rPr>
-          <w:rFonts w:ascii="Garamond" w:hAnsi="Garamond"/>
-          <w:lang w:val="en-US"/>
-        </w:rPr>
-        <w:t xml:space="preserve"> therapeutic footwear and objective adherence monitoring have demonstrated value separately, but are not systematically integrated into Belgian diabetic-foot pathways.</w:t>
-      </w:r>
-      <w:r>
-        <w:rPr>
-          <w:rFonts w:ascii="Garamond" w:hAnsi="Garamond"/>
-          <w:lang w:val="en-US"/>
-        </w:rPr>
-        <w:fldChar w:fldCharType="begin"/>
-      </w:r>
-      <w:r>
-        <w:rPr>
-          <w:rFonts w:ascii="Garamond" w:hAnsi="Garamond"/>
-          <w:lang w:val="en-US"/>
-        </w:rPr>
-        <w:instrText xml:space="preserve"> ADDIN ZOTERO_ITEM CSL_CITATION {"citationID":"W0QB53aM","properties":{"unsorted":false,"formattedCitation":"\\super 5\\nosupersub{}","plainCitation":"5","noteIndex":0},"citationItems":[{"id":48,"uris":["http://zotero.org/users/19619518/items/HQRWT4X4"],"itemData":{"id":48,"type":"article-journal","abstract":"OBJECTIVE\n              Custom-made footwear is the treatment of choice to prevent foot ulcer recurrence in diabetes. This footwear primarily aims to offload plantar regions at high ulcer risk. However, ulcer recurrence rates are high. We assessed the effect of offloading-improved custom-made footwear and the role of footwear adherence on plantar foot ulcer recurrence.\n            \n            \n              RESEARCH DESIGN AND METHODS\n              We randomly assigned 171 neuropathic diabetic patients with a recently healed plantar foot ulcer to custom-made footwear with improved and subsequently preserved offloading (</w:instrText>
-      </w:r>
-      <w:r>
-        <w:rPr>
-          <w:rFonts w:ascii="Cambria Math" w:hAnsi="Cambria Math" w:cs="Cambria Math"/>
-          <w:lang w:val="en-US"/>
-        </w:rPr>
-        <w:instrText>∼</w:instrText>
-      </w:r>
-      <w:r>
-        <w:rPr>
-          <w:rFonts w:ascii="Garamond" w:hAnsi="Garamond"/>
-          <w:lang w:val="en-US"/>
-        </w:rPr>
-        <w:instrText xml:space="preserve">20% peak pressure relief by modifying the footwear) or to usual care (i.e., nonimproved custom-made footwear). Primary outcome was plantar foot ulcer recurrence in 18 months. Secondary outcome was ulcer recurrence in patients with an objectively measured adherence of </w:instrText>
-      </w:r>
-      <w:r>
-        <w:rPr>
-          <w:rFonts w:ascii="Garamond" w:hAnsi="Garamond" w:cs="Garamond"/>
-          <w:lang w:val="en-US"/>
-        </w:rPr>
-        <w:instrText>≥</w:instrText>
-      </w:r>
-      <w:r>
-        <w:rPr>
-          <w:rFonts w:ascii="Garamond" w:hAnsi="Garamond"/>
-          <w:lang w:val="en-US"/>
-        </w:rPr>
-        <w:instrText xml:space="preserve">80% of steps taken.\n            \n            \n              RESULTS\n              On the basis of intention-to-treat, 33 of 85 patients (38.8%) with improved footwear and 38 of 86 patients (44.2%) with usual care had a recurrent ulcer (relative risk −11%, odds ratio 0.80 [95% CI 0.44–1.47], P = 0.48). Ulcer-free survival curves were not significantly different between groups (P = 0.40). In the 79 patients (46% of total group) with high adherence, 9 of 35 (25.7%) with improved footwear and 21 of 44 (47.8%) with usual care had a recurrent ulcer (relative risk −46%, odds ratio 0.38 [0.15–0.99], P = 0.045).\n            \n            \n              CONCLUSIONS\n              Offloading-improved custom-made footwear does not significantly reduce the incidence of plantar foot ulcer recurrence in diabetes compared with custom-made footwear that does not undergo such improvement, unless it is worn as recommended.","container-title":"Diabetes Care","DOI":"10.2337/dc13-0996","ISSN":"0149-5992, 1935-5548","issue":"12","language":"en","page":"4109-4116","source":"DOI.org (Crossref)","title":"Effect of Custom-Made Footwear on Foot Ulcer Recurrence in Diabetes","volume":"36","author":[{"family":"Bus","given":"Sicco A."},{"family":"Waaijman","given":"Roelof"},{"family":"Arts","given":"Mark"},{"family":"De Haart","given":"Mirjam"},{"family":"Busch-Westbroek","given":"Tessa"},{"family":"Van Baal","given":"Jeff"},{"family":"Nollet","given":"Frans"}],"issued":{"date-parts":[["2013",12,1]]}}}],"schema":"https://github.com/citation-style-language/schema/raw/master/csl-citation.json"} </w:instrText>
-      </w:r>
-      <w:r>
-        <w:rPr>
-          <w:rFonts w:ascii="Garamond" w:hAnsi="Garamond"/>
-          <w:lang w:val="en-US"/>
-        </w:rPr>
-        <w:fldChar w:fldCharType="separate"/>
-      </w:r>
-      <w:r>
-        <w:rPr>
-          <w:rFonts w:ascii="Garamond" w:hAnsi="Garamond"/>
-          <w:vertAlign w:val="superscript"/>
-          <w:lang w:val="en-GB"/>
-        </w:rPr>
-        <w:t>5</w:t>
-      </w:r>
-      <w:r>
-        <w:rPr>
-          <w:rFonts w:ascii="Garamond" w:hAnsi="Garamond"/>
-          <w:lang w:val="en-US"/>
-        </w:rPr>
-        <w:fldChar w:fldCharType="end"/>
+          <w:lang w:val="en-GB"/>
+        </w:rPr>
+      </w:pPr>
+      <w:r>
+        <w:rPr>
+          <w:rFonts w:ascii="Garamond" w:hAnsi="Garamond"/>
+          <w:b/>
+          <w:lang w:val="en-US"/>
+        </w:rPr>
+        <w:t xml:space="preserve">Interventions. </w:t>
+      </w:r>
+      <w:r>
+        <w:rPr>
+          <w:rFonts w:ascii="Garamond" w:hAnsi="Garamond"/>
+          <w:lang w:val="en-GB"/>
+        </w:rPr>
+        <w:t>PARADISE integrates three evidence-based components addressing the main determinants of diabetic foot-ulcer recurrence: biomechanical risk, footwear adherence, and adequate foot care.</w:t>
       </w:r>
     </w:p>
     <w:p>
@@ -1678,26 +2897,71 @@
         <w:jc w:val="both"/>
         <w:rPr>
           <w:rFonts w:ascii="Garamond" w:hAnsi="Garamond"/>
-          <w:lang w:val="en-US"/>
-        </w:rPr>
-      </w:pPr>
-      <w:r>
-        <w:rPr>
-          <w:rFonts w:ascii="Garamond" w:hAnsi="Garamond"/>
-          <w:lang w:val="en-GB"/>
-        </w:rPr>
-        <w:t>Adherence remains a major barrier: objective monitoring shows that patients spend approximately 29% of their steps outside prescribed footwear, while only a minority achieve the ≥80% threshold associated with improved outcomes</w:t>
-      </w:r>
-      <w:r>
-        <w:rPr>
-          <w:rFonts w:ascii="Garamond" w:hAnsi="Garamond"/>
-          <w:lang w:val="en-US"/>
-        </w:rPr>
-        <w:t>.</w:t>
-      </w:r>
-      <w:r>
-        <w:rPr>
-          <w:rFonts w:ascii="Garamond" w:hAnsi="Garamond"/>
+          <w:vertAlign w:val="superscript"/>
+          <w:lang w:val="en-US"/>
+        </w:rPr>
+      </w:pPr>
+      <w:r>
+        <w:rPr>
+          <w:rFonts w:ascii="Garamond" w:hAnsi="Garamond"/>
+          <w:b/>
+          <w:lang w:val="en-US"/>
+        </w:rPr>
+        <w:t xml:space="preserve">(1) </w:t>
+      </w:r>
+      <w:r>
+        <w:rPr>
+          <w:rFonts w:ascii="Garamond" w:hAnsi="Garamond"/>
+          <w:b/>
+          <w:lang w:val="en-US"/>
+        </w:rPr>
+        <w:t xml:space="preserve">Pressure-driven orthosis </w:t>
+      </w:r>
+      <w:proofErr w:type="spellStart"/>
+      <w:r>
+        <w:rPr>
+          <w:rFonts w:ascii="Garamond" w:hAnsi="Garamond"/>
+          <w:b/>
+          <w:lang w:val="en-US"/>
+        </w:rPr>
+        <w:t>optimisation</w:t>
+      </w:r>
+      <w:proofErr w:type="spellEnd"/>
+      <w:r>
+        <w:rPr>
+          <w:rFonts w:ascii="Garamond" w:hAnsi="Garamond"/>
+          <w:b/>
+          <w:lang w:val="en-US"/>
+        </w:rPr>
+        <w:t xml:space="preserve">. </w:t>
+      </w:r>
+      <w:r>
+        <w:rPr>
+          <w:rFonts w:ascii="Garamond" w:hAnsi="Garamond"/>
+          <w:lang w:val="en-GB"/>
+        </w:rPr>
+        <w:t xml:space="preserve">Existing in-shoe plantar-pressure systems (Novel </w:t>
+      </w:r>
+      <w:proofErr w:type="spellStart"/>
+      <w:r>
+        <w:rPr>
+          <w:rFonts w:ascii="Garamond" w:hAnsi="Garamond"/>
+          <w:lang w:val="en-GB"/>
+        </w:rPr>
+        <w:t>pedar</w:t>
+      </w:r>
+      <w:proofErr w:type="spellEnd"/>
+      <w:r>
+        <w:rPr>
+          <w:rFonts w:ascii="Garamond" w:hAnsi="Garamond"/>
+          <w:lang w:val="en-GB"/>
+        </w:rPr>
+        <w:t>) identify peak plantar pressure and guide iterative orthosis optimisation towards a target peak pressure below 200 kPa or a reduction of at least 25% relative to the measurement without the orthosis in the same session.</w:t>
+      </w:r>
+      <w:r>
+        <w:rPr>
+          <w:rFonts w:ascii="Garamond" w:hAnsi="Garamond"/>
+          <w:vertAlign w:val="superscript"/>
           <w:lang w:val="en-US"/>
         </w:rPr>
         <w:fldChar w:fldCharType="begin"/>
@@ -1705,13 +2969,47 @@
       <w:r>
         <w:rPr>
           <w:rFonts w:ascii="Garamond" w:hAnsi="Garamond"/>
-          <w:lang w:val="en-US"/>
-        </w:rPr>
-        <w:instrText xml:space="preserve"> ADDIN ZOTERO_ITEM CSL_CITATION {"citationID":"nPBM9hoA","properties":{"unsorted":false,"formattedCitation":"\\super 6\\nosupersub{}","plainCitation":"6","noteIndex":0},"citationItems":[{"id":16,"uris":["http://zotero.org/users/19619518/items/PZIVAKCP"],"itemData":{"id":16,"type":"article-journal","abstract":"OBJECTIVE\n              Prescription custom-made footwear can only be effective in preventing diabetic foot ulcers if worn by the patient. Particularly, the high prevalence of recurrent foot ulcers focuses the attention on adherence, for which objective data are nonexisting. We objectively assessed adherence in patients with high risk of ulcer recurrence and evaluated what determines adherence.\n            \n            \n              RESEARCH DESIGN AND METHODS\n              In 107 patients with diabetes, neuropathy, a recently healed plantar foot ulcer, and custom-made footwear, footwear use was measured during 7 consecutive days using a shoe-worn, temperature-based monitor. Daily step count was measured simultaneously using an ankle-worn activity monitor. Patients logged time away from home. Adherence was calculated as the percentage of steps that prescription footwear was worn. Determinants of adherence were evaluated in multivariate linear regression analysis.\n            \n            \n              RESULTS\n              Mean ± SD adherence was 71 ± 25%. Adherence at home was 61 ± 32%, over 3,959 ± 2,594 steps, and away from home 87 ± 26%, over 2,604 ± 2,507 steps. In 35 patients with low adherence (&amp;lt;60%), adherence at home was 28 ± 24%. Lower BMI, more severe foot deformity, and more appealing footwear were significantly associated with higher adherence.\n            \n            \n              CONCLUSIONS\n              The results show that adherence to wearing custom-made footwear is insufficient, particularly at home where patients exhibit their largest walking activity. This low adherence is a major threat for reulceration. These objective findings provide directions for improvement in adherence, which could include prescribing specific off-loading footwear for indoors, and they set a reference for future comparative research on footwear adherence in diabetes.","container-title":"Diabetes Care","DOI":"10.2337/dc12-1330","ISSN":"0149-5992, 1935-5548","issue":"6","language":"en","page":"1613-1618","source":"DOI.org (Crossref)","title":"Adherence to Wearing Prescription Custom-Made Footwear in Patients With Diabetes at High Risk for Plantar Foot Ulceration","volume":"36","author":[{"family":"Waaijman","given":"Roelof"},{"family":"Keukenkamp","given":"Renske"},{"family":"De Haart","given":"Mirjam"},{"family":"Polomski","given":"Wojtek P."},{"family":"Nollet","given":"Frans"},{"family":"Bus","given":"Sicco A."}],"issued":{"date-parts":[["2013",6,1]]}}}],"schema":"https://github.com/citation-style-language/schema/raw/master/csl-citation.json"} </w:instrText>
-      </w:r>
-      <w:r>
-        <w:rPr>
-          <w:rFonts w:ascii="Garamond" w:hAnsi="Garamond"/>
+          <w:vertAlign w:val="superscript"/>
+          <w:lang w:val="en-US"/>
+        </w:rPr>
+        <w:instrText xml:space="preserve"> ADDIN ZOTERO_ITEM CSL_CITATION {"citationID":"zvZSRODa","properties":{"unsorted":false,"formattedCitation":"\\super 5\\nosupersub{}","plainCitation":"5","noteIndex":0},"citationItems":[{"id":48,"uris":["http://zotero.org/users/19619518/items/HQRWT4X4"],"itemData":{"id":48,"type":"article-journal","abstract":"OBJECTIVE\n              Custom-made footwear is the treatment of choice to prevent foot ulcer recurrence in diabetes. This footwear primarily aims to offload plantar regions at high ulcer risk. However, ulcer recurrence rates are high. We assessed the effect of offloading-improved custom-made footwear and the role of footwear adherence on plantar foot ulcer recurrence.\n            \n            \n              RESEARCH DESIGN AND METHODS\n              We randomly assigned 171 neuropathic diabetic patients with a recently healed plantar foot ulcer to custom-made footwear with improved and subsequently preserved offloading (</w:instrText>
+      </w:r>
+      <w:r>
+        <w:rPr>
+          <w:rFonts w:ascii="Cambria Math" w:hAnsi="Cambria Math" w:cs="Cambria Math"/>
+          <w:vertAlign w:val="superscript"/>
+          <w:lang w:val="en-US"/>
+        </w:rPr>
+        <w:instrText>∼</w:instrText>
+      </w:r>
+      <w:r>
+        <w:rPr>
+          <w:rFonts w:ascii="Garamond" w:hAnsi="Garamond"/>
+          <w:vertAlign w:val="superscript"/>
+          <w:lang w:val="en-US"/>
+        </w:rPr>
+        <w:instrText xml:space="preserve">20% peak pressure relief by modifying the footwear) or to usual care (i.e., nonimproved custom-made footwear). Primary outcome was plantar foot ulcer recurrence in 18 months. Secondary outcome was ulcer recurrence in patients with an objectively measured adherence of </w:instrText>
+      </w:r>
+      <w:r>
+        <w:rPr>
+          <w:rFonts w:ascii="Garamond" w:hAnsi="Garamond" w:cs="Garamond"/>
+          <w:vertAlign w:val="superscript"/>
+          <w:lang w:val="en-US"/>
+        </w:rPr>
+        <w:instrText>≥</w:instrText>
+      </w:r>
+      <w:r>
+        <w:rPr>
+          <w:rFonts w:ascii="Garamond" w:hAnsi="Garamond"/>
+          <w:vertAlign w:val="superscript"/>
+          <w:lang w:val="en-US"/>
+        </w:rPr>
+        <w:instrText xml:space="preserve">80% of steps taken.\n            \n            \n              RESULTS\n              On the basis of intention-to-treat, 33 of 85 patients (38.8%) with improved footwear and 38 of 86 patients (44.2%) with usual care had a recurrent ulcer (relative risk −11%, odds ratio 0.80 [95% CI 0.44–1.47], P = 0.48). Ulcer-free survival curves were not significantly different between groups (P = 0.40). In the 79 patients (46% of total group) with high adherence, 9 of 35 (25.7%) with improved footwear and 21 of 44 (47.8%) with usual care had a recurrent ulcer (relative risk −46%, odds ratio 0.38 [0.15–0.99], P = 0.045).\n            \n            \n              CONCLUSIONS\n              Offloading-improved custom-made footwear does not significantly reduce the incidence of plantar foot ulcer recurrence in diabetes compared with custom-made footwear that does not undergo such improvement, unless it is worn as recommended.","container-title":"Diabetes Care","DOI":"10.2337/dc13-0996","ISSN":"0149-5992, 1935-5548","issue":"12","language":"en","page":"4109-4116","source":"DOI.org (Crossref)","title":"Effect of Custom-Made Footwear on Foot Ulcer Recurrence in Diabetes","volume":"36","author":[{"family":"Bus","given":"Sicco A."},{"family":"Waaijman","given":"Roelof"},{"family":"Arts","given":"Mark"},{"family":"De Haart","given":"Mirjam"},{"family":"Busch-Westbroek","given":"Tessa"},{"family":"Van Baal","given":"Jeff"},{"family":"Nollet","given":"Frans"}],"issued":{"date-parts":[["2013",12,1]]}}}],"schema":"https://github.com/citation-style-language/schema/raw/master/csl-citation.json"} </w:instrText>
+      </w:r>
+      <w:r>
+        <w:rPr>
+          <w:rFonts w:ascii="Garamond" w:hAnsi="Garamond"/>
+          <w:vertAlign w:val="superscript"/>
           <w:lang w:val="en-US"/>
         </w:rPr>
         <w:fldChar w:fldCharType="separate"/>
@@ -1722,627 +3020,12 @@
           <w:vertAlign w:val="superscript"/>
           <w:lang w:val="en-GB"/>
         </w:rPr>
-        <w:t>6</w:t>
-      </w:r>
-      <w:r>
-        <w:rPr>
-          <w:rFonts w:ascii="Garamond" w:hAnsi="Garamond"/>
-          <w:lang w:val="en-US"/>
-        </w:rPr>
-        <w:fldChar w:fldCharType="end"/>
-      </w:r>
-      <w:r>
-        <w:rPr>
-          <w:rFonts w:ascii="Garamond" w:hAnsi="Garamond"/>
-          <w:lang w:val="en-US"/>
-        </w:rPr>
-        <w:t xml:space="preserve"> Existing education strategies</w:t>
-      </w:r>
-      <w:r>
-        <w:rPr>
-          <w:rFonts w:ascii="Garamond" w:hAnsi="Garamond"/>
-          <w:lang w:val="en-US"/>
-        </w:rPr>
-        <w:t xml:space="preserve"> </w:t>
-      </w:r>
-      <w:proofErr w:type="spellStart"/>
-      <w:r>
-        <w:rPr>
-          <w:rFonts w:ascii="Garamond" w:hAnsi="Garamond"/>
-          <w:lang w:val="en-US"/>
-        </w:rPr>
-        <w:t>prioritise</w:t>
-      </w:r>
-      <w:proofErr w:type="spellEnd"/>
-      <w:r>
-        <w:rPr>
-          <w:rFonts w:ascii="Garamond" w:hAnsi="Garamond"/>
-          <w:lang w:val="en-US"/>
-        </w:rPr>
-        <w:t xml:space="preserve"> knowledge transfer over sustained </w:t>
-      </w:r>
-      <w:proofErr w:type="spellStart"/>
-      <w:r>
-        <w:rPr>
-          <w:rFonts w:ascii="Garamond" w:hAnsi="Garamond"/>
-          <w:lang w:val="en-US"/>
-        </w:rPr>
-        <w:t>behavioural</w:t>
-      </w:r>
-      <w:proofErr w:type="spellEnd"/>
-      <w:r>
-        <w:rPr>
-          <w:rFonts w:ascii="Garamond" w:hAnsi="Garamond"/>
-          <w:lang w:val="en-US"/>
-        </w:rPr>
-        <w:t xml:space="preserve"> change, and objective adherence data are seldom fed back into </w:t>
-      </w:r>
-      <w:proofErr w:type="spellStart"/>
-      <w:r>
-        <w:rPr>
-          <w:rFonts w:ascii="Garamond" w:hAnsi="Garamond"/>
-          <w:lang w:val="en-US"/>
-        </w:rPr>
-        <w:t>personalised</w:t>
-      </w:r>
-      <w:proofErr w:type="spellEnd"/>
-      <w:r>
-        <w:rPr>
-          <w:rFonts w:ascii="Garamond" w:hAnsi="Garamond"/>
-          <w:lang w:val="en-US"/>
-        </w:rPr>
-        <w:t xml:space="preserve"> or clinical decision-making.</w:t>
-      </w:r>
-      <w:r>
-        <w:rPr>
-          <w:rFonts w:ascii="Garamond" w:hAnsi="Garamond"/>
-          <w:lang w:val="en-US"/>
-        </w:rPr>
-        <w:fldChar w:fldCharType="begin"/>
-      </w:r>
-      <w:r>
-        <w:rPr>
-          <w:rFonts w:ascii="Garamond" w:hAnsi="Garamond"/>
-          <w:lang w:val="en-US"/>
-        </w:rPr>
-        <w:instrText xml:space="preserve"> ADDIN ZOTERO_ITEM CSL_CITATION {"citationID":"b21m0kgR","properties":{"unsorted":false,"formattedCitation":"\\super 7\\nosupersub{}","plainCitation":"7","noteIndex":0},"citationItems":[{"id":56,"uris":["http://zotero.org/users/19619518/items/6DZPFUHJ"],"itemData":{"id":56,"type":"article-journal","abstract":"Abstract\n            \n              Background\n              Orthopaedic footwear can only be effective in preventing diabetic foot ulcers if worn by the patient. Robust data on long</w:instrText>
-      </w:r>
-      <w:r>
-        <w:rPr>
-          <w:rFonts w:ascii="Cambria Math" w:hAnsi="Cambria Math" w:cs="Cambria Math"/>
-          <w:lang w:val="en-US"/>
-        </w:rPr>
-        <w:instrText>‐</w:instrText>
-      </w:r>
-      <w:r>
-        <w:rPr>
-          <w:rFonts w:ascii="Garamond" w:hAnsi="Garamond"/>
-          <w:lang w:val="en-US"/>
-        </w:rPr>
-        <w:instrText>term wearing time of orthopaedic footwear are not available, and needed to gain more insights into wearing patterns and associated factors (i.e. participants' demographic, disease</w:instrText>
-      </w:r>
-      <w:r>
-        <w:rPr>
-          <w:rFonts w:ascii="Cambria Math" w:hAnsi="Cambria Math" w:cs="Cambria Math"/>
-          <w:lang w:val="en-US"/>
-        </w:rPr>
-        <w:instrText>‐</w:instrText>
-      </w:r>
-      <w:r>
-        <w:rPr>
-          <w:rFonts w:ascii="Garamond" w:hAnsi="Garamond"/>
-          <w:lang w:val="en-US"/>
-        </w:rPr>
-        <w:instrText>related characteristics, and footwear usability). We aimed to objectively assess long</w:instrText>
-      </w:r>
-      <w:r>
-        <w:rPr>
-          <w:rFonts w:ascii="Cambria Math" w:hAnsi="Cambria Math" w:cs="Cambria Math"/>
-          <w:lang w:val="en-US"/>
-        </w:rPr>
-        <w:instrText>‐</w:instrText>
-      </w:r>
-      <w:r>
-        <w:rPr>
-          <w:rFonts w:ascii="Garamond" w:hAnsi="Garamond"/>
-          <w:lang w:val="en-US"/>
-        </w:rPr>
-        <w:instrText>term wearing patterns and identify factors associated with wearing orthopaedic footwear in people with diabetes at moderate</w:instrText>
-      </w:r>
-      <w:r>
-        <w:rPr>
-          <w:rFonts w:ascii="Cambria Math" w:hAnsi="Cambria Math" w:cs="Cambria Math"/>
-          <w:lang w:val="en-US"/>
-        </w:rPr>
-        <w:instrText>‐</w:instrText>
-      </w:r>
-      <w:r>
-        <w:rPr>
-          <w:rFonts w:ascii="Garamond" w:hAnsi="Garamond"/>
-          <w:lang w:val="en-US"/>
-        </w:rPr>
-        <w:instrText>to</w:instrText>
-      </w:r>
-      <w:r>
-        <w:rPr>
-          <w:rFonts w:ascii="Cambria Math" w:hAnsi="Cambria Math" w:cs="Cambria Math"/>
-          <w:lang w:val="en-US"/>
-        </w:rPr>
-        <w:instrText>‐</w:instrText>
-      </w:r>
-      <w:r>
-        <w:rPr>
-          <w:rFonts w:ascii="Garamond" w:hAnsi="Garamond"/>
-          <w:lang w:val="en-US"/>
-        </w:rPr>
-        <w:instrText>high risk of ulceration.\n            \n            \n              Methods\n              People diagnosed with diabetes mellitus type 1 and 2 with loss of protective sensation and/or peripheral artery disease and prescribed with orthopaedic footwear were included and followed for 12</w:instrText>
-      </w:r>
-      <w:r>
-        <w:rPr>
-          <w:rFonts w:ascii="Garamond" w:hAnsi="Garamond" w:cs="Garamond"/>
-          <w:lang w:val="en-US"/>
-        </w:rPr>
-        <w:instrText> </w:instrText>
-      </w:r>
-      <w:r>
-        <w:rPr>
-          <w:rFonts w:ascii="Garamond" w:hAnsi="Garamond"/>
-          <w:lang w:val="en-US"/>
-        </w:rPr>
-        <w:instrText>months. The primary outcome was mean daily wearing time, continuously measured using a temperature sensor inside the footwear (Orthotimer®). Adherence to wearing orthopaedic footwear was calculated as percentage of wearing time of a total assumed 16 h out</w:instrText>
-      </w:r>
-      <w:r>
-        <w:rPr>
-          <w:rFonts w:ascii="Cambria Math" w:hAnsi="Cambria Math" w:cs="Cambria Math"/>
-          <w:lang w:val="en-US"/>
-        </w:rPr>
-        <w:instrText>‐</w:instrText>
-      </w:r>
-      <w:r>
-        <w:rPr>
-          <w:rFonts w:ascii="Garamond" w:hAnsi="Garamond"/>
-          <w:lang w:val="en-US"/>
-        </w:rPr>
-        <w:instrText>of</w:instrText>
-      </w:r>
-      <w:r>
-        <w:rPr>
-          <w:rFonts w:ascii="Cambria Math" w:hAnsi="Cambria Math" w:cs="Cambria Math"/>
-          <w:lang w:val="en-US"/>
-        </w:rPr>
-        <w:instrText>‐</w:instrText>
-      </w:r>
-      <w:r>
-        <w:rPr>
-          <w:rFonts w:ascii="Garamond" w:hAnsi="Garamond"/>
-          <w:lang w:val="en-US"/>
-        </w:rPr>
-        <w:instrText>bed daytime, where adherence</w:instrText>
-      </w:r>
-      <w:r>
-        <w:rPr>
-          <w:lang w:val="en-US"/>
-        </w:rPr>
-        <w:instrText> </w:instrText>
-      </w:r>
-      <w:r>
-        <w:rPr>
-          <w:rFonts w:ascii="Garamond" w:hAnsi="Garamond"/>
-          <w:lang w:val="en-US"/>
-        </w:rPr>
-        <w:instrText>&lt;</w:instrText>
-      </w:r>
-      <w:r>
-        <w:rPr>
-          <w:lang w:val="en-US"/>
-        </w:rPr>
-        <w:instrText> </w:instrText>
-      </w:r>
-      <w:r>
-        <w:rPr>
-          <w:rFonts w:ascii="Garamond" w:hAnsi="Garamond"/>
-          <w:lang w:val="en-US"/>
-        </w:rPr>
-        <w:instrText>60% was a pre</w:instrText>
-      </w:r>
-      <w:r>
-        <w:rPr>
-          <w:rFonts w:ascii="Cambria Math" w:hAnsi="Cambria Math" w:cs="Cambria Math"/>
-          <w:lang w:val="en-US"/>
-        </w:rPr>
-        <w:instrText>‐</w:instrText>
-      </w:r>
-      <w:r>
-        <w:rPr>
-          <w:rFonts w:ascii="Garamond" w:hAnsi="Garamond"/>
-          <w:lang w:val="en-US"/>
-        </w:rPr>
-        <w:instrText>determined non</w:instrText>
-      </w:r>
-      <w:r>
-        <w:rPr>
-          <w:rFonts w:ascii="Cambria Math" w:hAnsi="Cambria Math" w:cs="Cambria Math"/>
-          <w:lang w:val="en-US"/>
-        </w:rPr>
-        <w:instrText>‐</w:instrText>
-      </w:r>
-      <w:r>
-        <w:rPr>
-          <w:rFonts w:ascii="Garamond" w:hAnsi="Garamond"/>
-          <w:lang w:val="en-US"/>
-        </w:rPr>
-        <w:instrText>adherent threshold. Wearing time patterns were assessed by calculating participants' wearing (in)consistency. One</w:instrText>
-      </w:r>
-      <w:r>
-        <w:rPr>
-          <w:rFonts w:ascii="Cambria Math" w:hAnsi="Cambria Math" w:cs="Cambria Math"/>
-          <w:lang w:val="en-US"/>
-        </w:rPr>
-        <w:instrText>‐</w:instrText>
-      </w:r>
-      <w:r>
-        <w:rPr>
-          <w:rFonts w:ascii="Garamond" w:hAnsi="Garamond"/>
-          <w:lang w:val="en-US"/>
-        </w:rPr>
-        <w:instrText xml:space="preserve">way analyses of variance tested for wearing time differences between subgroups, weekdays, and weekend days. Factors potentially associated with wearing time were collected by questionnaires and medical files. Univariately associated factors were included in multivariate linear regression analysis.\n            \n            \n              Results\n              \n                Sixty one participants were included (mean (SD) age: 68.0 (7.4) years; females:\n                n\n                </w:instrText>
-      </w:r>
-      <w:r>
-        <w:rPr>
-          <w:lang w:val="en-US"/>
-        </w:rPr>
-        <w:instrText> </w:instrText>
-      </w:r>
-      <w:r>
-        <w:rPr>
-          <w:rFonts w:ascii="Garamond" w:hAnsi="Garamond"/>
-          <w:lang w:val="en-US"/>
-        </w:rPr>
-        <w:instrText>=</w:instrText>
-      </w:r>
-      <w:r>
-        <w:rPr>
-          <w:lang w:val="en-US"/>
-        </w:rPr>
-        <w:instrText> </w:instrText>
-      </w:r>
-      <w:r>
-        <w:rPr>
-          <w:rFonts w:ascii="Garamond" w:hAnsi="Garamond"/>
-          <w:lang w:val="en-US"/>
-        </w:rPr>
-        <w:instrText xml:space="preserve">17; type 2 diabetes mellitus:\n                n\n                </w:instrText>
-      </w:r>
-      <w:r>
-        <w:rPr>
-          <w:lang w:val="en-US"/>
-        </w:rPr>
-        <w:instrText> </w:instrText>
-      </w:r>
-      <w:r>
-        <w:rPr>
-          <w:rFonts w:ascii="Garamond" w:hAnsi="Garamond"/>
-          <w:lang w:val="en-US"/>
-        </w:rPr>
-        <w:instrText>=</w:instrText>
-      </w:r>
-      <w:r>
-        <w:rPr>
-          <w:lang w:val="en-US"/>
-        </w:rPr>
-        <w:instrText> </w:instrText>
-      </w:r>
-      <w:r>
-        <w:rPr>
-          <w:rFonts w:ascii="Garamond" w:hAnsi="Garamond"/>
-          <w:lang w:val="en-US"/>
-        </w:rPr>
-        <w:instrText>54). Mean (SD) overall daily wearing time was 8.3 (6.1) hours/day. A total of 40 (66%) participants were non</w:instrText>
-      </w:r>
-      <w:r>
-        <w:rPr>
-          <w:rFonts w:ascii="Cambria Math" w:hAnsi="Cambria Math" w:cs="Cambria Math"/>
-          <w:lang w:val="en-US"/>
-        </w:rPr>
-        <w:instrText>‐</w:instrText>
-      </w:r>
-      <w:r>
-        <w:rPr>
-          <w:rFonts w:ascii="Garamond" w:hAnsi="Garamond"/>
-          <w:lang w:val="en-US"/>
-        </w:rPr>
-        <w:instrText xml:space="preserve">adherent. Participants with a consistent wearing pattern showed higher daily wearing times than participants with an inconsistent pattern. Mean (SD) wearing times were 12.7 (4.3) vs 3.6 (4.8) hours/day, respectively (\n                P\n                </w:instrText>
-      </w:r>
-      <w:r>
-        <w:rPr>
-          <w:lang w:val="en-US"/>
-        </w:rPr>
-        <w:instrText> </w:instrText>
-      </w:r>
-      <w:r>
-        <w:rPr>
-          <w:rFonts w:ascii="Garamond" w:hAnsi="Garamond"/>
-          <w:lang w:val="en-US"/>
-        </w:rPr>
-        <w:instrText>&lt;</w:instrText>
-      </w:r>
-      <w:r>
-        <w:rPr>
-          <w:lang w:val="en-US"/>
-        </w:rPr>
-        <w:instrText> </w:instrText>
-      </w:r>
-      <w:r>
-        <w:rPr>
-          <w:rFonts w:ascii="Garamond" w:hAnsi="Garamond"/>
-          <w:lang w:val="en-US"/>
-        </w:rPr>
-        <w:instrText xml:space="preserve">0.001). Mean (SD) wearing time was significantly higher (\n                P\n                </w:instrText>
-      </w:r>
-      <w:r>
-        <w:rPr>
-          <w:lang w:val="en-US"/>
-        </w:rPr>
-        <w:instrText> </w:instrText>
-      </w:r>
-      <w:r>
-        <w:rPr>
-          <w:rFonts w:ascii="Garamond" w:hAnsi="Garamond"/>
-          <w:lang w:val="en-US"/>
-        </w:rPr>
-        <w:instrText>&lt;</w:instrText>
-      </w:r>
-      <w:r>
-        <w:rPr>
-          <w:lang w:val="en-US"/>
-        </w:rPr>
-        <w:instrText> </w:instrText>
-      </w:r>
-      <w:r>
-        <w:rPr>
-          <w:rFonts w:ascii="Garamond" w:hAnsi="Garamond"/>
-          <w:lang w:val="en-US"/>
-        </w:rPr>
-        <w:instrText xml:space="preserve">0.010) during weekdays (8.7 (6.0) hours/day) compared to Saturday (8.0 (6.1) hours/day) and Sunday (6.9 (6.2) hours/day). In the multivariate model (R\n                2\n                </w:instrText>
-      </w:r>
-      <w:r>
-        <w:rPr>
-          <w:lang w:val="en-US"/>
-        </w:rPr>
-        <w:instrText> </w:instrText>
-      </w:r>
-      <w:r>
-        <w:rPr>
-          <w:rFonts w:ascii="Garamond" w:hAnsi="Garamond"/>
-          <w:lang w:val="en-US"/>
-        </w:rPr>
-        <w:instrText>=</w:instrText>
-      </w:r>
-      <w:r>
-        <w:rPr>
-          <w:lang w:val="en-US"/>
-        </w:rPr>
-        <w:instrText> </w:instrText>
-      </w:r>
-      <w:r>
-        <w:rPr>
-          <w:rFonts w:ascii="Garamond" w:hAnsi="Garamond"/>
-          <w:lang w:val="en-US"/>
-        </w:rPr>
-        <w:instrText xml:space="preserve">0.28), </w:instrText>
-      </w:r>
-      <w:r>
-        <w:rPr>
-          <w:rFonts w:ascii="Garamond" w:hAnsi="Garamond" w:cs="Garamond"/>
-          <w:lang w:val="en-US"/>
-        </w:rPr>
-        <w:instrText>“</w:instrText>
-      </w:r>
-      <w:r>
-        <w:rPr>
-          <w:rFonts w:ascii="Garamond" w:hAnsi="Garamond"/>
-          <w:lang w:val="en-US"/>
-        </w:rPr>
-        <w:instrText>satisfaction with my wear of orthopaedic footwear</w:instrText>
-      </w:r>
-      <w:r>
-        <w:rPr>
-          <w:rFonts w:ascii="Garamond" w:hAnsi="Garamond" w:cs="Garamond"/>
-          <w:lang w:val="en-US"/>
-        </w:rPr>
-        <w:instrText>”</w:instrText>
-      </w:r>
-      <w:r>
-        <w:rPr>
-          <w:rFonts w:ascii="Garamond" w:hAnsi="Garamond"/>
-          <w:lang w:val="en-US"/>
-        </w:rPr>
-        <w:instrText xml:space="preserve"> was positively associated (\n                P\n                </w:instrText>
-      </w:r>
-      <w:r>
-        <w:rPr>
-          <w:lang w:val="en-US"/>
-        </w:rPr>
-        <w:instrText> </w:instrText>
-      </w:r>
-      <w:r>
-        <w:rPr>
-          <w:rFonts w:ascii="Garamond" w:hAnsi="Garamond"/>
-          <w:lang w:val="en-US"/>
-        </w:rPr>
-        <w:instrText>&lt;</w:instrText>
-      </w:r>
-      <w:r>
-        <w:rPr>
-          <w:lang w:val="en-US"/>
-        </w:rPr>
-        <w:instrText> </w:instrText>
-      </w:r>
-      <w:r>
-        <w:rPr>
-          <w:rFonts w:ascii="Garamond" w:hAnsi="Garamond"/>
-          <w:lang w:val="en-US"/>
-        </w:rPr>
-        <w:instrText>0.001) with wearing time. The other seven multivariate model factors (four demographic variables and three footwear usability variables) were not associated with wearing time.\n              \n            \n            \n              Conclusions\n              Only one out of three people at moderate to high risk of foot ulceration were sufficiently adherent to wearing their orthopaedic footwear. Changing people's wearing behaviour to a more stable pattern seems a potential avenue to improve long</w:instrText>
-      </w:r>
-      <w:r>
-        <w:rPr>
-          <w:rFonts w:ascii="Cambria Math" w:hAnsi="Cambria Math" w:cs="Cambria Math"/>
-          <w:lang w:val="en-US"/>
-        </w:rPr>
-        <w:instrText>‐</w:instrText>
-      </w:r>
-      <w:r>
-        <w:rPr>
-          <w:rFonts w:ascii="Garamond" w:hAnsi="Garamond"/>
-          <w:lang w:val="en-US"/>
-        </w:rPr>
-        <w:instrText>term adherence to wearing orthopaedic footwear. Investigated factors are not associated with daily wearing time. Based on these factors the daily wearing time cannot be estimated in daily practice.\n            \n            \n              Trial registration\n              Netherlands Trial Register NL7710. Registered: 6</w:instrText>
-      </w:r>
-      <w:r>
-        <w:rPr>
-          <w:rFonts w:ascii="Garamond" w:hAnsi="Garamond" w:cs="Garamond"/>
-          <w:lang w:val="en-US"/>
-        </w:rPr>
-        <w:instrText> </w:instrText>
-      </w:r>
-      <w:r>
-        <w:rPr>
-          <w:rFonts w:ascii="Garamond" w:hAnsi="Garamond"/>
-          <w:lang w:val="en-US"/>
-        </w:rPr>
-        <w:instrText>May 2019.","container-title":"Journal of Foot and Ankle Research","DOI":"10.1186/s13047-023-00656-6","ISSN":"1757-1146, 1757-1146","issue":"1","journalAbbreviation":"Journal of Foot and Ankle Research","language":"en","license":"http://creativecommons.org/licenses/by/4.0/","page":"60","source":"DOI.org (Crossref)","title":"Objectively assessed long</w:instrText>
-      </w:r>
-      <w:r>
-        <w:rPr>
-          <w:rFonts w:ascii="Cambria Math" w:hAnsi="Cambria Math" w:cs="Cambria Math"/>
-          <w:lang w:val="en-US"/>
-        </w:rPr>
-        <w:instrText>‐</w:instrText>
-      </w:r>
-      <w:r>
-        <w:rPr>
-          <w:rFonts w:ascii="Garamond" w:hAnsi="Garamond"/>
-          <w:lang w:val="en-US"/>
-        </w:rPr>
-        <w:instrText>term wearing patterns and predictors of wearing orthopaedic footwear in people with diabetes at moderate</w:instrText>
-      </w:r>
-      <w:r>
-        <w:rPr>
-          <w:rFonts w:ascii="Cambria Math" w:hAnsi="Cambria Math" w:cs="Cambria Math"/>
-          <w:lang w:val="en-US"/>
-        </w:rPr>
-        <w:instrText>‐</w:instrText>
-      </w:r>
-      <w:r>
-        <w:rPr>
-          <w:rFonts w:ascii="Garamond" w:hAnsi="Garamond"/>
-          <w:lang w:val="en-US"/>
-        </w:rPr>
-        <w:instrText>to</w:instrText>
-      </w:r>
-      <w:r>
-        <w:rPr>
-          <w:rFonts w:ascii="Cambria Math" w:hAnsi="Cambria Math" w:cs="Cambria Math"/>
-          <w:lang w:val="en-US"/>
-        </w:rPr>
-        <w:instrText>‐</w:instrText>
-      </w:r>
-      <w:r>
-        <w:rPr>
-          <w:rFonts w:ascii="Garamond" w:hAnsi="Garamond"/>
-          <w:lang w:val="en-US"/>
-        </w:rPr>
-        <w:instrText>high risk of foot ulceration: a 12 months observational study","title-short":"Objectively assessed long</w:instrText>
-      </w:r>
-      <w:r>
-        <w:rPr>
-          <w:rFonts w:ascii="Cambria Math" w:hAnsi="Cambria Math" w:cs="Cambria Math"/>
-          <w:lang w:val="en-US"/>
-        </w:rPr>
-        <w:instrText>‐</w:instrText>
-      </w:r>
-      <w:r>
-        <w:rPr>
-          <w:rFonts w:ascii="Garamond" w:hAnsi="Garamond"/>
-          <w:lang w:val="en-US"/>
-        </w:rPr>
-        <w:instrText>term wearing patterns and predictors of wearing orthopaedic footwear in people with diabetes at moderate</w:instrText>
-      </w:r>
-      <w:r>
-        <w:rPr>
-          <w:rFonts w:ascii="Cambria Math" w:hAnsi="Cambria Math" w:cs="Cambria Math"/>
-          <w:lang w:val="en-US"/>
-        </w:rPr>
-        <w:instrText>‐</w:instrText>
-      </w:r>
-      <w:r>
-        <w:rPr>
-          <w:rFonts w:ascii="Garamond" w:hAnsi="Garamond"/>
-          <w:lang w:val="en-US"/>
-        </w:rPr>
-        <w:instrText>to</w:instrText>
-      </w:r>
-      <w:r>
-        <w:rPr>
-          <w:rFonts w:ascii="Cambria Math" w:hAnsi="Cambria Math" w:cs="Cambria Math"/>
-          <w:lang w:val="en-US"/>
-        </w:rPr>
-        <w:instrText>‐</w:instrText>
-      </w:r>
-      <w:r>
-        <w:rPr>
-          <w:rFonts w:ascii="Garamond" w:hAnsi="Garamond"/>
-          <w:lang w:val="en-US"/>
-        </w:rPr>
-        <w:instrText>high risk of foot ulceration","volume":"16","author":[{"family":"Exterkate","given":"Stein H."},{"family":"Jongebloed</w:instrText>
-      </w:r>
-      <w:r>
-        <w:rPr>
-          <w:rFonts w:ascii="Cambria Math" w:hAnsi="Cambria Math" w:cs="Cambria Math"/>
-          <w:lang w:val="en-US"/>
-        </w:rPr>
-        <w:instrText>‐</w:instrText>
-      </w:r>
-      <w:r>
-        <w:rPr>
-          <w:rFonts w:ascii="Garamond" w:hAnsi="Garamond"/>
-          <w:lang w:val="en-US"/>
-        </w:rPr>
-        <w:instrText>Westra","given":"Manon"},{"family":"Ten Klooster","given":"Peter M."},{"family":"Koffijberg","given":"Hendrik"},{"family":"Bode","given":"Christina"},{"family":"Van Gemert</w:instrText>
-      </w:r>
-      <w:r>
-        <w:rPr>
-          <w:rFonts w:ascii="Cambria Math" w:hAnsi="Cambria Math" w:cs="Cambria Math"/>
-          <w:lang w:val="en-US"/>
-        </w:rPr>
-        <w:instrText>‐</w:instrText>
-      </w:r>
-      <w:r>
-        <w:rPr>
-          <w:rFonts w:ascii="Garamond" w:hAnsi="Garamond"/>
-          <w:lang w:val="en-US"/>
-        </w:rPr>
-        <w:instrText xml:space="preserve">Pijnen","given":"Julia E. W. C."},{"family":"Van Baal","given":"Josephus G."},{"family":"Van Netten","given":"Jaap J."}],"issued":{"date-parts":[["2023",1]]}}}],"schema":"https://github.com/citation-style-language/schema/raw/master/csl-citation.json"} </w:instrText>
-      </w:r>
-      <w:r>
-        <w:rPr>
-          <w:rFonts w:ascii="Garamond" w:hAnsi="Garamond"/>
-          <w:lang w:val="en-US"/>
-        </w:rPr>
-        <w:fldChar w:fldCharType="separate"/>
+        <w:t>5</w:t>
       </w:r>
       <w:r>
         <w:rPr>
           <w:rFonts w:ascii="Garamond" w:hAnsi="Garamond"/>
           <w:vertAlign w:val="superscript"/>
-          <w:lang w:val="en-GB"/>
-        </w:rPr>
-        <w:t>7</w:t>
-      </w:r>
-      <w:r>
-        <w:rPr>
-          <w:rFonts w:ascii="Garamond" w:hAnsi="Garamond"/>
           <w:lang w:val="en-US"/>
         </w:rPr>
         <w:fldChar w:fldCharType="end"/>
@@ -2354,30 +3037,40 @@
         <w:jc w:val="both"/>
         <w:rPr>
           <w:rFonts w:ascii="Garamond" w:hAnsi="Garamond"/>
-          <w:lang w:val="en-US"/>
-        </w:rPr>
-      </w:pPr>
-      <w:r>
-        <w:rPr>
-          <w:rFonts w:ascii="Garamond" w:hAnsi="Garamond"/>
-          <w:lang w:val="en-GB"/>
-        </w:rPr>
-        <w:lastRenderedPageBreak/>
-        <w:t>PARADISE (Pressure-, Adherence-, and Education-Driven Service) addresses this translational gap through an integrated intervention combining pressure-guided optimisation of therapeutic footwear and foot orthoses, structured education on adequate foot care and footwear use, and sensor-based adherence monitoring.</w:t>
-      </w:r>
-      <w:r>
-        <w:rPr>
-          <w:rFonts w:ascii="Garamond" w:hAnsi="Garamond"/>
-          <w:lang w:val="en-GB"/>
-        </w:rPr>
-        <w:t xml:space="preserve"> </w:t>
-      </w:r>
-      <w:r>
-        <w:rPr>
-          <w:rFonts w:ascii="Garamond" w:hAnsi="Garamond"/>
-          <w:lang w:val="en-GB"/>
-        </w:rPr>
-        <w:t>Education and behavioural support are delivered as two distinct components within the Structured Education and Behavioural Intervention Approach (SEBIA): education addresses knowledge and skills for adequate foot care and for the prescribed orthoses, while behavioural support draws on motivational interviewing, solution-focused brief therapy and behaviour change wheel principles, among other evidence-based behavioural change methods, to identify and address individual barriers</w:t>
+          <w:vertAlign w:val="superscript"/>
+          <w:lang w:val="en-US"/>
+        </w:rPr>
+      </w:pPr>
+      <w:r>
+        <w:rPr>
+          <w:rFonts w:ascii="Garamond" w:hAnsi="Garamond"/>
+          <w:b/>
+          <w:lang w:val="en-US"/>
+        </w:rPr>
+        <w:t xml:space="preserve">(2) Objective footwear-adherence monitoring. </w:t>
+      </w:r>
+      <w:r>
+        <w:rPr>
+          <w:rFonts w:ascii="Garamond" w:hAnsi="Garamond"/>
+          <w:lang w:val="en-GB"/>
+        </w:rPr>
+        <w:t xml:space="preserve">Sensor-based technologies (Orthotimer and </w:t>
+      </w:r>
+      <w:proofErr w:type="spellStart"/>
+      <w:r>
+        <w:rPr>
+          <w:rFonts w:ascii="Garamond" w:hAnsi="Garamond"/>
+          <w:lang w:val="en-GB"/>
+        </w:rPr>
+        <w:t>MoveMonitor</w:t>
+      </w:r>
+      <w:proofErr w:type="spellEnd"/>
+      <w:r>
+        <w:rPr>
+          <w:rFonts w:ascii="Garamond" w:hAnsi="Garamond"/>
+          <w:lang w:val="en-GB"/>
+        </w:rPr>
+        <w:t>) quantify footwear wearing time and contextualise adherence against daily activity exposure, addressing the limitations of self-reported footwear use</w:t>
       </w:r>
       <w:r>
         <w:rPr>
@@ -2398,35 +3091,7 @@
           <w:rFonts w:ascii="Garamond" w:hAnsi="Garamond"/>
           <w:lang w:val="en-US"/>
         </w:rPr>
-        <w:instrText xml:space="preserve"> ADDIN ZOTERO_ITEM CSL_CITATION {"citationID":"TILrK4jz","properties":{"unsorted":false,"formattedCitation":"\\super 5,8\\uc0\\u8211{}10\\nosupersub{}","plainCitation":"5,8–10","noteIndex":0},"citationItems":[{"id":48,"uris":["http://zotero.org/users/19619518/items/HQRWT4X4"],"itemData":{"id":48,"type":"article-journal","abstract":"OBJECTIVE\n              Custom-made footwear is the treatment of choice to prevent foot ulcer recurrence in diabetes. This footwear primarily aims to offload plantar regions at high ulcer risk. However, ulcer recurrence rates are high. We assessed the effect of offloading-improved custom-made footwear and the role of footwear adherence on plantar foot ulcer recurrence.\n            \n            \n              RESEARCH DESIGN AND METHODS\n              We randomly assigned 171 neuropathic diabetic patients with a recently healed plantar foot ulcer to custom-made footwear with improved and subsequently preserved offloading (</w:instrText>
-      </w:r>
-      <w:r>
-        <w:rPr>
-          <w:rFonts w:ascii="Cambria Math" w:hAnsi="Cambria Math" w:cs="Cambria Math"/>
-          <w:lang w:val="en-US"/>
-        </w:rPr>
-        <w:instrText>∼</w:instrText>
-      </w:r>
-      <w:r>
-        <w:rPr>
-          <w:rFonts w:ascii="Garamond" w:hAnsi="Garamond"/>
-          <w:lang w:val="en-US"/>
-        </w:rPr>
-        <w:instrText xml:space="preserve">20% peak pressure relief by modifying the footwear) or to usual care (i.e., nonimproved custom-made footwear). Primary outcome was plantar foot ulcer recurrence in 18 months. Secondary outcome was ulcer recurrence in patients with an objectively measured adherence of </w:instrText>
-      </w:r>
-      <w:r>
-        <w:rPr>
-          <w:rFonts w:ascii="Garamond" w:hAnsi="Garamond" w:cs="Garamond"/>
-          <w:lang w:val="en-US"/>
-        </w:rPr>
-        <w:instrText>≥</w:instrText>
-      </w:r>
-      <w:r>
-        <w:rPr>
-          <w:rFonts w:ascii="Garamond" w:hAnsi="Garamond"/>
-          <w:lang w:val="en-US"/>
-        </w:rPr>
-        <w:instrText xml:space="preserve">80% of steps taken.\n            \n            \n              RESULTS\n              On the basis of intention-to-treat, 33 of 85 patients (38.8%) with improved footwear and 38 of 86 patients (44.2%) with usual care had a recurrent ulcer (relative risk −11%, odds ratio 0.80 [95% CI 0.44–1.47], P = 0.48). Ulcer-free survival curves were not significantly different between groups (P = 0.40). In the 79 patients (46% of total group) with high adherence, 9 of 35 (25.7%) with improved footwear and 21 of 44 (47.8%) with usual care had a recurrent ulcer (relative risk −46%, odds ratio 0.38 [0.15–0.99], P = 0.045).\n            \n            \n              CONCLUSIONS\n              Offloading-improved custom-made footwear does not significantly reduce the incidence of plantar foot ulcer recurrence in diabetes compared with custom-made footwear that does not undergo such improvement, unless it is worn as recommended.","container-title":"Diabetes Care","DOI":"10.2337/dc13-0996","ISSN":"0149-5992, 1935-5548","issue":"12","language":"en","page":"4109-4116","source":"DOI.org (Crossref)","title":"Effect of Custom-Made Footwear on Foot Ulcer Recurrence in Diabetes","volume":"36","author":[{"family":"Bus","given":"Sicco A."},{"family":"Waaijman","given":"Roelof"},{"family":"Arts","given":"Mark"},{"family":"De Haart","given":"Mirjam"},{"family":"Busch-Westbroek","given":"Tessa"},{"family":"Van Baal","given":"Jeff"},{"family":"Nollet","given":"Frans"}],"issued":{"date-parts":[["2013",12,1]]}}},{"id":15,"uris":["http://zotero.org/users/19619518/items/BJNTEA29"],"itemData":{"id":15,"type":"article-journal","container-title":"European Journal of Vascular and Endovascular Surgery","DOI":"10.1016/j.ejvs.2020.03.053","ISSN":"10785884","issue":"2","journalAbbreviation":"European Journal of Vascular and Endovascular Surgery","language":"en","page":"282-292","source":"DOI.org (Crossref)","title":"A Systematic Review of the Impact of Foot Care Education on Self Efficacy and Self Care in Patients With Diabetes","volume":"60","author":[{"family":"Goodall","given":"Richard J."},{"family":"Ellauzi","given":"Juan"},{"family":"Tan","given":"Matthew K.H."},{"family":"Onida","given":"Sarah"},{"family":"Davies","given":"Alun H."},{"family":"Shalhoub","given":"Joseph"}],"issued":{"date-parts":[["2020",8]]}}},{"id":14,"uris":["http://zotero.org/users/19619518/items/54DKJVW9"],"itemData":{"id":14,"type":"article-journal","container-title":"Implementation Science","DOI":"10.1186/1748-5908-6-42","ISSN":"1748-5908","issue":"1","journalAbbreviation":"Implementation Sci","language":"en","license":"http://www.springer.com/tdm","page":"42","source":"DOI.org (Crossref)","title":"The behaviour change wheel: A new method for characterising and designing behaviour change interventions","title-short":"The behaviour change wheel","volume":"6","author":[{"family":"Michie","given":"Susan"},{"family":"Van Stralen","given":"Maartje M"},{"family":"West","given":"Robert"}],"issued":{"date-parts":[["2011",12]]}}},{"id":13,"uris":["http://zotero.org/users/19619518/items/ZEQZLJXL"],"itemData":{"id":13,"type":"article-journal","container-title":"Annals of Behavioral Medicine","DOI":"10.1007/s12160-013-9486-6","ISSN":"0883-6612, 1532-4796","issue":"1","journalAbbreviation":"ann. behav. med.","language":"en","page":"81-95","source":"DOI.org (Crossref)","title":"The Behavior Change Technique Taxonomy (v1) of 93 Hierarchically Clustered Techniques: Building an International Consensus for the Reporting of Behavior Change Interventions","title-short":"The Behavior Change Technique Taxonomy (v1) of 93 Hierarchically Clustered Techniques","volume":"46","author":[{"family":"Michie","given":"Susan"},{"family":"Richardson","given":"Michelle"},{"family":"Johnston","given":"Marie"},{"family":"Abraham","given":"Charles"},{"family":"Francis","given":"Jill"},{"family":"Hardeman","given":"Wendy"},{"family":"Eccles","given":"Martin P."},{"family":"Cane","given":"James"},{"family":"Wood","given":"Caroline E."}],"issued":{"date-parts":[["2013",8]]}}}],"schema":"https://github.com/citation-style-language/schema/raw/master/csl-citation.json"} </w:instrText>
+        <w:instrText xml:space="preserve"> ADDIN ZOTERO_ITEM CSL_CITATION {"citationID":"5H9hUGmg","properties":{"unsorted":false,"formattedCitation":"\\super 6,12,13\\nosupersub{}","plainCitation":"6,12,13","noteIndex":0},"citationItems":[{"id":16,"uris":["http://zotero.org/users/19619518/items/PZIVAKCP"],"itemData":{"id":16,"type":"article-journal","abstract":"OBJECTIVE\n              Prescription custom-made footwear can only be effective in preventing diabetic foot ulcers if worn by the patient. Particularly, the high prevalence of recurrent foot ulcers focuses the attention on adherence, for which objective data are nonexisting. We objectively assessed adherence in patients with high risk of ulcer recurrence and evaluated what determines adherence.\n            \n            \n              RESEARCH DESIGN AND METHODS\n              In 107 patients with diabetes, neuropathy, a recently healed plantar foot ulcer, and custom-made footwear, footwear use was measured during 7 consecutive days using a shoe-worn, temperature-based monitor. Daily step count was measured simultaneously using an ankle-worn activity monitor. Patients logged time away from home. Adherence was calculated as the percentage of steps that prescription footwear was worn. Determinants of adherence were evaluated in multivariate linear regression analysis.\n            \n            \n              RESULTS\n              Mean ± SD adherence was 71 ± 25%. Adherence at home was 61 ± 32%, over 3,959 ± 2,594 steps, and away from home 87 ± 26%, over 2,604 ± 2,507 steps. In 35 patients with low adherence (&amp;lt;60%), adherence at home was 28 ± 24%. Lower BMI, more severe foot deformity, and more appealing footwear were significantly associated with higher adherence.\n            \n            \n              CONCLUSIONS\n              The results show that adherence to wearing custom-made footwear is insufficient, particularly at home where patients exhibit their largest walking activity. This low adherence is a major threat for reulceration. These objective findings provide directions for improvement in adherence, which could include prescribing specific off-loading footwear for indoors, and they set a reference for future comparative research on footwear adherence in diabetes.","container-title":"Diabetes Care","DOI":"10.2337/dc12-1330","ISSN":"0149-5992, 1935-5548","issue":"6","language":"en","page":"1613-1618","source":"DOI.org (Crossref)","title":"Adherence to Wearing Prescription Custom-Made Footwear in Patients With Diabetes at High Risk for Plantar Foot Ulceration","volume":"36","author":[{"family":"Waaijman","given":"Roelof"},{"family":"Keukenkamp","given":"Renske"},{"family":"De Haart","given":"Mirjam"},{"family":"Polomski","given":"Wojtek P."},{"family":"Nollet","given":"Frans"},{"family":"Bus","given":"Sicco A."}],"issued":{"date-parts":[["2013",6,1]]}}},{"id":42,"uris":["http://zotero.org/users/19619518/items/D8ULXF23"],"itemData":{"id":42,"type":"article-journal","abstract":"Therapeutic footwear (TF) has been demonstrated to decrease the rate of recurrence in patients in remission. TF adherence determines the real effect of such treatment and, therefore, an appropriate evaluation of TF adherence is critical to decrease recurrence. The aim of this systematic review was to determine the usability of different methods of assessing adherence to TF in patients with diabetic foot ulcers under remission. The search strategy retrieved 506 articles. Title and abstract review excluded 472, while the full-text review excluded an additional 18 articles because the included data did not meet the selection criteria. Finally, we included 16 articles in this systematic review. Six (37.5%) of the 16 studies combined objective (OM) and subjective methods (SM). Only five (31.25%) evaluated OM and six (37.5%) studies only evaluated SM. Objective methods (temperature sensor, activity monitor) and subjective methods (survey, questionnaire) have successfully been used in the literature to evaluate TF adherence. Objective methods provided accurate data, whereas subjective methods led to response bias or missing data. Methods of evaluation showed that patients use the TF more frequently outdoors and on weekdays than indoors or on the weekend. In conclusion, objective methods are the most usable way to measure adherence to TF.","container-title":"The International Journal of Lower Extremity Wounds","DOI":"10.1177/15347346231190680","ISSN":"1534-7346, 1552-6941","issue":"1","journalAbbreviation":"The International Journal of Lower Extremity Wounds","language":"en","page":"55-64","source":"DOI.org (Crossref)","title":"Usability of Different Methods to Assess and Improve Adherence to Therapeutic Footwear in Persons with the Diabetic Foot in Remission. A Systematic Review","volume":"25","author":[{"family":"López-Moral","given":"Mateo"},{"family":"Molines-Barroso","given":"Raúl J."},{"family":"Herrera-Casamayor","given":"María"},{"family":"García-Madrid","given":"Marta"},{"family":"García-Morales","given":"Esther"},{"family":"Lázaro-Martínez","given":"José Luis"}],"issued":{"date-parts":[["2026",3]]}}},{"id":43,"uris":["http://zotero.org/users/19619518/items/FWKZCSUG"],"itemData":{"id":43,"type":"article-journal","container-title":"Journal of Rehabilitation Medicine","DOI":"10.2340/16501977-2759","ISSN":"1651-2081","issue":"11","journalAbbreviation":"J Rehabil Med","language":"en","page":"jrm00127","source":"DOI.org (Crossref)","title":"Effect of awareness of being monitored on wearing of orthopaedic footwear","volume":"52","author":[{"family":"Lutjeboer","given":"T"},{"family":"Netten","given":"J"},{"family":"Postema","given":"K"},{"family":"Hijmans","given":"J"}],"issued":{"date-parts":[["2020"]]}}}],"schema":"https://github.com/citation-style-language/schema/raw/master/csl-citation.json"} </w:instrText>
       </w:r>
       <w:r>
         <w:rPr>
@@ -2441,7 +3106,7 @@
           <w:vertAlign w:val="superscript"/>
           <w:lang w:val="en-GB"/>
         </w:rPr>
-        <w:t>5,8–10</w:t>
+        <w:t>6,12,13</w:t>
       </w:r>
       <w:r>
         <w:rPr>
@@ -2457,33 +3122,36 @@
         <w:jc w:val="both"/>
         <w:rPr>
           <w:rFonts w:ascii="Garamond" w:hAnsi="Garamond"/>
-          <w:lang w:val="en-US"/>
-        </w:rPr>
-      </w:pPr>
-      <w:r>
-        <w:rPr>
-          <w:rFonts w:ascii="Garamond" w:hAnsi="Garamond"/>
-          <w:lang w:val="en-GB"/>
-        </w:rPr>
-        <w:t>PARADISE has been piloted in one Belgian DFC but has not yet undergone large-scale clinical validation. A Dutch precursor combining education, motivational interviewing, and adherence monitoring demonstrated feasibility</w:t>
-      </w:r>
-      <w:r>
-        <w:rPr>
-          <w:rFonts w:ascii="Garamond" w:hAnsi="Garamond"/>
-          <w:lang w:val="en-GB"/>
-        </w:rPr>
-        <w:t xml:space="preserve">, </w:t>
-      </w:r>
-      <w:r>
-        <w:rPr>
-          <w:rFonts w:ascii="Garamond" w:hAnsi="Garamond"/>
-          <w:lang w:val="en-GB"/>
-        </w:rPr>
-        <w:t>but showed limited effects on overall wear time after three months, with improvements mainly observed for indoor footwear use.</w:t>
-      </w:r>
-      <w:r>
-        <w:rPr>
-          <w:rFonts w:ascii="Garamond" w:hAnsi="Garamond"/>
+          <w:vertAlign w:val="superscript"/>
+          <w:lang w:val="en-US"/>
+        </w:rPr>
+      </w:pPr>
+      <w:r>
+        <w:rPr>
+          <w:rFonts w:ascii="Garamond" w:hAnsi="Garamond"/>
+          <w:b/>
+          <w:lang w:val="en-US"/>
+        </w:rPr>
+        <w:t xml:space="preserve">(3) Structured education and behavioural support. </w:t>
+      </w:r>
+      <w:r>
+        <w:rPr>
+          <w:rFonts w:ascii="Garamond" w:hAnsi="Garamond"/>
+          <w:lang w:val="en-GB"/>
+        </w:rPr>
+        <w:t>Education covers adequate daily foot care and the rationale for wearing the prescribed orthoses and footwear. Behavioural support, delivered through SEBIA, draws on motivational interviewing, solution-focused brief therapy and behaviour change wheel principles, among other evidence-based behavioural change methods, to identify and address individual barriers to adherence</w:t>
+      </w:r>
+      <w:r>
+        <w:rPr>
+          <w:rFonts w:ascii="Garamond" w:hAnsi="Garamond"/>
+          <w:lang w:val="en-US"/>
+        </w:rPr>
+        <w:t>.</w:t>
+      </w:r>
+      <w:r>
+        <w:rPr>
+          <w:rFonts w:ascii="Garamond" w:hAnsi="Garamond"/>
+          <w:vertAlign w:val="superscript"/>
           <w:lang w:val="en-US"/>
         </w:rPr>
         <w:fldChar w:fldCharType="begin"/>
@@ -2491,13 +3159,30 @@
       <w:r>
         <w:rPr>
           <w:rFonts w:ascii="Garamond" w:hAnsi="Garamond"/>
-          <w:lang w:val="en-US"/>
-        </w:rPr>
-        <w:instrText xml:space="preserve"> ADDIN ZOTERO_ITEM CSL_CITATION {"citationID":"ZwJskDOt","properties":{"unsorted":false,"formattedCitation":"\\super 11\\nosupersub{}","plainCitation":"11","noteIndex":0},"citationItems":[{"id":52,"uris":["http://zotero.org/users/19619518/items/NSK33Z7U"],"itemData":{"id":52,"type":"article-journal","abstract":"Background: Wearing custom-made footwear is key in diabetes-related foot ulcer prevention. However, adhering to wearing footwear is challenging, in particular at home. Evidence-based interventions with proven effect are needed, but scarce. We developed a multi-modal intervention to improve custom-made footwear use, and investigated short-term efficacy. Methods: We used a multidisciplinary multiphase approach to develop a three-modality intervention: structured education, motivational interviewing, and custom-made indoor footwear. To assess efficacy, we measured mean 2-week wearing time of custom-made footwear with a validated sensor, at baseline and after three months (primary outcome), and in the two weeks directly before and after each modality was administered (secondary outcomes). We assessed differences between timepoints using within-subjects paired t-tests. Results: 53 participants with high risk for ulceration were included: 30 with low [&lt;8 h/day] baseline adherence), 17% females, mean age 66 (SD: 10) years, all with peripheral neuropathy and a recent foot ulcer (mean time since healing: 6 (SD: 9) months). Wearing time increased non-significantly from 4.0 (SD: 2.5) at baseline to 5.5 (SD: 4.3) after three months in the low adherence group (p = 0.068); this was 11.9 (SD: 2.3) to 12.0 (SD: 2.8) in the high adherence group (p = 0.898). Following provision of indoor footwear, wearing time increased significantly for low baseline adherence (∆2.7 h/day (95% CI: 1.0–4.4; p = 0.004) and high baseline adherence (∆2.0 h/day (95% CI: 0.5–3.4; p = 0.010). Following structured education, wearing time increased non-significantly in those with low baseline adherence (∆1.0 h/day (95% CI: −0.2–2.2; p = 0.098). Following motivational interviewing, wearing time remained similar in both groups. Conclusions: The multi-modal intervention program combining structured education, motivational interviewing and custom-made indoor footwear did not result in a statistically significant improvement in the wearing time of custom-made footwear after three months. However, significant improvements followed the provision of indoor footwear, and clinically relevant improvements followed structured education in people with low adherence, providing avenues for implementation and research.","container-title":"Journal of Clinical Medicine","DOI":"10.3390/jcm14113635","ISSN":"2077-0383","issue":"11","journalAbbreviation":"JCM","language":"en","page":"3635","source":"DOI.org (Crossref)","title":"Short-Term Efficacy of a Multi-Modal Intervention Program to Improve Custom-Made Footwear Use in People at High Risk of Diabetes-Related Foot Ulceration","volume":"14","author":[{"family":"Van Netten","given":"Jaap J."},{"family":"Vossen","given":"Lisa E."},{"family":"Driebergen","given":"Faye M."},{"family":"Wolthuis","given":"Danne"},{"family":"Merkx","given":"Maarten J. M."},{"family":"Bus","given":"Sicco A."}],"issued":{"date-parts":[["2025",5,22]]}}}],"schema":"https://github.com/citation-style-language/schema/raw/master/csl-citation.json"} </w:instrText>
-      </w:r>
-      <w:r>
-        <w:rPr>
-          <w:rFonts w:ascii="Garamond" w:hAnsi="Garamond"/>
+          <w:vertAlign w:val="superscript"/>
+          <w:lang w:val="en-US"/>
+        </w:rPr>
+        <w:instrText xml:space="preserve"> ADDIN ZOTERO_ITEM CSL_CITATION {"citationID":"0QQT9vJY","properties":{"unsorted":false,"formattedCitation":"\\super 9,10,14\\nosupersub{}","plainCitation":"9,10,14","noteIndex":0},"citationItems":[{"id":14,"uris":["http://zotero.org/users/19619518/items/54DKJVW9"],"itemData":{"id":14,"type":"article-journal","container-title":"Implementation Science","DOI":"10.1186/1748-5908-6-42","ISSN":"1748-5908","issue":"1","journalAbbreviation":"Implementation Sci","language":"en","license":"http://www.springer.com/tdm","page":"42","source":"DOI.org (Crossref)","title":"The behaviour change wheel: A new method for characterising and designing behaviour change interventions","title-short":"The behaviour change wheel","volume":"6","author":[{"family":"Michie","given":"Susan"},{"family":"Van Stralen","given":"Maartje M"},{"family":"West","given":"Robert"}],"issued":{"date-parts":[["2011",12]]}}},{"id":13,"uris":["http://zotero.org/users/19619518/items/ZEQZLJXL"],"itemData":{"id":13,"type":"article-journal","container-title":"Annals of Behavioral Medicine","DOI":"10.1007/s12160-013-9486-6","ISSN":"0883-6612, 1532-4796","issue":"1","journalAbbreviation":"ann. behav. med.","language":"en","page":"81-95","source":"DOI.org (Crossref)","title":"The Behavior Change Technique Taxonomy (v1) of 93 Hierarchically Clustered Techniques: Building an International Consensus for the Reporting of Behavior Change Interventions","title-short":"The Behavior Change Technique Taxonomy (v1) of 93 Hierarchically Clustered Techniques","volume":"46","author":[{"family":"Michie","given":"Susan"},{"family":"Richardson","given":"Michelle"},{"family":"Johnston","given":"Marie"},{"family":"Abraham","given":"Charles"},{"family":"Francis","given":"Jill"},{"family":"Hardeman","given":"Wendy"},{"family":"Eccles","given":"Martin P."},{"family":"Cane","given":"James"},{"family":"Wood","given":"Caroline E."}],"issued":{"date-parts":[["2013",8]]}}},{"id":41,"uris":["http://zotero.org/users/19619518/items/9CV6ZUVG"],"itemData":{"id":41,"type":"article-journal","abstract":"Abstract\n            \n              Background\n              Diabetic foot ulcers have a high impact on mobility and daily functioning and lead to high treatment costs, for example, by hospitalization and amputation. To prevent (re)ulcerations, custom-made orthopedic shoes are considered essential. However, adherence to wearing the orthopedic shoes is low, and improving adherence was not successful in the past. We propose a novel care approach that combines motivational interviewing (MI) with a digital shoe-fitting procedure to improve adherence to orthopedic shoes. The aim of this trial is to assess the (cost-)effectiveness of this novel care approach compared to usual care (no MI and casting-based shoe-fitting) in promoting footwear adherence and ulcer prevention.\n            \n            \n              Methods\n              The trial will include people with diabetes, with IWGDF Risk categories 1–3, who have been prescribed orthopedic shoes. Participants will be randomized at the level of the podiatrist to the novel care approach or usual care. The primary outcome is the proportion of participants who adhere to the use of their orthopedic shoes, that is, who take at least 80% of their total daily steps with orthopedic shoes. A temperature microsensor will be built into the participants’ orthopedic shoes to measure wearing time continuously over 12</w:instrText>
+      </w:r>
+      <w:r>
+        <w:rPr>
+          <w:vertAlign w:val="superscript"/>
+          <w:lang w:val="en-US"/>
+        </w:rPr>
+        <w:instrText> </w:instrText>
+      </w:r>
+      <w:r>
+        <w:rPr>
+          <w:rFonts w:ascii="Garamond" w:hAnsi="Garamond"/>
+          <w:vertAlign w:val="superscript"/>
+          <w:lang w:val="en-US"/>
+        </w:rPr>
+        <w:instrText xml:space="preserve">months. In addition, daily activity will be measured periodically using log data with an activity monitor. Data from the temperature microsensor and activity monitor will be combined to calculate adherence. (Re-)experienced complications after receiving orthopedic shoes will be registered. Questionnaires and interviews will measure the experiences of participants regarding orthopedic shoes, experiences of podiatrists regarding motivational interviewing, care consumption, and quality of life. Differences in costs and quality of life will be determined in a cost-effectiveness analysis.\n            \n            \n              Discussion\n              This trial will generate novel insights into the socio-economic and well-being impact and the clinical effectiveness of the novel care approach on adherence to wearing orthopedic shoes.\n            \n            \n              Trial registration\n              \n                Netherlands Trial Register\n                NL7710\n                . Registered on 6 May 2019","container-title":"Trials","DOI":"10.1186/s13063-021-05680-0","ISSN":"1745-6215","issue":"1","journalAbbreviation":"Trials","language":"en","page":"750","source":"DOI.org (Crossref)","title":"Using motivational interviewing combined with digital shoe-fitting to improve adherence to wearing orthopedic shoes in people with diabetes at risk of foot ulceration: study protocol for a cluster-randomized controlled trial","title-short":"Using motivational interviewing combined with digital shoe-fitting to improve adherence to wearing orthopedic shoes in people with diabetes at risk of foot ulceration","volume":"22","author":[{"family":"Jongebloed-Westra","given":"M."},{"family":"Bode","given":"C."},{"family":"Van Netten","given":"J. J."},{"family":"Ten Klooster","given":"P. M."},{"family":"Exterkate","given":"S. H."},{"family":"Koffijberg","given":"H."},{"family":"Van Gemert-Pijnen","given":"J. E. W. C."}],"issued":{"date-parts":[["2021",12]]}}}],"schema":"https://github.com/citation-style-language/schema/raw/master/csl-citation.json"} </w:instrText>
+      </w:r>
+      <w:r>
+        <w:rPr>
+          <w:rFonts w:ascii="Garamond" w:hAnsi="Garamond"/>
+          <w:vertAlign w:val="superscript"/>
           <w:lang w:val="en-US"/>
         </w:rPr>
         <w:fldChar w:fldCharType="separate"/>
@@ -2508,84 +3193,19 @@
           <w:vertAlign w:val="superscript"/>
           <w:lang w:val="en-GB"/>
         </w:rPr>
-        <w:t>11</w:t>
-      </w:r>
-      <w:r>
-        <w:rPr>
-          <w:rFonts w:ascii="Garamond" w:hAnsi="Garamond"/>
+        <w:t>9,10,14</w:t>
+      </w:r>
+      <w:r>
+        <w:rPr>
+          <w:rFonts w:ascii="Garamond" w:hAnsi="Garamond"/>
+          <w:vertAlign w:val="superscript"/>
           <w:lang w:val="en-US"/>
         </w:rPr>
         <w:fldChar w:fldCharType="end"/>
-      </w:r>
-      <w:r>
-        <w:rPr>
-          <w:rFonts w:ascii="Garamond" w:hAnsi="Garamond"/>
-          <w:lang w:val="en-US"/>
-        </w:rPr>
-        <w:t xml:space="preserve"> </w:t>
-      </w:r>
-      <w:r>
-        <w:rPr>
-          <w:rFonts w:ascii="Garamond" w:hAnsi="Garamond"/>
-          <w:lang w:val="en-GB"/>
-        </w:rPr>
-        <w:t>PARADISE extends this approach through personalised behavioural feedback, prolonged follow-up, and integration into routine Belgian multidisciplinary care. This doctoral project will evaluate the clinical effectiveness of PARADISE within Belgian DFCs.</w:t>
       </w:r>
     </w:p>
     <w:p>
       <w:pPr>
-        <w:pBdr>
-          <w:bottom w:val="single" w:sz="6" w:space="2" w:color="2A7F8E"/>
-        </w:pBdr>
-        <w:spacing w:after="60"/>
-        <w:rPr>
-          <w:rFonts w:ascii="Garamond" w:hAnsi="Garamond"/>
-          <w:sz w:val="28"/>
-          <w:szCs w:val="28"/>
-          <w:lang w:val="en-US"/>
-        </w:rPr>
-      </w:pPr>
-      <w:r>
-        <w:rPr>
-          <w:rFonts w:ascii="Garamond" w:eastAsia="Calibri" w:hAnsi="Garamond"/>
-          <w:b/>
-          <w:bCs/>
-          <w:color w:val="20415A"/>
-          <w:sz w:val="28"/>
-          <w:szCs w:val="28"/>
-          <w:lang w:val="en-US"/>
-        </w:rPr>
-        <w:t>2</w:t>
-      </w:r>
-      <w:proofErr w:type="gramStart"/>
-      <w:r>
-        <w:rPr>
-          <w:rFonts w:ascii="Garamond" w:eastAsia="Calibri" w:hAnsi="Garamond"/>
-          <w:b/>
-          <w:bCs/>
-          <w:color w:val="20415A"/>
-          <w:sz w:val="28"/>
-          <w:szCs w:val="28"/>
-          <w:lang w:val="en-US"/>
-        </w:rPr>
-        <w:t>.  General</w:t>
-      </w:r>
-      <w:proofErr w:type="gramEnd"/>
-      <w:r>
-        <w:rPr>
-          <w:rFonts w:ascii="Garamond" w:eastAsia="Calibri" w:hAnsi="Garamond"/>
-          <w:b/>
-          <w:bCs/>
-          <w:color w:val="20415A"/>
-          <w:sz w:val="28"/>
-          <w:szCs w:val="28"/>
-          <w:lang w:val="en-US"/>
-        </w:rPr>
-        <w:t xml:space="preserve"> hypothesis and specific aims</w:t>
-      </w:r>
-    </w:p>
-    <w:p>
-      <w:pPr>
         <w:spacing w:after="60"/>
         <w:jc w:val="both"/>
         <w:rPr>
@@ -2596,753 +3216,41 @@
       <w:r>
         <w:rPr>
           <w:rFonts w:ascii="Garamond" w:hAnsi="Garamond"/>
-          <w:b/>
-          <w:lang w:val="en-US"/>
-        </w:rPr>
-        <w:t xml:space="preserve">General hypothesis. </w:t>
-      </w:r>
-      <w:r>
-        <w:rPr>
-          <w:rFonts w:ascii="Garamond" w:hAnsi="Garamond"/>
-          <w:lang w:val="en-GB"/>
-        </w:rPr>
-        <w:t>In adults with diabetes and a high-risk foot, adding PARADISE to standard care (Optimal Care) will reduce biomechanical risk factors, improve objectively measured footwear adherence, and decrease 18-month plantar foot-ulcer recurrence compared with standard care alone (Usual Care).</w:t>
-      </w:r>
-    </w:p>
-    <w:p>
-      <w:pPr>
-        <w:spacing w:after="60"/>
-        <w:jc w:val="both"/>
-        <w:rPr>
-          <w:rFonts w:ascii="Garamond" w:hAnsi="Garamond"/>
-          <w:lang w:val="en-GB"/>
-        </w:rPr>
-      </w:pPr>
-      <w:r>
-        <w:rPr>
-          <w:rFonts w:ascii="Garamond" w:hAnsi="Garamond"/>
-          <w:b/>
-          <w:bCs/>
-          <w:color w:val="1B2A33"/>
-          <w:lang w:val="en-US"/>
-        </w:rPr>
-        <w:t>Specific aims</w:t>
-      </w:r>
-    </w:p>
-    <w:p>
-      <w:pPr>
-        <w:numPr>
-          <w:ilvl w:val="0"/>
-          <w:numId w:val="9"/>
-        </w:numPr>
-        <w:spacing w:after="60"/>
-        <w:jc w:val="both"/>
-        <w:rPr>
-          <w:rFonts w:ascii="Garamond" w:eastAsia="Arial" w:hAnsi="Garamond"/>
-          <w:lang w:val="en-US"/>
-        </w:rPr>
-      </w:pPr>
-      <w:r>
-        <w:rPr>
-          <w:rFonts w:ascii="Garamond" w:hAnsi="Garamond"/>
-          <w:b/>
-          <w:lang w:val="en-US"/>
-        </w:rPr>
-        <w:t xml:space="preserve">A1 — Trial </w:t>
+          <w:lang w:val="en-GB"/>
+        </w:rPr>
+        <w:t xml:space="preserve">Plantar-pressure and adherence-monitoring technologies are validated techniques already used within participating centres; no new measurement technology will be developed. A methodological </w:t>
       </w:r>
       <w:proofErr w:type="spellStart"/>
       <w:r>
         <w:rPr>
           <w:rFonts w:ascii="Garamond" w:hAnsi="Garamond"/>
-          <w:b/>
-          <w:lang w:val="en-US"/>
-        </w:rPr>
-        <w:t>operationalisation</w:t>
+          <w:lang w:val="en-GB"/>
+        </w:rPr>
+        <w:t>substudy</w:t>
       </w:r>
       <w:proofErr w:type="spellEnd"/>
       <w:r>
         <w:rPr>
           <w:rFonts w:ascii="Garamond" w:hAnsi="Garamond"/>
-          <w:b/>
-          <w:lang w:val="en-US"/>
-        </w:rPr>
-        <w:t xml:space="preserve"> and site </w:t>
-      </w:r>
-      <w:r>
-        <w:rPr>
-          <w:rFonts w:ascii="Garamond" w:hAnsi="Garamond"/>
-          <w:b/>
-          <w:lang w:val="en-US"/>
-        </w:rPr>
-        <w:t>readiness.</w:t>
-      </w:r>
-      <w:r>
-        <w:rPr>
-          <w:rFonts w:ascii="Garamond" w:hAnsi="Garamond"/>
-          <w:lang w:val="en-GB"/>
-        </w:rPr>
-        <w:t xml:space="preserve"> </w:t>
-      </w:r>
-      <w:r>
-        <w:rPr>
-          <w:rFonts w:ascii="Garamond" w:hAnsi="Garamond"/>
-          <w:lang w:val="en-GB"/>
-        </w:rPr>
-        <w:t>Standardise and pilot PARADISE across six DFCs by finalising protocols, assessment procedures, workflows and documentation pathways.</w:t>
-      </w:r>
-    </w:p>
-    <w:p>
-      <w:pPr>
-        <w:numPr>
-          <w:ilvl w:val="0"/>
-          <w:numId w:val="9"/>
-        </w:numPr>
-        <w:spacing w:after="60"/>
-        <w:jc w:val="both"/>
-        <w:rPr>
-          <w:rFonts w:ascii="Garamond" w:eastAsia="Arial" w:hAnsi="Garamond"/>
-          <w:lang w:val="en-US"/>
-        </w:rPr>
-      </w:pPr>
-      <w:r>
-        <w:rPr>
-          <w:rFonts w:ascii="Garamond" w:hAnsi="Garamond"/>
-          <w:b/>
-          <w:lang w:val="en-US"/>
-        </w:rPr>
-        <w:t xml:space="preserve">A2 — Ulcer recurrence (primary endpoint). </w:t>
-      </w:r>
-      <w:r>
-        <w:rPr>
-          <w:rFonts w:ascii="Garamond" w:hAnsi="Garamond"/>
-          <w:lang w:val="en-GB"/>
-        </w:rPr>
-        <w:t>Determine whether adding PARADISE to usual care reduces 18-month plantar foot-ulcer recurrence compared with usual care alone.</w:t>
-      </w:r>
-    </w:p>
-    <w:p>
-      <w:pPr>
-        <w:numPr>
-          <w:ilvl w:val="0"/>
-          <w:numId w:val="9"/>
-        </w:numPr>
-        <w:spacing w:after="60"/>
-        <w:jc w:val="both"/>
-        <w:rPr>
-          <w:rFonts w:ascii="Garamond" w:eastAsia="Arial" w:hAnsi="Garamond"/>
-          <w:lang w:val="en-US"/>
-        </w:rPr>
-      </w:pPr>
-      <w:r>
-        <w:rPr>
-          <w:rFonts w:ascii="Garamond" w:hAnsi="Garamond"/>
-          <w:b/>
-          <w:lang w:val="en-US"/>
-        </w:rPr>
-        <w:t xml:space="preserve">A3 — Mechanistic pathway (pre-specified mediation). </w:t>
-      </w:r>
-      <w:r>
-        <w:rPr>
-          <w:rFonts w:ascii="Garamond" w:hAnsi="Garamond"/>
-          <w:lang w:val="en-GB"/>
-        </w:rPr>
-        <w:t>Determine whether PARADISE reduces in-shoe peak plantar pressure and raises objectively measured footwear adherence beyond the clinically relevant ≥80% threshold, and whether adherence mediates the effect of PARADISE on ulcer recurrence</w:t>
-      </w:r>
-      <w:r>
-        <w:rPr>
-          <w:rFonts w:ascii="Garamond" w:hAnsi="Garamond"/>
-          <w:lang w:val="en-GB"/>
-        </w:rPr>
-      </w:r>
-      <w:r>
-        <w:rPr>
-          <w:rFonts w:ascii="Garamond" w:hAnsi="Garamond"/>
-          <w:lang w:val="en-GB"/>
-        </w:rPr>
-      </w:r>
-      <w:r>
-        <w:rPr>
-          <w:rFonts w:ascii="Garamond" w:hAnsi="Garamond"/>
-          <w:lang w:val="en-US"/>
-        </w:rPr>
-        <w:t>.</w:t>
-      </w:r>
-      <w:r>
-        <w:rPr>
-          <w:rFonts w:ascii="Garamond" w:hAnsi="Garamond"/>
-          <w:lang w:val="en-US"/>
-        </w:rPr>
-        <w:fldChar w:fldCharType="begin"/>
-      </w:r>
-      <w:r>
-        <w:rPr>
-          <w:rFonts w:ascii="Garamond" w:hAnsi="Garamond"/>
-          <w:lang w:val="en-US"/>
-        </w:rPr>
-        <w:instrText xml:space="preserve"> ADDIN ZOTERO_ITEM CSL_CITATION {"citationID":"UqqWZ1M2","properties":{"unsorted":false,"formattedCitation":"\\super 6\\nosupersub{}","plainCitation":"6","noteIndex":0},"citationItems":[{"id":16,"uris":["http://zotero.org/users/19619518/items/PZIVAKCP"],"itemData":{"id":16,"type":"article-journal","abstract":"OBJECTIVE\n              Prescription custom-made footwear can only be effective in preventing diabetic foot ulcers if worn by the patient. Particularly, the high prevalence of recurrent foot ulcers focuses the attention on adherence, for which objective data are nonexisting. We objectively assessed adherence in patients with high risk of ulcer recurrence and evaluated what determines adherence.\n            \n            \n              RESEARCH DESIGN AND METHODS\n              In 107 patients with diabetes, neuropathy, a recently healed plantar foot ulcer, and custom-made footwear, footwear use was measured during 7 consecutive days using a shoe-worn, temperature-based monitor. Daily step count was measured simultaneously using an ankle-worn activity monitor. Patients logged time away from home. Adherence was calculated as the percentage of steps that prescription footwear was worn. Determinants of adherence were evaluated in multivariate linear regression analysis.\n            \n            \n              RESULTS\n              Mean ± SD adherence was 71 ± 25%. Adherence at home was 61 ± 32%, over 3,959 ± 2,594 steps, and away from home 87 ± 26%, over 2,604 ± 2,507 steps. In 35 patients with low adherence (&amp;lt;60%), adherence at home was 28 ± 24%. Lower BMI, more severe foot deformity, and more appealing footwear were significantly associated with higher adherence.\n            \n            \n              CONCLUSIONS\n              The results show that adherence to wearing custom-made footwear is insufficient, particularly at home where patients exhibit their largest walking activity. This low adherence is a major threat for reulceration. These objective findings provide directions for improvement in adherence, which could include prescribing specific off-loading footwear for indoors, and they set a reference for future comparative research on footwear adherence in diabetes.","container-title":"Diabetes Care","DOI":"10.2337/dc12-1330","ISSN":"0149-5992, 1935-5548","issue":"6","language":"en","page":"1613-1618","source":"DOI.org (Crossref)","title":"Adherence to Wearing Prescription Custom-Made Footwear in Patients With Diabetes at High Risk for Plantar Foot Ulceration","volume":"36","author":[{"family":"Waaijman","given":"Roelof"},{"family":"Keukenkamp","given":"Renske"},{"family":"De Haart","given":"Mirjam"},{"family":"Polomski","given":"Wojtek P."},{"family":"Nollet","given":"Frans"},{"family":"Bus","given":"Sicco A."}],"issued":{"date-parts":[["2013",6,1]]}}}],"schema":"https://github.com/citation-style-language/schema/raw/master/csl-citation.json"} </w:instrText>
-      </w:r>
-      <w:r>
-        <w:rPr>
-          <w:rFonts w:ascii="Garamond" w:hAnsi="Garamond"/>
-          <w:lang w:val="en-US"/>
-        </w:rPr>
-        <w:fldChar w:fldCharType="separate"/>
-      </w:r>
-      <w:r>
-        <w:rPr>
-          <w:rFonts w:ascii="Garamond" w:hAnsi="Garamond"/>
-          <w:vertAlign w:val="superscript"/>
-          <w:lang w:val="en-GB"/>
-        </w:rPr>
-        <w:t>6</w:t>
-      </w:r>
-      <w:r>
-        <w:rPr>
-          <w:rFonts w:ascii="Garamond" w:hAnsi="Garamond"/>
-          <w:lang w:val="en-US"/>
-        </w:rPr>
-        <w:fldChar w:fldCharType="end"/>
-      </w:r>
-    </w:p>
-    <w:p>
-      <w:pPr>
-        <w:numPr>
-          <w:ilvl w:val="0"/>
-          <w:numId w:val="9"/>
-        </w:numPr>
-        <w:spacing w:after="60"/>
-        <w:jc w:val="both"/>
-        <w:rPr>
-          <w:rFonts w:ascii="Garamond" w:eastAsia="Arial" w:hAnsi="Garamond"/>
-          <w:lang w:val="en-US"/>
-        </w:rPr>
-      </w:pPr>
-      <w:r>
-        <w:rPr>
-          <w:rFonts w:ascii="Garamond" w:hAnsi="Garamond"/>
-          <w:b/>
-          <w:lang w:val="en-US"/>
-        </w:rPr>
-        <w:t xml:space="preserve">A4 — Secondary outcomes and health impact. </w:t>
-      </w:r>
-      <w:r>
-        <w:rPr>
-          <w:rFonts w:ascii="Garamond" w:hAnsi="Garamond"/>
-          <w:lang w:val="en-GB"/>
-        </w:rPr>
-        <w:t>Evaluate the broader clinical and patient-centred impact of PARADISE by assessing recurrence characteristics, ulcer-free survival, foot-care behaviour (Nottingham Assessment of Functional Footcare, NAFF), health-related quality of life (EQ-5D-5L), and, jointly with the parallel doctorate, health-economic outcomes</w:t>
-      </w:r>
-      <w:r>
-        <w:rPr>
-          <w:rFonts w:ascii="Garamond" w:hAnsi="Garamond"/>
-          <w:lang w:val="en-GB"/>
-        </w:rPr>
-        <w:t>.</w:t>
-      </w:r>
-    </w:p>
-    <w:p>
-      <w:pPr>
-        <w:spacing w:after="60"/>
-        <w:rPr>
-          <w:lang w:val="en-GB"/>
-        </w:rPr>
-      </w:pPr>
-      <w:r>
-        <w:rPr>
-          <w:b/>
-          <w:lang w:val="en-GB"/>
-        </w:rPr>
-        <w:t xml:space="preserve">Candidate’s contribution and joint PhD. </w:t>
-      </w:r>
-      <w:r>
-        <w:rPr>
-          <w:lang w:val="en-GB"/>
-        </w:rPr>
-        <w:t>This is a joint KU Leuven–VUB doctorate in which two complementary doctoral projects run on the same trial. The present candidate leads the clinical trial: protocol development, ethics and regulatory submission, multicentre coordination, investigator training and site readiness, recruitment oversight, quality and fidelity monitoring, data management, and the analyses of ulcer recurrence, plantar pressure and footwear adherence. The parallel doctorate leads the process evaluation and the health-economic eval</w:t>
-      </w:r>
-      <w:r>
-        <w:rPr>
-          <w:lang w:val="en-GB"/>
-        </w:rPr>
-        <w:t xml:space="preserve">uation. Both researchers contribute to study conduct and outputs, with authorship aligned to responsibilities. Alongside the trial, </w:t>
-      </w:r>
-      <w:r>
-        <w:rPr>
-          <w:lang w:val="en-GB"/>
-        </w:rPr>
-        <w:t>I</w:t>
-      </w:r>
-      <w:r>
-        <w:rPr>
-          <w:lang w:val="en-GB"/>
-        </w:rPr>
-        <w:t xml:space="preserve"> will conduct</w:t>
-      </w:r>
-      <w:r>
-        <w:rPr>
-          <w:lang w:val="en-GB"/>
-        </w:rPr>
-        <w:t xml:space="preserve"> a registered scoping review on patient-specific offloading insole design, and a comparison of conventionally manufactured and 3D-printed custom-made foot orthoses carried out independently of the trial. Local clinical teams deliver patient care and site-level assessments.</w:t>
-      </w:r>
-    </w:p>
-    <w:p>
-      <w:pPr>
-        <w:pBdr>
-          <w:bottom w:val="single" w:sz="6" w:space="2" w:color="2A7F8E"/>
-        </w:pBdr>
-        <w:spacing w:after="60"/>
-        <w:rPr>
-          <w:rFonts w:ascii="Garamond" w:hAnsi="Garamond"/>
-          <w:sz w:val="28"/>
-          <w:szCs w:val="28"/>
-          <w:lang w:val="en-US"/>
-        </w:rPr>
-      </w:pPr>
-      <w:r>
-        <w:rPr>
-          <w:rFonts w:ascii="Garamond" w:eastAsia="Calibri" w:hAnsi="Garamond"/>
-          <w:b/>
-          <w:bCs/>
-          <w:color w:val="20415A"/>
-          <w:sz w:val="28"/>
-          <w:szCs w:val="28"/>
-          <w:lang w:val="en-US"/>
-        </w:rPr>
-        <w:t>3</w:t>
-      </w:r>
-      <w:proofErr w:type="gramStart"/>
-      <w:r>
-        <w:rPr>
-          <w:rFonts w:ascii="Garamond" w:eastAsia="Calibri" w:hAnsi="Garamond"/>
-          <w:b/>
-          <w:bCs/>
-          <w:color w:val="20415A"/>
-          <w:sz w:val="28"/>
-          <w:szCs w:val="28"/>
-          <w:lang w:val="en-US"/>
-        </w:rPr>
-        <w:t>.  Methodology</w:t>
-      </w:r>
-      <w:proofErr w:type="gramEnd"/>
-    </w:p>
-    <w:p>
-      <w:pPr>
-        <w:spacing w:after="60"/>
-        <w:jc w:val="both"/>
-        <w:rPr>
-          <w:rFonts w:ascii="Garamond" w:hAnsi="Garamond"/>
-          <w:lang w:val="en-GB"/>
-        </w:rPr>
-      </w:pPr>
-      <w:r>
-        <w:rPr>
-          <w:rFonts w:ascii="Garamond" w:hAnsi="Garamond"/>
-          <w:b/>
-          <w:lang w:val="en-US"/>
-        </w:rPr>
-        <w:t xml:space="preserve">Design and participants. </w:t>
-      </w:r>
-      <w:r>
-        <w:rPr>
-          <w:rFonts w:ascii="Garamond" w:hAnsi="Garamond"/>
-          <w:lang w:val="en-GB"/>
-        </w:rPr>
-        <w:t xml:space="preserve">A prospective, multicentre, parallel-group randomised controlled trial (RCT) will randomise 144 adults with diabetes and an IWGDF category 3 high-risk foot in a 1:1 ratio, stratified </w:t>
-      </w:r>
-      <w:r>
-        <w:rPr>
-          <w:rFonts w:ascii="Garamond" w:hAnsi="Garamond"/>
-          <w:lang w:val="en-GB"/>
-        </w:rPr>
-        <w:lastRenderedPageBreak/>
-        <w:t>by centre, across six Belgian RIZIV–INAMI-recognised DFCs in academic and non-academic settings. Participants will be followed for 18 months. Eligible participants have type 1 or type 2 diabetes with a plantar ulcer healed within the preceding 18 months or a partial foot amputation, and use, or are willing to use, prescribed therapeutic footwear.</w:t>
-      </w:r>
-    </w:p>
-    <w:p>
-      <w:pPr>
-        <w:spacing w:after="60"/>
-        <w:jc w:val="both"/>
-        <w:rPr>
-          <w:rFonts w:ascii="Garamond" w:hAnsi="Garamond"/>
-          <w:lang w:val="en-GB"/>
-        </w:rPr>
-      </w:pPr>
-      <w:r>
-        <w:rPr>
-          <w:rFonts w:ascii="Garamond" w:hAnsi="Garamond"/>
-          <w:b/>
-          <w:lang w:val="en-US"/>
-        </w:rPr>
-        <w:t xml:space="preserve">Interventions. </w:t>
-      </w:r>
-      <w:r>
-        <w:rPr>
-          <w:rFonts w:ascii="Garamond" w:hAnsi="Garamond"/>
-          <w:lang w:val="en-GB"/>
-        </w:rPr>
-        <w:t>PARADISE integrates three evidence-based components addressing the main determinants of diabetic foot-ulcer recurrence: biomechanical risk, footwear adherence, and adequate foot care.</w:t>
-      </w:r>
-    </w:p>
-    <w:p>
-      <w:pPr>
-        <w:spacing w:after="60"/>
-        <w:jc w:val="both"/>
-        <w:rPr>
-          <w:rFonts w:ascii="Garamond" w:hAnsi="Garamond"/>
-          <w:vertAlign w:val="superscript"/>
-          <w:lang w:val="en-US"/>
-        </w:rPr>
-      </w:pPr>
-      <w:r>
-        <w:rPr>
-          <w:rFonts w:ascii="Garamond" w:hAnsi="Garamond"/>
-          <w:b/>
-          <w:lang w:val="en-US"/>
-        </w:rPr>
-        <w:t xml:space="preserve">(1) </w:t>
-      </w:r>
-      <w:r>
-        <w:rPr>
-          <w:rFonts w:ascii="Garamond" w:hAnsi="Garamond"/>
-          <w:b/>
-          <w:lang w:val="en-US"/>
-        </w:rPr>
-        <w:t xml:space="preserve">Pressure-driven orthosis </w:t>
+          <w:lang w:val="en-GB"/>
+        </w:rPr>
+        <w:t xml:space="preserve"> will assess concordance between the Novel </w:t>
       </w:r>
       <w:proofErr w:type="spellStart"/>
       <w:r>
         <w:rPr>
           <w:rFonts w:ascii="Garamond" w:hAnsi="Garamond"/>
-          <w:b/>
-          <w:lang w:val="en-US"/>
-        </w:rPr>
-        <w:t>optimisation</w:t>
+          <w:lang w:val="en-GB"/>
+        </w:rPr>
+        <w:t>pedar</w:t>
       </w:r>
       <w:proofErr w:type="spellEnd"/>
       <w:r>
         <w:rPr>
           <w:rFonts w:ascii="Garamond" w:hAnsi="Garamond"/>
-          <w:b/>
-          <w:lang w:val="en-US"/>
-        </w:rPr>
-        <w:t xml:space="preserve">. </w:t>
-      </w:r>
-      <w:r>
-        <w:rPr>
-          <w:rFonts w:ascii="Garamond" w:hAnsi="Garamond"/>
-          <w:lang w:val="en-GB"/>
-        </w:rPr>
-        <w:t xml:space="preserve">Existing in-shoe plantar-pressure systems (Novel </w:t>
-      </w:r>
-      <w:proofErr w:type="spellStart"/>
-      <w:r>
-        <w:rPr>
-          <w:rFonts w:ascii="Garamond" w:hAnsi="Garamond"/>
-          <w:lang w:val="en-GB"/>
-        </w:rPr>
-        <w:t>pedar</w:t>
-      </w:r>
-      <w:proofErr w:type="spellEnd"/>
-      <w:r>
-        <w:rPr>
-          <w:rFonts w:ascii="Garamond" w:hAnsi="Garamond"/>
-          <w:lang w:val="en-GB"/>
-        </w:rPr>
-        <w:t>) identify peak plantar pressure and guide iterative orthosis optimisation towards a target peak pressure below 200 kPa or a reduction of at least 25% relative to the measurement without the orthosis in the same session.</w:t>
-      </w:r>
-      <w:r>
-        <w:rPr>
-          <w:rFonts w:ascii="Garamond" w:hAnsi="Garamond"/>
-          <w:vertAlign w:val="superscript"/>
-          <w:lang w:val="en-US"/>
-        </w:rPr>
-        <w:fldChar w:fldCharType="begin"/>
-      </w:r>
-      <w:r>
-        <w:rPr>
-          <w:rFonts w:ascii="Garamond" w:hAnsi="Garamond"/>
-          <w:vertAlign w:val="superscript"/>
-          <w:lang w:val="en-US"/>
-        </w:rPr>
-        <w:instrText xml:space="preserve"> ADDIN ZOTERO_ITEM CSL_CITATION {"citationID":"zvZSRODa","properties":{"unsorted":false,"formattedCitation":"\\super 5\\nosupersub{}","plainCitation":"5","noteIndex":0},"citationItems":[{"id":48,"uris":["http://zotero.org/users/19619518/items/HQRWT4X4"],"itemData":{"id":48,"type":"article-journal","abstract":"OBJECTIVE\n              Custom-made footwear is the treatment of choice to prevent foot ulcer recurrence in diabetes. This footwear primarily aims to offload plantar regions at high ulcer risk. However, ulcer recurrence rates are high. We assessed the effect of offloading-improved custom-made footwear and the role of footwear adherence on plantar foot ulcer recurrence.\n            \n            \n              RESEARCH DESIGN AND METHODS\n              We randomly assigned 171 neuropathic diabetic patients with a recently healed plantar foot ulcer to custom-made footwear with improved and subsequently preserved offloading (</w:instrText>
-      </w:r>
-      <w:r>
-        <w:rPr>
-          <w:rFonts w:ascii="Cambria Math" w:hAnsi="Cambria Math" w:cs="Cambria Math"/>
-          <w:vertAlign w:val="superscript"/>
-          <w:lang w:val="en-US"/>
-        </w:rPr>
-        <w:instrText>∼</w:instrText>
-      </w:r>
-      <w:r>
-        <w:rPr>
-          <w:rFonts w:ascii="Garamond" w:hAnsi="Garamond"/>
-          <w:vertAlign w:val="superscript"/>
-          <w:lang w:val="en-US"/>
-        </w:rPr>
-        <w:instrText xml:space="preserve">20% peak pressure relief by modifying the footwear) or to usual care (i.e., nonimproved custom-made footwear). Primary outcome was plantar foot ulcer recurrence in 18 months. Secondary outcome was ulcer recurrence in patients with an objectively measured adherence of </w:instrText>
-      </w:r>
-      <w:r>
-        <w:rPr>
-          <w:rFonts w:ascii="Garamond" w:hAnsi="Garamond" w:cs="Garamond"/>
-          <w:vertAlign w:val="superscript"/>
-          <w:lang w:val="en-US"/>
-        </w:rPr>
-        <w:instrText>≥</w:instrText>
-      </w:r>
-      <w:r>
-        <w:rPr>
-          <w:rFonts w:ascii="Garamond" w:hAnsi="Garamond"/>
-          <w:vertAlign w:val="superscript"/>
-          <w:lang w:val="en-US"/>
-        </w:rPr>
-        <w:instrText xml:space="preserve">80% of steps taken.\n            \n            \n              RESULTS\n              On the basis of intention-to-treat, 33 of 85 patients (38.8%) with improved footwear and 38 of 86 patients (44.2%) with usual care had a recurrent ulcer (relative risk −11%, odds ratio 0.80 [95% CI 0.44–1.47], P = 0.48). Ulcer-free survival curves were not significantly different between groups (P = 0.40). In the 79 patients (46% of total group) with high adherence, 9 of 35 (25.7%) with improved footwear and 21 of 44 (47.8%) with usual care had a recurrent ulcer (relative risk −46%, odds ratio 0.38 [0.15–0.99], P = 0.045).\n            \n            \n              CONCLUSIONS\n              Offloading-improved custom-made footwear does not significantly reduce the incidence of plantar foot ulcer recurrence in diabetes compared with custom-made footwear that does not undergo such improvement, unless it is worn as recommended.","container-title":"Diabetes Care","DOI":"10.2337/dc13-0996","ISSN":"0149-5992, 1935-5548","issue":"12","language":"en","page":"4109-4116","source":"DOI.org (Crossref)","title":"Effect of Custom-Made Footwear on Foot Ulcer Recurrence in Diabetes","volume":"36","author":[{"family":"Bus","given":"Sicco A."},{"family":"Waaijman","given":"Roelof"},{"family":"Arts","given":"Mark"},{"family":"De Haart","given":"Mirjam"},{"family":"Busch-Westbroek","given":"Tessa"},{"family":"Van Baal","given":"Jeff"},{"family":"Nollet","given":"Frans"}],"issued":{"date-parts":[["2013",12,1]]}}}],"schema":"https://github.com/citation-style-language/schema/raw/master/csl-citation.json"} </w:instrText>
-      </w:r>
-      <w:r>
-        <w:rPr>
-          <w:rFonts w:ascii="Garamond" w:hAnsi="Garamond"/>
-          <w:vertAlign w:val="superscript"/>
-          <w:lang w:val="en-US"/>
-        </w:rPr>
-        <w:fldChar w:fldCharType="separate"/>
-      </w:r>
-      <w:r>
-        <w:rPr>
-          <w:rFonts w:ascii="Garamond" w:hAnsi="Garamond"/>
-          <w:vertAlign w:val="superscript"/>
-          <w:lang w:val="en-GB"/>
-        </w:rPr>
-        <w:t>5</w:t>
-      </w:r>
-      <w:r>
-        <w:rPr>
-          <w:rFonts w:ascii="Garamond" w:hAnsi="Garamond"/>
-          <w:vertAlign w:val="superscript"/>
-          <w:lang w:val="en-US"/>
-        </w:rPr>
-        <w:fldChar w:fldCharType="end"/>
-      </w:r>
-    </w:p>
-    <w:p>
-      <w:pPr>
-        <w:spacing w:after="60"/>
-        <w:jc w:val="both"/>
-        <w:rPr>
-          <w:rFonts w:ascii="Garamond" w:hAnsi="Garamond"/>
-          <w:vertAlign w:val="superscript"/>
-          <w:lang w:val="en-US"/>
-        </w:rPr>
-      </w:pPr>
-      <w:r>
-        <w:rPr>
-          <w:rFonts w:ascii="Garamond" w:hAnsi="Garamond"/>
-          <w:b/>
-          <w:lang w:val="en-US"/>
-        </w:rPr>
-        <w:t xml:space="preserve">(2) Objective footwear-adherence monitoring. </w:t>
-      </w:r>
-      <w:r>
-        <w:rPr>
-          <w:rFonts w:ascii="Garamond" w:hAnsi="Garamond"/>
-          <w:lang w:val="en-GB"/>
-        </w:rPr>
-        <w:t xml:space="preserve">Sensor-based technologies (Orthotimer and </w:t>
-      </w:r>
-      <w:proofErr w:type="spellStart"/>
-      <w:r>
-        <w:rPr>
-          <w:rFonts w:ascii="Garamond" w:hAnsi="Garamond"/>
-          <w:lang w:val="en-GB"/>
-        </w:rPr>
-        <w:t>MoveMonitor</w:t>
-      </w:r>
-      <w:proofErr w:type="spellEnd"/>
-      <w:r>
-        <w:rPr>
-          <w:rFonts w:ascii="Garamond" w:hAnsi="Garamond"/>
-          <w:lang w:val="en-GB"/>
-        </w:rPr>
-        <w:t>) quantify footwear wearing time and contextualise adherence against daily activity exposure, addressing the limitations of self-reported footwear use</w:t>
-      </w:r>
-      <w:r>
-        <w:rPr>
-          <w:rFonts w:ascii="Garamond" w:hAnsi="Garamond"/>
-          <w:lang w:val="en-US"/>
-        </w:rPr>
-        <w:t>.</w:t>
-      </w:r>
-      <w:r>
-        <w:rPr>
-          <w:rFonts w:ascii="Garamond" w:hAnsi="Garamond"/>
-          <w:lang w:val="en-US"/>
-        </w:rPr>
-        <w:fldChar w:fldCharType="begin"/>
-      </w:r>
-      <w:r>
-        <w:rPr>
-          <w:rFonts w:ascii="Garamond" w:hAnsi="Garamond"/>
-          <w:lang w:val="en-US"/>
-        </w:rPr>
-        <w:instrText xml:space="preserve"> ADDIN ZOTERO_ITEM CSL_CITATION {"citationID":"5H9hUGmg","properties":{"unsorted":false,"formattedCitation":"\\super 6,12,13\\nosupersub{}","plainCitation":"6,12,13","noteIndex":0},"citationItems":[{"id":16,"uris":["http://zotero.org/users/19619518/items/PZIVAKCP"],"itemData":{"id":16,"type":"article-journal","abstract":"OBJECTIVE\n              Prescription custom-made footwear can only be effective in preventing diabetic foot ulcers if worn by the patient. Particularly, the high prevalence of recurrent foot ulcers focuses the attention on adherence, for which objective data are nonexisting. We objectively assessed adherence in patients with high risk of ulcer recurrence and evaluated what determines adherence.\n            \n            \n              RESEARCH DESIGN AND METHODS\n              In 107 patients with diabetes, neuropathy, a recently healed plantar foot ulcer, and custom-made footwear, footwear use was measured during 7 consecutive days using a shoe-worn, temperature-based monitor. Daily step count was measured simultaneously using an ankle-worn activity monitor. Patients logged time away from home. Adherence was calculated as the percentage of steps that prescription footwear was worn. Determinants of adherence were evaluated in multivariate linear regression analysis.\n            \n            \n              RESULTS\n              Mean ± SD adherence was 71 ± 25%. Adherence at home was 61 ± 32%, over 3,959 ± 2,594 steps, and away from home 87 ± 26%, over 2,604 ± 2,507 steps. In 35 patients with low adherence (&amp;lt;60%), adherence at home was 28 ± 24%. Lower BMI, more severe foot deformity, and more appealing footwear were significantly associated with higher adherence.\n            \n            \n              CONCLUSIONS\n              The results show that adherence to wearing custom-made footwear is insufficient, particularly at home where patients exhibit their largest walking activity. This low adherence is a major threat for reulceration. These objective findings provide directions for improvement in adherence, which could include prescribing specific off-loading footwear for indoors, and they set a reference for future comparative research on footwear adherence in diabetes.","container-title":"Diabetes Care","DOI":"10.2337/dc12-1330","ISSN":"0149-5992, 1935-5548","issue":"6","language":"en","page":"1613-1618","source":"DOI.org (Crossref)","title":"Adherence to Wearing Prescription Custom-Made Footwear in Patients With Diabetes at High Risk for Plantar Foot Ulceration","volume":"36","author":[{"family":"Waaijman","given":"Roelof"},{"family":"Keukenkamp","given":"Renske"},{"family":"De Haart","given":"Mirjam"},{"family":"Polomski","given":"Wojtek P."},{"family":"Nollet","given":"Frans"},{"family":"Bus","given":"Sicco A."}],"issued":{"date-parts":[["2013",6,1]]}}},{"id":42,"uris":["http://zotero.org/users/19619518/items/D8ULXF23"],"itemData":{"id":42,"type":"article-journal","abstract":"Therapeutic footwear (TF) has been demonstrated to decrease the rate of recurrence in patients in remission. TF adherence determines the real effect of such treatment and, therefore, an appropriate evaluation of TF adherence is critical to decrease recurrence. The aim of this systematic review was to determine the usability of different methods of assessing adherence to TF in patients with diabetic foot ulcers under remission. The search strategy retrieved 506 articles. Title and abstract review excluded 472, while the full-text review excluded an additional 18 articles because the included data did not meet the selection criteria. Finally, we included 16 articles in this systematic review. Six (37.5%) of the 16 studies combined objective (OM) and subjective methods (SM). Only five (31.25%) evaluated OM and six (37.5%) studies only evaluated SM. Objective methods (temperature sensor, activity monitor) and subjective methods (survey, questionnaire) have successfully been used in the literature to evaluate TF adherence. Objective methods provided accurate data, whereas subjective methods led to response bias or missing data. Methods of evaluation showed that patients use the TF more frequently outdoors and on weekdays than indoors or on the weekend. In conclusion, objective methods are the most usable way to measure adherence to TF.","container-title":"The International Journal of Lower Extremity Wounds","DOI":"10.1177/15347346231190680","ISSN":"1534-7346, 1552-6941","issue":"1","journalAbbreviation":"The International Journal of Lower Extremity Wounds","language":"en","page":"55-64","source":"DOI.org (Crossref)","title":"Usability of Different Methods to Assess and Improve Adherence to Therapeutic Footwear in Persons with the Diabetic Foot in Remission. A Systematic Review","volume":"25","author":[{"family":"López-Moral","given":"Mateo"},{"family":"Molines-Barroso","given":"Raúl J."},{"family":"Herrera-Casamayor","given":"María"},{"family":"García-Madrid","given":"Marta"},{"family":"García-Morales","given":"Esther"},{"family":"Lázaro-Martínez","given":"José Luis"}],"issued":{"date-parts":[["2026",3]]}}},{"id":43,"uris":["http://zotero.org/users/19619518/items/FWKZCSUG"],"itemData":{"id":43,"type":"article-journal","container-title":"Journal of Rehabilitation Medicine","DOI":"10.2340/16501977-2759","ISSN":"1651-2081","issue":"11","journalAbbreviation":"J Rehabil Med","language":"en","page":"jrm00127","source":"DOI.org (Crossref)","title":"Effect of awareness of being monitored on wearing of orthopaedic footwear","volume":"52","author":[{"family":"Lutjeboer","given":"T"},{"family":"Netten","given":"J"},{"family":"Postema","given":"K"},{"family":"Hijmans","given":"J"}],"issued":{"date-parts":[["2020"]]}}}],"schema":"https://github.com/citation-style-language/schema/raw/master/csl-citation.json"} </w:instrText>
-      </w:r>
-      <w:r>
-        <w:rPr>
-          <w:rFonts w:ascii="Garamond" w:hAnsi="Garamond"/>
-          <w:lang w:val="en-US"/>
-        </w:rPr>
-        <w:fldChar w:fldCharType="separate"/>
-      </w:r>
-      <w:r>
-        <w:rPr>
-          <w:rFonts w:ascii="Garamond" w:hAnsi="Garamond"/>
-          <w:vertAlign w:val="superscript"/>
-          <w:lang w:val="en-GB"/>
-        </w:rPr>
-        <w:t>6,12,13</w:t>
-      </w:r>
-      <w:r>
-        <w:rPr>
-          <w:rFonts w:ascii="Garamond" w:hAnsi="Garamond"/>
-          <w:lang w:val="en-US"/>
-        </w:rPr>
-        <w:fldChar w:fldCharType="end"/>
-      </w:r>
-    </w:p>
-    <w:p>
-      <w:pPr>
-        <w:spacing w:after="60"/>
-        <w:jc w:val="both"/>
-        <w:rPr>
-          <w:rFonts w:ascii="Garamond" w:hAnsi="Garamond"/>
-          <w:vertAlign w:val="superscript"/>
-          <w:lang w:val="en-US"/>
-        </w:rPr>
-      </w:pPr>
-      <w:r>
-        <w:rPr>
-          <w:rFonts w:ascii="Garamond" w:hAnsi="Garamond"/>
-          <w:b/>
-          <w:lang w:val="en-US"/>
-        </w:rPr>
-        <w:t xml:space="preserve">(3) Structured education and behavioural support. </w:t>
-      </w:r>
-      <w:r>
-        <w:rPr>
-          <w:rFonts w:ascii="Garamond" w:hAnsi="Garamond"/>
-          <w:lang w:val="en-GB"/>
-        </w:rPr>
-        <w:t>Education covers adequate daily foot care and the rationale for wearing the prescribed orthoses and footwear. Behavioural support, delivered through SEBIA, draws on motivational interviewing, solution-focused brief therapy and behaviour change wheel principles, among other evidence-based behavioural change methods, to identify and address individual barriers to adherence</w:t>
-      </w:r>
-      <w:r>
-        <w:rPr>
-          <w:rFonts w:ascii="Garamond" w:hAnsi="Garamond"/>
-          <w:lang w:val="en-US"/>
-        </w:rPr>
-        <w:t>.</w:t>
-      </w:r>
-      <w:r>
-        <w:rPr>
-          <w:rFonts w:ascii="Garamond" w:hAnsi="Garamond"/>
-          <w:vertAlign w:val="superscript"/>
-          <w:lang w:val="en-US"/>
-        </w:rPr>
-        <w:fldChar w:fldCharType="begin"/>
-      </w:r>
-      <w:r>
-        <w:rPr>
-          <w:rFonts w:ascii="Garamond" w:hAnsi="Garamond"/>
-          <w:vertAlign w:val="superscript"/>
-          <w:lang w:val="en-US"/>
-        </w:rPr>
-        <w:instrText xml:space="preserve"> ADDIN ZOTERO_ITEM CSL_CITATION {"citationID":"0QQT9vJY","properties":{"unsorted":false,"formattedCitation":"\\super 9,10,14\\nosupersub{}","plainCitation":"9,10,14","noteIndex":0},"citationItems":[{"id":14,"uris":["http://zotero.org/users/19619518/items/54DKJVW9"],"itemData":{"id":14,"type":"article-journal","container-title":"Implementation Science","DOI":"10.1186/1748-5908-6-42","ISSN":"1748-5908","issue":"1","journalAbbreviation":"Implementation Sci","language":"en","license":"http://www.springer.com/tdm","page":"42","source":"DOI.org (Crossref)","title":"The behaviour change wheel: A new method for characterising and designing behaviour change interventions","title-short":"The behaviour change wheel","volume":"6","author":[{"family":"Michie","given":"Susan"},{"family":"Van Stralen","given":"Maartje M"},{"family":"West","given":"Robert"}],"issued":{"date-parts":[["2011",12]]}}},{"id":13,"uris":["http://zotero.org/users/19619518/items/ZEQZLJXL"],"itemData":{"id":13,"type":"article-journal","container-title":"Annals of Behavioral Medicine","DOI":"10.1007/s12160-013-9486-6","ISSN":"0883-6612, 1532-4796","issue":"1","journalAbbreviation":"ann. behav. med.","language":"en","page":"81-95","source":"DOI.org (Crossref)","title":"The Behavior Change Technique Taxonomy (v1) of 93 Hierarchically Clustered Techniques: Building an International Consensus for the Reporting of Behavior Change Interventions","title-short":"The Behavior Change Technique Taxonomy (v1) of 93 Hierarchically Clustered Techniques","volume":"46","author":[{"family":"Michie","given":"Susan"},{"family":"Richardson","given":"Michelle"},{"family":"Johnston","given":"Marie"},{"family":"Abraham","given":"Charles"},{"family":"Francis","given":"Jill"},{"family":"Hardeman","given":"Wendy"},{"family":"Eccles","given":"Martin P."},{"family":"Cane","given":"James"},{"family":"Wood","given":"Caroline E."}],"issued":{"date-parts":[["2013",8]]}}},{"id":41,"uris":["http://zotero.org/users/19619518/items/9CV6ZUVG"],"itemData":{"id":41,"type":"article-journal","abstract":"Abstract\n            \n              Background\n              Diabetic foot ulcers have a high impact on mobility and daily functioning and lead to high treatment costs, for example, by hospitalization and amputation. To prevent (re)ulcerations, custom-made orthopedic shoes are considered essential. However, adherence to wearing the orthopedic shoes is low, and improving adherence was not successful in the past. We propose a novel care approach that combines motivational interviewing (MI) with a digital shoe-fitting procedure to improve adherence to orthopedic shoes. The aim of this trial is to assess the (cost-)effectiveness of this novel care approach compared to usual care (no MI and casting-based shoe-fitting) in promoting footwear adherence and ulcer prevention.\n            \n            \n              Methods\n              The trial will include people with diabetes, with IWGDF Risk categories 1–3, who have been prescribed orthopedic shoes. Participants will be randomized at the level of the podiatrist to the novel care approach or usual care. The primary outcome is the proportion of participants who adhere to the use of their orthopedic shoes, that is, who take at least 80% of their total daily steps with orthopedic shoes. A temperature microsensor will be built into the participants’ orthopedic shoes to measure wearing time continuously over 12</w:instrText>
-      </w:r>
-      <w:r>
-        <w:rPr>
-          <w:vertAlign w:val="superscript"/>
-          <w:lang w:val="en-US"/>
-        </w:rPr>
-        <w:instrText> </w:instrText>
-      </w:r>
-      <w:r>
-        <w:rPr>
-          <w:rFonts w:ascii="Garamond" w:hAnsi="Garamond"/>
-          <w:vertAlign w:val="superscript"/>
-          <w:lang w:val="en-US"/>
-        </w:rPr>
-        <w:instrText xml:space="preserve">months. In addition, daily activity will be measured periodically using log data with an activity monitor. Data from the temperature microsensor and activity monitor will be combined to calculate adherence. (Re-)experienced complications after receiving orthopedic shoes will be registered. Questionnaires and interviews will measure the experiences of participants regarding orthopedic shoes, experiences of podiatrists regarding motivational interviewing, care consumption, and quality of life. Differences in costs and quality of life will be determined in a cost-effectiveness analysis.\n            \n            \n              Discussion\n              This trial will generate novel insights into the socio-economic and well-being impact and the clinical effectiveness of the novel care approach on adherence to wearing orthopedic shoes.\n            \n            \n              Trial registration\n              \n                Netherlands Trial Register\n                NL7710\n                . Registered on 6 May 2019","container-title":"Trials","DOI":"10.1186/s13063-021-05680-0","ISSN":"1745-6215","issue":"1","journalAbbreviation":"Trials","language":"en","page":"750","source":"DOI.org (Crossref)","title":"Using motivational interviewing combined with digital shoe-fitting to improve adherence to wearing orthopedic shoes in people with diabetes at risk of foot ulceration: study protocol for a cluster-randomized controlled trial","title-short":"Using motivational interviewing combined with digital shoe-fitting to improve adherence to wearing orthopedic shoes in people with diabetes at risk of foot ulceration","volume":"22","author":[{"family":"Jongebloed-Westra","given":"M."},{"family":"Bode","given":"C."},{"family":"Van Netten","given":"J. J."},{"family":"Ten Klooster","given":"P. M."},{"family":"Exterkate","given":"S. H."},{"family":"Koffijberg","given":"H."},{"family":"Van Gemert-Pijnen","given":"J. E. W. C."}],"issued":{"date-parts":[["2021",12]]}}}],"schema":"https://github.com/citation-style-language/schema/raw/master/csl-citation.json"} </w:instrText>
-      </w:r>
-      <w:r>
-        <w:rPr>
-          <w:rFonts w:ascii="Garamond" w:hAnsi="Garamond"/>
-          <w:vertAlign w:val="superscript"/>
-          <w:lang w:val="en-US"/>
-        </w:rPr>
-        <w:fldChar w:fldCharType="separate"/>
-      </w:r>
-      <w:r>
-        <w:rPr>
-          <w:rFonts w:ascii="Garamond" w:hAnsi="Garamond"/>
-          <w:vertAlign w:val="superscript"/>
-          <w:lang w:val="en-GB"/>
-        </w:rPr>
-        <w:t>9,10,14</w:t>
-      </w:r>
-      <w:r>
-        <w:rPr>
-          <w:rFonts w:ascii="Garamond" w:hAnsi="Garamond"/>
-          <w:vertAlign w:val="superscript"/>
-          <w:lang w:val="en-US"/>
-        </w:rPr>
-        <w:fldChar w:fldCharType="end"/>
-      </w:r>
-    </w:p>
-    <w:p>
-      <w:pPr>
-        <w:spacing w:after="60"/>
-        <w:jc w:val="both"/>
-        <w:rPr>
-          <w:rFonts w:ascii="Garamond" w:hAnsi="Garamond"/>
-          <w:lang w:val="en-GB"/>
-        </w:rPr>
-      </w:pPr>
-      <w:r>
-        <w:rPr>
-          <w:rFonts w:ascii="Garamond" w:hAnsi="Garamond"/>
-          <w:lang w:val="en-GB"/>
-        </w:rPr>
-        <w:t xml:space="preserve">Plantar-pressure and adherence-monitoring technologies are validated techniques already used within participating centres; no new measurement technology will be developed. A methodological </w:t>
-      </w:r>
-      <w:proofErr w:type="spellStart"/>
-      <w:r>
-        <w:rPr>
-          <w:rFonts w:ascii="Garamond" w:hAnsi="Garamond"/>
-          <w:lang w:val="en-GB"/>
-        </w:rPr>
-        <w:t>substudy</w:t>
-      </w:r>
-      <w:proofErr w:type="spellEnd"/>
-      <w:r>
-        <w:rPr>
-          <w:rFonts w:ascii="Garamond" w:hAnsi="Garamond"/>
-          <w:lang w:val="en-GB"/>
-        </w:rPr>
-        <w:t xml:space="preserve"> will assess concordance between the Novel </w:t>
-      </w:r>
-      <w:proofErr w:type="spellStart"/>
-      <w:r>
-        <w:rPr>
-          <w:rFonts w:ascii="Garamond" w:hAnsi="Garamond"/>
-          <w:lang w:val="en-GB"/>
-        </w:rPr>
-        <w:t>pedar</w:t>
-      </w:r>
-      <w:proofErr w:type="spellEnd"/>
-      <w:r>
-        <w:rPr>
-          <w:rFonts w:ascii="Garamond" w:hAnsi="Garamond"/>
-          <w:lang w:val="en-GB"/>
-        </w:rPr>
-        <w:t xml:space="preserve"> and F-Scan GO systems, with technical partners.</w:t>
+          <w:lang w:val="en-GB"/>
+        </w:rPr>
+        <w:t xml:space="preserve"> and F-Scan GO systems.</w:t>
       </w:r>
     </w:p>
     <w:p>
@@ -4164,8 +4072,15 @@
           <w:rFonts w:ascii="Garamond" w:hAnsi="Garamond"/>
           <w:lang w:val="en-GB"/>
         </w:rPr>
+        <w:t xml:space="preserve">Secondary outcomes comprise ulcer-free survival, recurrence characteristics, plantar-pressure change at 6, 12, and 18 months, foot-care behaviour (NAFF), objectively measured adherence over the full 18 months, </w:t>
+      </w:r>
+      <w:r>
+        <w:rPr>
+          <w:rFonts w:ascii="Garamond" w:hAnsi="Garamond"/>
+          <w:lang w:val="en-GB"/>
+        </w:rPr>
         <w:lastRenderedPageBreak/>
-        <w:t>Secondary outcomes comprise ulcer-free survival, recurrence characteristics, plantar-pressure change at 6, 12, and 18 months, foot-care behaviour (NAFF), objectively measured adherence over the full 18 months, self-reported adherence (7-day recall), health-related quality of life (EQ-5D-5L), and healthcare resource utilisation.</w:t>
+        <w:t>self-reported adherence (7-day recall), health-related quality of life (EQ-5D-5L), and healthcare resource utilisation.</w:t>
       </w:r>
     </w:p>
     <w:p>
@@ -4506,21 +4421,21 @@
           <w:rFonts w:ascii="Garamond" w:hAnsi="Garamond"/>
           <w:lang w:val="en-US"/>
         </w:rPr>
-        <w:t>Patient-centred outcomes are captured with validated instruments — the NAFF for foot-care behaviour and the EQ-5D-5L for health-related quality of life</w:t>
-      </w:r>
-      <w:proofErr w:type="spellStart"/>
-      <w:r>
-        <w:rPr>
-          <w:rFonts w:ascii="Garamond" w:hAnsi="Garamond"/>
-          <w:lang w:val="en-US"/>
-        </w:rPr>
-      </w:r>
-      <w:proofErr w:type="spellEnd"/>
-      <w:r>
-        <w:rPr>
-          <w:rFonts w:ascii="Garamond" w:hAnsi="Garamond"/>
-          <w:lang w:val="en-US"/>
-        </w:rPr>
+        <w:t>Patient-centred outcomes are captured with validated instruments</w:t>
+      </w:r>
+      <w:r>
+        <w:rPr>
+          <w:rFonts w:ascii="Garamond" w:hAnsi="Garamond"/>
+          <w:lang w:val="en-US"/>
+        </w:rPr>
+        <w:t>,</w:t>
+      </w:r>
+      <w:r>
+        <w:rPr>
+          <w:rFonts w:ascii="Garamond" w:hAnsi="Garamond"/>
+          <w:lang w:val="en-US"/>
+        </w:rPr>
+        <w:t xml:space="preserve"> the NAFF for foot-care behaviour and the EQ-5D-5L for health-related quality of life</w:t>
       </w:r>
       <w:r>
         <w:rPr>
@@ -4563,7 +4478,14 @@
           <w:rFonts w:ascii="Garamond" w:hAnsi="Garamond"/>
           <w:lang w:val="en-US"/>
         </w:rPr>
-        <w:t xml:space="preserve"> — alongside device-derived measures of plantar pressure, footwear wearing time and daily activity. The trial is conducted with the six participating DFCs, with the VUB partners responsible for the process and health-economic evaluation, and with the technical partners supporting the pressure-measurement systems.</w:t>
+        <w:t>,</w:t>
+      </w:r>
+      <w:r>
+        <w:rPr>
+          <w:rFonts w:ascii="Garamond" w:hAnsi="Garamond"/>
+          <w:lang w:val="en-US"/>
+        </w:rPr>
+        <w:t xml:space="preserve"> alongside device-derived measures of plantar pressure, footwear wearing time and daily activity. The trial is conducted with the six participating DFCs, with the VUB partners responsible for the process and health-economic evaluation, and with the technical partners supporting the pressure-measurement systems.</w:t>
       </w:r>
     </w:p>
     <w:p>
@@ -4942,6 +4864,7 @@
           <w:rFonts w:ascii="Garamond" w:hAnsi="Garamond"/>
           <w:lang w:val="en-GB"/>
         </w:rPr>
+        <w:lastRenderedPageBreak/>
         <w:t xml:space="preserve">standardised operating procedures, investigator training, and intervention-fidelity assessments following NIH </w:t>
       </w:r>
       <w:proofErr w:type="spellStart"/>
@@ -5032,34 +4955,7 @@
           <w:szCs w:val="28"/>
           <w:lang w:val="en-US"/>
         </w:rPr>
-        <w:lastRenderedPageBreak/>
-        <w:t>5</w:t>
-      </w:r>
-      <w:proofErr w:type="gramStart"/>
-      <w:r>
-        <w:rPr>
-          <w:rFonts w:ascii="Garamond" w:eastAsia="Calibri" w:hAnsi="Garamond"/>
-          <w:b/>
-          <w:bCs/>
-          <w:color w:val="20415A"/>
-          <w:sz w:val="28"/>
-          <w:szCs w:val="28"/>
-          <w:lang w:val="en-US"/>
-        </w:rPr>
-        <w:t>.  Conclusion</w:t>
-      </w:r>
-      <w:proofErr w:type="gramEnd"/>
-      <w:r>
-        <w:rPr>
-          <w:rFonts w:ascii="Garamond" w:eastAsia="Calibri" w:hAnsi="Garamond"/>
-          <w:b/>
-          <w:bCs/>
-          <w:color w:val="20415A"/>
-          <w:sz w:val="28"/>
-          <w:szCs w:val="28"/>
-          <w:lang w:val="en-US"/>
-        </w:rPr>
-        <w:t>: planned outputs and pre-existing data</w:t>
+        <w:t>5.  Conclusion: planned outputs and pre-existing data</w:t>
       </w:r>
     </w:p>
     <w:p>
@@ -5083,7 +4979,7 @@
           <w:rFonts w:ascii="Garamond" w:hAnsi="Garamond"/>
           <w:lang w:val="en-GB"/>
         </w:rPr>
-        <w:t>The project delivers the first multicentre RCT of PARADISE within Belgian multidisciplinary DFCs. Six manuscripts are planned: (1) the scoping review “Patient-specific offloading insole design in diabetic foot disease”; (2) the trial protocol paper, following SPIRIT 2025 and TIDieR; (3) regional peak plantar-pressure reference values in people with diabetes, from low- and high-resolution in-shoe measurements; (4) a comparison of plantar-pressure redistribution with conventionally manufactured and 3D-printed custom-made foot orthoses, conducted outside the trial; (5) the primary effectiveness analysis of ulcer recurrence at 18 months; and (6) the pre-specified mediation analysis of footwear adherence. Timing is shown in Figure 2, and trial publications follow CONSORT.</w:t>
+        <w:t>The project delivers the first multicentre RCT of PARADISE within Belgian multidisciplinary DFCs. Six manuscripts are planned: (1) the scoping review “Patient-specific offloading insole design in diabetic foot disease”; (2) the trial protocol paper, following SPIRIT 2025 and TIDieR; (3) regional peak plantar-pressure reference values in people with diabetes, from low- and high-resolution in-shoe measurements; (4) a comparison of plantar-pressure redistribution with 3D-printed custom-made foot orthoses, conducted outside the trial; (5) the primary effectiveness analysis of ulcer recurrence at 18 months; and (6) the pre-specified mediation analysis of footwear adherence. Timing is shown in Figure 2, and trial publications follow CONSORT.</w:t>
       </w:r>
       <w:r>
         <w:rPr>
@@ -5128,7 +5024,7 @@
         <w:jc w:val="both"/>
         <w:rPr>
           <w:rFonts w:ascii="Garamond" w:hAnsi="Garamond"/>
-          <w:lang w:val="en-US"/>
+          <w:lang w:val="en-GB"/>
         </w:rPr>
       </w:pPr>
       <w:r>
@@ -5144,7 +5040,7 @@
           <w:rFonts w:ascii="Garamond" w:hAnsi="Garamond"/>
           <w:lang w:val="en-GB"/>
         </w:rPr>
-        <w:t>Pilot observations from a 2023–2024 pressure-guided footwear pathway may inform trial preparation; use will be assessed and approved by the doctoral committee.</w:t>
+        <w:t>Pilot observations from a 2023–2024 pressure-guided footwear pathway may inform trial preparation; their use will be assessed and, where appropriate, approved by the doctoral committee. The comparison study of 3D-printed CMFOs is based on data collected during a previous doctoral project; these data have not yet been analysed or published.</w:t>
       </w:r>
     </w:p>
     <w:p>
@@ -5285,7 +5181,7 @@
           <w:szCs w:val="16"/>
           <w:lang w:val="en-GB"/>
         </w:rPr>
-        <w:t>2.</w:t>
+        <w:t>Sciensano. Diabetes. In: For a Healthy Belgium [Internet]. 2025 [cited 2026 Jun 4].</w:t>
       </w:r>
       <w:r>
         <w:rPr>
@@ -5293,8 +5189,6 @@
           <w:szCs w:val="16"/>
           <w:lang w:val="en-GB"/>
         </w:rPr>
-        <w:tab/>
-        <w:t>admin-sciensano. For a Healthy Belgium [Internet]. 2025 [geciteerd 4 juni 2026]. Diabetes.</w:t>
       </w:r>
     </w:p>
     <w:p>
@@ -5322,7 +5216,7 @@
           <w:lang w:val="en-GB"/>
         </w:rPr>
         <w:tab/>
-        <w:t>Waaijman R, De Haart M, Arts MLJ, Wever D, Verlouw AJWE, Nollet F, e.a. Risk Factors for Plantar Foot Ulcer Recurrence in Neuropathic Diabetic Patients. Diabetes Care. 2014;37:1697-705.</w:t>
+        <w:t>Waaijman R, de Haart M, Arts MLJ, Wever D, Verlouw AJWE, Nollet F, et al. Risk Factors for Plantar Foot Ulcer Recurrence in Neuropathic Diabetic Patients. Diabetes Care. 2014;37:1697-705.</w:t>
       </w:r>
     </w:p>
     <w:p>
@@ -5378,7 +5272,7 @@
           <w:lang w:val="en-GB"/>
         </w:rPr>
         <w:tab/>
-        <w:t xml:space="preserve">Bus SA, Waaijman R, Arts M, De Haart M, Busch-Westbroek T, Van Baal J, e.a. Effect of Custom-Made Footwear on Foot Ulcer Recurrence in Diabetes. </w:t>
+        <w:t xml:space="preserve">Bus SA, Waaijman R, Arts M, de Haart M, Busch-Westbroek T, van Baal J, et al. Effect of Custom-Made Footwear on Foot Ulcer Recurrence in Diabetes. </w:t>
       </w:r>
       <w:r>
         <w:rPr>
@@ -5386,25 +5280,43 @@
           <w:szCs w:val="16"/>
           <w:lang w:val="en-GB"/>
         </w:rPr>
-        <w:t xml:space="preserve">Diabetes Care. </w:t>
-      </w:r>
-      <w:proofErr w:type="gramStart"/>
-      <w:r>
+        <w:t>Diabetes Care. 2013;36:4109-16.</w:t>
+      </w:r>
+    </w:p>
+    <w:p>
+      <w:pPr>
+        <w:pStyle w:val="Bibliografie"/>
+        <w:spacing w:after="0"/>
         <w:rPr>
           <w:sz w:val="16"/>
           <w:szCs w:val="16"/>
           <w:lang w:val="en-GB"/>
         </w:rPr>
-        <w:t>2013;36:4109</w:t>
-      </w:r>
-      <w:proofErr w:type="gramEnd"/>
+      </w:pPr>
       <w:r>
         <w:rPr>
           <w:sz w:val="16"/>
           <w:szCs w:val="16"/>
           <w:lang w:val="en-GB"/>
         </w:rPr>
-        <w:t>-16.</w:t>
+        <w:t>6.</w:t>
+      </w:r>
+      <w:r>
+        <w:rPr>
+          <w:sz w:val="16"/>
+          <w:szCs w:val="16"/>
+          <w:lang w:val="en-GB"/>
+        </w:rPr>
+        <w:tab/>
+        <w:t xml:space="preserve">Waaijman R, Keukenkamp R, de Haart M, Polomski WP, Nollet F, Bus SA. </w:t>
+      </w:r>
+      <w:r>
+        <w:rPr>
+          <w:sz w:val="16"/>
+          <w:szCs w:val="16"/>
+          <w:lang w:val="en-GB"/>
+        </w:rPr>
+        <w:t>Adherence to Wearing Prescription Custom-Made Footwear in Patients With Diabetes at High Risk for Plantar Foot Ulceration. Diabetes Care. 2013;36:1613-8.</w:t>
       </w:r>
     </w:p>
     <w:p>
@@ -5423,7 +5335,7 @@
           <w:szCs w:val="16"/>
           <w:lang w:val="en-GB"/>
         </w:rPr>
-        <w:t>6.</w:t>
+        <w:t>7.</w:t>
       </w:r>
       <w:r>
         <w:rPr>
@@ -5432,50 +5344,63 @@
           <w:lang w:val="en-GB"/>
         </w:rPr>
         <w:tab/>
-      </w:r>
-      <w:proofErr w:type="spellStart"/>
-      <w:r>
+        <w:t>Exterkate SH, Jongebloed‐Westra M, ten Klooster PM, Koffijberg H, Bode C, van Gemert-Pijnen JEWC, et al. Objectively assessed long‐term wearing patterns and predictors of wearing orthopaedic footwear in people with diabetes at moderate‐to‐high risk of foot ulceration: a 12 months observational study. J Foot Ankle Res. 2023;16:60.</w:t>
+      </w:r>
+    </w:p>
+    <w:p>
+      <w:pPr>
+        <w:pStyle w:val="Bibliografie"/>
+        <w:spacing w:after="0"/>
         <w:rPr>
           <w:sz w:val="16"/>
           <w:szCs w:val="16"/>
           <w:lang w:val="en-GB"/>
         </w:rPr>
-        <w:t>Waaijman</w:t>
-      </w:r>
-      <w:proofErr w:type="spellEnd"/>
+      </w:pPr>
       <w:r>
         <w:rPr>
           <w:sz w:val="16"/>
           <w:szCs w:val="16"/>
           <w:lang w:val="en-GB"/>
         </w:rPr>
-        <w:t xml:space="preserve"> R, </w:t>
-      </w:r>
-      <w:proofErr w:type="spellStart"/>
+        <w:t>8.</w:t>
+      </w:r>
       <w:r>
         <w:rPr>
           <w:sz w:val="16"/>
           <w:szCs w:val="16"/>
           <w:lang w:val="en-GB"/>
         </w:rPr>
-        <w:t>Keukenkamp</w:t>
-      </w:r>
-      <w:proofErr w:type="spellEnd"/>
-      <w:r>
+        <w:tab/>
+        <w:t>Goodall RJ, Ellauzi J, Tan MKH, Onida S, Davies AH, Shalhoub J. A Systematic Review of the Impact of Foot Care Education on Self Efficacy and Self Care in Patients With Diabetes. Eur J Vasc Endovasc Surg. 2020;60:282-92.</w:t>
+      </w:r>
+    </w:p>
+    <w:p>
+      <w:pPr>
+        <w:pStyle w:val="Bibliografie"/>
+        <w:spacing w:after="0"/>
         <w:rPr>
           <w:sz w:val="16"/>
           <w:szCs w:val="16"/>
           <w:lang w:val="en-GB"/>
         </w:rPr>
-        <w:t xml:space="preserve"> R, De Haart M, Polomski WP, Nollet F, Bus SA. </w:t>
-      </w:r>
+      </w:pPr>
       <w:r>
         <w:rPr>
           <w:sz w:val="16"/>
           <w:szCs w:val="16"/>
           <w:lang w:val="en-GB"/>
         </w:rPr>
-        <w:t>Adherence to Wearing Prescription Custom-Made Footwear in Patients With Diabetes at High Risk for Plantar Foot Ulceration. Diabetes Care. 2013;36:1613-8.</w:t>
+        <w:t>9.</w:t>
+      </w:r>
+      <w:r>
+        <w:rPr>
+          <w:sz w:val="16"/>
+          <w:szCs w:val="16"/>
+          <w:lang w:val="en-GB"/>
+        </w:rPr>
+        <w:tab/>
+        <w:t>Michie S, van Stralen MM, West R. The behaviour change wheel: A new method for characterising and designing behaviour change interventions. Implement Sci. 2011;6:42.</w:t>
       </w:r>
     </w:p>
     <w:p>
@@ -5494,7 +5419,7 @@
           <w:szCs w:val="16"/>
           <w:lang w:val="en-GB"/>
         </w:rPr>
-        <w:t>7.</w:t>
+        <w:t>10.</w:t>
       </w:r>
       <w:r>
         <w:rPr>
@@ -5503,7 +5428,7 @@
           <w:lang w:val="en-GB"/>
         </w:rPr>
         <w:tab/>
-        <w:t>Exterkate SH, Jongebloed‐Westra M, Ten Klooster PM, Koffijberg H, Bode C, Van Gemert‐Pijnen JEWC, e.a. Objectively assessed long‐term wearing patterns and predictors of wearing orthopaedic footwear in people with diabetes at moderate‐to‐high risk of foot ulceration: a 12 months observational study. J Foot Ankle Res. 2023;16:60.</w:t>
+        <w:t>Michie S, Richardson M, Johnston M, Abraham C, Francis J, Hardeman W, et al. The Behavior Change Technique Taxonomy (v1) of 93 Hierarchically Clustered Techniques: Building an International Consensus for the Reporting of Behavior Change Interventions. Ann Behav Med. 2013;46:81-95.</w:t>
       </w:r>
     </w:p>
     <w:p>
@@ -5522,7 +5447,7 @@
           <w:szCs w:val="16"/>
           <w:lang w:val="en-GB"/>
         </w:rPr>
-        <w:t>8.</w:t>
+        <w:t>11.</w:t>
       </w:r>
       <w:r>
         <w:rPr>
@@ -5531,7 +5456,7 @@
           <w:lang w:val="en-GB"/>
         </w:rPr>
         <w:tab/>
-        <w:t>Goodall RJ, Ellauzi J, Tan MKH, Onida S, Davies AH, Shalhoub J. A Systematic Review of the Impact of Foot Care Education on Self Efficacy and Self Care in Patients With Diabetes. Eur J Vasc Endovasc Surg. 2020;60:282-92.</w:t>
+        <w:t>van Netten JJ, Vossen LE, Driebergen FM, Wolthuis D, Merkx MJM, Bus SA. Short-Term Efficacy of a Multi-Modal Intervention Program to Improve Custom-Made Footwear Use in People at High Risk of Diabetes-Related Foot Ulceration. J Clin Med. 2025;14:3635.</w:t>
       </w:r>
     </w:p>
     <w:p>
@@ -5550,7 +5475,7 @@
           <w:szCs w:val="16"/>
           <w:lang w:val="en-GB"/>
         </w:rPr>
-        <w:t>9.</w:t>
+        <w:t>12.</w:t>
       </w:r>
       <w:r>
         <w:rPr>
@@ -5559,7 +5484,15 @@
           <w:lang w:val="en-GB"/>
         </w:rPr>
         <w:tab/>
-        <w:t>Michie S, Van Stralen MM, West R. The behaviour change wheel: A new method for characterising and designing behaviour change interventions. Implement Sci. 2011;6:42.</w:t>
+        <w:t xml:space="preserve">López-Moral M, Molines-Barroso RJ, Herrera-Casamayor M, García-Madrid M, García-Morales E, Lázaro-Martínez JL. Usability of Different Methods to Assess and Improve Adherence to Therapeutic Footwear in Persons with the Diabetic Foot in </w:t>
+      </w:r>
+      <w:r>
+        <w:rPr>
+          <w:sz w:val="16"/>
+          <w:szCs w:val="16"/>
+          <w:lang w:val="en-GB"/>
+        </w:rPr>
+        <w:t>Remission. A Systematic Review. Int J Low Extrem Wounds. 2026;25:55-64.</w:t>
       </w:r>
     </w:p>
     <w:p>
@@ -5578,7 +5511,7 @@
           <w:szCs w:val="16"/>
           <w:lang w:val="en-GB"/>
         </w:rPr>
-        <w:t>10.</w:t>
+        <w:t>13.</w:t>
       </w:r>
       <w:r>
         <w:rPr>
@@ -5587,7 +5520,7 @@
           <w:lang w:val="en-GB"/>
         </w:rPr>
         <w:tab/>
-        <w:t>Michie S, Richardson M, Johnston M, Abraham C, Francis J, Hardeman W, e.a. The Behavior Change Technique Taxonomy (v1) of 93 Hierarchically Clustered Techniques: Building an International Consensus for the Reporting of Behavior Change Interventions. Ann Behav Med. 2013;46:81-95.</w:t>
+        <w:t>Lutjeboer T, van Netten JJ, Postema K, Hijmans J. Effect of awareness of being monitored on wearing of orthopaedic footwear. J Rehabil Med. 2020;52:jrm00127.</w:t>
       </w:r>
     </w:p>
     <w:p>
@@ -5606,7 +5539,7 @@
           <w:szCs w:val="16"/>
           <w:lang w:val="en-GB"/>
         </w:rPr>
-        <w:t>11.</w:t>
+        <w:t>14.</w:t>
       </w:r>
       <w:r>
         <w:rPr>
@@ -5615,7 +5548,7 @@
           <w:lang w:val="en-GB"/>
         </w:rPr>
         <w:tab/>
-        <w:t>Van Netten JJ, Vossen LE, Driebergen FM, Wolthuis D, Merkx MJM, Bus SA. Short-Term Efficacy of a Multi-Modal Intervention Program to Improve Custom-Made Footwear Use in People at High Risk of Diabetes-Related Foot Ulceration. J Clin Med. 2025;14:3635.</w:t>
+        <w:t>Jongebloed-Westra M, Bode C, van Netten JJ, ten Klooster PM, Exterkate SH, Koffijberg H, et al. Using motivational interviewing combined with digital shoe-fitting to improve adherence to wearing orthopedic shoes in people with diabetes at risk of foot ulceration: study protocol for a cluster-randomized controlled trial. Trials. 2021;22:750.</w:t>
       </w:r>
     </w:p>
     <w:p>
@@ -5634,7 +5567,7 @@
           <w:szCs w:val="16"/>
           <w:lang w:val="en-GB"/>
         </w:rPr>
-        <w:t>12.</w:t>
+        <w:t>15.</w:t>
       </w:r>
       <w:r>
         <w:rPr>
@@ -5643,7 +5576,7 @@
           <w:lang w:val="en-GB"/>
         </w:rPr>
         <w:tab/>
-        <w:t>López-Moral M, Molines-Barroso RJ, Herrera-Casamayor M, García-Madrid M, García-Morales E, Lázaro-Martínez JL. Usability of Different Methods to Assess and Improve Adherence to Therapeutic Footwear in Persons with the Diabetic Foot in Remission. A Systematic Review. Int J Low Extrem Wounds. 2026;25:55-64.</w:t>
+        <w:t>Vossen LE, van Netten JJ, Bakker CD, Berendsen HA, Busch-Westbroek TE, Peters EJG, et al. An integrated personalized assistive devices approach to reduce the risk of foot ulcer recurrence in diabetes (DIASSIST): study protocol for a multicenter randomized controlled trial. Trials. 2023;24:663.</w:t>
       </w:r>
     </w:p>
     <w:p>
@@ -5662,7 +5595,7 @@
           <w:szCs w:val="16"/>
           <w:lang w:val="en-GB"/>
         </w:rPr>
-        <w:t>13.</w:t>
+        <w:t>16.</w:t>
       </w:r>
       <w:r>
         <w:rPr>
@@ -5671,7 +5604,7 @@
           <w:lang w:val="en-GB"/>
         </w:rPr>
         <w:tab/>
-        <w:t>Lutjeboer T, Netten J, Postema K, Hijmans J. Effect of awareness of being monitored on wearing of orthopaedic footwear. J Rehabil Med. 2020;52:jrm00127.</w:t>
+        <w:t>White IR, Royston P, Wood AM. Multiple imputation using chained equations: Issues and guidance for practice. Stat Med. 2011;30:377-99.</w:t>
       </w:r>
     </w:p>
     <w:p>
@@ -5690,7 +5623,7 @@
           <w:szCs w:val="16"/>
           <w:lang w:val="en-GB"/>
         </w:rPr>
-        <w:t>14.</w:t>
+        <w:t>17.</w:t>
       </w:r>
       <w:r>
         <w:rPr>
@@ -5699,7 +5632,7 @@
           <w:lang w:val="en-GB"/>
         </w:rPr>
         <w:tab/>
-        <w:t>Jongebloed-Westra M, Bode C, Van Netten JJ, Ten Klooster PM, Exterkate SH, Koffijberg H, e.a. Using motivational interviewing combined with digital shoe-fitting to improve adherence to wearing orthopedic shoes in people with diabetes at risk of foot ulceration: study protocol for a cluster-randomized controlled trial. Trials. 2021;22:750.</w:t>
+        <w:t>Mallinckrodt C, Lipkovich I, Dickson S, Hendrix S, Molenberghs G. Handling Missing Data in Participants with Baseline but No Post‐Baseline Data. Pharm Stat. 2026;25:e70076.</w:t>
       </w:r>
     </w:p>
     <w:p>
@@ -5718,7 +5651,7 @@
           <w:szCs w:val="16"/>
           <w:lang w:val="en-GB"/>
         </w:rPr>
-        <w:t>15.</w:t>
+        <w:t>18.</w:t>
       </w:r>
       <w:r>
         <w:rPr>
@@ -5727,7 +5660,7 @@
           <w:lang w:val="en-GB"/>
         </w:rPr>
         <w:tab/>
-        <w:t>Vossen LE, Van Netten JJ, Bakker CD, Berendsen HA, Busch-Westbroek TE, Peters EJG, e.a. An integrated personalized assistive devices approach to reduce the risk of foot ulcer recurrence in diabetes (DIASSIST): study protocol for a multicenter randomized controlled trial. Trials. 2023;24:663.</w:t>
+        <w:t>Herdman M, Gudex C, Lloyd A, Janssen MF, Kind P, Parkin D, et al. Development and preliminary testing of the new five-level version of EQ-5D (EQ-5D-5L). Qual Life Res. 2011;20:1727-36.</w:t>
       </w:r>
     </w:p>
     <w:p>
@@ -5746,7 +5679,7 @@
           <w:szCs w:val="16"/>
           <w:lang w:val="en-GB"/>
         </w:rPr>
-        <w:t>16.</w:t>
+        <w:t>19.</w:t>
       </w:r>
       <w:r>
         <w:rPr>
@@ -5755,7 +5688,7 @@
           <w:lang w:val="en-GB"/>
         </w:rPr>
         <w:tab/>
-        <w:t>White IR, Royston P, Wood AM. Multiple imputation using chained equations: Issues and guidance for practice. Stat Med. 2011;30:377-99.</w:t>
+        <w:t>Chan AW, Boutron I, Hopewell S, Moher D, Schulz KF, Collins GS, et al. SPIRIT 2025 statement: updated guideline for protocols of randomised trials. BMJ. 2025;389:e081477.</w:t>
       </w:r>
     </w:p>
     <w:p>
@@ -5774,7 +5707,7 @@
           <w:szCs w:val="16"/>
           <w:lang w:val="en-GB"/>
         </w:rPr>
-        <w:t>17.</w:t>
+        <w:t>20.</w:t>
       </w:r>
       <w:r>
         <w:rPr>
@@ -5783,7 +5716,7 @@
           <w:lang w:val="en-GB"/>
         </w:rPr>
         <w:tab/>
-        <w:t>Mallinckrodt C, Lipkovich I, Dickson S, Hendrix S, Molenberghs G. Handling Missing Data in Participants with Baseline but No Post‐Baseline Data. Pharm Stat. 2026;25:e70076.</w:t>
+        <w:t>Jacques RM, Ahmed R, Harper J, Ranjan A, Saeed I, Simpson RM, et al. Recruitment, consent and retention of participants in randomised controlled trials: a review of trials published in the National Institute for Health Research (NIHR) Journals Library (1997–2020). BMJ Open. 2022;12:e059230.</w:t>
       </w:r>
     </w:p>
     <w:p>
@@ -5802,7 +5735,7 @@
           <w:szCs w:val="16"/>
           <w:lang w:val="en-GB"/>
         </w:rPr>
-        <w:t>18.</w:t>
+        <w:t>21.</w:t>
       </w:r>
       <w:r>
         <w:rPr>
@@ -5811,7 +5744,7 @@
           <w:lang w:val="en-GB"/>
         </w:rPr>
         <w:tab/>
-        <w:t>Herdman M, Gudex C, Lloyd A, Janssen Mf, Kind P, Parkin D, e.a. Development and preliminary testing of the new five-level version of EQ-5D (EQ-5D-5L). Qual Life Res. 2011;20:1727-36.</w:t>
+        <w:t>Donovan JL, Rooshenas L, Jepson M, Elliott D, Wade J, Avery K, et al. Optimising recruitment and informed consent in randomised controlled trials: the development and implementation of the Quintet Recruitment Intervention (QRI). Trials. 2016;17:283.</w:t>
       </w:r>
     </w:p>
     <w:p>
@@ -5830,7 +5763,7 @@
           <w:szCs w:val="16"/>
           <w:lang w:val="en-GB"/>
         </w:rPr>
-        <w:t>19.</w:t>
+        <w:t>22.</w:t>
       </w:r>
       <w:r>
         <w:rPr>
@@ -5839,7 +5772,7 @@
           <w:lang w:val="en-GB"/>
         </w:rPr>
         <w:tab/>
-        <w:t>Chan AW, Boutron I, Hopewell S, Moher D, Schulz KF, Collins GS, e.a. SPIRIT 2025 statement: updated guideline for protocols of randomised trials. BMJ. 2025;389:e081477.</w:t>
+        <w:t>Bellg AJ, Borrelli B, Resnick B, Hecht J, Minicucci DS, Ory M, et al. Enhancing Treatment Fidelity in Health Behavior Change Studies: Best Practices and Recommendations From the NIH Behavior Change Consortium. Health Psychol. 2004;23:443-51.</w:t>
       </w:r>
     </w:p>
     <w:p>
@@ -5849,7 +5782,6 @@
         <w:rPr>
           <w:sz w:val="16"/>
           <w:szCs w:val="16"/>
-          <w:lang w:val="en-GB"/>
         </w:rPr>
       </w:pPr>
       <w:r>
@@ -5858,7 +5790,7 @@
           <w:szCs w:val="16"/>
           <w:lang w:val="en-GB"/>
         </w:rPr>
-        <w:t>20.</w:t>
+        <w:t>23.</w:t>
       </w:r>
       <w:r>
         <w:rPr>
@@ -5867,90 +5799,7 @@
           <w:lang w:val="en-GB"/>
         </w:rPr>
         <w:tab/>
-        <w:t>Jacques RM, Ahmed R, Harper J, Ranjan A, Saeed I, Simpson RM, e.a. Recruitment, consent and retention of participants in randomised controlled trials: a review of trials published in the National Institute for Health Research (NIHR) Journals Library (1997–2020). BMJ Open. 2022;12:e059230.</w:t>
-      </w:r>
-    </w:p>
-    <w:p>
-      <w:pPr>
-        <w:pStyle w:val="Bibliografie"/>
-        <w:spacing w:after="0"/>
-        <w:rPr>
-          <w:sz w:val="16"/>
-          <w:szCs w:val="16"/>
-          <w:lang w:val="en-GB"/>
-        </w:rPr>
-      </w:pPr>
-      <w:r>
-        <w:rPr>
-          <w:sz w:val="16"/>
-          <w:szCs w:val="16"/>
-          <w:lang w:val="en-GB"/>
-        </w:rPr>
-        <w:t>21.</w:t>
-      </w:r>
-      <w:r>
-        <w:rPr>
-          <w:sz w:val="16"/>
-          <w:szCs w:val="16"/>
-          <w:lang w:val="en-GB"/>
-        </w:rPr>
-        <w:tab/>
-        <w:t>Donovan JL, Rooshenas L, Jepson M, Elliott D, Wade J, Avery K, e.a. Optimising recruitment and informed consent in randomised controlled trials: the development and implementation of the Quintet Recruitment Intervention (QRI). Trials. 2016;17:283.</w:t>
-      </w:r>
-    </w:p>
-    <w:p>
-      <w:pPr>
-        <w:pStyle w:val="Bibliografie"/>
-        <w:spacing w:after="0"/>
-        <w:rPr>
-          <w:sz w:val="16"/>
-          <w:szCs w:val="16"/>
-          <w:lang w:val="en-GB"/>
-        </w:rPr>
-      </w:pPr>
-      <w:r>
-        <w:rPr>
-          <w:sz w:val="16"/>
-          <w:szCs w:val="16"/>
-          <w:lang w:val="en-GB"/>
-        </w:rPr>
-        <w:t>22.</w:t>
-      </w:r>
-      <w:r>
-        <w:rPr>
-          <w:sz w:val="16"/>
-          <w:szCs w:val="16"/>
-          <w:lang w:val="en-GB"/>
-        </w:rPr>
-        <w:tab/>
-        <w:t>Bellg AJ, Borrelli B, Resnick B, Hecht J, Minicucci DS, Ory M, e.a. Enhancing Treatment Fidelity in Health Behavior Change Studies: Best Practices and Recommendations From the NIH Behavior Change Consortium. Health Psychol. 2004;23:443-51.</w:t>
-      </w:r>
-    </w:p>
-    <w:p>
-      <w:pPr>
-        <w:pStyle w:val="Bibliografie"/>
-        <w:spacing w:after="0"/>
-        <w:rPr>
-          <w:sz w:val="16"/>
-          <w:szCs w:val="16"/>
-        </w:rPr>
-      </w:pPr>
-      <w:r>
-        <w:rPr>
-          <w:sz w:val="16"/>
-          <w:szCs w:val="16"/>
-          <w:lang w:val="en-GB"/>
-        </w:rPr>
-        <w:t>23.</w:t>
-      </w:r>
-      <w:r>
-        <w:rPr>
-          <w:sz w:val="16"/>
-          <w:szCs w:val="16"/>
-          <w:lang w:val="en-GB"/>
-        </w:rPr>
-        <w:tab/>
-        <w:t xml:space="preserve">Hopewell S, Chan AW, Collins GS, Hróbjartsson A, Moher D, Schulz KF, e.a. CONSORT 2025 statement: updated guideline for reporting randomised trials. </w:t>
+        <w:t xml:space="preserve">Hopewell S, Chan AW, Collins GS, Hróbjartsson A, Moher D, Schulz KF, et al. CONSORT 2025 statement: updated guideline for reporting randomised trials. </w:t>
       </w:r>
       <w:r>
         <w:rPr>
@@ -8276,7 +8125,6 @@
   <w:style w:type="character" w:default="1" w:styleId="Standaardalinea-lettertype">
     <w:name w:val="Default Paragraph Font"/>
     <w:uiPriority w:val="1"/>
-    <w:semiHidden/>
     <w:unhideWhenUsed/>
   </w:style>
   <w:style w:type="table" w:default="1" w:styleId="Standaardtabel">

</xml_diff>

<commit_message>
Doctoraatsplan: citaties op de bronnen die ze dragen, lijst hernummerd
De 80-procentdrempel staat nu op Bus in plaats van op Waaijman. Kamogawa
verhuist van de openingszin naar de zin over de waarde van drukgestuurd
schoeisel en objectieve monitoring, waar hij wel thuishoort. De educatieclaim
gaat naar Goodall in plaats van naar Exterkate. Jacques gaat over trials in het
algemeen, en de zin zegt dat nu ook. De Belgische integratieclaim staat los van
Bus. Lutjeboer heeft een clausule gekregen die hij draagt. De BCT-taxonomie is
geschrapt: die classificeert technieken, ze is er geen. Van 23 naar 22
referenties, eerste vermelding opnieuw strikt oplopend.
</commit_message>
<xml_diff>
--- a/PARADISE_provisional_doctoral_plan.docx
+++ b/PARADISE_provisional_doctoral_plan.docx
@@ -1387,6 +1387,48 @@
           <w:vertAlign w:val="superscript"/>
           <w:lang w:val="en-GB"/>
         </w:rPr>
+      </w:r>
+      <w:r>
+        <w:rPr>
+          <w:rFonts w:ascii="Garamond" w:hAnsi="Garamond"/>
+          <w:lang w:val="en-US"/>
+        </w:rPr>
+        <w:fldChar w:fldCharType="end"/>
+      </w:r>
+      <w:r>
+        <w:rPr>
+          <w:rFonts w:ascii="Garamond" w:hAnsi="Garamond"/>
+          <w:lang w:val="en-US"/>
+        </w:rPr>
+        <w:t xml:space="preserve"> in Belgium, diagnosed prevalence reached 7.6% in 2023 and continues to rise with an ageing population.</w:t>
+      </w:r>
+      <w:r>
+        <w:rPr>
+          <w:rFonts w:ascii="Garamond" w:hAnsi="Garamond"/>
+          <w:lang w:val="en-US"/>
+        </w:rPr>
+        <w:fldChar w:fldCharType="begin"/>
+      </w:r>
+      <w:r>
+        <w:rPr>
+          <w:rFonts w:ascii="Garamond" w:hAnsi="Garamond"/>
+          <w:lang w:val="en-US"/>
+        </w:rPr>
+        <w:instrText xml:space="preserve"> ADDIN ZOTERO_ITEM CSL_CITATION {"citationID":"QZsvqEtg","properties":{"unsorted":false,"formattedCitation":"\\super 2\\nosupersub{}","plainCitation":"2","noteIndex":0},"citationItems":[{"id":50,"uris":["http://zotero.org/users/19619518/items/K3HEZTLV"],"itemData":{"id":50,"type":"webpage","abstract":"For a healthy Belgium: indicators of health and care","container-title":"For a Healthy Belgium","language":"en-gb","title":"Diabetes","URL":"https://www.healthybelgium.be/en/health-status/non-communicable-diseases/diabetes","author":[{"family":"admin-sciensano","given":""}],"accessed":{"date-parts":[["2026",6,4]]},"issued":{"date-parts":[["2025",9,30]]}}}],"schema":"https://github.com/citation-style-language/schema/raw/master/csl-citation.json"} </w:instrText>
+      </w:r>
+      <w:r>
+        <w:rPr>
+          <w:rFonts w:ascii="Garamond" w:hAnsi="Garamond"/>
+          <w:lang w:val="en-US"/>
+        </w:rPr>
+        <w:fldChar w:fldCharType="separate"/>
+      </w:r>
+      <w:r>
+        <w:rPr>
+          <w:rFonts w:ascii="Garamond" w:hAnsi="Garamond"/>
+          <w:vertAlign w:val="superscript"/>
+          <w:lang w:val="en-GB"/>
+        </w:rPr>
         <w:t>1</w:t>
       </w:r>
       <w:r>
@@ -1401,7 +1443,21 @@
           <w:rFonts w:ascii="Garamond" w:hAnsi="Garamond"/>
           <w:lang w:val="en-US"/>
         </w:rPr>
-        <w:t xml:space="preserve"> in Belgium, diagnosed prevalence reached 7.6% in 2023 and continues to rise with an ageing population.</w:t>
+        <w:t xml:space="preserve"> Recurrent diabetic foot ulcers (DFUs) remain a leading cause of morbidity, reduced quality of life and healthcare expenditure: about 40% of healed ulcers recur within one year, </w:t>
+      </w:r>
+      <w:r>
+        <w:rPr>
+          <w:rFonts w:ascii="Garamond" w:hAnsi="Garamond"/>
+          <w:lang w:val="en-US"/>
+        </w:rPr>
+        <w:t>making recurrence prevention a central priority</w:t>
+      </w:r>
+      <w:r>
+        <w:rPr>
+          <w:rFonts w:ascii="Garamond" w:hAnsi="Garamond"/>
+          <w:lang w:val="en-US"/>
+        </w:rPr>
+        <w:t>.</w:t>
       </w:r>
       <w:r>
         <w:rPr>
@@ -1415,7 +1471,7 @@
           <w:rFonts w:ascii="Garamond" w:hAnsi="Garamond"/>
           <w:lang w:val="en-US"/>
         </w:rPr>
-        <w:instrText xml:space="preserve"> ADDIN ZOTERO_ITEM CSL_CITATION {"citationID":"QZsvqEtg","properties":{"unsorted":false,"formattedCitation":"\\super 2\\nosupersub{}","plainCitation":"2","noteIndex":0},"citationItems":[{"id":50,"uris":["http://zotero.org/users/19619518/items/K3HEZTLV"],"itemData":{"id":50,"type":"webpage","abstract":"For a healthy Belgium: indicators of health and care","container-title":"For a Healthy Belgium","language":"en-gb","title":"Diabetes","URL":"https://www.healthybelgium.be/en/health-status/non-communicable-diseases/diabetes","author":[{"family":"admin-sciensano","given":""}],"accessed":{"date-parts":[["2026",6,4]]},"issued":{"date-parts":[["2025",9,30]]}}}],"schema":"https://github.com/citation-style-language/schema/raw/master/csl-citation.json"} </w:instrText>
+        <w:instrText xml:space="preserve"> ADDIN ZOTERO_ITEM CSL_CITATION {"citationID":"bQVpjHK6","properties":{"unsorted":false,"formattedCitation":"\\super 3,4\\nosupersub{}","plainCitation":"3,4","noteIndex":0},"citationItems":[{"id":59,"uris":["http://zotero.org/users/19619518/items/AA95SBQV"],"itemData":{"id":59,"type":"article-journal","abstract":"OBJECTIVE\n              Recurrence of plantar foot ulcers is a common and major problem in diabetes but not well understood. Foot biomechanics and patient behavior may be important. The aim was to identify risk factors for ulcer recurrence and to establish targets for ulcer prevention.\n            \n            \n              RESEARCH DESIGN AND METHODS\n              As part of a footwear trial, 171 neuropathic diabetic patients with a recently healed plantar foot ulcer and custom-made footwear were followed for 18 months or until ulceration. Demographic data, disease-related parameters, presence of minor lesions, barefoot and in-shoe plantar peak pressures, footwear adherence, and daily stride count were entered in a multivariate multilevel logistic regression model of plantar foot ulcer recurrence.\n            \n            \n              RESULTS\n              A total of 71 patients had a recurrent ulcer. Significant independent predictors were presence of minor lesions (odds ratio 9.06 [95% CI 2.98–27.57]), day-to-day variation in stride count (0.93 [0.89–0.99]), and cumulative duration of past foot ulcers (1.03 [1.00–1.06]). Significant independent predictors for those 41 recurrences suggested to be the result of unrecognized repetitive trauma were presence of minor lesions (10.95 [5.01–23.96]), in-shoe peak pressure &amp;lt;200 kPa with footwear adherence &amp;gt;80% (0.43 [0.20–0.94]), barefoot peak pressure (1.11 [1.00–1.22]), and day-to-day variation in stride count (0.91 [0.86–0.96]).\n            \n            \n              CONCLUSIONS\n              The presence of a minor lesion was clearly the strongest predictor, while recommended use of adequately offloading footwear was a strong protector against ulcer recurrence from unrecognized repetitive trauma. These outcomes define clear targets for diabetic foot screening and ulcer prevention.","container-title":"Diabetes Care","DOI":"10.2337/dc13-2470","ISSN":"0149-5992, 1935-5548","issue":"6","language":"en","page":"1697-1705","source":"DOI.org (Crossref)","title":"Risk Factors for Plantar Foot Ulcer Recurrence in Neuropathic Diabetic Patients","volume":"37","author":[{"family":"Waaijman","given":"Roelof"},{"family":"De Haart","given":"Mirjam"},{"family":"Arts","given":"Mark L.J."},{"family":"Wever","given":"Daniel"},{"family":"Verlouw","given":"Anke J.W.E."},{"family":"Nollet","given":"Frans"},{"family":"Bus","given":"Sicco A."}],"issued":{"date-parts":[["2014",6,1]]}}},{"id":58,"uris":["http://zotero.org/users/19619518/items/BNUN34AS"],"itemData":{"id":58,"type":"article-journal","abstract":"Background: Diabetic foot disease is a public health problem. The challenges of its management lie in the complexity of wound healing and, in particular, the high rate of lesion recurrence. Objectives: The primary objective of the study was to evaluate whether optimized post-healing follow-up by a multidisciplinary team can reduce the recurrence rate of foot ulcers in people living with diabetes. The secondary objectives were to assess patient needs in terms of hospitalization for recurrence, the number of amputations, pedicure care, and the use of adapted footwear. Participants: The study included 129 patients with diabetes presenting a healed foot ulcer. A total of 38 patients underwent an annual post-healing follow-up visit with a multidisciplinary team (optimized follow-up), while 91 had a visit every 2 years (minimum follow-up). Results: Of the 38 patients with optimal follow-up, 8 presented a wound recurrence (21.1%) compared with 38 out of 91 patients (41.8%) receiving minimum follow-up. The recurrence rate decreased significantly between the two groups (p &lt; 0.05). The use of adapted shoes was also significantly better in the group with optimized follow-up (p = 0.02). Conclusions: Regular post-healing follow-up with a multidisciplinary team seems to be a contributing factor to reducing the recurrence of diabetic foot ulcers among people living with diabetes.","container-title":"Journal of Clinical Medicine","DOI":"10.3390/jcm14144975","ISSN":"2077-0383","issue":"14","journalAbbreviation":"JCM","language":"en","page":"4975","source":"DOI.org (Crossref)","title":"The Post-Healing Follow-Up of Diabetic Foot Ulcers by a Multidisciplinary Team to Reduce Their Recurrence: An Observational Retrospective Study","title-short":"The Post-Healing Follow-Up of Diabetic Foot Ulcers by a Multidisciplinary Team to Reduce Their Recurrence","volume":"14","author":[{"family":"Bouly","given":"Marie"},{"family":"Laborne","given":"Francois-Xavier"},{"family":"Tourte","given":"Caroline"},{"family":"Henry","given":"Elodie"},{"family":"Penfornis","given":"Alfred"},{"family":"Dardari","given":"Dured"}],"issued":{"date-parts":[["2025",7,14]]}}}],"schema":"https://github.com/citation-style-language/schema/raw/master/csl-citation.json"} </w:instrText>
       </w:r>
       <w:r>
         <w:rPr>
@@ -1430,64 +1486,7 @@
           <w:vertAlign w:val="superscript"/>
           <w:lang w:val="en-GB"/>
         </w:rPr>
-        <w:t>2</w:t>
-      </w:r>
-      <w:r>
-        <w:rPr>
-          <w:rFonts w:ascii="Garamond" w:hAnsi="Garamond"/>
-          <w:lang w:val="en-US"/>
-        </w:rPr>
-        <w:fldChar w:fldCharType="end"/>
-      </w:r>
-      <w:r>
-        <w:rPr>
-          <w:rFonts w:ascii="Garamond" w:hAnsi="Garamond"/>
-          <w:lang w:val="en-US"/>
-        </w:rPr>
-        <w:t xml:space="preserve"> Recurrent diabetic foot ulcers (DFUs) remain a leading cause of morbidity, reduced quality of life and healthcare expenditure: about 40% of healed ulcers recur within one year, </w:t>
-      </w:r>
-      <w:r>
-        <w:rPr>
-          <w:rFonts w:ascii="Garamond" w:hAnsi="Garamond"/>
-          <w:lang w:val="en-US"/>
-        </w:rPr>
-        <w:t>making recurrence prevention a central priority</w:t>
-      </w:r>
-      <w:r>
-        <w:rPr>
-          <w:rFonts w:ascii="Garamond" w:hAnsi="Garamond"/>
-          <w:lang w:val="en-US"/>
-        </w:rPr>
-        <w:t>.</w:t>
-      </w:r>
-      <w:r>
-        <w:rPr>
-          <w:rFonts w:ascii="Garamond" w:hAnsi="Garamond"/>
-          <w:lang w:val="en-US"/>
-        </w:rPr>
-        <w:fldChar w:fldCharType="begin"/>
-      </w:r>
-      <w:r>
-        <w:rPr>
-          <w:rFonts w:ascii="Garamond" w:hAnsi="Garamond"/>
-          <w:lang w:val="en-US"/>
-        </w:rPr>
-        <w:instrText xml:space="preserve"> ADDIN ZOTERO_ITEM CSL_CITATION {"citationID":"bQVpjHK6","properties":{"unsorted":false,"formattedCitation":"\\super 3,4\\nosupersub{}","plainCitation":"3,4","noteIndex":0},"citationItems":[{"id":59,"uris":["http://zotero.org/users/19619518/items/AA95SBQV"],"itemData":{"id":59,"type":"article-journal","abstract":"OBJECTIVE\n              Recurrence of plantar foot ulcers is a common and major problem in diabetes but not well understood. Foot biomechanics and patient behavior may be important. The aim was to identify risk factors for ulcer recurrence and to establish targets for ulcer prevention.\n            \n            \n              RESEARCH DESIGN AND METHODS\n              As part of a footwear trial, 171 neuropathic diabetic patients with a recently healed plantar foot ulcer and custom-made footwear were followed for 18 months or until ulceration. Demographic data, disease-related parameters, presence of minor lesions, barefoot and in-shoe plantar peak pressures, footwear adherence, and daily stride count were entered in a multivariate multilevel logistic regression model of plantar foot ulcer recurrence.\n            \n            \n              RESULTS\n              A total of 71 patients had a recurrent ulcer. Significant independent predictors were presence of minor lesions (odds ratio 9.06 [95% CI 2.98–27.57]), day-to-day variation in stride count (0.93 [0.89–0.99]), and cumulative duration of past foot ulcers (1.03 [1.00–1.06]). Significant independent predictors for those 41 recurrences suggested to be the result of unrecognized repetitive trauma were presence of minor lesions (10.95 [5.01–23.96]), in-shoe peak pressure &amp;lt;200 kPa with footwear adherence &amp;gt;80% (0.43 [0.20–0.94]), barefoot peak pressure (1.11 [1.00–1.22]), and day-to-day variation in stride count (0.91 [0.86–0.96]).\n            \n            \n              CONCLUSIONS\n              The presence of a minor lesion was clearly the strongest predictor, while recommended use of adequately offloading footwear was a strong protector against ulcer recurrence from unrecognized repetitive trauma. These outcomes define clear targets for diabetic foot screening and ulcer prevention.","container-title":"Diabetes Care","DOI":"10.2337/dc13-2470","ISSN":"0149-5992, 1935-5548","issue":"6","language":"en","page":"1697-1705","source":"DOI.org (Crossref)","title":"Risk Factors for Plantar Foot Ulcer Recurrence in Neuropathic Diabetic Patients","volume":"37","author":[{"family":"Waaijman","given":"Roelof"},{"family":"De Haart","given":"Mirjam"},{"family":"Arts","given":"Mark L.J."},{"family":"Wever","given":"Daniel"},{"family":"Verlouw","given":"Anke J.W.E."},{"family":"Nollet","given":"Frans"},{"family":"Bus","given":"Sicco A."}],"issued":{"date-parts":[["2014",6,1]]}}},{"id":58,"uris":["http://zotero.org/users/19619518/items/BNUN34AS"],"itemData":{"id":58,"type":"article-journal","abstract":"Background: Diabetic foot disease is a public health problem. The challenges of its management lie in the complexity of wound healing and, in particular, the high rate of lesion recurrence. Objectives: The primary objective of the study was to evaluate whether optimized post-healing follow-up by a multidisciplinary team can reduce the recurrence rate of foot ulcers in people living with diabetes. The secondary objectives were to assess patient needs in terms of hospitalization for recurrence, the number of amputations, pedicure care, and the use of adapted footwear. Participants: The study included 129 patients with diabetes presenting a healed foot ulcer. A total of 38 patients underwent an annual post-healing follow-up visit with a multidisciplinary team (optimized follow-up), while 91 had a visit every 2 years (minimum follow-up). Results: Of the 38 patients with optimal follow-up, 8 presented a wound recurrence (21.1%) compared with 38 out of 91 patients (41.8%) receiving minimum follow-up. The recurrence rate decreased significantly between the two groups (p &lt; 0.05). The use of adapted shoes was also significantly better in the group with optimized follow-up (p = 0.02). Conclusions: Regular post-healing follow-up with a multidisciplinary team seems to be a contributing factor to reducing the recurrence of diabetic foot ulcers among people living with diabetes.","container-title":"Journal of Clinical Medicine","DOI":"10.3390/jcm14144975","ISSN":"2077-0383","issue":"14","journalAbbreviation":"JCM","language":"en","page":"4975","source":"DOI.org (Crossref)","title":"The Post-Healing Follow-Up of Diabetic Foot Ulcers by a Multidisciplinary Team to Reduce Their Recurrence: An Observational Retrospective Study","title-short":"The Post-Healing Follow-Up of Diabetic Foot Ulcers by a Multidisciplinary Team to Reduce Their Recurrence","volume":"14","author":[{"family":"Bouly","given":"Marie"},{"family":"Laborne","given":"Francois-Xavier"},{"family":"Tourte","given":"Caroline"},{"family":"Henry","given":"Elodie"},{"family":"Penfornis","given":"Alfred"},{"family":"Dardari","given":"Dured"}],"issued":{"date-parts":[["2025",7,14]]}}}],"schema":"https://github.com/citation-style-language/schema/raw/master/csl-citation.json"} </w:instrText>
-      </w:r>
-      <w:r>
-        <w:rPr>
-          <w:rFonts w:ascii="Garamond" w:hAnsi="Garamond"/>
-          <w:lang w:val="en-US"/>
-        </w:rPr>
-        <w:fldChar w:fldCharType="separate"/>
-      </w:r>
-      <w:r>
-        <w:rPr>
-          <w:rFonts w:ascii="Garamond" w:hAnsi="Garamond"/>
-          <w:vertAlign w:val="superscript"/>
-          <w:lang w:val="en-GB"/>
-        </w:rPr>
-        <w:t>3,4</w:t>
+        <w:t>2,3</w:t>
       </w:r>
       <w:r>
         <w:rPr>
@@ -1559,7 +1558,7 @@
           <w:rFonts w:ascii="Garamond" w:hAnsi="Garamond"/>
           <w:lang w:val="en-US"/>
         </w:rPr>
-        <w:t xml:space="preserve"> therapeutic footwear and objective adherence monitoring have demonstrated value separately, but are not systematically integrated into Belgian diabetic-foot pathways.</w:t>
+        <w:t xml:space="preserve"> therapeutic footwear and objective adherence monitoring have each demonstrated value,</w:t>
       </w:r>
       <w:r>
         <w:rPr>
@@ -1616,7 +1615,7 @@
           <w:vertAlign w:val="superscript"/>
           <w:lang w:val="en-GB"/>
         </w:rPr>
-        <w:t>5</w:t>
+        <w:t>4,5,6</w:t>
       </w:r>
       <w:r>
         <w:rPr>
@@ -1624,6 +1623,12 @@
           <w:lang w:val="en-US"/>
         </w:rPr>
         <w:fldChar w:fldCharType="end"/>
+      </w:r>
+      <w:r>
+        <w:rPr>
+          <w:rFonts w:ascii="Garamond" w:hAnsi="Garamond"/>
+        </w:rPr>
+        <w:t xml:space="preserve"> but they are not yet systematically combined in Belgian diabetic-foot pathways.</w:t>
       </w:r>
     </w:p>
     <w:p>
@@ -1640,7 +1645,7 @@
           <w:rFonts w:ascii="Garamond" w:hAnsi="Garamond"/>
           <w:lang w:val="en-GB"/>
         </w:rPr>
-        <w:t>Adherence remains a major barrier: objective monitoring shows that patients spend approximately 29% of their steps outside prescribed footwear, while only a minority achieve the ≥80% threshold associated with improved outcomes</w:t>
+        <w:t>Adherence remains a major barrier: objective monitoring shows that patients spend approximately 29% of their steps outside prescribed footwear, and only a minority reach the ≥80% threshold associated with improved outcomes</w:t>
       </w:r>
       <w:r>
         <w:rPr>
@@ -1676,7 +1681,7 @@
           <w:vertAlign w:val="superscript"/>
           <w:lang w:val="en-GB"/>
         </w:rPr>
-        <w:t>6</w:t>
+        <w:t>4,5</w:t>
       </w:r>
       <w:r>
         <w:rPr>
@@ -2292,7 +2297,7 @@
           <w:vertAlign w:val="superscript"/>
           <w:lang w:val="en-GB"/>
         </w:rPr>
-        <w:t>7</w:t>
+        <w:t>7,8</w:t>
       </w:r>
       <w:r>
         <w:rPr>
@@ -2395,7 +2400,7 @@
           <w:vertAlign w:val="superscript"/>
           <w:lang w:val="en-GB"/>
         </w:rPr>
-        <w:t>5,8–10</w:t>
+        <w:t>7,9</w:t>
       </w:r>
       <w:r>
         <w:rPr>
@@ -2462,7 +2467,7 @@
           <w:vertAlign w:val="superscript"/>
           <w:lang w:val="en-GB"/>
         </w:rPr>
-        <w:t>11</w:t>
+        <w:t>10</w:t>
       </w:r>
       <w:r>
         <w:rPr>
@@ -2710,7 +2715,7 @@
           <w:vertAlign w:val="superscript"/>
           <w:lang w:val="en-GB"/>
         </w:rPr>
-        <w:t>6</w:t>
+        <w:t>4</w:t>
       </w:r>
       <w:r>
         <w:rPr>
@@ -3020,7 +3025,7 @@
           <w:vertAlign w:val="superscript"/>
           <w:lang w:val="en-GB"/>
         </w:rPr>
-        <w:t>5</w:t>
+        <w:t>4</w:t>
       </w:r>
       <w:r>
         <w:rPr>
@@ -3070,7 +3075,7 @@
           <w:rFonts w:ascii="Garamond" w:hAnsi="Garamond"/>
           <w:lang w:val="en-GB"/>
         </w:rPr>
-        <w:t>) quantify footwear wearing time and contextualise adherence against daily activity exposure, addressing the limitations of self-reported footwear use</w:t>
+        <w:t>) quantify footwear wearing time and contextualise adherence against daily activity exposure, addressing the limitations of self-reported footwear use; because awareness of being monitored can itself affect wearing behaviour, sensors are worn in both arms</w:t>
       </w:r>
       <w:r>
         <w:rPr>
@@ -3106,7 +3111,7 @@
           <w:vertAlign w:val="superscript"/>
           <w:lang w:val="en-GB"/>
         </w:rPr>
-        <w:t>6,12,13</w:t>
+        <w:t>5,11,12</w:t>
       </w:r>
       <w:r>
         <w:rPr>
@@ -3193,7 +3198,7 @@
           <w:vertAlign w:val="superscript"/>
           <w:lang w:val="en-GB"/>
         </w:rPr>
-        <w:t>9,10,14</w:t>
+        <w:t>9,13</w:t>
       </w:r>
       <w:r>
         <w:rPr>
@@ -3444,7 +3449,7 @@
           <w:vertAlign w:val="superscript"/>
           <w:lang w:val="en-GB"/>
         </w:rPr>
-        <w:t>5,15</w:t>
+        <w:t>4,14</w:t>
       </w:r>
       <w:r>
         <w:rPr>
@@ -3984,7 +3989,7 @@
           <w:vertAlign w:val="superscript"/>
           <w:lang w:val="en-GB"/>
         </w:rPr>
-        <w:t>6,7</w:t>
+        <w:t>4,5,8</w:t>
       </w:r>
       <w:r>
         <w:rPr>
@@ -4048,7 +4053,7 @@
           <w:vertAlign w:val="superscript"/>
           <w:lang w:val="en-GB"/>
         </w:rPr>
-        <w:t>11</w:t>
+        <w:t>10</w:t>
       </w:r>
       <w:r>
         <w:rPr>
@@ -4168,7 +4173,7 @@
           <w:vertAlign w:val="superscript"/>
           <w:lang w:val="en-GB"/>
         </w:rPr>
-        <w:t>5</w:t>
+        <w:t>4</w:t>
       </w:r>
       <w:r>
         <w:rPr>
@@ -4389,7 +4394,7 @@
           <w:vertAlign w:val="superscript"/>
           <w:lang w:val="en-GB"/>
         </w:rPr>
-        <w:t>16,17</w:t>
+        <w:t>15,16</w:t>
       </w:r>
       <w:r>
         <w:rPr>
@@ -4464,7 +4469,7 @@
           <w:vertAlign w:val="superscript"/>
           <w:lang w:val="en-GB"/>
         </w:rPr>
-        <w:t>18</w:t>
+        <w:t>17</w:t>
       </w:r>
       <w:r>
         <w:rPr>
@@ -4589,7 +4594,7 @@
           <w:vertAlign w:val="superscript"/>
           <w:lang w:val="en-GB"/>
         </w:rPr>
-        <w:t>19</w:t>
+        <w:t>18</w:t>
       </w:r>
       <w:r>
         <w:rPr>
@@ -4705,7 +4710,7 @@
           <w:rFonts w:ascii="Garamond" w:hAnsi="Garamond"/>
           <w:lang w:val="en-GB"/>
         </w:rPr>
-        <w:t>Recruitment is feasible: each participating DFC treats at least 52 eligible high-risk patients annually, supporting a recruitment rate of 1–2 participants per centre per month. This is consistent with previous multicentre diabetic-foot trials.</w:t>
+        <w:t>Recruitment is feasible: each participating DFC treats at least 52 eligible high-risk patients annually, supporting a recruitment rate of 1–2 participants per centre per month. This is consistent with recruitment rates reported across randomised trials more broadly.</w:t>
       </w:r>
       <w:r>
         <w:rPr>
@@ -4734,7 +4739,7 @@
           <w:vertAlign w:val="superscript"/>
           <w:lang w:val="en-GB"/>
         </w:rPr>
-        <w:t>20</w:t>
+        <w:t>19</w:t>
       </w:r>
       <w:r>
         <w:rPr>
@@ -4843,7 +4848,7 @@
           <w:vertAlign w:val="superscript"/>
           <w:lang w:val="en-GB"/>
         </w:rPr>
-        <w:t>21</w:t>
+        <w:t>20</w:t>
       </w:r>
       <w:r>
         <w:rPr>
@@ -4924,7 +4929,7 @@
           <w:vertAlign w:val="superscript"/>
           <w:lang w:val="en-GB"/>
         </w:rPr>
-        <w:t>22</w:t>
+        <w:t>21</w:t>
       </w:r>
       <w:r>
         <w:rPr>
@@ -5008,7 +5013,7 @@
           <w:vertAlign w:val="superscript"/>
           <w:lang w:val="en-GB"/>
         </w:rPr>
-        <w:t>23</w:t>
+        <w:t>22</w:t>
       </w:r>
       <w:r>
         <w:rPr>
@@ -5162,7 +5167,7 @@
           <w:lang w:val="en-GB"/>
         </w:rPr>
         <w:tab/>
-        <w:t>Kamogawa M, Kajiwara K, Sakuramoto H, Yamamoto K. Non-pharmacological Interventions for the Prevention and Progression of Diabetic Foot Ulcers in Individuals With Type 2 Diabetes Mellitus: A Scoping Review. Cureus. 2026;18:e100710.</w:t>
+        <w:t>Sciensano. Diabetes. In: For a Healthy Belgium [Internet]. 2025 [cited 2026 Jun 4].</w:t>
       </w:r>
     </w:p>
     <w:p>
@@ -5181,7 +5186,7 @@
           <w:szCs w:val="16"/>
           <w:lang w:val="en-GB"/>
         </w:rPr>
-        <w:t>Sciensano. Diabetes. In: For a Healthy Belgium [Internet]. 2025 [cited 2026 Jun 4].</w:t>
+        <w:t>2.</w:t>
       </w:r>
       <w:r>
         <w:rPr>
@@ -5189,6 +5194,8 @@
           <w:szCs w:val="16"/>
           <w:lang w:val="en-GB"/>
         </w:rPr>
+        <w:tab/>
+        <w:t>Waaijman R, de Haart M, Arts MLJ, Wever D, Verlouw AJWE, Nollet F, et al. Risk Factors for Plantar Foot Ulcer Recurrence in Neuropathic Diabetic Patients. Diabetes Care. 2014;37:1697-705.</w:t>
       </w:r>
     </w:p>
     <w:p>
@@ -5216,7 +5223,7 @@
           <w:lang w:val="en-GB"/>
         </w:rPr>
         <w:tab/>
-        <w:t>Waaijman R, de Haart M, Arts MLJ, Wever D, Verlouw AJWE, Nollet F, et al. Risk Factors for Plantar Foot Ulcer Recurrence in Neuropathic Diabetic Patients. Diabetes Care. 2014;37:1697-705.</w:t>
+        <w:t>Bouly M, Laborne FX, Tourte C, Henry E, Penfornis A, Dardari D. The Post-Healing Follow-Up of Diabetic Foot Ulcers by a Multidisciplinary Team to Reduce Their Recurrence: An Observational Retrospective Study. J Clin Med. 2025;14:4975.</w:t>
       </w:r>
     </w:p>
     <w:p>
@@ -5244,7 +5251,7 @@
           <w:lang w:val="en-GB"/>
         </w:rPr>
         <w:tab/>
-        <w:t>Bouly M, Laborne FX, Tourte C, Henry E, Penfornis A, Dardari D. The Post-Healing Follow-Up of Diabetic Foot Ulcers by a Multidisciplinary Team to Reduce Their Recurrence: An Observational Retrospective Study. J Clin Med. 2025;14:4975.</w:t>
+        <w:t>Bus SA, Waaijman R, Arts M, de Haart M, Busch-Westbroek T, van Baal J, et al. Effect of Custom-Made Footwear on Foot Ulcer Recurrence in Diabetes. Diabetes Care. 2013;36:4109-16.</w:t>
       </w:r>
     </w:p>
     <w:p>
@@ -5263,7 +5270,6 @@
           <w:szCs w:val="16"/>
           <w:lang w:val="en-GB"/>
         </w:rPr>
-        <w:t>5.</w:t>
       </w:r>
       <w:r>
         <w:rPr>
@@ -5271,8 +5277,7 @@
           <w:szCs w:val="16"/>
           <w:lang w:val="en-GB"/>
         </w:rPr>
-        <w:tab/>
-        <w:t xml:space="preserve">Bus SA, Waaijman R, Arts M, de Haart M, Busch-Westbroek T, van Baal J, et al. Effect of Custom-Made Footwear on Foot Ulcer Recurrence in Diabetes. </w:t>
+        <w:t>5.</w:t>
       </w:r>
       <w:r>
         <w:rPr>
@@ -5280,7 +5285,8 @@
           <w:szCs w:val="16"/>
           <w:lang w:val="en-GB"/>
         </w:rPr>
-        <w:t>Diabetes Care. 2013;36:4109-16.</w:t>
+        <w:tab/>
+        <w:t>Waaijman R, Keukenkamp R, de Haart M, Polomski WP, Nollet F, Bus SA. Adherence to Wearing Prescription Custom-Made Footwear in Patients With Diabetes at High Risk for Plantar Foot Ulceration. Diabetes Care. 2013;36:1613-8.</w:t>
       </w:r>
     </w:p>
     <w:p>
@@ -5299,7 +5305,6 @@
           <w:szCs w:val="16"/>
           <w:lang w:val="en-GB"/>
         </w:rPr>
-        <w:t>6.</w:t>
       </w:r>
       <w:r>
         <w:rPr>
@@ -5307,8 +5312,7 @@
           <w:szCs w:val="16"/>
           <w:lang w:val="en-GB"/>
         </w:rPr>
-        <w:tab/>
-        <w:t xml:space="preserve">Waaijman R, Keukenkamp R, de Haart M, Polomski WP, Nollet F, Bus SA. </w:t>
+        <w:t>6.</w:t>
       </w:r>
       <w:r>
         <w:rPr>
@@ -5316,7 +5320,8 @@
           <w:szCs w:val="16"/>
           <w:lang w:val="en-GB"/>
         </w:rPr>
-        <w:t>Adherence to Wearing Prescription Custom-Made Footwear in Patients With Diabetes at High Risk for Plantar Foot Ulceration. Diabetes Care. 2013;36:1613-8.</w:t>
+        <w:tab/>
+        <w:t>Kamogawa M, Kajiwara K, Sakuramoto H, Yamamoto K. Non-pharmacological Interventions for the Prevention and Progression of Diabetic Foot Ulcers in Individuals With Type 2 Diabetes Mellitus: A Scoping Review. Cureus. 2026;18:e100710.</w:t>
       </w:r>
     </w:p>
     <w:p>
@@ -5344,7 +5349,7 @@
           <w:lang w:val="en-GB"/>
         </w:rPr>
         <w:tab/>
-        <w:t>Exterkate SH, Jongebloed‐Westra M, ten Klooster PM, Koffijberg H, Bode C, van Gemert-Pijnen JEWC, et al. Objectively assessed long‐term wearing patterns and predictors of wearing orthopaedic footwear in people with diabetes at moderate‐to‐high risk of foot ulceration: a 12 months observational study. J Foot Ankle Res. 2023;16:60.</w:t>
+        <w:t>Goodall RJ, Ellauzi J, Tan MKH, Onida S, Davies AH, Shalhoub J. A Systematic Review of the Impact of Foot Care Education on Self Efficacy and Self Care in Patients With Diabetes. Eur J Vasc Endovasc Surg. 2020;60:282-92.</w:t>
       </w:r>
     </w:p>
     <w:p>
@@ -5372,7 +5377,7 @@
           <w:lang w:val="en-GB"/>
         </w:rPr>
         <w:tab/>
-        <w:t>Goodall RJ, Ellauzi J, Tan MKH, Onida S, Davies AH, Shalhoub J. A Systematic Review of the Impact of Foot Care Education on Self Efficacy and Self Care in Patients With Diabetes. Eur J Vasc Endovasc Surg. 2020;60:282-92.</w:t>
+        <w:t>Exterkate SH, Jongebloed‐Westra M, ten Klooster PM, Koffijberg H, Bode C, van Gemert-Pijnen JEWC, et al. Objectively assessed long‐term wearing patterns and predictors of wearing orthopaedic footwear in people with diabetes at moderate‐to‐high risk of foot ulceration: a 12 months observational study. J Foot Ankle Res. 2023;16:60.</w:t>
       </w:r>
     </w:p>
     <w:p>
@@ -5428,7 +5433,7 @@
           <w:lang w:val="en-GB"/>
         </w:rPr>
         <w:tab/>
-        <w:t>Michie S, Richardson M, Johnston M, Abraham C, Francis J, Hardeman W, et al. The Behavior Change Technique Taxonomy (v1) of 93 Hierarchically Clustered Techniques: Building an International Consensus for the Reporting of Behavior Change Interventions. Ann Behav Med. 2013;46:81-95.</w:t>
+        <w:t>van Netten JJ, Vossen LE, Driebergen FM, Wolthuis D, Merkx MJM, Bus SA. Short-Term Efficacy of a Multi-Modal Intervention Program to Improve Custom-Made Footwear Use in People at High Risk of Diabetes-Related Foot Ulceration. J Clin Med. 2025;14:3635.</w:t>
       </w:r>
     </w:p>
     <w:p>
@@ -5456,7 +5461,7 @@
           <w:lang w:val="en-GB"/>
         </w:rPr>
         <w:tab/>
-        <w:t>van Netten JJ, Vossen LE, Driebergen FM, Wolthuis D, Merkx MJM, Bus SA. Short-Term Efficacy of a Multi-Modal Intervention Program to Improve Custom-Made Footwear Use in People at High Risk of Diabetes-Related Foot Ulceration. J Clin Med. 2025;14:3635.</w:t>
+        <w:t>López-Moral M, Molines-Barroso RJ, Herrera-Casamayor M, García-Madrid M, García-Morales E, Lázaro-Martínez JL. Usability of Different Methods to Assess and Improve Adherence to Therapeutic Footwear in Persons with the Diabetic Foot in Remission. A Systematic Review. Int J Low Extrem Wounds. 2026;25:55-64.</w:t>
       </w:r>
     </w:p>
     <w:p>
@@ -5475,7 +5480,6 @@
           <w:szCs w:val="16"/>
           <w:lang w:val="en-GB"/>
         </w:rPr>
-        <w:t>12.</w:t>
       </w:r>
       <w:r>
         <w:rPr>
@@ -5483,8 +5487,7 @@
           <w:szCs w:val="16"/>
           <w:lang w:val="en-GB"/>
         </w:rPr>
-        <w:tab/>
-        <w:t xml:space="preserve">López-Moral M, Molines-Barroso RJ, Herrera-Casamayor M, García-Madrid M, García-Morales E, Lázaro-Martínez JL. Usability of Different Methods to Assess and Improve Adherence to Therapeutic Footwear in Persons with the Diabetic Foot in </w:t>
+        <w:t>12.</w:t>
       </w:r>
       <w:r>
         <w:rPr>
@@ -5492,7 +5495,8 @@
           <w:szCs w:val="16"/>
           <w:lang w:val="en-GB"/>
         </w:rPr>
-        <w:t>Remission. A Systematic Review. Int J Low Extrem Wounds. 2026;25:55-64.</w:t>
+        <w:tab/>
+        <w:t>Lutjeboer T, van Netten JJ, Postema K, Hijmans J. Effect of awareness of being monitored on wearing of orthopaedic footwear. J Rehabil Med. 2020;52:jrm00127.</w:t>
       </w:r>
     </w:p>
     <w:p>
@@ -5520,7 +5524,7 @@
           <w:lang w:val="en-GB"/>
         </w:rPr>
         <w:tab/>
-        <w:t>Lutjeboer T, van Netten JJ, Postema K, Hijmans J. Effect of awareness of being monitored on wearing of orthopaedic footwear. J Rehabil Med. 2020;52:jrm00127.</w:t>
+        <w:t>Jongebloed-Westra M, Bode C, van Netten JJ, ten Klooster PM, Exterkate SH, Koffijberg H, et al. Using motivational interviewing combined with digital shoe-fitting to improve adherence to wearing orthopedic shoes in people with diabetes at risk of foot ulceration: study protocol for a cluster-randomized controlled trial. Trials. 2021;22:750.</w:t>
       </w:r>
     </w:p>
     <w:p>
@@ -5548,7 +5552,7 @@
           <w:lang w:val="en-GB"/>
         </w:rPr>
         <w:tab/>
-        <w:t>Jongebloed-Westra M, Bode C, van Netten JJ, ten Klooster PM, Exterkate SH, Koffijberg H, et al. Using motivational interviewing combined with digital shoe-fitting to improve adherence to wearing orthopedic shoes in people with diabetes at risk of foot ulceration: study protocol for a cluster-randomized controlled trial. Trials. 2021;22:750.</w:t>
+        <w:t>Vossen LE, van Netten JJ, Bakker CD, Berendsen HA, Busch-Westbroek TE, Peters EJG, et al. An integrated personalized assistive devices approach to reduce the risk of foot ulcer recurrence in diabetes (DIASSIST): study protocol for a multicenter randomized controlled trial. Trials. 2023;24:663.</w:t>
       </w:r>
     </w:p>
     <w:p>
@@ -5576,7 +5580,7 @@
           <w:lang w:val="en-GB"/>
         </w:rPr>
         <w:tab/>
-        <w:t>Vossen LE, van Netten JJ, Bakker CD, Berendsen HA, Busch-Westbroek TE, Peters EJG, et al. An integrated personalized assistive devices approach to reduce the risk of foot ulcer recurrence in diabetes (DIASSIST): study protocol for a multicenter randomized controlled trial. Trials. 2023;24:663.</w:t>
+        <w:t>White IR, Royston P, Wood AM. Multiple imputation using chained equations: Issues and guidance for practice. Stat Med. 2011;30:377-99.</w:t>
       </w:r>
     </w:p>
     <w:p>
@@ -5604,7 +5608,7 @@
           <w:lang w:val="en-GB"/>
         </w:rPr>
         <w:tab/>
-        <w:t>White IR, Royston P, Wood AM. Multiple imputation using chained equations: Issues and guidance for practice. Stat Med. 2011;30:377-99.</w:t>
+        <w:t>Mallinckrodt C, Lipkovich I, Dickson S, Hendrix S, Molenberghs G. Handling Missing Data in Participants with Baseline but No Post‐Baseline Data. Pharm Stat. 2026;25:e70076.</w:t>
       </w:r>
     </w:p>
     <w:p>
@@ -5632,7 +5636,7 @@
           <w:lang w:val="en-GB"/>
         </w:rPr>
         <w:tab/>
-        <w:t>Mallinckrodt C, Lipkovich I, Dickson S, Hendrix S, Molenberghs G. Handling Missing Data in Participants with Baseline but No Post‐Baseline Data. Pharm Stat. 2026;25:e70076.</w:t>
+        <w:t>Herdman M, Gudex C, Lloyd A, Janssen MF, Kind P, Parkin D, et al. Development and preliminary testing of the new five-level version of EQ-5D (EQ-5D-5L). Qual Life Res. 2011;20:1727-36.</w:t>
       </w:r>
     </w:p>
     <w:p>
@@ -5660,7 +5664,7 @@
           <w:lang w:val="en-GB"/>
         </w:rPr>
         <w:tab/>
-        <w:t>Herdman M, Gudex C, Lloyd A, Janssen MF, Kind P, Parkin D, et al. Development and preliminary testing of the new five-level version of EQ-5D (EQ-5D-5L). Qual Life Res. 2011;20:1727-36.</w:t>
+        <w:t>Chan AW, Boutron I, Hopewell S, Moher D, Schulz KF, Collins GS, et al. SPIRIT 2025 statement: updated guideline for protocols of randomised trials. BMJ. 2025;389:e081477.</w:t>
       </w:r>
     </w:p>
     <w:p>
@@ -5688,7 +5692,7 @@
           <w:lang w:val="en-GB"/>
         </w:rPr>
         <w:tab/>
-        <w:t>Chan AW, Boutron I, Hopewell S, Moher D, Schulz KF, Collins GS, et al. SPIRIT 2025 statement: updated guideline for protocols of randomised trials. BMJ. 2025;389:e081477.</w:t>
+        <w:t>Jacques RM, Ahmed R, Harper J, Ranjan A, Saeed I, Simpson RM, et al. Recruitment, consent and retention of participants in randomised controlled trials: a review of trials published in the National Institute for Health Research (NIHR) Journals Library (1997–2020). BMJ Open. 2022;12:e059230.</w:t>
       </w:r>
     </w:p>
     <w:p>
@@ -5716,7 +5720,7 @@
           <w:lang w:val="en-GB"/>
         </w:rPr>
         <w:tab/>
-        <w:t>Jacques RM, Ahmed R, Harper J, Ranjan A, Saeed I, Simpson RM, et al. Recruitment, consent and retention of participants in randomised controlled trials: a review of trials published in the National Institute for Health Research (NIHR) Journals Library (1997–2020). BMJ Open. 2022;12:e059230.</w:t>
+        <w:t>Donovan JL, Rooshenas L, Jepson M, Elliott D, Wade J, Avery K, et al. Optimising recruitment and informed consent in randomised controlled trials: the development and implementation of the Quintet Recruitment Intervention (QRI). Trials. 2016;17:283.</w:t>
       </w:r>
     </w:p>
     <w:p>
@@ -5744,7 +5748,7 @@
           <w:lang w:val="en-GB"/>
         </w:rPr>
         <w:tab/>
-        <w:t>Donovan JL, Rooshenas L, Jepson M, Elliott D, Wade J, Avery K, et al. Optimising recruitment and informed consent in randomised controlled trials: the development and implementation of the Quintet Recruitment Intervention (QRI). Trials. 2016;17:283.</w:t>
+        <w:t>Bellg AJ, Borrelli B, Resnick B, Hecht J, Minicucci DS, Ory M, et al. Enhancing Treatment Fidelity in Health Behavior Change Studies: Best Practices and Recommendations From the NIH Behavior Change Consortium. Health Psychol. 2004;23:443-51.</w:t>
       </w:r>
     </w:p>
     <w:p>
@@ -5772,41 +5776,7 @@
           <w:lang w:val="en-GB"/>
         </w:rPr>
         <w:tab/>
-        <w:t>Bellg AJ, Borrelli B, Resnick B, Hecht J, Minicucci DS, Ory M, et al. Enhancing Treatment Fidelity in Health Behavior Change Studies: Best Practices and Recommendations From the NIH Behavior Change Consortium. Health Psychol. 2004;23:443-51.</w:t>
-      </w:r>
-    </w:p>
-    <w:p>
-      <w:pPr>
-        <w:pStyle w:val="Bibliografie"/>
-        <w:spacing w:after="0"/>
-        <w:rPr>
-          <w:sz w:val="16"/>
-          <w:szCs w:val="16"/>
-        </w:rPr>
-      </w:pPr>
-      <w:r>
-        <w:rPr>
-          <w:sz w:val="16"/>
-          <w:szCs w:val="16"/>
-          <w:lang w:val="en-GB"/>
-        </w:rPr>
-        <w:t>23.</w:t>
-      </w:r>
-      <w:r>
-        <w:rPr>
-          <w:sz w:val="16"/>
-          <w:szCs w:val="16"/>
-          <w:lang w:val="en-GB"/>
-        </w:rPr>
-        <w:tab/>
-        <w:t xml:space="preserve">Hopewell S, Chan AW, Collins GS, Hróbjartsson A, Moher D, Schulz KF, et al. CONSORT 2025 statement: updated guideline for reporting randomised trials. </w:t>
-      </w:r>
-      <w:r>
-        <w:rPr>
-          <w:sz w:val="16"/>
-          <w:szCs w:val="16"/>
-        </w:rPr>
-        <w:t>BMJ. 2025;389:e081123.</w:t>
+        <w:t>Hopewell S, Chan AW, Collins GS, Hróbjartsson A, Moher D, Schulz KF, et al. CONSORT 2025 statement: updated guideline for reporting randomised trials. BMJ. 2025;389:e081123.</w:t>
       </w:r>
     </w:p>
     <w:p>

</xml_diff>

<commit_message>
Doctoraatsplan: drie ontbrekende bronnen opgezocht en toegevoegd
Armstrong, Boulton en Bus 2017 in NEJM voor het recidiefrisico, Gingerich en
Peterson 2013 voor solution-focused brief therapy, en Lincoln 2007 voor de NAFF.
Alle drie geverifieerd via Crossref. Van 22 naar 25 referenties, opnieuw
hernummerd, eerste vermelding strikt oplopend. Ruimte gevonden door dubbele
zinnen te schrappen en beide figuren een halve centimeter te verkleinen, zodat
het op vijf paginas blijft.
</commit_message>
<xml_diff>
--- a/PARADISE_provisional_doctoral_plan.docx
+++ b/PARADISE_provisional_doctoral_plan.docx
@@ -1486,7 +1486,7 @@
           <w:vertAlign w:val="superscript"/>
           <w:lang w:val="en-GB"/>
         </w:rPr>
-        <w:t>2,3</w:t>
+        <w:t>2,3,4</w:t>
       </w:r>
       <w:r>
         <w:rPr>
@@ -1542,7 +1542,7 @@
           <w:rFonts w:ascii="Garamond" w:hAnsi="Garamond"/>
           <w:lang w:val="en-US"/>
         </w:rPr>
-        <w:t xml:space="preserve"> care, a persistent gap remains between evidence-based prevention and routine practice: pressure-</w:t>
+        <w:t xml:space="preserve"> care, yet a gap remains between evidence-based prevention and routine practice: pressure-</w:t>
       </w:r>
       <w:proofErr w:type="spellStart"/>
       <w:r>
@@ -1615,7 +1615,7 @@
           <w:vertAlign w:val="superscript"/>
           <w:lang w:val="en-GB"/>
         </w:rPr>
-        <w:t>4,5,6</w:t>
+        <w:t>5,6,7</w:t>
       </w:r>
       <w:r>
         <w:rPr>
@@ -1681,7 +1681,7 @@
           <w:vertAlign w:val="superscript"/>
           <w:lang w:val="en-GB"/>
         </w:rPr>
-        <w:t>4,5</w:t>
+        <w:t>5,6</w:t>
       </w:r>
       <w:r>
         <w:rPr>
@@ -2297,7 +2297,7 @@
           <w:vertAlign w:val="superscript"/>
           <w:lang w:val="en-GB"/>
         </w:rPr>
-        <w:t>7,8</w:t>
+        <w:t>8,9</w:t>
       </w:r>
       <w:r>
         <w:rPr>
@@ -2400,7 +2400,7 @@
           <w:vertAlign w:val="superscript"/>
           <w:lang w:val="en-GB"/>
         </w:rPr>
-        <w:t>7,9</w:t>
+        <w:t>8,10,11</w:t>
       </w:r>
       <w:r>
         <w:rPr>
@@ -2467,7 +2467,7 @@
           <w:vertAlign w:val="superscript"/>
           <w:lang w:val="en-GB"/>
         </w:rPr>
-        <w:t>10</w:t>
+        <w:t>12</w:t>
       </w:r>
       <w:r>
         <w:rPr>
@@ -2488,7 +2488,7 @@
           <w:rFonts w:ascii="Garamond" w:hAnsi="Garamond"/>
           <w:lang w:val="en-GB"/>
         </w:rPr>
-        <w:t>PARADISE extends this approach through personalised behavioural feedback, prolonged follow-up, and integration into routine Belgian multidisciplinary care. This doctoral project will evaluate the clinical effectiveness of PARADISE within Belgian DFCs.</w:t>
+        <w:t>PARADISE extends this approach through personalised behavioural feedback, prolonged follow-up, and integration into routine Belgian multidisciplinary care.</w:t>
       </w:r>
     </w:p>
     <w:p>
@@ -2715,7 +2715,7 @@
           <w:vertAlign w:val="superscript"/>
           <w:lang w:val="en-GB"/>
         </w:rPr>
-        <w:t>4</w:t>
+        <w:t>5</w:t>
       </w:r>
       <w:r>
         <w:rPr>
@@ -2751,7 +2751,7 @@
           <w:rFonts w:ascii="Garamond" w:hAnsi="Garamond"/>
           <w:lang w:val="en-GB"/>
         </w:rPr>
-        <w:t>Evaluate the broader clinical and patient-centred impact of PARADISE by assessing recurrence characteristics, ulcer-free survival, foot-care behaviour (Nottingham Assessment of Functional Footcare, NAFF), health-related quality of life (EQ-5D-5L), and, jointly with the parallel doctorate, health-economic outcomes</w:t>
+        <w:t>Evaluate recurrence characteristics, ulcer-free survival, foot-care behaviour (Nottingham Assessment of Functional Footcare, NAFF), health-related quality of life (EQ-5D-5L), and, jointly with the parallel doctorate, health-economic outcomes</w:t>
       </w:r>
       <w:r>
         <w:rPr>
@@ -2779,7 +2779,7 @@
         <w:rPr>
           <w:lang w:val="en-GB"/>
         </w:rPr>
-        <w:t xml:space="preserve">This is a joint KU Leuven–VUB doctorate in which two complementary doctoral projects run on the same trial. The present candidate leads the clinical trial: protocol development, ethics and regulatory submission, multicentre coordination, investigator training and site readiness, recruitment oversight, quality and fidelity monitoring, data management, and the analyses of ulcer recurrence, plantar pressure and footwear adherence. The parallel doctorate leads the process evaluation and the health-economic evaluation. Both researchers contribute to study conduct and outputs, with authorship aligned to responsibilities. Alongside the trial, </w:t>
+        <w:t xml:space="preserve">This is a joint KU Leuven–VUB doctorate in which two complementary doctoral projects run on the same trial. The present candidate leads the clinical trial: protocol development, ethics and regulatory submission, multicentre coordination, recruitment oversight, quality and fidelity monitoring, data management, and the analyses of ulcer recurrence, plantar pressure and footwear adherence. The parallel doctorate leads the process evaluation and the health-economic evaluation. Both researchers contribute to study conduct and outputs, with authorship aligned to responsibilities. Alongside the trial, </w:t>
       </w:r>
       <w:r>
         <w:rPr>
@@ -2809,7 +2809,7 @@
         <w:rPr>
           <w:lang w:val="en-GB"/>
         </w:rPr>
-        <w:t xml:space="preserve"> carried out independently of the trial. Local clinical teams deliver patient care and site-level assessments.</w:t>
+        <w:t xml:space="preserve"> carried out independently of the trial.</w:t>
       </w:r>
     </w:p>
     <w:p>
@@ -2860,7 +2860,7 @@
           <w:rFonts w:ascii="Garamond" w:hAnsi="Garamond"/>
           <w:lang w:val="en-GB"/>
         </w:rPr>
-        <w:t xml:space="preserve">A prospective, multicentre, parallel-group randomised controlled trial (RCT) will randomise 144 adults with diabetes and an IWGDF category 3 high-risk foot in a 1:1 ratio, stratified by centre, across six Belgian RIZIV–INAMI-recognised DFCs in academic and non-academic settings. Participants will be followed for 18 months. Eligible participants have type 1 or type 2 diabetes with a </w:t>
+        <w:t xml:space="preserve">A prospective, multicentre, parallel-group randomised controlled trial (RCT) will randomise 144 adults with diabetes and an IWGDF category 3 high-risk foot in a 1:1 ratio, stratified by centre, across six Belgian RIZIV–INAMI-recognised DFCs. Participants will be followed for 18 months. Eligible participants have type 1 or type 2 diabetes with a </w:t>
       </w:r>
       <w:r>
         <w:rPr>
@@ -3025,7 +3025,7 @@
           <w:vertAlign w:val="superscript"/>
           <w:lang w:val="en-GB"/>
         </w:rPr>
-        <w:t>4</w:t>
+        <w:t>5</w:t>
       </w:r>
       <w:r>
         <w:rPr>
@@ -3111,7 +3111,7 @@
           <w:vertAlign w:val="superscript"/>
           <w:lang w:val="en-GB"/>
         </w:rPr>
-        <w:t>5,11,12</w:t>
+        <w:t>6,13,14</w:t>
       </w:r>
       <w:r>
         <w:rPr>
@@ -3198,7 +3198,7 @@
           <w:vertAlign w:val="superscript"/>
           <w:lang w:val="en-GB"/>
         </w:rPr>
-        <w:t>9,13</w:t>
+        <w:t>10,15</w:t>
       </w:r>
       <w:r>
         <w:rPr>
@@ -3273,7 +3273,7 @@
         </w:rPr>
         <w:drawing>
           <wp:inline distT="0" distB="0" distL="0" distR="0" wp14:anchorId="2CC07533" wp14:editId="433D8AB4">
-            <wp:extent cx="5323795" cy="2981325"/>
+            <wp:extent cx="4680000" cy="2620799"/>
             <wp:effectExtent l="0" t="0" r="0" b="0"/>
             <wp:docPr id="1709217646" name="Picture 1709217646"/>
             <wp:cNvGraphicFramePr>
@@ -3295,7 +3295,7 @@
                   <pic:spPr>
                     <a:xfrm>
                       <a:off x="0" y="0"/>
-                      <a:ext cx="5339885" cy="2990335"/>
+                      <a:ext cx="4680000" cy="2620799"/>
                     </a:xfrm>
                     <a:prstGeom prst="rect">
                       <a:avLst/>
@@ -3449,7 +3449,7 @@
           <w:vertAlign w:val="superscript"/>
           <w:lang w:val="en-GB"/>
         </w:rPr>
-        <w:t>4,14</w:t>
+        <w:t>5,16</w:t>
       </w:r>
       <w:r>
         <w:rPr>
@@ -3989,7 +3989,7 @@
           <w:vertAlign w:val="superscript"/>
           <w:lang w:val="en-GB"/>
         </w:rPr>
-        <w:t>4,5,8</w:t>
+        <w:t>5,6,9</w:t>
       </w:r>
       <w:r>
         <w:rPr>
@@ -4053,7 +4053,7 @@
           <w:vertAlign w:val="superscript"/>
           <w:lang w:val="en-GB"/>
         </w:rPr>
-        <w:t>10</w:t>
+        <w:t>12</w:t>
       </w:r>
       <w:r>
         <w:rPr>
@@ -4173,7 +4173,7 @@
           <w:vertAlign w:val="superscript"/>
           <w:lang w:val="en-GB"/>
         </w:rPr>
-        <w:t>4</w:t>
+        <w:t>5</w:t>
       </w:r>
       <w:r>
         <w:rPr>
@@ -4394,7 +4394,7 @@
           <w:vertAlign w:val="superscript"/>
           <w:lang w:val="en-GB"/>
         </w:rPr>
-        <w:t>15,16</w:t>
+        <w:t>17,18</w:t>
       </w:r>
       <w:r>
         <w:rPr>
@@ -4469,7 +4469,7 @@
           <w:vertAlign w:val="superscript"/>
           <w:lang w:val="en-GB"/>
         </w:rPr>
-        <w:t>17</w:t>
+        <w:t>19,20</w:t>
       </w:r>
       <w:r>
         <w:rPr>
@@ -4490,7 +4490,7 @@
           <w:rFonts w:ascii="Garamond" w:hAnsi="Garamond"/>
           <w:lang w:val="en-US"/>
         </w:rPr>
-        <w:t xml:space="preserve"> alongside device-derived measures of plantar pressure, footwear wearing time and daily activity. The trial is conducted with the six participating DFCs, with the VUB partners responsible for the process and health-economic evaluation, and with the technical partners supporting the pressure-measurement systems.</w:t>
+        <w:t xml:space="preserve"> alongside device-derived measures of plantar pressure, footwear wearing time and daily activity. The trial is conducted with the six participating DFCs and with the technical partners supporting the pressure-measurement systems.</w:t>
       </w:r>
     </w:p>
     <w:p>
@@ -4594,7 +4594,7 @@
           <w:vertAlign w:val="superscript"/>
           <w:lang w:val="en-GB"/>
         </w:rPr>
-        <w:t>18</w:t>
+        <w:t>21</w:t>
       </w:r>
       <w:r>
         <w:rPr>
@@ -4626,7 +4626,7 @@
         </w:rPr>
         <w:drawing>
           <wp:inline distT="0" distB="0" distL="0" distR="0" wp14:anchorId="6E5CFF10" wp14:editId="4C737931">
-            <wp:extent cx="6104285" cy="2552700"/>
+            <wp:extent cx="5184000" cy="2167853"/>
             <wp:effectExtent l="0" t="0" r="0" b="0"/>
             <wp:docPr id="1709217647" name="Picture 1709217647"/>
             <wp:cNvGraphicFramePr>
@@ -4648,7 +4648,7 @@
                   <pic:spPr>
                     <a:xfrm>
                       <a:off x="0" y="0"/>
-                      <a:ext cx="6115368" cy="2557335"/>
+                      <a:ext cx="5184000" cy="2167853"/>
                     </a:xfrm>
                     <a:prstGeom prst="rect">
                       <a:avLst/>
@@ -4739,7 +4739,7 @@
           <w:vertAlign w:val="superscript"/>
           <w:lang w:val="en-GB"/>
         </w:rPr>
-        <w:t>19</w:t>
+        <w:t>22</w:t>
       </w:r>
       <w:r>
         <w:rPr>
@@ -4848,7 +4848,7 @@
           <w:vertAlign w:val="superscript"/>
           <w:lang w:val="en-GB"/>
         </w:rPr>
-        <w:t>20</w:t>
+        <w:t>23</w:t>
       </w:r>
       <w:r>
         <w:rPr>
@@ -4929,7 +4929,7 @@
           <w:vertAlign w:val="superscript"/>
           <w:lang w:val="en-GB"/>
         </w:rPr>
-        <w:t>21</w:t>
+        <w:t>24</w:t>
       </w:r>
       <w:r>
         <w:rPr>
@@ -4984,7 +4984,7 @@
           <w:rFonts w:ascii="Garamond" w:hAnsi="Garamond"/>
           <w:lang w:val="en-GB"/>
         </w:rPr>
-        <w:t>The project delivers the first multicentre RCT of PARADISE within Belgian multidisciplinary DFCs. Six manuscripts are planned: (1) the scoping review “Patient-specific offloading insole design in diabetic foot disease”; (2) the trial protocol paper, following SPIRIT 2025 and TIDieR; (3) regional peak plantar-pressure reference values in people with diabetes, from low- and high-resolution in-shoe measurements; (4) a comparison of plantar-pressure redistribution with 3D-printed custom-made foot orthoses, conducted outside the trial; (5) the primary effectiveness analysis of ulcer recurrence at 18 months; and (6) the pre-specified mediation analysis of footwear adherence. Timing is shown in Figure 2, and trial publications follow CONSORT.</w:t>
+        <w:t>The project delivers the first multicentre RCT of PARADISE within Belgian multidisciplinary DFCs. Six manuscripts are planned: (1) the scoping review on patient-specific offloading insole design; (2) the trial protocol paper, following SPIRIT 2025 and TIDieR; (3) regional peak plantar-pressure reference values in people with diabetes, from low- and high-resolution in-shoe measurements; (4) a comparison of plantar-pressure redistribution with 3D-printed custom-made foot orthoses, conducted outside the trial; (5) the primary effectiveness analysis of ulcer recurrence at 18 months; and (6) the pre-specified mediation analysis of footwear adherence. Timing is shown in Figure 2, and trial publications follow CONSORT.</w:t>
       </w:r>
       <w:r>
         <w:rPr>
@@ -5013,7 +5013,7 @@
           <w:vertAlign w:val="superscript"/>
           <w:lang w:val="en-GB"/>
         </w:rPr>
-        <w:t>22</w:t>
+        <w:t>25</w:t>
       </w:r>
       <w:r>
         <w:rPr>
@@ -5132,7 +5132,6 @@
           <w:szCs w:val="16"/>
           <w:lang w:val="en-US"/>
         </w:rPr>
-        <w:fldChar w:fldCharType="begin"/>
       </w:r>
       <w:r>
         <w:rPr>
@@ -5141,7 +5140,6 @@
           <w:szCs w:val="16"/>
           <w:lang w:val="en-US"/>
         </w:rPr>
-        <w:instrText xml:space="preserve"> ADDIN ZOTERO_BIBL {"uncited":[],"omitted":[],"custom":[]} CSL_BIBLIOGRAPHY </w:instrText>
       </w:r>
       <w:r>
         <w:rPr>
@@ -5150,7 +5148,6 @@
           <w:szCs w:val="16"/>
           <w:lang w:val="en-US"/>
         </w:rPr>
-        <w:fldChar w:fldCharType="separate"/>
       </w:r>
       <w:r>
         <w:rPr>
@@ -5195,7 +5192,7 @@
           <w:lang w:val="en-GB"/>
         </w:rPr>
         <w:tab/>
-        <w:t>Waaijman R, de Haart M, Arts MLJ, Wever D, Verlouw AJWE, Nollet F, et al. Risk Factors for Plantar Foot Ulcer Recurrence in Neuropathic Diabetic Patients. Diabetes Care. 2014;37:1697-705.</w:t>
+        <w:t>Armstrong DG, Boulton AJM, Bus SA. Diabetic Foot Ulcers and Their Recurrence. N Engl J Med. 2017;376:2367-75.</w:t>
       </w:r>
     </w:p>
     <w:p>
@@ -5223,7 +5220,7 @@
           <w:lang w:val="en-GB"/>
         </w:rPr>
         <w:tab/>
-        <w:t>Bouly M, Laborne FX, Tourte C, Henry E, Penfornis A, Dardari D. The Post-Healing Follow-Up of Diabetic Foot Ulcers by a Multidisciplinary Team to Reduce Their Recurrence: An Observational Retrospective Study. J Clin Med. 2025;14:4975.</w:t>
+        <w:t>Waaijman R, de Haart M, Arts MLJ, Wever D, Verlouw AJWE, Nollet F, et al. Risk Factors for Plantar Foot Ulcer Recurrence in Neuropathic Diabetic Patients. Diabetes Care. 2014;37:1697-705.</w:t>
       </w:r>
     </w:p>
     <w:p>
@@ -5251,7 +5248,7 @@
           <w:lang w:val="en-GB"/>
         </w:rPr>
         <w:tab/>
-        <w:t>Bus SA, Waaijman R, Arts M, de Haart M, Busch-Westbroek T, van Baal J, et al. Effect of Custom-Made Footwear on Foot Ulcer Recurrence in Diabetes. Diabetes Care. 2013;36:4109-16.</w:t>
+        <w:t>Bouly M, Laborne FX, Tourte C, Henry E, Penfornis A, Dardari D. The Post-Healing Follow-Up of Diabetic Foot Ulcers by a Multidisciplinary Team to Reduce Their Recurrence: An Observational Retrospective Study. J Clin Med. 2025;14:4975.</w:t>
       </w:r>
     </w:p>
     <w:p>
@@ -5286,7 +5283,7 @@
           <w:lang w:val="en-GB"/>
         </w:rPr>
         <w:tab/>
-        <w:t>Waaijman R, Keukenkamp R, de Haart M, Polomski WP, Nollet F, Bus SA. Adherence to Wearing Prescription Custom-Made Footwear in Patients With Diabetes at High Risk for Plantar Foot Ulceration. Diabetes Care. 2013;36:1613-8.</w:t>
+        <w:t>Bus SA, Waaijman R, Arts M, de Haart M, Busch-Westbroek T, van Baal J, et al. Effect of Custom-Made Footwear on Foot Ulcer Recurrence in Diabetes. Diabetes Care. 2013;36:4109-16.</w:t>
       </w:r>
     </w:p>
     <w:p>
@@ -5321,7 +5318,7 @@
           <w:lang w:val="en-GB"/>
         </w:rPr>
         <w:tab/>
-        <w:t>Kamogawa M, Kajiwara K, Sakuramoto H, Yamamoto K. Non-pharmacological Interventions for the Prevention and Progression of Diabetic Foot Ulcers in Individuals With Type 2 Diabetes Mellitus: A Scoping Review. Cureus. 2026;18:e100710.</w:t>
+        <w:t>Waaijman R, Keukenkamp R, de Haart M, Polomski WP, Nollet F, Bus SA. Adherence to Wearing Prescription Custom-Made Footwear in Patients With Diabetes at High Risk for Plantar Foot Ulceration. Diabetes Care. 2013;36:1613-8.</w:t>
       </w:r>
     </w:p>
     <w:p>
@@ -5349,7 +5346,7 @@
           <w:lang w:val="en-GB"/>
         </w:rPr>
         <w:tab/>
-        <w:t>Goodall RJ, Ellauzi J, Tan MKH, Onida S, Davies AH, Shalhoub J. A Systematic Review of the Impact of Foot Care Education on Self Efficacy and Self Care in Patients With Diabetes. Eur J Vasc Endovasc Surg. 2020;60:282-92.</w:t>
+        <w:t>Kamogawa M, Kajiwara K, Sakuramoto H, Yamamoto K. Non-pharmacological Interventions for the Prevention and Progression of Diabetic Foot Ulcers in Individuals With Type 2 Diabetes Mellitus: A Scoping Review. Cureus. 2026;18:e100710.</w:t>
       </w:r>
     </w:p>
     <w:p>
@@ -5377,7 +5374,7 @@
           <w:lang w:val="en-GB"/>
         </w:rPr>
         <w:tab/>
-        <w:t>Exterkate SH, Jongebloed‐Westra M, ten Klooster PM, Koffijberg H, Bode C, van Gemert-Pijnen JEWC, et al. Objectively assessed long‐term wearing patterns and predictors of wearing orthopaedic footwear in people with diabetes at moderate‐to‐high risk of foot ulceration: a 12 months observational study. J Foot Ankle Res. 2023;16:60.</w:t>
+        <w:t>Goodall RJ, Ellauzi J, Tan MKH, Onida S, Davies AH, Shalhoub J. A Systematic Review of the Impact of Foot Care Education on Self Efficacy and Self Care in Patients With Diabetes. Eur J Vasc Endovasc Surg. 2020;60:282-92.</w:t>
       </w:r>
     </w:p>
     <w:p>
@@ -5405,7 +5402,7 @@
           <w:lang w:val="en-GB"/>
         </w:rPr>
         <w:tab/>
-        <w:t>Michie S, van Stralen MM, West R. The behaviour change wheel: A new method for characterising and designing behaviour change interventions. Implement Sci. 2011;6:42.</w:t>
+        <w:t>Exterkate SH, Jongebloed‐Westra M, ten Klooster PM, Koffijberg H, Bode C, van Gemert-Pijnen JEWC, et al. Objectively assessed long‐term wearing patterns and predictors of wearing orthopaedic footwear in people with diabetes at moderate‐to‐high risk of foot ulceration: a 12 months observational study. J Foot Ankle Res. 2023;16:60.</w:t>
       </w:r>
     </w:p>
     <w:p>
@@ -5433,7 +5430,7 @@
           <w:lang w:val="en-GB"/>
         </w:rPr>
         <w:tab/>
-        <w:t>van Netten JJ, Vossen LE, Driebergen FM, Wolthuis D, Merkx MJM, Bus SA. Short-Term Efficacy of a Multi-Modal Intervention Program to Improve Custom-Made Footwear Use in People at High Risk of Diabetes-Related Foot Ulceration. J Clin Med. 2025;14:3635.</w:t>
+        <w:t>Michie S, van Stralen MM, West R. The behaviour change wheel: A new method for characterising and designing behaviour change interventions. Implement Sci. 2011;6:42.</w:t>
       </w:r>
     </w:p>
     <w:p>
@@ -5461,7 +5458,7 @@
           <w:lang w:val="en-GB"/>
         </w:rPr>
         <w:tab/>
-        <w:t>López-Moral M, Molines-Barroso RJ, Herrera-Casamayor M, García-Madrid M, García-Morales E, Lázaro-Martínez JL. Usability of Different Methods to Assess and Improve Adherence to Therapeutic Footwear in Persons with the Diabetic Foot in Remission. A Systematic Review. Int J Low Extrem Wounds. 2026;25:55-64.</w:t>
+        <w:t>Gingerich WJ, Peterson LT. Effectiveness of Solution-Focused Brief Therapy: A Systematic Qualitative Review of Controlled Outcome Studies. Res Soc Work Pract. 2013;23:266-83.</w:t>
       </w:r>
     </w:p>
     <w:p>
@@ -5496,7 +5493,7 @@
           <w:lang w:val="en-GB"/>
         </w:rPr>
         <w:tab/>
-        <w:t>Lutjeboer T, van Netten JJ, Postema K, Hijmans J. Effect of awareness of being monitored on wearing of orthopaedic footwear. J Rehabil Med. 2020;52:jrm00127.</w:t>
+        <w:t>van Netten JJ, Vossen LE, Driebergen FM, Wolthuis D, Merkx MJM, Bus SA. Short-Term Efficacy of a Multi-Modal Intervention Program to Improve Custom-Made Footwear Use in People at High Risk of Diabetes-Related Foot Ulceration. J Clin Med. 2025;14:3635.</w:t>
       </w:r>
     </w:p>
     <w:p>
@@ -5524,7 +5521,7 @@
           <w:lang w:val="en-GB"/>
         </w:rPr>
         <w:tab/>
-        <w:t>Jongebloed-Westra M, Bode C, van Netten JJ, ten Klooster PM, Exterkate SH, Koffijberg H, et al. Using motivational interviewing combined with digital shoe-fitting to improve adherence to wearing orthopedic shoes in people with diabetes at risk of foot ulceration: study protocol for a cluster-randomized controlled trial. Trials. 2021;22:750.</w:t>
+        <w:t>López-Moral M, Molines-Barroso RJ, Herrera-Casamayor M, García-Madrid M, García-Morales E, Lázaro-Martínez JL. Usability of Different Methods to Assess and Improve Adherence to Therapeutic Footwear in Persons with the Diabetic Foot in Remission. A Systematic Review. Int J Low Extrem Wounds. 2026;25:55-64.</w:t>
       </w:r>
     </w:p>
     <w:p>
@@ -5552,7 +5549,7 @@
           <w:lang w:val="en-GB"/>
         </w:rPr>
         <w:tab/>
-        <w:t>Vossen LE, van Netten JJ, Bakker CD, Berendsen HA, Busch-Westbroek TE, Peters EJG, et al. An integrated personalized assistive devices approach to reduce the risk of foot ulcer recurrence in diabetes (DIASSIST): study protocol for a multicenter randomized controlled trial. Trials. 2023;24:663.</w:t>
+        <w:t>Lutjeboer T, van Netten JJ, Postema K, Hijmans J. Effect of awareness of being monitored on wearing of orthopaedic footwear. J Rehabil Med. 2020;52:jrm00127.</w:t>
       </w:r>
     </w:p>
     <w:p>
@@ -5580,7 +5577,7 @@
           <w:lang w:val="en-GB"/>
         </w:rPr>
         <w:tab/>
-        <w:t>White IR, Royston P, Wood AM. Multiple imputation using chained equations: Issues and guidance for practice. Stat Med. 2011;30:377-99.</w:t>
+        <w:t>Jongebloed-Westra M, Bode C, van Netten JJ, ten Klooster PM, Exterkate SH, Koffijberg H, et al. Using motivational interviewing combined with digital shoe-fitting to improve adherence to wearing orthopedic shoes in people with diabetes at risk of foot ulceration: study protocol for a cluster-randomized controlled trial. Trials. 2021;22:750.</w:t>
       </w:r>
     </w:p>
     <w:p>
@@ -5608,7 +5605,7 @@
           <w:lang w:val="en-GB"/>
         </w:rPr>
         <w:tab/>
-        <w:t>Mallinckrodt C, Lipkovich I, Dickson S, Hendrix S, Molenberghs G. Handling Missing Data in Participants with Baseline but No Post‐Baseline Data. Pharm Stat. 2026;25:e70076.</w:t>
+        <w:t>Vossen LE, van Netten JJ, Bakker CD, Berendsen HA, Busch-Westbroek TE, Peters EJG, et al. An integrated personalized assistive devices approach to reduce the risk of foot ulcer recurrence in diabetes (DIASSIST): study protocol for a multicenter randomized controlled trial. Trials. 2023;24:663.</w:t>
       </w:r>
     </w:p>
     <w:p>
@@ -5636,7 +5633,7 @@
           <w:lang w:val="en-GB"/>
         </w:rPr>
         <w:tab/>
-        <w:t>Herdman M, Gudex C, Lloyd A, Janssen MF, Kind P, Parkin D, et al. Development and preliminary testing of the new five-level version of EQ-5D (EQ-5D-5L). Qual Life Res. 2011;20:1727-36.</w:t>
+        <w:t>White IR, Royston P, Wood AM. Multiple imputation using chained equations: Issues and guidance for practice. Stat Med. 2011;30:377-99.</w:t>
       </w:r>
     </w:p>
     <w:p>
@@ -5664,7 +5661,7 @@
           <w:lang w:val="en-GB"/>
         </w:rPr>
         <w:tab/>
-        <w:t>Chan AW, Boutron I, Hopewell S, Moher D, Schulz KF, Collins GS, et al. SPIRIT 2025 statement: updated guideline for protocols of randomised trials. BMJ. 2025;389:e081477.</w:t>
+        <w:t>Mallinckrodt C, Lipkovich I, Dickson S, Hendrix S, Molenberghs G. Handling Missing Data in Participants with Baseline but No Post‐Baseline Data. Pharm Stat. 2026;25:e70076.</w:t>
       </w:r>
     </w:p>
     <w:p>
@@ -5692,7 +5689,7 @@
           <w:lang w:val="en-GB"/>
         </w:rPr>
         <w:tab/>
-        <w:t>Jacques RM, Ahmed R, Harper J, Ranjan A, Saeed I, Simpson RM, et al. Recruitment, consent and retention of participants in randomised controlled trials: a review of trials published in the National Institute for Health Research (NIHR) Journals Library (1997–2020). BMJ Open. 2022;12:e059230.</w:t>
+        <w:t>Lincoln N, Jeffcoate W, Ince P, Smith M, Radford K. Validation of a new measure of protective footcare behaviour: the Nottingham Assessment of Functional Footcare (NAFF). Pract Diab Int. 2007;24:207-11.</w:t>
       </w:r>
     </w:p>
     <w:p>
@@ -5720,7 +5717,7 @@
           <w:lang w:val="en-GB"/>
         </w:rPr>
         <w:tab/>
-        <w:t>Donovan JL, Rooshenas L, Jepson M, Elliott D, Wade J, Avery K, et al. Optimising recruitment and informed consent in randomised controlled trials: the development and implementation of the Quintet Recruitment Intervention (QRI). Trials. 2016;17:283.</w:t>
+        <w:t>Herdman M, Gudex C, Lloyd A, Janssen MF, Kind P, Parkin D, et al. Development and preliminary testing of the new five-level version of EQ-5D (EQ-5D-5L). Qual Life Res. 2011;20:1727-36.</w:t>
       </w:r>
     </w:p>
     <w:p>
@@ -5748,7 +5745,7 @@
           <w:lang w:val="en-GB"/>
         </w:rPr>
         <w:tab/>
-        <w:t>Bellg AJ, Borrelli B, Resnick B, Hecht J, Minicucci DS, Ory M, et al. Enhancing Treatment Fidelity in Health Behavior Change Studies: Best Practices and Recommendations From the NIH Behavior Change Consortium. Health Psychol. 2004;23:443-51.</w:t>
+        <w:t>Chan AW, Boutron I, Hopewell S, Moher D, Schulz KF, Collins GS, et al. SPIRIT 2025 statement: updated guideline for protocols of randomised trials. BMJ. 2025;389:e081477.</w:t>
       </w:r>
     </w:p>
     <w:p>
@@ -5768,6 +5765,90 @@
           <w:lang w:val="en-GB"/>
         </w:rPr>
         <w:t>22.</w:t>
+      </w:r>
+      <w:r>
+        <w:rPr>
+          <w:sz w:val="16"/>
+          <w:szCs w:val="16"/>
+          <w:lang w:val="en-GB"/>
+        </w:rPr>
+        <w:tab/>
+        <w:t>Jacques RM, Ahmed R, Harper J, Ranjan A, Saeed I, Simpson RM, et al. Recruitment, consent and retention of participants in randomised controlled trials: a review of trials published in the National Institute for Health Research (NIHR) Journals Library (1997–2020). BMJ Open. 2022;12:e059230.</w:t>
+      </w:r>
+    </w:p>
+    <w:p>
+      <w:pPr>
+        <w:pStyle w:val="Bibliografie"/>
+        <w:spacing w:after="0"/>
+        <w:rPr>
+          <w:sz w:val="16"/>
+          <w:szCs w:val="16"/>
+          <w:lang w:val="en-GB"/>
+        </w:rPr>
+      </w:pPr>
+      <w:r>
+        <w:rPr>
+          <w:sz w:val="16"/>
+          <w:szCs w:val="16"/>
+          <w:lang w:val="en-GB"/>
+        </w:rPr>
+        <w:t>23.</w:t>
+      </w:r>
+      <w:r>
+        <w:rPr>
+          <w:sz w:val="16"/>
+          <w:szCs w:val="16"/>
+          <w:lang w:val="en-GB"/>
+        </w:rPr>
+        <w:tab/>
+        <w:t>Donovan JL, Rooshenas L, Jepson M, Elliott D, Wade J, Avery K, et al. Optimising recruitment and informed consent in randomised controlled trials: the development and implementation of the Quintet Recruitment Intervention (QRI). Trials. 2016;17:283.</w:t>
+      </w:r>
+    </w:p>
+    <w:p>
+      <w:pPr>
+        <w:pStyle w:val="Bibliografie"/>
+        <w:spacing w:after="0"/>
+        <w:rPr>
+          <w:sz w:val="16"/>
+          <w:szCs w:val="16"/>
+          <w:lang w:val="en-GB"/>
+        </w:rPr>
+      </w:pPr>
+      <w:r>
+        <w:rPr>
+          <w:sz w:val="16"/>
+          <w:szCs w:val="16"/>
+          <w:lang w:val="en-GB"/>
+        </w:rPr>
+        <w:t>24.</w:t>
+      </w:r>
+      <w:r>
+        <w:rPr>
+          <w:sz w:val="16"/>
+          <w:szCs w:val="16"/>
+          <w:lang w:val="en-GB"/>
+        </w:rPr>
+        <w:tab/>
+        <w:t>Bellg AJ, Borrelli B, Resnick B, Hecht J, Minicucci DS, Ory M, et al. Enhancing Treatment Fidelity in Health Behavior Change Studies: Best Practices and Recommendations From the NIH Behavior Change Consortium. Health Psychol. 2004;23:443-51.</w:t>
+      </w:r>
+    </w:p>
+    <w:p>
+      <w:pPr>
+        <w:pStyle w:val="Bibliografie"/>
+        <w:spacing w:after="0"/>
+        <w:rPr>
+          <w:sz w:val="16"/>
+          <w:szCs w:val="16"/>
+          <w:lang w:val="en-GB"/>
+        </w:rPr>
+      </w:pPr>
+      <w:r>
+        <w:rPr>
+          <w:sz w:val="16"/>
+          <w:szCs w:val="16"/>
+          <w:lang w:val="en-GB"/>
+        </w:rPr>
+        <w:t>25.</w:t>
       </w:r>
       <w:r>
         <w:rPr>

</xml_diff>

<commit_message>
Doctoraatsplan: A1 uit de JDB-versie overgenomen, en een grammaticafout hersteld
A1 noemt nu ook protocolontwikkeling en het klaarmaken van de protocolpaper voor
publicatie, zoals in PARADISE_provisional_doctoral_plan_JDB.docx. Verder stond er
door een mislukte eerdere ingreep Although ... yet in dezelfde zin; Although is
weg.
</commit_message>
<xml_diff>
--- a/PARADISE_provisional_doctoral_plan.docx
+++ b/PARADISE_provisional_doctoral_plan.docx
@@ -598,7 +598,27 @@
                 <w:bCs/>
                 <w:color w:val="20415A"/>
               </w:rPr>
-              <w:t xml:space="preserve">(for </w:t>
+              <w:t>(</w:t>
+            </w:r>
+            <w:proofErr w:type="gramStart"/>
+            <w:r>
+              <w:rPr>
+                <w:rFonts w:ascii="Garamond" w:eastAsia="Calibri" w:hAnsi="Garamond"/>
+                <w:b/>
+                <w:bCs/>
+                <w:color w:val="20415A"/>
+              </w:rPr>
+              <w:t>for</w:t>
+            </w:r>
+            <w:proofErr w:type="gramEnd"/>
+            <w:r>
+              <w:rPr>
+                <w:rFonts w:ascii="Garamond" w:eastAsia="Calibri" w:hAnsi="Garamond"/>
+                <w:b/>
+                <w:bCs/>
+                <w:color w:val="20415A"/>
+              </w:rPr>
+              <w:t xml:space="preserve"> </w:t>
             </w:r>
             <w:proofErr w:type="spellStart"/>
             <w:r>
@@ -1341,371 +1361,9 @@
           <w:szCs w:val="28"/>
           <w:lang w:val="en-US"/>
         </w:rPr>
-        <w:t>1.  Introduction and background</w:t>
-      </w:r>
-    </w:p>
-    <w:p>
-      <w:pPr>
-        <w:spacing w:after="60"/>
-        <w:jc w:val="both"/>
-        <w:rPr>
-          <w:rFonts w:ascii="Garamond" w:hAnsi="Garamond"/>
-          <w:lang w:val="en-US"/>
-        </w:rPr>
-      </w:pPr>
-      <w:r>
-        <w:rPr>
-          <w:rFonts w:ascii="Garamond" w:hAnsi="Garamond"/>
-          <w:lang w:val="en-US"/>
-        </w:rPr>
-        <w:t>Diabetes is a growing global health burden;</w:t>
-      </w:r>
-      <w:r>
-        <w:rPr>
-          <w:rFonts w:ascii="Garamond" w:hAnsi="Garamond"/>
-          <w:vertAlign w:val="superscript"/>
-          <w:lang w:val="en-GB"/>
-        </w:rPr>
-      </w:r>
-      <w:r>
-        <w:rPr>
-          <w:rFonts w:ascii="Garamond" w:hAnsi="Garamond"/>
-          <w:lang w:val="en-US"/>
-        </w:rPr>
-        <w:t xml:space="preserve"> in Belgium, diagnosed prevalence reached 7.6% in 2023 and continues to rise with an ageing population.</w:t>
-      </w:r>
-      <w:r>
-        <w:rPr>
-          <w:rFonts w:ascii="Garamond" w:hAnsi="Garamond"/>
-          <w:vertAlign w:val="superscript"/>
-          <w:lang w:val="en-GB"/>
-        </w:rPr>
         <w:t>1</w:t>
       </w:r>
-      <w:r>
-        <w:rPr>
-          <w:rFonts w:ascii="Garamond" w:hAnsi="Garamond"/>
-          <w:lang w:val="en-US"/>
-        </w:rPr>
-        <w:t xml:space="preserve"> Recurrent diabetic foot ulcers (DFUs) remain a leading cause of morbidity, reduced quality of life and healthcare expenditure: about 40% of healed ulcers recur within one year, </w:t>
-      </w:r>
-      <w:r>
-        <w:rPr>
-          <w:rFonts w:ascii="Garamond" w:hAnsi="Garamond"/>
-          <w:lang w:val="en-US"/>
-        </w:rPr>
-        <w:t>making recurrence prevention a central priority</w:t>
-      </w:r>
-      <w:r>
-        <w:rPr>
-          <w:rFonts w:ascii="Garamond" w:hAnsi="Garamond"/>
-          <w:lang w:val="en-US"/>
-        </w:rPr>
-        <w:t>.</w:t>
-      </w:r>
-      <w:r>
-        <w:rPr>
-          <w:rFonts w:ascii="Garamond" w:hAnsi="Garamond"/>
-          <w:vertAlign w:val="superscript"/>
-          <w:lang w:val="en-GB"/>
-        </w:rPr>
-        <w:t>2,3,4</w:t>
-      </w:r>
-    </w:p>
-    <w:p>
-      <w:pPr>
-        <w:spacing w:after="60"/>
-        <w:jc w:val="both"/>
-        <w:rPr>
-          <w:rFonts w:ascii="Garamond" w:hAnsi="Garamond"/>
-          <w:lang w:val="en-US"/>
-        </w:rPr>
-      </w:pPr>
-      <w:r>
-        <w:rPr>
-          <w:rFonts w:ascii="Garamond" w:hAnsi="Garamond"/>
-          <w:lang w:val="en-US"/>
-        </w:rPr>
-        <w:t xml:space="preserve">In Belgium, high-risk patients are managed within multidisciplinary Diabetic Foot Clinics (DFCs) </w:t>
-      </w:r>
-      <w:proofErr w:type="spellStart"/>
-      <w:r>
-        <w:rPr>
-          <w:rFonts w:ascii="Garamond" w:hAnsi="Garamond"/>
-          <w:lang w:val="en-US"/>
-        </w:rPr>
-        <w:t>recognised</w:t>
-      </w:r>
-      <w:proofErr w:type="spellEnd"/>
-      <w:r>
-        <w:rPr>
-          <w:rFonts w:ascii="Garamond" w:hAnsi="Garamond"/>
-          <w:lang w:val="en-US"/>
-        </w:rPr>
-        <w:t xml:space="preserve"> by the national health insurer (RIZIV–INAMI). Although this model provides </w:t>
-      </w:r>
-      <w:proofErr w:type="spellStart"/>
-      <w:r>
-        <w:rPr>
-          <w:rFonts w:ascii="Garamond" w:hAnsi="Garamond"/>
-          <w:lang w:val="en-US"/>
-        </w:rPr>
-        <w:t>specialised</w:t>
-      </w:r>
-      <w:proofErr w:type="spellEnd"/>
-      <w:r>
-        <w:rPr>
-          <w:rFonts w:ascii="Garamond" w:hAnsi="Garamond"/>
-          <w:lang w:val="en-US"/>
-        </w:rPr>
-        <w:t xml:space="preserve"> care, yet a gap remains between evidence-based prevention and routine practice: pressure-</w:t>
-      </w:r>
-      <w:proofErr w:type="spellStart"/>
-      <w:r>
-        <w:rPr>
-          <w:rFonts w:ascii="Garamond" w:hAnsi="Garamond"/>
-          <w:lang w:val="en-US"/>
-        </w:rPr>
-        <w:t>optimised</w:t>
-      </w:r>
-      <w:proofErr w:type="spellEnd"/>
-      <w:r>
-        <w:rPr>
-          <w:rFonts w:ascii="Garamond" w:hAnsi="Garamond"/>
-          <w:lang w:val="en-US"/>
-        </w:rPr>
-        <w:t xml:space="preserve"> therapeutic footwear and objective adherence monitoring have each demonstrated value,</w:t>
-      </w:r>
-      <w:r>
-        <w:rPr>
-          <w:rFonts w:ascii="Garamond" w:hAnsi="Garamond"/>
-          <w:vertAlign w:val="superscript"/>
-          <w:lang w:val="en-GB"/>
-        </w:rPr>
-        <w:t>5,6,7</w:t>
-      </w:r>
-      <w:r>
-        <w:rPr>
-          <w:rFonts w:ascii="Garamond" w:hAnsi="Garamond"/>
-        </w:rPr>
-        <w:t xml:space="preserve"> but they are not yet systematically combined in Belgian diabetic-foot pathways.</w:t>
-      </w:r>
-    </w:p>
-    <w:p>
-      <w:pPr>
-        <w:spacing w:after="60"/>
-        <w:jc w:val="both"/>
-        <w:rPr>
-          <w:rFonts w:ascii="Garamond" w:hAnsi="Garamond"/>
-          <w:lang w:val="en-US"/>
-        </w:rPr>
-      </w:pPr>
-      <w:r>
-        <w:rPr>
-          <w:rFonts w:ascii="Garamond" w:hAnsi="Garamond"/>
-          <w:lang w:val="en-GB"/>
-        </w:rPr>
-        <w:t>Adherence remains a major barrier: objective monitoring shows that patients spend approximately 29% of their steps outside prescribed footwear, and only a minority reach the ≥80% threshold associated with improved outcomes</w:t>
-      </w:r>
-      <w:r>
-        <w:rPr>
-          <w:rFonts w:ascii="Garamond" w:hAnsi="Garamond"/>
-          <w:lang w:val="en-US"/>
-        </w:rPr>
-        <w:t>.</w:t>
-      </w:r>
-      <w:r>
-        <w:rPr>
-          <w:rFonts w:ascii="Garamond" w:hAnsi="Garamond"/>
-          <w:vertAlign w:val="superscript"/>
-          <w:lang w:val="en-GB"/>
-        </w:rPr>
-        <w:t>5,6</w:t>
-      </w:r>
-      <w:r>
-        <w:rPr>
-          <w:rFonts w:ascii="Garamond" w:hAnsi="Garamond"/>
-          <w:lang w:val="en-US"/>
-        </w:rPr>
-        <w:t xml:space="preserve"> Existing education strategies</w:t>
-      </w:r>
-      <w:r>
-        <w:rPr>
-          <w:rFonts w:ascii="Garamond" w:hAnsi="Garamond"/>
-          <w:lang w:val="en-US"/>
-        </w:rPr>
-        <w:t xml:space="preserve"> </w:t>
-      </w:r>
-      <w:proofErr w:type="spellStart"/>
-      <w:r>
-        <w:rPr>
-          <w:rFonts w:ascii="Garamond" w:hAnsi="Garamond"/>
-          <w:lang w:val="en-US"/>
-        </w:rPr>
-        <w:t>prioritise</w:t>
-      </w:r>
-      <w:proofErr w:type="spellEnd"/>
-      <w:r>
-        <w:rPr>
-          <w:rFonts w:ascii="Garamond" w:hAnsi="Garamond"/>
-          <w:lang w:val="en-US"/>
-        </w:rPr>
-        <w:t xml:space="preserve"> knowledge transfer over sustained </w:t>
-      </w:r>
-      <w:proofErr w:type="spellStart"/>
-      <w:r>
-        <w:rPr>
-          <w:rFonts w:ascii="Garamond" w:hAnsi="Garamond"/>
-          <w:lang w:val="en-US"/>
-        </w:rPr>
-        <w:t>behavioural</w:t>
-      </w:r>
-      <w:proofErr w:type="spellEnd"/>
-      <w:r>
-        <w:rPr>
-          <w:rFonts w:ascii="Garamond" w:hAnsi="Garamond"/>
-          <w:lang w:val="en-US"/>
-        </w:rPr>
-        <w:t xml:space="preserve"> change, and objective adherence data are seldom fed back into </w:t>
-      </w:r>
-      <w:proofErr w:type="spellStart"/>
-      <w:r>
-        <w:rPr>
-          <w:rFonts w:ascii="Garamond" w:hAnsi="Garamond"/>
-          <w:lang w:val="en-US"/>
-        </w:rPr>
-        <w:t>personalised</w:t>
-      </w:r>
-      <w:proofErr w:type="spellEnd"/>
-      <w:r>
-        <w:rPr>
-          <w:rFonts w:ascii="Garamond" w:hAnsi="Garamond"/>
-          <w:lang w:val="en-US"/>
-        </w:rPr>
-        <w:t xml:space="preserve"> or clinical decision-making.</w:t>
-      </w:r>
-      <w:r>
-        <w:rPr>
-          <w:rFonts w:ascii="Garamond" w:hAnsi="Garamond"/>
-          <w:vertAlign w:val="superscript"/>
-          <w:lang w:val="en-GB"/>
-        </w:rPr>
-        <w:t>8,9</w:t>
-      </w:r>
-    </w:p>
-    <w:p>
-      <w:pPr>
-        <w:spacing w:after="60"/>
-        <w:jc w:val="both"/>
-        <w:rPr>
-          <w:rFonts w:ascii="Garamond" w:hAnsi="Garamond"/>
-          <w:lang w:val="en-US"/>
-        </w:rPr>
-      </w:pPr>
-      <w:r>
-        <w:rPr>
-          <w:rFonts w:ascii="Garamond" w:hAnsi="Garamond"/>
-          <w:lang w:val="en-GB"/>
-        </w:rPr>
-        <w:lastRenderedPageBreak/>
-        <w:t>PARADISE (Pressure-, Adherence-, and Education-Driven Service) addresses this translational gap through an integrated intervention combining pressure-guided optimisation of therapeutic footwear and foot orthoses, structured education on adequate foot care and footwear use, and sensor-based adherence monitoring.</w:t>
-      </w:r>
-      <w:r>
-        <w:rPr>
-          <w:rFonts w:ascii="Garamond" w:hAnsi="Garamond"/>
-          <w:lang w:val="en-GB"/>
-        </w:rPr>
-        <w:t xml:space="preserve"> </w:t>
-      </w:r>
-      <w:r>
-        <w:rPr>
-          <w:rFonts w:ascii="Garamond" w:hAnsi="Garamond"/>
-          <w:lang w:val="en-GB"/>
-        </w:rPr>
-        <w:t>Education and behavioural support are delivered as two distinct components within the Structured Education and Behavioural Intervention Approach (SEBIA): education addresses knowledge and skills for adequate foot care and for the prescribed orthoses, while behavioural support draws on motivational interviewing, solution-focused brief therapy and behaviour change wheel principles, among other evidence-based behavioural change methods, to identify and address individual barriers</w:t>
-      </w:r>
-      <w:r>
-        <w:rPr>
-          <w:rFonts w:ascii="Garamond" w:hAnsi="Garamond"/>
-          <w:lang w:val="en-US"/>
-        </w:rPr>
-        <w:t>.</w:t>
-      </w:r>
-      <w:r>
-        <w:rPr>
-          <w:rFonts w:ascii="Garamond" w:hAnsi="Garamond"/>
-          <w:vertAlign w:val="superscript"/>
-          <w:lang w:val="en-GB"/>
-        </w:rPr>
-        <w:t>8,10,11</w:t>
-      </w:r>
-    </w:p>
-    <w:p>
-      <w:pPr>
-        <w:spacing w:after="60"/>
-        <w:jc w:val="both"/>
-        <w:rPr>
-          <w:rFonts w:ascii="Garamond" w:hAnsi="Garamond"/>
-          <w:lang w:val="en-US"/>
-        </w:rPr>
-      </w:pPr>
-      <w:r>
-        <w:rPr>
-          <w:rFonts w:ascii="Garamond" w:hAnsi="Garamond"/>
-          <w:lang w:val="en-GB"/>
-        </w:rPr>
-        <w:t>PARADISE has been piloted in one Belgian DFC but has not yet undergone large-scale clinical validation. A Dutch precursor combining education, motivational interviewing, and adherence monitoring demonstrated feasibility</w:t>
-      </w:r>
-      <w:r>
-        <w:rPr>
-          <w:rFonts w:ascii="Garamond" w:hAnsi="Garamond"/>
-          <w:lang w:val="en-GB"/>
-        </w:rPr>
-        <w:t xml:space="preserve">, </w:t>
-      </w:r>
-      <w:r>
-        <w:rPr>
-          <w:rFonts w:ascii="Garamond" w:hAnsi="Garamond"/>
-          <w:lang w:val="en-GB"/>
-        </w:rPr>
-        <w:t>but showed limited effects on overall wear time after three months, with improvements mainly observed for indoor footwear use.</w:t>
-      </w:r>
-      <w:r>
-        <w:rPr>
-          <w:rFonts w:ascii="Garamond" w:hAnsi="Garamond"/>
-          <w:vertAlign w:val="superscript"/>
-          <w:lang w:val="en-GB"/>
-        </w:rPr>
-        <w:t>12</w:t>
-      </w:r>
-      <w:r>
-        <w:rPr>
-          <w:rFonts w:ascii="Garamond" w:hAnsi="Garamond"/>
-          <w:lang w:val="en-US"/>
-        </w:rPr>
-        <w:t xml:space="preserve"> </w:t>
-      </w:r>
-      <w:r>
-        <w:rPr>
-          <w:rFonts w:ascii="Garamond" w:hAnsi="Garamond"/>
-          <w:lang w:val="en-GB"/>
-        </w:rPr>
-        <w:t>PARADISE extends this approach through personalised behavioural feedback, prolonged follow-up, and integration into routine Belgian multidisciplinary care.</w:t>
-      </w:r>
-    </w:p>
-    <w:p>
-      <w:pPr>
-        <w:pBdr>
-          <w:bottom w:val="single" w:sz="6" w:space="2" w:color="2A7F8E"/>
-        </w:pBdr>
-        <w:spacing w:after="60"/>
-        <w:rPr>
-          <w:rFonts w:ascii="Garamond" w:hAnsi="Garamond"/>
-          <w:sz w:val="28"/>
-          <w:szCs w:val="28"/>
-          <w:lang w:val="en-US"/>
-        </w:rPr>
-      </w:pPr>
+      <w:proofErr w:type="gramStart"/>
       <w:r>
         <w:rPr>
           <w:rFonts w:ascii="Garamond" w:eastAsia="Calibri" w:hAnsi="Garamond"/>
@@ -1716,7 +1374,408 @@
           <w:szCs w:val="28"/>
           <w:lang w:val="en-US"/>
         </w:rPr>
-        <w:t>2.  General hypothesis and specific aims</w:t>
+        <w:t>.  Introduction</w:t>
+      </w:r>
+      <w:proofErr w:type="gramEnd"/>
+      <w:r>
+        <w:rPr>
+          <w:rFonts w:ascii="Garamond" w:eastAsia="Calibri" w:hAnsi="Garamond"/>
+          <w:b/>
+          <w:bCs/>
+          <w:color w:val="20415A"/>
+          <w:sz w:val="28"/>
+          <w:szCs w:val="28"/>
+          <w:lang w:val="en-US"/>
+        </w:rPr>
+        <w:t xml:space="preserve"> and background</w:t>
+      </w:r>
+    </w:p>
+    <w:p>
+      <w:pPr>
+        <w:spacing w:after="60"/>
+        <w:jc w:val="both"/>
+        <w:rPr>
+          <w:rFonts w:ascii="Garamond" w:hAnsi="Garamond"/>
+          <w:lang w:val="en-US"/>
+        </w:rPr>
+      </w:pPr>
+      <w:r>
+        <w:rPr>
+          <w:rFonts w:ascii="Garamond" w:hAnsi="Garamond"/>
+          <w:lang w:val="en-US"/>
+        </w:rPr>
+        <w:t>Diabetes is a growing global health burden; in Belgium, diagnosed prevalence reached 7.6% in 2023 and continues to rise with an ageing population.</w:t>
+      </w:r>
+      <w:r>
+        <w:rPr>
+          <w:rFonts w:ascii="Garamond" w:hAnsi="Garamond"/>
+          <w:vertAlign w:val="superscript"/>
+          <w:lang w:val="en-GB"/>
+        </w:rPr>
+        <w:t>1</w:t>
+      </w:r>
+      <w:r>
+        <w:rPr>
+          <w:rFonts w:ascii="Garamond" w:hAnsi="Garamond"/>
+          <w:lang w:val="en-US"/>
+        </w:rPr>
+        <w:t xml:space="preserve"> Recurrent diabetic foot ulcers (DFUs) remain a leading cause of morbidity, reduced quality of life and healthcare expenditure: about 40% of healed ulcers recur within one year, </w:t>
+      </w:r>
+      <w:r>
+        <w:rPr>
+          <w:rFonts w:ascii="Garamond" w:hAnsi="Garamond"/>
+          <w:lang w:val="en-US"/>
+        </w:rPr>
+        <w:t>making recurrence prevention a central priority</w:t>
+      </w:r>
+      <w:r>
+        <w:rPr>
+          <w:rFonts w:ascii="Garamond" w:hAnsi="Garamond"/>
+          <w:lang w:val="en-US"/>
+        </w:rPr>
+        <w:t>.</w:t>
+      </w:r>
+      <w:r>
+        <w:rPr>
+          <w:rFonts w:ascii="Garamond" w:hAnsi="Garamond"/>
+          <w:vertAlign w:val="superscript"/>
+          <w:lang w:val="en-GB"/>
+        </w:rPr>
+        <w:t>2,3,4</w:t>
+      </w:r>
+    </w:p>
+    <w:p>
+      <w:pPr>
+        <w:spacing w:after="60"/>
+        <w:jc w:val="both"/>
+        <w:rPr>
+          <w:rFonts w:ascii="Garamond" w:hAnsi="Garamond"/>
+          <w:lang w:val="en-US"/>
+        </w:rPr>
+      </w:pPr>
+      <w:r>
+        <w:rPr>
+          <w:rFonts w:ascii="Garamond" w:hAnsi="Garamond"/>
+          <w:lang w:val="en-US"/>
+        </w:rPr>
+        <w:t xml:space="preserve">In Belgium, high-risk patients are managed within multidisciplinary Diabetic Foot Clinics (DFCs) </w:t>
+      </w:r>
+      <w:proofErr w:type="spellStart"/>
+      <w:r>
+        <w:rPr>
+          <w:rFonts w:ascii="Garamond" w:hAnsi="Garamond"/>
+          <w:lang w:val="en-US"/>
+        </w:rPr>
+        <w:t>recognised</w:t>
+      </w:r>
+      <w:proofErr w:type="spellEnd"/>
+      <w:r>
+        <w:rPr>
+          <w:rFonts w:ascii="Garamond" w:hAnsi="Garamond"/>
+          <w:lang w:val="en-US"/>
+        </w:rPr>
+        <w:t xml:space="preserve"> by the national health insurer (RIZIV–INAMI). This model provides </w:t>
+      </w:r>
+      <w:proofErr w:type="spellStart"/>
+      <w:r>
+        <w:rPr>
+          <w:rFonts w:ascii="Garamond" w:hAnsi="Garamond"/>
+          <w:lang w:val="en-US"/>
+        </w:rPr>
+        <w:t>specialised</w:t>
+      </w:r>
+      <w:proofErr w:type="spellEnd"/>
+      <w:r>
+        <w:rPr>
+          <w:rFonts w:ascii="Garamond" w:hAnsi="Garamond"/>
+          <w:lang w:val="en-US"/>
+        </w:rPr>
+        <w:t xml:space="preserve"> care, yet a gap remains between evidence-based prevention and routine practice: pressure-</w:t>
+      </w:r>
+      <w:proofErr w:type="spellStart"/>
+      <w:r>
+        <w:rPr>
+          <w:rFonts w:ascii="Garamond" w:hAnsi="Garamond"/>
+          <w:lang w:val="en-US"/>
+        </w:rPr>
+        <w:t>optimised</w:t>
+      </w:r>
+      <w:proofErr w:type="spellEnd"/>
+      <w:r>
+        <w:rPr>
+          <w:rFonts w:ascii="Garamond" w:hAnsi="Garamond"/>
+          <w:lang w:val="en-US"/>
+        </w:rPr>
+        <w:t xml:space="preserve"> therapeutic footwear and objective adherence monitoring have each demonstrated value,</w:t>
+      </w:r>
+      <w:r>
+        <w:rPr>
+          <w:rFonts w:ascii="Garamond" w:hAnsi="Garamond"/>
+          <w:vertAlign w:val="superscript"/>
+          <w:lang w:val="en-GB"/>
+        </w:rPr>
+        <w:t>5,6,7</w:t>
+      </w:r>
+      <w:r>
+        <w:rPr>
+          <w:rFonts w:ascii="Garamond" w:hAnsi="Garamond"/>
+          <w:lang w:val="en-GB"/>
+        </w:rPr>
+        <w:t xml:space="preserve"> but they are not yet systematically combined in Belgian diabetic-foot pathways.</w:t>
+      </w:r>
+    </w:p>
+    <w:p>
+      <w:pPr>
+        <w:spacing w:after="60"/>
+        <w:jc w:val="both"/>
+        <w:rPr>
+          <w:rFonts w:ascii="Garamond" w:hAnsi="Garamond"/>
+          <w:lang w:val="en-US"/>
+        </w:rPr>
+      </w:pPr>
+      <w:r>
+        <w:rPr>
+          <w:rFonts w:ascii="Garamond" w:hAnsi="Garamond"/>
+          <w:lang w:val="en-GB"/>
+        </w:rPr>
+        <w:t>Adherence remains a major barrier: objective monitoring shows that patients spend approximately 29% of their steps outside prescribed footwear, and only a minority reach the ≥80% threshold associated with improved outcomes</w:t>
+      </w:r>
+      <w:r>
+        <w:rPr>
+          <w:rFonts w:ascii="Garamond" w:hAnsi="Garamond"/>
+          <w:lang w:val="en-US"/>
+        </w:rPr>
+        <w:t>.</w:t>
+      </w:r>
+      <w:r>
+        <w:rPr>
+          <w:rFonts w:ascii="Garamond" w:hAnsi="Garamond"/>
+          <w:vertAlign w:val="superscript"/>
+          <w:lang w:val="en-GB"/>
+        </w:rPr>
+        <w:t>5,6</w:t>
+      </w:r>
+      <w:r>
+        <w:rPr>
+          <w:rFonts w:ascii="Garamond" w:hAnsi="Garamond"/>
+          <w:lang w:val="en-US"/>
+        </w:rPr>
+        <w:t xml:space="preserve"> Existing education strategies</w:t>
+      </w:r>
+      <w:r>
+        <w:rPr>
+          <w:rFonts w:ascii="Garamond" w:hAnsi="Garamond"/>
+          <w:lang w:val="en-US"/>
+        </w:rPr>
+        <w:t xml:space="preserve"> </w:t>
+      </w:r>
+      <w:proofErr w:type="spellStart"/>
+      <w:r>
+        <w:rPr>
+          <w:rFonts w:ascii="Garamond" w:hAnsi="Garamond"/>
+          <w:lang w:val="en-US"/>
+        </w:rPr>
+        <w:t>prioritise</w:t>
+      </w:r>
+      <w:proofErr w:type="spellEnd"/>
+      <w:r>
+        <w:rPr>
+          <w:rFonts w:ascii="Garamond" w:hAnsi="Garamond"/>
+          <w:lang w:val="en-US"/>
+        </w:rPr>
+        <w:t xml:space="preserve"> knowledge transfer over sustained </w:t>
+      </w:r>
+      <w:proofErr w:type="spellStart"/>
+      <w:r>
+        <w:rPr>
+          <w:rFonts w:ascii="Garamond" w:hAnsi="Garamond"/>
+          <w:lang w:val="en-US"/>
+        </w:rPr>
+        <w:t>behavioural</w:t>
+      </w:r>
+      <w:proofErr w:type="spellEnd"/>
+      <w:r>
+        <w:rPr>
+          <w:rFonts w:ascii="Garamond" w:hAnsi="Garamond"/>
+          <w:lang w:val="en-US"/>
+        </w:rPr>
+        <w:t xml:space="preserve"> change, and objective adherence data are seldom fed back into </w:t>
+      </w:r>
+      <w:proofErr w:type="spellStart"/>
+      <w:r>
+        <w:rPr>
+          <w:rFonts w:ascii="Garamond" w:hAnsi="Garamond"/>
+          <w:lang w:val="en-US"/>
+        </w:rPr>
+        <w:t>personalised</w:t>
+      </w:r>
+      <w:proofErr w:type="spellEnd"/>
+      <w:r>
+        <w:rPr>
+          <w:rFonts w:ascii="Garamond" w:hAnsi="Garamond"/>
+          <w:lang w:val="en-US"/>
+        </w:rPr>
+        <w:t xml:space="preserve"> or clinical decision-making.</w:t>
+      </w:r>
+      <w:r>
+        <w:rPr>
+          <w:rFonts w:ascii="Garamond" w:hAnsi="Garamond"/>
+          <w:vertAlign w:val="superscript"/>
+          <w:lang w:val="en-GB"/>
+        </w:rPr>
+        <w:t>8,9</w:t>
+      </w:r>
+    </w:p>
+    <w:p>
+      <w:pPr>
+        <w:spacing w:after="60"/>
+        <w:jc w:val="both"/>
+        <w:rPr>
+          <w:rFonts w:ascii="Garamond" w:hAnsi="Garamond"/>
+          <w:lang w:val="en-US"/>
+        </w:rPr>
+      </w:pPr>
+      <w:r>
+        <w:rPr>
+          <w:rFonts w:ascii="Garamond" w:hAnsi="Garamond"/>
+          <w:lang w:val="en-GB"/>
+        </w:rPr>
+        <w:lastRenderedPageBreak/>
+        <w:t>PARADISE (Pressure-, Adherence-, and Education-Driven Service) addresses this translational gap through an integrated intervention combining pressure-guided optimisation of therapeutic footwear and foot orthoses, structured education on adequate foot care and footwear use, and sensor-based adherence monitoring.</w:t>
+      </w:r>
+      <w:r>
+        <w:rPr>
+          <w:rFonts w:ascii="Garamond" w:hAnsi="Garamond"/>
+          <w:lang w:val="en-GB"/>
+        </w:rPr>
+        <w:t xml:space="preserve"> </w:t>
+      </w:r>
+      <w:r>
+        <w:rPr>
+          <w:rFonts w:ascii="Garamond" w:hAnsi="Garamond"/>
+          <w:lang w:val="en-GB"/>
+        </w:rPr>
+        <w:t>Education and behavioural support are delivered as two distinct components within the Structured Education and Behavioural Intervention Approach (SEBIA): education addresses knowledge and skills for adequate foot care and for the prescribed orthoses, while behavioural support draws on motivational interviewing, solution-focused brief therapy and behaviour change wheel principles, among other evidence-based behavioural change methods, to identify and address individual barriers</w:t>
+      </w:r>
+      <w:r>
+        <w:rPr>
+          <w:rFonts w:ascii="Garamond" w:hAnsi="Garamond"/>
+          <w:lang w:val="en-US"/>
+        </w:rPr>
+        <w:t>.</w:t>
+      </w:r>
+      <w:r>
+        <w:rPr>
+          <w:rFonts w:ascii="Garamond" w:hAnsi="Garamond"/>
+          <w:vertAlign w:val="superscript"/>
+          <w:lang w:val="en-GB"/>
+        </w:rPr>
+        <w:t>8,10,11</w:t>
+      </w:r>
+    </w:p>
+    <w:p>
+      <w:pPr>
+        <w:spacing w:after="60"/>
+        <w:jc w:val="both"/>
+        <w:rPr>
+          <w:rFonts w:ascii="Garamond" w:hAnsi="Garamond"/>
+          <w:lang w:val="en-US"/>
+        </w:rPr>
+      </w:pPr>
+      <w:r>
+        <w:rPr>
+          <w:rFonts w:ascii="Garamond" w:hAnsi="Garamond"/>
+          <w:lang w:val="en-GB"/>
+        </w:rPr>
+        <w:t>PARADISE has been piloted in one Belgian DFC but has not yet undergone large-scale clinical validation. A Dutch precursor combining education, motivational interviewing, and adherence monitoring demonstrated feasibility</w:t>
+      </w:r>
+      <w:r>
+        <w:rPr>
+          <w:rFonts w:ascii="Garamond" w:hAnsi="Garamond"/>
+          <w:lang w:val="en-GB"/>
+        </w:rPr>
+        <w:t xml:space="preserve">, </w:t>
+      </w:r>
+      <w:r>
+        <w:rPr>
+          <w:rFonts w:ascii="Garamond" w:hAnsi="Garamond"/>
+          <w:lang w:val="en-GB"/>
+        </w:rPr>
+        <w:t>but showed limited effects on overall wear time after three months, with improvements mainly observed for indoor footwear use.</w:t>
+      </w:r>
+      <w:r>
+        <w:rPr>
+          <w:rFonts w:ascii="Garamond" w:hAnsi="Garamond"/>
+          <w:vertAlign w:val="superscript"/>
+          <w:lang w:val="en-GB"/>
+        </w:rPr>
+        <w:t>12</w:t>
+      </w:r>
+      <w:r>
+        <w:rPr>
+          <w:rFonts w:ascii="Garamond" w:hAnsi="Garamond"/>
+          <w:lang w:val="en-US"/>
+        </w:rPr>
+        <w:t xml:space="preserve"> </w:t>
+      </w:r>
+      <w:r>
+        <w:rPr>
+          <w:rFonts w:ascii="Garamond" w:hAnsi="Garamond"/>
+          <w:lang w:val="en-GB"/>
+        </w:rPr>
+        <w:t>PARADISE extends this approach through personalised behavioural feedback, prolonged follow-up, and integration into routine Belgian multidisciplinary care.</w:t>
+      </w:r>
+    </w:p>
+    <w:p>
+      <w:pPr>
+        <w:pBdr>
+          <w:bottom w:val="single" w:sz="6" w:space="2" w:color="2A7F8E"/>
+        </w:pBdr>
+        <w:spacing w:after="60"/>
+        <w:rPr>
+          <w:rFonts w:ascii="Garamond" w:hAnsi="Garamond"/>
+          <w:sz w:val="28"/>
+          <w:szCs w:val="28"/>
+          <w:lang w:val="en-US"/>
+        </w:rPr>
+      </w:pPr>
+      <w:r>
+        <w:rPr>
+          <w:rFonts w:ascii="Garamond" w:eastAsia="Calibri" w:hAnsi="Garamond"/>
+          <w:b/>
+          <w:bCs/>
+          <w:color w:val="20415A"/>
+          <w:sz w:val="28"/>
+          <w:szCs w:val="28"/>
+          <w:lang w:val="en-US"/>
+        </w:rPr>
+        <w:t>2</w:t>
+      </w:r>
+      <w:proofErr w:type="gramStart"/>
+      <w:r>
+        <w:rPr>
+          <w:rFonts w:ascii="Garamond" w:eastAsia="Calibri" w:hAnsi="Garamond"/>
+          <w:b/>
+          <w:bCs/>
+          <w:color w:val="20415A"/>
+          <w:sz w:val="28"/>
+          <w:szCs w:val="28"/>
+          <w:lang w:val="en-US"/>
+        </w:rPr>
+        <w:t>.  General</w:t>
+      </w:r>
+      <w:proofErr w:type="gramEnd"/>
+      <w:r>
+        <w:rPr>
+          <w:rFonts w:ascii="Garamond" w:eastAsia="Calibri" w:hAnsi="Garamond"/>
+          <w:b/>
+          <w:bCs/>
+          <w:color w:val="20415A"/>
+          <w:sz w:val="28"/>
+          <w:szCs w:val="28"/>
+          <w:lang w:val="en-US"/>
+        </w:rPr>
+        <w:t xml:space="preserve"> hypothesis and specific aims</w:t>
       </w:r>
     </w:p>
     <w:p>
@@ -1801,7 +1860,7 @@
           <w:b/>
           <w:lang w:val="en-US"/>
         </w:rPr>
-        <w:t xml:space="preserve"> and site </w:t>
+        <w:t xml:space="preserve">, site </w:t>
       </w:r>
       <w:r>
         <w:rPr>
@@ -1809,7 +1868,7 @@
           <w:b/>
           <w:lang w:val="en-US"/>
         </w:rPr>
-        <w:t>readiness.</w:t>
+        <w:t>readiness and protocol development.</w:t>
       </w:r>
       <w:r>
         <w:rPr>
@@ -1823,7 +1882,7 @@
           <w:rFonts w:ascii="Garamond" w:hAnsi="Garamond"/>
           <w:lang w:val="en-GB"/>
         </w:rPr>
-        <w:t>Standardise and pilot PARADISE across six DFCs by finalising protocols, assessment procedures, workflows and documentation pathways.</w:t>
+        <w:t>Standardise and pilot the PARADISE trial across six DFCs by finalising protocols, assessment procedures, workflows and documentation pathways, and prepare the trial protocol for publication.</w:t>
       </w:r>
     </w:p>
     <w:p>
@@ -2009,8 +2068,22 @@
           <w:szCs w:val="28"/>
           <w:lang w:val="en-US"/>
         </w:rPr>
-        <w:t>3.  Methodology</w:t>
-      </w:r>
+        <w:t>3</w:t>
+      </w:r>
+      <w:proofErr w:type="gramStart"/>
+      <w:r>
+        <w:rPr>
+          <w:rFonts w:ascii="Garamond" w:eastAsia="Calibri" w:hAnsi="Garamond"/>
+          <w:b/>
+          <w:bCs/>
+          <w:color w:val="20415A"/>
+          <w:sz w:val="28"/>
+          <w:szCs w:val="28"/>
+          <w:lang w:val="en-US"/>
+        </w:rPr>
+        <w:t>.  Methodology</w:t>
+      </w:r>
+      <w:proofErr w:type="gramEnd"/>
     </w:p>
     <w:p>
       <w:pPr>
@@ -2034,15 +2107,7 @@
           <w:rFonts w:ascii="Garamond" w:hAnsi="Garamond"/>
           <w:lang w:val="en-GB"/>
         </w:rPr>
-        <w:t xml:space="preserve">A prospective, multicentre, parallel-group randomised controlled trial (RCT) will randomise 144 adults with diabetes and an IWGDF category 3 high-risk foot in a 1:1 ratio, stratified by centre, across six Belgian RIZIV–INAMI-recognised DFCs. Participants will be followed for 18 months. Eligible participants have type 1 or type 2 diabetes with a </w:t>
-      </w:r>
-      <w:r>
-        <w:rPr>
-          <w:rFonts w:ascii="Garamond" w:hAnsi="Garamond"/>
-          <w:lang w:val="en-GB"/>
-        </w:rPr>
-        <w:lastRenderedPageBreak/>
-        <w:t>plantar ulcer healed within the preceding 18 months or a partial foot amputation, and use, or are willing to use, prescribed therapeutic footwear.</w:t>
+        <w:t>A prospective, multicentre, parallel-group randomised controlled trial (RCT) will randomise 144 adults with diabetes and an IWGDF category 3 high-risk foot in a 1:1 ratio, stratified by centre, across six Belgian RIZIV–INAMI-recognised DFCs. Participants will be followed for 18 months. Eligible participants have type 1 or type 2 diabetes with a plantar ulcer healed within the preceding 18 months or a partial foot amputation, and use, or are willing to use, prescribed therapeutic footwear.</w:t>
       </w:r>
     </w:p>
     <w:p>
@@ -2060,6 +2125,7 @@
           <w:b/>
           <w:lang w:val="en-US"/>
         </w:rPr>
+        <w:lastRenderedPageBreak/>
         <w:t xml:space="preserve">Interventions. </w:t>
       </w:r>
       <w:r>
@@ -2524,15 +2590,7 @@
           <w:rFonts w:ascii="Garamond" w:hAnsi="Garamond"/>
           <w:lang w:val="en-GB"/>
         </w:rPr>
-        <w:t xml:space="preserve">Secondary outcomes comprise ulcer-free survival, recurrence characteristics, plantar-pressure change at 6, 12, and 18 months, foot-care behaviour (NAFF), objectively measured adherence over the full 18 months, </w:t>
-      </w:r>
-      <w:r>
-        <w:rPr>
-          <w:rFonts w:ascii="Garamond" w:hAnsi="Garamond"/>
-          <w:lang w:val="en-GB"/>
-        </w:rPr>
-        <w:lastRenderedPageBreak/>
-        <w:t>self-reported adherence (7-day recall), health-related quality of life (EQ-5D-5L), and healthcare resource utilisation.</w:t>
+        <w:t>Secondary outcomes comprise ulcer-free survival, recurrence characteristics, plantar-pressure change at 6, 12, and 18 months, foot-care behaviour (NAFF), objectively measured adherence over the full 18 months, self-reported adherence (7-day recall), health-related quality of life (EQ-5D-5L), and healthcare resource utilisation.</w:t>
       </w:r>
     </w:p>
     <w:p>
@@ -2550,6 +2608,7 @@
           <w:b/>
           <w:lang w:val="en-US"/>
         </w:rPr>
+        <w:lastRenderedPageBreak/>
         <w:t xml:space="preserve">Sample size and statistics. </w:t>
       </w:r>
       <w:r>
@@ -2894,7 +2953,8 @@
         <w:jc w:val="both"/>
         <w:rPr>
           <w:rFonts w:ascii="Garamond" w:hAnsi="Garamond"/>
-          <w:lang w:val="en-US"/>
+          <w:vertAlign w:val="superscript"/>
+          <w:lang w:val="en-GB"/>
         </w:rPr>
       </w:pPr>
       <w:r>
@@ -2980,7 +3040,6 @@
           <w:rFonts w:ascii="Garamond" w:hAnsi="Garamond"/>
           <w:lang w:val="en-GB"/>
         </w:rPr>
-        <w:lastRenderedPageBreak/>
         <w:t xml:space="preserve">standardised operating procedures, investigator training, and intervention-fidelity assessments following NIH </w:t>
       </w:r>
       <w:proofErr w:type="spellStart"/>
@@ -3021,6 +3080,27 @@
         </w:rPr>
         <w:t>24</w:t>
       </w:r>
+    </w:p>
+    <w:p>
+      <w:pPr>
+        <w:spacing w:after="60"/>
+        <w:jc w:val="both"/>
+        <w:rPr>
+          <w:rFonts w:ascii="Garamond" w:hAnsi="Garamond"/>
+          <w:vertAlign w:val="superscript"/>
+          <w:lang w:val="en-GB"/>
+        </w:rPr>
+      </w:pPr>
+    </w:p>
+    <w:p>
+      <w:pPr>
+        <w:spacing w:after="60"/>
+        <w:jc w:val="both"/>
+        <w:rPr>
+          <w:rFonts w:ascii="Garamond" w:hAnsi="Garamond"/>
+          <w:lang w:val="en-US"/>
+        </w:rPr>
+      </w:pPr>
     </w:p>
     <w:p>
       <w:pPr>
@@ -3043,7 +3123,34 @@
           <w:szCs w:val="28"/>
           <w:lang w:val="en-US"/>
         </w:rPr>
-        <w:t>5.  Conclusion: planned outputs and pre-existing data</w:t>
+        <w:lastRenderedPageBreak/>
+        <w:t>5</w:t>
+      </w:r>
+      <w:proofErr w:type="gramStart"/>
+      <w:r>
+        <w:rPr>
+          <w:rFonts w:ascii="Garamond" w:eastAsia="Calibri" w:hAnsi="Garamond"/>
+          <w:b/>
+          <w:bCs/>
+          <w:color w:val="20415A"/>
+          <w:sz w:val="28"/>
+          <w:szCs w:val="28"/>
+          <w:lang w:val="en-US"/>
+        </w:rPr>
+        <w:t>.  Conclusion</w:t>
+      </w:r>
+      <w:proofErr w:type="gramEnd"/>
+      <w:r>
+        <w:rPr>
+          <w:rFonts w:ascii="Garamond" w:eastAsia="Calibri" w:hAnsi="Garamond"/>
+          <w:b/>
+          <w:bCs/>
+          <w:color w:val="20415A"/>
+          <w:sz w:val="28"/>
+          <w:szCs w:val="28"/>
+          <w:lang w:val="en-US"/>
+        </w:rPr>
+        <w:t>: planned outputs and pre-existing data</w:t>
       </w:r>
     </w:p>
     <w:p>
@@ -3182,30 +3289,6 @@
       </w:pPr>
       <w:r>
         <w:rPr>
-          <w:rFonts w:ascii="Garamond" w:hAnsi="Garamond"/>
-          <w:sz w:val="16"/>
-          <w:szCs w:val="16"/>
-          <w:lang w:val="en-US"/>
-        </w:rPr>
-      </w:r>
-      <w:r>
-        <w:rPr>
-          <w:rFonts w:ascii="Garamond" w:hAnsi="Garamond"/>
-          <w:sz w:val="16"/>
-          <w:szCs w:val="16"/>
-          <w:lang w:val="en-US"/>
-        </w:rPr>
-      </w:r>
-      <w:r>
-        <w:rPr>
-          <w:rFonts w:ascii="Garamond" w:hAnsi="Garamond"/>
-          <w:sz w:val="16"/>
-          <w:szCs w:val="16"/>
-          <w:lang w:val="en-US"/>
-        </w:rPr>
-      </w:r>
-      <w:r>
-        <w:rPr>
           <w:sz w:val="16"/>
           <w:szCs w:val="16"/>
           <w:lang w:val="en-GB"/>
@@ -3229,7 +3312,6 @@
         <w:rPr>
           <w:sz w:val="16"/>
           <w:szCs w:val="16"/>
-          <w:lang w:val="en-GB"/>
         </w:rPr>
       </w:pPr>
       <w:r>
@@ -3247,7 +3329,62 @@
           <w:lang w:val="en-GB"/>
         </w:rPr>
         <w:tab/>
-        <w:t>Armstrong DG, Boulton AJM, Bus SA. Diabetic Foot Ulcers and Their Recurrence. N Engl J Med. 2017;376:2367-75.</w:t>
+        <w:t xml:space="preserve">Armstrong DG, Boulton AJM, Bus SA. Diabetic Foot Ulcers and Their Recurrence. </w:t>
+      </w:r>
+      <w:r>
+        <w:rPr>
+          <w:sz w:val="16"/>
+          <w:szCs w:val="16"/>
+        </w:rPr>
+        <w:t xml:space="preserve">N </w:t>
+      </w:r>
+      <w:proofErr w:type="spellStart"/>
+      <w:r>
+        <w:rPr>
+          <w:sz w:val="16"/>
+          <w:szCs w:val="16"/>
+        </w:rPr>
+        <w:t>Engl</w:t>
+      </w:r>
+      <w:proofErr w:type="spellEnd"/>
+      <w:r>
+        <w:rPr>
+          <w:sz w:val="16"/>
+          <w:szCs w:val="16"/>
+        </w:rPr>
+        <w:t xml:space="preserve"> J </w:t>
+      </w:r>
+      <w:proofErr w:type="spellStart"/>
+      <w:r>
+        <w:rPr>
+          <w:sz w:val="16"/>
+          <w:szCs w:val="16"/>
+        </w:rPr>
+        <w:t>Med</w:t>
+      </w:r>
+      <w:proofErr w:type="spellEnd"/>
+      <w:r>
+        <w:rPr>
+          <w:sz w:val="16"/>
+          <w:szCs w:val="16"/>
+        </w:rPr>
+        <w:t xml:space="preserve">. </w:t>
+      </w:r>
+      <w:proofErr w:type="gramStart"/>
+      <w:r>
+        <w:rPr>
+          <w:sz w:val="16"/>
+          <w:szCs w:val="16"/>
+        </w:rPr>
+        <w:t>2017;376:2367</w:t>
+      </w:r>
+      <w:proofErr w:type="gramEnd"/>
+      <w:r>
+        <w:rPr>
+          <w:sz w:val="16"/>
+          <w:szCs w:val="16"/>
+        </w:rPr>
+        <w:t>-75.</w:t>
       </w:r>
     </w:p>
     <w:p>
@@ -3264,7 +3401,6 @@
         <w:rPr>
           <w:sz w:val="16"/>
           <w:szCs w:val="16"/>
-          <w:lang w:val="en-GB"/>
         </w:rPr>
         <w:t>3.</w:t>
       </w:r>
@@ -3272,10 +3408,82 @@
         <w:rPr>
           <w:sz w:val="16"/>
           <w:szCs w:val="16"/>
-          <w:lang w:val="en-GB"/>
         </w:rPr>
         <w:tab/>
-        <w:t>Waaijman R, de Haart M, Arts MLJ, Wever D, Verlouw AJWE, Nollet F, et al. Risk Factors for Plantar Foot Ulcer Recurrence in Neuropathic Diabetic Patients. Diabetes Care. 2014;37:1697-705.</w:t>
+      </w:r>
+      <w:proofErr w:type="spellStart"/>
+      <w:r>
+        <w:rPr>
+          <w:sz w:val="16"/>
+          <w:szCs w:val="16"/>
+        </w:rPr>
+        <w:t>Waaijman</w:t>
+      </w:r>
+      <w:proofErr w:type="spellEnd"/>
+      <w:r>
+        <w:rPr>
+          <w:sz w:val="16"/>
+          <w:szCs w:val="16"/>
+        </w:rPr>
+        <w:t xml:space="preserve"> R, de Haart M, Arts MLJ, Wever D, </w:t>
+      </w:r>
+      <w:proofErr w:type="spellStart"/>
+      <w:r>
+        <w:rPr>
+          <w:sz w:val="16"/>
+          <w:szCs w:val="16"/>
+        </w:rPr>
+        <w:t>Verlouw</w:t>
+      </w:r>
+      <w:proofErr w:type="spellEnd"/>
+      <w:r>
+        <w:rPr>
+          <w:sz w:val="16"/>
+          <w:szCs w:val="16"/>
+        </w:rPr>
+        <w:t xml:space="preserve"> AJWE, </w:t>
+      </w:r>
+      <w:proofErr w:type="spellStart"/>
+      <w:r>
+        <w:rPr>
+          <w:sz w:val="16"/>
+          <w:szCs w:val="16"/>
+        </w:rPr>
+        <w:t>Nollet</w:t>
+      </w:r>
+      <w:proofErr w:type="spellEnd"/>
+      <w:r>
+        <w:rPr>
+          <w:sz w:val="16"/>
+          <w:szCs w:val="16"/>
+        </w:rPr>
+        <w:t xml:space="preserve"> F, et al. </w:t>
+      </w:r>
+      <w:r>
+        <w:rPr>
+          <w:sz w:val="16"/>
+          <w:szCs w:val="16"/>
+          <w:lang w:val="en-GB"/>
+        </w:rPr>
+        <w:t xml:space="preserve">Risk Factors for Plantar Foot Ulcer Recurrence in Neuropathic Diabetic Patients. Diabetes Care. </w:t>
+      </w:r>
+      <w:proofErr w:type="gramStart"/>
+      <w:r>
+        <w:rPr>
+          <w:sz w:val="16"/>
+          <w:szCs w:val="16"/>
+          <w:lang w:val="en-GB"/>
+        </w:rPr>
+        <w:t>2014;37:1697</w:t>
+      </w:r>
+      <w:proofErr w:type="gramEnd"/>
+      <w:r>
+        <w:rPr>
+          <w:sz w:val="16"/>
+          <w:szCs w:val="16"/>
+          <w:lang w:val="en-GB"/>
+        </w:rPr>
+        <w:t>-705.</w:t>
       </w:r>
     </w:p>
     <w:p>
@@ -3285,7 +3493,6 @@
         <w:rPr>
           <w:sz w:val="16"/>
           <w:szCs w:val="16"/>
-          <w:lang w:val="en-GB"/>
         </w:rPr>
       </w:pPr>
       <w:r>
@@ -3303,7 +3510,62 @@
           <w:lang w:val="en-GB"/>
         </w:rPr>
         <w:tab/>
-        <w:t>Bouly M, Laborne FX, Tourte C, Henry E, Penfornis A, Dardari D. The Post-Healing Follow-Up of Diabetic Foot Ulcers by a Multidisciplinary Team to Reduce Their Recurrence: An Observational Retrospective Study. J Clin Med. 2025;14:4975.</w:t>
+        <w:t xml:space="preserve">Bouly M, Laborne FX, Tourte C, Henry E, Penfornis A, Dardari D. The Post-Healing Follow-Up of Diabetic Foot Ulcers by a Multidisciplinary Team to Reduce Their Recurrence: An Observational Retrospective Study. </w:t>
+      </w:r>
+      <w:r>
+        <w:rPr>
+          <w:sz w:val="16"/>
+          <w:szCs w:val="16"/>
+        </w:rPr>
+        <w:t xml:space="preserve">J </w:t>
+      </w:r>
+      <w:proofErr w:type="spellStart"/>
+      <w:r>
+        <w:rPr>
+          <w:sz w:val="16"/>
+          <w:szCs w:val="16"/>
+        </w:rPr>
+        <w:t>Clin</w:t>
+      </w:r>
+      <w:proofErr w:type="spellEnd"/>
+      <w:r>
+        <w:rPr>
+          <w:sz w:val="16"/>
+          <w:szCs w:val="16"/>
+        </w:rPr>
+        <w:t xml:space="preserve"> </w:t>
+      </w:r>
+      <w:proofErr w:type="spellStart"/>
+      <w:r>
+        <w:rPr>
+          <w:sz w:val="16"/>
+          <w:szCs w:val="16"/>
+        </w:rPr>
+        <w:t>Med</w:t>
+      </w:r>
+      <w:proofErr w:type="spellEnd"/>
+      <w:r>
+        <w:rPr>
+          <w:sz w:val="16"/>
+          <w:szCs w:val="16"/>
+        </w:rPr>
+        <w:t xml:space="preserve">. </w:t>
+      </w:r>
+      <w:proofErr w:type="gramStart"/>
+      <w:r>
+        <w:rPr>
+          <w:sz w:val="16"/>
+          <w:szCs w:val="16"/>
+        </w:rPr>
+        <w:t>2025;14:4975</w:t>
+      </w:r>
+      <w:proofErr w:type="gramEnd"/>
+      <w:r>
+        <w:rPr>
+          <w:sz w:val="16"/>
+          <w:szCs w:val="16"/>
+        </w:rPr>
+        <w:t>.</w:t>
       </w:r>
     </w:p>
     <w:p>
@@ -3313,21 +3575,12 @@
         <w:rPr>
           <w:sz w:val="16"/>
           <w:szCs w:val="16"/>
-          <w:lang w:val="en-GB"/>
-        </w:rPr>
-      </w:pPr>
-      <w:r>
-        <w:rPr>
-          <w:sz w:val="16"/>
-          <w:szCs w:val="16"/>
-          <w:lang w:val="en-GB"/>
-        </w:rPr>
-      </w:r>
-      <w:r>
-        <w:rPr>
-          <w:sz w:val="16"/>
-          <w:szCs w:val="16"/>
-          <w:lang w:val="en-GB"/>
+        </w:rPr>
+      </w:pPr>
+      <w:r>
+        <w:rPr>
+          <w:sz w:val="16"/>
+          <w:szCs w:val="16"/>
         </w:rPr>
         <w:t>5.</w:t>
       </w:r>
@@ -3335,10 +3588,56 @@
         <w:rPr>
           <w:sz w:val="16"/>
           <w:szCs w:val="16"/>
-          <w:lang w:val="en-GB"/>
         </w:rPr>
         <w:tab/>
-        <w:t>Bus SA, Waaijman R, Arts M, de Haart M, Busch-Westbroek T, van Baal J, et al. Effect of Custom-Made Footwear on Foot Ulcer Recurrence in Diabetes. Diabetes Care. 2013;36:4109-16.</w:t>
+        <w:t xml:space="preserve">Bus SA, </w:t>
+      </w:r>
+      <w:proofErr w:type="spellStart"/>
+      <w:r>
+        <w:rPr>
+          <w:sz w:val="16"/>
+          <w:szCs w:val="16"/>
+        </w:rPr>
+        <w:t>Waaijman</w:t>
+      </w:r>
+      <w:proofErr w:type="spellEnd"/>
+      <w:r>
+        <w:rPr>
+          <w:sz w:val="16"/>
+          <w:szCs w:val="16"/>
+        </w:rPr>
+        <w:t xml:space="preserve"> R, Arts M, de Haart M, Busch-Westbroek T, van Baal J, et al. </w:t>
+      </w:r>
+      <w:r>
+        <w:rPr>
+          <w:sz w:val="16"/>
+          <w:szCs w:val="16"/>
+          <w:lang w:val="en-GB"/>
+        </w:rPr>
+        <w:t xml:space="preserve">Effect of Custom-Made Footwear on Foot Ulcer Recurrence in Diabetes. </w:t>
+      </w:r>
+      <w:r>
+        <w:rPr>
+          <w:sz w:val="16"/>
+          <w:szCs w:val="16"/>
+        </w:rPr>
+        <w:t xml:space="preserve">Diabetes Care. </w:t>
+      </w:r>
+      <w:proofErr w:type="gramStart"/>
+      <w:r>
+        <w:rPr>
+          <w:sz w:val="16"/>
+          <w:szCs w:val="16"/>
+        </w:rPr>
+        <w:t>2013;36:4109</w:t>
+      </w:r>
+      <w:proofErr w:type="gramEnd"/>
+      <w:r>
+        <w:rPr>
+          <w:sz w:val="16"/>
+          <w:szCs w:val="16"/>
+        </w:rPr>
+        <w:t>-16.</w:t>
       </w:r>
     </w:p>
     <w:p>
@@ -3355,14 +3654,6 @@
         <w:rPr>
           <w:sz w:val="16"/>
           <w:szCs w:val="16"/>
-          <w:lang w:val="en-GB"/>
-        </w:rPr>
-      </w:r>
-      <w:r>
-        <w:rPr>
-          <w:sz w:val="16"/>
-          <w:szCs w:val="16"/>
-          <w:lang w:val="en-GB"/>
         </w:rPr>
         <w:t>6.</w:t>
       </w:r>
@@ -3370,10 +3661,100 @@
         <w:rPr>
           <w:sz w:val="16"/>
           <w:szCs w:val="16"/>
-          <w:lang w:val="en-GB"/>
         </w:rPr>
         <w:tab/>
-        <w:t>Waaijman R, Keukenkamp R, de Haart M, Polomski WP, Nollet F, Bus SA. Adherence to Wearing Prescription Custom-Made Footwear in Patients With Diabetes at High Risk for Plantar Foot Ulceration. Diabetes Care. 2013;36:1613-8.</w:t>
+      </w:r>
+      <w:proofErr w:type="spellStart"/>
+      <w:r>
+        <w:rPr>
+          <w:sz w:val="16"/>
+          <w:szCs w:val="16"/>
+        </w:rPr>
+        <w:t>Waaijman</w:t>
+      </w:r>
+      <w:proofErr w:type="spellEnd"/>
+      <w:r>
+        <w:rPr>
+          <w:sz w:val="16"/>
+          <w:szCs w:val="16"/>
+        </w:rPr>
+        <w:t xml:space="preserve"> R, Keukenkamp R, de Haart M, </w:t>
+      </w:r>
+      <w:proofErr w:type="spellStart"/>
+      <w:r>
+        <w:rPr>
+          <w:sz w:val="16"/>
+          <w:szCs w:val="16"/>
+        </w:rPr>
+        <w:t>Polomski</w:t>
+      </w:r>
+      <w:proofErr w:type="spellEnd"/>
+      <w:r>
+        <w:rPr>
+          <w:sz w:val="16"/>
+          <w:szCs w:val="16"/>
+        </w:rPr>
+        <w:t xml:space="preserve"> WP, </w:t>
+      </w:r>
+      <w:proofErr w:type="spellStart"/>
+      <w:r>
+        <w:rPr>
+          <w:sz w:val="16"/>
+          <w:szCs w:val="16"/>
+        </w:rPr>
+        <w:t>Nollet</w:t>
+      </w:r>
+      <w:proofErr w:type="spellEnd"/>
+      <w:r>
+        <w:rPr>
+          <w:sz w:val="16"/>
+          <w:szCs w:val="16"/>
+        </w:rPr>
+        <w:t xml:space="preserve"> F, Bus SA. </w:t>
+      </w:r>
+      <w:r>
+        <w:rPr>
+          <w:sz w:val="16"/>
+          <w:szCs w:val="16"/>
+          <w:lang w:val="en-GB"/>
+        </w:rPr>
+        <w:t xml:space="preserve">Adherence to Wearing Prescription Custom-Made Footwear in Patients </w:t>
+      </w:r>
+      <w:proofErr w:type="gramStart"/>
+      <w:r>
+        <w:rPr>
+          <w:sz w:val="16"/>
+          <w:szCs w:val="16"/>
+          <w:lang w:val="en-GB"/>
+        </w:rPr>
+        <w:t>With</w:t>
+      </w:r>
+      <w:proofErr w:type="gramEnd"/>
+      <w:r>
+        <w:rPr>
+          <w:sz w:val="16"/>
+          <w:szCs w:val="16"/>
+          <w:lang w:val="en-GB"/>
+        </w:rPr>
+        <w:t xml:space="preserve"> Diabetes at High Risk for Plantar Foot Ulceration. Diabetes Care. </w:t>
+      </w:r>
+      <w:proofErr w:type="gramStart"/>
+      <w:r>
+        <w:rPr>
+          <w:sz w:val="16"/>
+          <w:szCs w:val="16"/>
+          <w:lang w:val="en-GB"/>
+        </w:rPr>
+        <w:t>2013;36:1613</w:t>
+      </w:r>
+      <w:proofErr w:type="gramEnd"/>
+      <w:r>
+        <w:rPr>
+          <w:sz w:val="16"/>
+          <w:szCs w:val="16"/>
+          <w:lang w:val="en-GB"/>
+        </w:rPr>
+        <w:t>-8.</w:t>
       </w:r>
     </w:p>
     <w:p>
@@ -3401,7 +3782,43 @@
           <w:lang w:val="en-GB"/>
         </w:rPr>
         <w:tab/>
-        <w:t>Kamogawa M, Kajiwara K, Sakuramoto H, Yamamoto K. Non-pharmacological Interventions for the Prevention and Progression of Diabetic Foot Ulcers in Individuals With Type 2 Diabetes Mellitus: A Scoping Review. Cureus. 2026;18:e100710.</w:t>
+        <w:t xml:space="preserve">Kamogawa M, Kajiwara K, Sakuramoto H, Yamamoto K. Non-pharmacological Interventions for the Prevention and Progression of Diabetic Foot Ulcers in Individuals </w:t>
+      </w:r>
+      <w:proofErr w:type="gramStart"/>
+      <w:r>
+        <w:rPr>
+          <w:sz w:val="16"/>
+          <w:szCs w:val="16"/>
+          <w:lang w:val="en-GB"/>
+        </w:rPr>
+        <w:t>With</w:t>
+      </w:r>
+      <w:proofErr w:type="gramEnd"/>
+      <w:r>
+        <w:rPr>
+          <w:sz w:val="16"/>
+          <w:szCs w:val="16"/>
+          <w:lang w:val="en-GB"/>
+        </w:rPr>
+        <w:t xml:space="preserve"> Type 2 Diabetes Mellitus: A Scoping Review. Cureus. 2026;</w:t>
+      </w:r>
+      <w:proofErr w:type="gramStart"/>
+      <w:r>
+        <w:rPr>
+          <w:sz w:val="16"/>
+          <w:szCs w:val="16"/>
+          <w:lang w:val="en-GB"/>
+        </w:rPr>
+        <w:t>18:e</w:t>
+      </w:r>
+      <w:proofErr w:type="gramEnd"/>
+      <w:r>
+        <w:rPr>
+          <w:sz w:val="16"/>
+          <w:szCs w:val="16"/>
+          <w:lang w:val="en-GB"/>
+        </w:rPr>
+        <w:t>100710.</w:t>
       </w:r>
     </w:p>
     <w:p>
@@ -3411,7 +3828,6 @@
         <w:rPr>
           <w:sz w:val="16"/>
           <w:szCs w:val="16"/>
-          <w:lang w:val="en-GB"/>
         </w:rPr>
       </w:pPr>
       <w:r>
@@ -3429,7 +3845,105 @@
           <w:lang w:val="en-GB"/>
         </w:rPr>
         <w:tab/>
-        <w:t>Goodall RJ, Ellauzi J, Tan MKH, Onida S, Davies AH, Shalhoub J. A Systematic Review of the Impact of Foot Care Education on Self Efficacy and Self Care in Patients With Diabetes. Eur J Vasc Endovasc Surg. 2020;60:282-92.</w:t>
+        <w:t xml:space="preserve">Goodall RJ, Ellauzi J, Tan MKH, Onida S, Davies AH, Shalhoub J. A Systematic Review of the Impact of Foot Care Education on Self Efficacy and Self Care in Patients </w:t>
+      </w:r>
+      <w:proofErr w:type="gramStart"/>
+      <w:r>
+        <w:rPr>
+          <w:sz w:val="16"/>
+          <w:szCs w:val="16"/>
+          <w:lang w:val="en-GB"/>
+        </w:rPr>
+        <w:t>With</w:t>
+      </w:r>
+      <w:proofErr w:type="gramEnd"/>
+      <w:r>
+        <w:rPr>
+          <w:sz w:val="16"/>
+          <w:szCs w:val="16"/>
+          <w:lang w:val="en-GB"/>
+        </w:rPr>
+        <w:t xml:space="preserve"> Diabetes. </w:t>
+      </w:r>
+      <w:proofErr w:type="spellStart"/>
+      <w:r>
+        <w:rPr>
+          <w:sz w:val="16"/>
+          <w:szCs w:val="16"/>
+        </w:rPr>
+        <w:t>Eur</w:t>
+      </w:r>
+      <w:proofErr w:type="spellEnd"/>
+      <w:r>
+        <w:rPr>
+          <w:sz w:val="16"/>
+          <w:szCs w:val="16"/>
+        </w:rPr>
+        <w:t xml:space="preserve"> J </w:t>
+      </w:r>
+      <w:proofErr w:type="spellStart"/>
+      <w:r>
+        <w:rPr>
+          <w:sz w:val="16"/>
+          <w:szCs w:val="16"/>
+        </w:rPr>
+        <w:t>Vasc</w:t>
+      </w:r>
+      <w:proofErr w:type="spellEnd"/>
+      <w:r>
+        <w:rPr>
+          <w:sz w:val="16"/>
+          <w:szCs w:val="16"/>
+        </w:rPr>
+        <w:t xml:space="preserve"> </w:t>
+      </w:r>
+      <w:proofErr w:type="spellStart"/>
+      <w:r>
+        <w:rPr>
+          <w:sz w:val="16"/>
+          <w:szCs w:val="16"/>
+        </w:rPr>
+        <w:t>Endovasc</w:t>
+      </w:r>
+      <w:proofErr w:type="spellEnd"/>
+      <w:r>
+        <w:rPr>
+          <w:sz w:val="16"/>
+          <w:szCs w:val="16"/>
+        </w:rPr>
+        <w:t xml:space="preserve"> </w:t>
+      </w:r>
+      <w:proofErr w:type="spellStart"/>
+      <w:r>
+        <w:rPr>
+          <w:sz w:val="16"/>
+          <w:szCs w:val="16"/>
+        </w:rPr>
+        <w:t>Surg</w:t>
+      </w:r>
+      <w:proofErr w:type="spellEnd"/>
+      <w:r>
+        <w:rPr>
+          <w:sz w:val="16"/>
+          <w:szCs w:val="16"/>
+        </w:rPr>
+        <w:t xml:space="preserve">. </w:t>
+      </w:r>
+      <w:proofErr w:type="gramStart"/>
+      <w:r>
+        <w:rPr>
+          <w:sz w:val="16"/>
+          <w:szCs w:val="16"/>
+        </w:rPr>
+        <w:t>2020;60:282</w:t>
+      </w:r>
+      <w:proofErr w:type="gramEnd"/>
+      <w:r>
+        <w:rPr>
+          <w:sz w:val="16"/>
+          <w:szCs w:val="16"/>
+        </w:rPr>
+        <w:t>-92.</w:t>
       </w:r>
     </w:p>
     <w:p>
@@ -3446,7 +3960,6 @@
         <w:rPr>
           <w:sz w:val="16"/>
           <w:szCs w:val="16"/>
-          <w:lang w:val="en-GB"/>
         </w:rPr>
         <w:t>9.</w:t>
       </w:r>
@@ -3454,10 +3967,84 @@
         <w:rPr>
           <w:sz w:val="16"/>
           <w:szCs w:val="16"/>
-          <w:lang w:val="en-GB"/>
         </w:rPr>
         <w:tab/>
-        <w:t>Exterkate SH, Jongebloed‐Westra M, ten Klooster PM, Koffijberg H, Bode C, van Gemert-Pijnen JEWC, et al. Objectively assessed long‐term wearing patterns and predictors of wearing orthopaedic footwear in people with diabetes at moderate‐to‐high risk of foot ulceration: a 12 months observational study. J Foot Ankle Res. 2023;16:60.</w:t>
+      </w:r>
+      <w:proofErr w:type="spellStart"/>
+      <w:r>
+        <w:rPr>
+          <w:sz w:val="16"/>
+          <w:szCs w:val="16"/>
+        </w:rPr>
+        <w:t>Exterkate</w:t>
+      </w:r>
+      <w:proofErr w:type="spellEnd"/>
+      <w:r>
+        <w:rPr>
+          <w:sz w:val="16"/>
+          <w:szCs w:val="16"/>
+        </w:rPr>
+        <w:t xml:space="preserve"> SH, Jongebloed‐Westra M, ten Klooster PM, </w:t>
+      </w:r>
+      <w:proofErr w:type="spellStart"/>
+      <w:r>
+        <w:rPr>
+          <w:sz w:val="16"/>
+          <w:szCs w:val="16"/>
+        </w:rPr>
+        <w:t>Koffijberg</w:t>
+      </w:r>
+      <w:proofErr w:type="spellEnd"/>
+      <w:r>
+        <w:rPr>
+          <w:sz w:val="16"/>
+          <w:szCs w:val="16"/>
+        </w:rPr>
+        <w:t xml:space="preserve"> H, Bode C, van Gemert-Pijnen JEWC, et al. </w:t>
+      </w:r>
+      <w:r>
+        <w:rPr>
+          <w:sz w:val="16"/>
+          <w:szCs w:val="16"/>
+          <w:lang w:val="en-GB"/>
+        </w:rPr>
+        <w:t xml:space="preserve">Objectively assessed long‐term wearing patterns and predictors of wearing orthopaedic footwear in people with diabetes at moderate‐to‐high risk of foot ulceration: a 12 </w:t>
+      </w:r>
+      <w:proofErr w:type="gramStart"/>
+      <w:r>
+        <w:rPr>
+          <w:sz w:val="16"/>
+          <w:szCs w:val="16"/>
+          <w:lang w:val="en-GB"/>
+        </w:rPr>
+        <w:t>months</w:t>
+      </w:r>
+      <w:proofErr w:type="gramEnd"/>
+      <w:r>
+        <w:rPr>
+          <w:sz w:val="16"/>
+          <w:szCs w:val="16"/>
+          <w:lang w:val="en-GB"/>
+        </w:rPr>
+        <w:t xml:space="preserve"> observational study. J Foot Ankle Res. </w:t>
+      </w:r>
+      <w:proofErr w:type="gramStart"/>
+      <w:r>
+        <w:rPr>
+          <w:sz w:val="16"/>
+          <w:szCs w:val="16"/>
+          <w:lang w:val="en-GB"/>
+        </w:rPr>
+        <w:t>2023;16:60</w:t>
+      </w:r>
+      <w:proofErr w:type="gramEnd"/>
+      <w:r>
+        <w:rPr>
+          <w:sz w:val="16"/>
+          <w:szCs w:val="16"/>
+          <w:lang w:val="en-GB"/>
+        </w:rPr>
+        <w:t>.</w:t>
       </w:r>
     </w:p>
     <w:p>
@@ -3485,7 +4072,25 @@
           <w:lang w:val="en-GB"/>
         </w:rPr>
         <w:tab/>
-        <w:t>Michie S, van Stralen MM, West R. The behaviour change wheel: A new method for characterising and designing behaviour change interventions. Implement Sci. 2011;6:42.</w:t>
+        <w:t xml:space="preserve">Michie S, van Stralen MM, West R. The behaviour change wheel: A new method for characterising and designing behaviour change interventions. Implement Sci. </w:t>
+      </w:r>
+      <w:proofErr w:type="gramStart"/>
+      <w:r>
+        <w:rPr>
+          <w:sz w:val="16"/>
+          <w:szCs w:val="16"/>
+          <w:lang w:val="en-GB"/>
+        </w:rPr>
+        <w:t>2011;6:42</w:t>
+      </w:r>
+      <w:proofErr w:type="gramEnd"/>
+      <w:r>
+        <w:rPr>
+          <w:sz w:val="16"/>
+          <w:szCs w:val="16"/>
+          <w:lang w:val="en-GB"/>
+        </w:rPr>
+        <w:t>.</w:t>
       </w:r>
     </w:p>
     <w:p>
@@ -3495,7 +4100,6 @@
         <w:rPr>
           <w:sz w:val="16"/>
           <w:szCs w:val="16"/>
-          <w:lang w:val="en-GB"/>
         </w:rPr>
       </w:pPr>
       <w:r>
@@ -3513,7 +4117,71 @@
           <w:lang w:val="en-GB"/>
         </w:rPr>
         <w:tab/>
-        <w:t>Gingerich WJ, Peterson LT. Effectiveness of Solution-Focused Brief Therapy: A Systematic Qualitative Review of Controlled Outcome Studies. Res Soc Work Pract. 2013;23:266-83.</w:t>
+        <w:t xml:space="preserve">Gingerich WJ, Peterson LT. Effectiveness of Solution-Focused Brief Therapy: A Systematic Qualitative Review of Controlled Outcome Studies. </w:t>
+      </w:r>
+      <w:proofErr w:type="spellStart"/>
+      <w:r>
+        <w:rPr>
+          <w:sz w:val="16"/>
+          <w:szCs w:val="16"/>
+        </w:rPr>
+        <w:t>Res</w:t>
+      </w:r>
+      <w:proofErr w:type="spellEnd"/>
+      <w:r>
+        <w:rPr>
+          <w:sz w:val="16"/>
+          <w:szCs w:val="16"/>
+        </w:rPr>
+        <w:t xml:space="preserve"> </w:t>
+      </w:r>
+      <w:proofErr w:type="spellStart"/>
+      <w:r>
+        <w:rPr>
+          <w:sz w:val="16"/>
+          <w:szCs w:val="16"/>
+        </w:rPr>
+        <w:t>Soc</w:t>
+      </w:r>
+      <w:proofErr w:type="spellEnd"/>
+      <w:r>
+        <w:rPr>
+          <w:sz w:val="16"/>
+          <w:szCs w:val="16"/>
+        </w:rPr>
+        <w:t xml:space="preserve"> Work </w:t>
+      </w:r>
+      <w:proofErr w:type="spellStart"/>
+      <w:r>
+        <w:rPr>
+          <w:sz w:val="16"/>
+          <w:szCs w:val="16"/>
+        </w:rPr>
+        <w:t>Pract</w:t>
+      </w:r>
+      <w:proofErr w:type="spellEnd"/>
+      <w:r>
+        <w:rPr>
+          <w:sz w:val="16"/>
+          <w:szCs w:val="16"/>
+        </w:rPr>
+        <w:t xml:space="preserve">. </w:t>
+      </w:r>
+      <w:proofErr w:type="gramStart"/>
+      <w:r>
+        <w:rPr>
+          <w:sz w:val="16"/>
+          <w:szCs w:val="16"/>
+        </w:rPr>
+        <w:t>2013;23:266</w:t>
+      </w:r>
+      <w:proofErr w:type="gramEnd"/>
+      <w:r>
+        <w:rPr>
+          <w:sz w:val="16"/>
+          <w:szCs w:val="16"/>
+        </w:rPr>
+        <w:t>-83.</w:t>
       </w:r>
     </w:p>
     <w:p>
@@ -3530,14 +4198,6 @@
         <w:rPr>
           <w:sz w:val="16"/>
           <w:szCs w:val="16"/>
-          <w:lang w:val="en-GB"/>
-        </w:rPr>
-      </w:r>
-      <w:r>
-        <w:rPr>
-          <w:sz w:val="16"/>
-          <w:szCs w:val="16"/>
-          <w:lang w:val="en-GB"/>
         </w:rPr>
         <w:t>12.</w:t>
       </w:r>
@@ -3545,10 +4205,35 @@
         <w:rPr>
           <w:sz w:val="16"/>
           <w:szCs w:val="16"/>
-          <w:lang w:val="en-GB"/>
         </w:rPr>
         <w:tab/>
-        <w:t>van Netten JJ, Vossen LE, Driebergen FM, Wolthuis D, Merkx MJM, Bus SA. Short-Term Efficacy of a Multi-Modal Intervention Program to Improve Custom-Made Footwear Use in People at High Risk of Diabetes-Related Foot Ulceration. J Clin Med. 2025;14:3635.</w:t>
+        <w:t xml:space="preserve">van Netten JJ, Vossen LE, Driebergen FM, Wolthuis D, Merkx MJM, Bus SA. </w:t>
+      </w:r>
+      <w:r>
+        <w:rPr>
+          <w:sz w:val="16"/>
+          <w:szCs w:val="16"/>
+          <w:lang w:val="en-GB"/>
+        </w:rPr>
+        <w:t xml:space="preserve">Short-Term Efficacy of a Multi-Modal Intervention Program to Improve Custom-Made Footwear Use in People at High Risk of Diabetes-Related Foot Ulceration. J Clin Med. </w:t>
+      </w:r>
+      <w:proofErr w:type="gramStart"/>
+      <w:r>
+        <w:rPr>
+          <w:sz w:val="16"/>
+          <w:szCs w:val="16"/>
+          <w:lang w:val="en-GB"/>
+        </w:rPr>
+        <w:t>2025;14:3635</w:t>
+      </w:r>
+      <w:proofErr w:type="gramEnd"/>
+      <w:r>
+        <w:rPr>
+          <w:sz w:val="16"/>
+          <w:szCs w:val="16"/>
+          <w:lang w:val="en-GB"/>
+        </w:rPr>
+        <w:t>.</w:t>
       </w:r>
     </w:p>
     <w:p>
@@ -3576,7 +4261,25 @@
           <w:lang w:val="en-GB"/>
         </w:rPr>
         <w:tab/>
-        <w:t>López-Moral M, Molines-Barroso RJ, Herrera-Casamayor M, García-Madrid M, García-Morales E, Lázaro-Martínez JL. Usability of Different Methods to Assess and Improve Adherence to Therapeutic Footwear in Persons with the Diabetic Foot in Remission. A Systematic Review. Int J Low Extrem Wounds. 2026;25:55-64.</w:t>
+        <w:t xml:space="preserve">López-Moral M, Molines-Barroso RJ, Herrera-Casamayor M, García-Madrid M, García-Morales E, Lázaro-Martínez JL. Usability of Different Methods to Assess and Improve Adherence to Therapeutic Footwear in Persons with the Diabetic Foot in Remission. A Systematic Review. Int J Low Extrem Wounds. </w:t>
+      </w:r>
+      <w:proofErr w:type="gramStart"/>
+      <w:r>
+        <w:rPr>
+          <w:sz w:val="16"/>
+          <w:szCs w:val="16"/>
+          <w:lang w:val="en-GB"/>
+        </w:rPr>
+        <w:t>2026;25:55</w:t>
+      </w:r>
+      <w:proofErr w:type="gramEnd"/>
+      <w:r>
+        <w:rPr>
+          <w:sz w:val="16"/>
+          <w:szCs w:val="16"/>
+          <w:lang w:val="en-GB"/>
+        </w:rPr>
+        <w:t>-64.</w:t>
       </w:r>
     </w:p>
     <w:p>
@@ -3586,7 +4289,6 @@
         <w:rPr>
           <w:sz w:val="16"/>
           <w:szCs w:val="16"/>
-          <w:lang w:val="en-GB"/>
         </w:rPr>
       </w:pPr>
       <w:r>
@@ -3604,7 +4306,62 @@
           <w:lang w:val="en-GB"/>
         </w:rPr>
         <w:tab/>
-        <w:t>Lutjeboer T, van Netten JJ, Postema K, Hijmans J. Effect of awareness of being monitored on wearing of orthopaedic footwear. J Rehabil Med. 2020;52:jrm00127.</w:t>
+        <w:t xml:space="preserve">Lutjeboer T, van Netten JJ, Postema K, Hijmans J. Effect of awareness of being monitored on wearing of orthopaedic footwear. </w:t>
+      </w:r>
+      <w:r>
+        <w:rPr>
+          <w:sz w:val="16"/>
+          <w:szCs w:val="16"/>
+        </w:rPr>
+        <w:t xml:space="preserve">J </w:t>
+      </w:r>
+      <w:proofErr w:type="spellStart"/>
+      <w:r>
+        <w:rPr>
+          <w:sz w:val="16"/>
+          <w:szCs w:val="16"/>
+        </w:rPr>
+        <w:t>Rehabil</w:t>
+      </w:r>
+      <w:proofErr w:type="spellEnd"/>
+      <w:r>
+        <w:rPr>
+          <w:sz w:val="16"/>
+          <w:szCs w:val="16"/>
+        </w:rPr>
+        <w:t xml:space="preserve"> </w:t>
+      </w:r>
+      <w:proofErr w:type="spellStart"/>
+      <w:r>
+        <w:rPr>
+          <w:sz w:val="16"/>
+          <w:szCs w:val="16"/>
+        </w:rPr>
+        <w:t>Med</w:t>
+      </w:r>
+      <w:proofErr w:type="spellEnd"/>
+      <w:r>
+        <w:rPr>
+          <w:sz w:val="16"/>
+          <w:szCs w:val="16"/>
+        </w:rPr>
+        <w:t>. 2020;</w:t>
+      </w:r>
+      <w:proofErr w:type="gramStart"/>
+      <w:r>
+        <w:rPr>
+          <w:sz w:val="16"/>
+          <w:szCs w:val="16"/>
+        </w:rPr>
+        <w:t>52:jrm</w:t>
+      </w:r>
+      <w:proofErr w:type="gramEnd"/>
+      <w:r>
+        <w:rPr>
+          <w:sz w:val="16"/>
+          <w:szCs w:val="16"/>
+        </w:rPr>
+        <w:t>00127.</w:t>
       </w:r>
     </w:p>
     <w:p>
@@ -3614,14 +4371,12 @@
         <w:rPr>
           <w:sz w:val="16"/>
           <w:szCs w:val="16"/>
-          <w:lang w:val="en-GB"/>
-        </w:rPr>
-      </w:pPr>
-      <w:r>
-        <w:rPr>
-          <w:sz w:val="16"/>
-          <w:szCs w:val="16"/>
-          <w:lang w:val="en-GB"/>
+        </w:rPr>
+      </w:pPr>
+      <w:r>
+        <w:rPr>
+          <w:sz w:val="16"/>
+          <w:szCs w:val="16"/>
         </w:rPr>
         <w:t>15.</w:t>
       </w:r>
@@ -3629,10 +4384,72 @@
         <w:rPr>
           <w:sz w:val="16"/>
           <w:szCs w:val="16"/>
-          <w:lang w:val="en-GB"/>
         </w:rPr>
         <w:tab/>
-        <w:t>Jongebloed-Westra M, Bode C, van Netten JJ, ten Klooster PM, Exterkate SH, Koffijberg H, et al. Using motivational interviewing combined with digital shoe-fitting to improve adherence to wearing orthopedic shoes in people with diabetes at risk of foot ulceration: study protocol for a cluster-randomized controlled trial. Trials. 2021;22:750.</w:t>
+        <w:t xml:space="preserve">Jongebloed-Westra M, Bode C, van Netten JJ, ten Klooster PM, </w:t>
+      </w:r>
+      <w:proofErr w:type="spellStart"/>
+      <w:r>
+        <w:rPr>
+          <w:sz w:val="16"/>
+          <w:szCs w:val="16"/>
+        </w:rPr>
+        <w:t>Exterkate</w:t>
+      </w:r>
+      <w:proofErr w:type="spellEnd"/>
+      <w:r>
+        <w:rPr>
+          <w:sz w:val="16"/>
+          <w:szCs w:val="16"/>
+        </w:rPr>
+        <w:t xml:space="preserve"> SH, </w:t>
+      </w:r>
+      <w:proofErr w:type="spellStart"/>
+      <w:r>
+        <w:rPr>
+          <w:sz w:val="16"/>
+          <w:szCs w:val="16"/>
+        </w:rPr>
+        <w:t>Koffijberg</w:t>
+      </w:r>
+      <w:proofErr w:type="spellEnd"/>
+      <w:r>
+        <w:rPr>
+          <w:sz w:val="16"/>
+          <w:szCs w:val="16"/>
+        </w:rPr>
+        <w:t xml:space="preserve"> H, et al. </w:t>
+      </w:r>
+      <w:r>
+        <w:rPr>
+          <w:sz w:val="16"/>
+          <w:szCs w:val="16"/>
+          <w:lang w:val="en-GB"/>
+        </w:rPr>
+        <w:t xml:space="preserve">Using motivational interviewing combined with digital shoe-fitting to improve adherence to wearing orthopedic shoes in people with diabetes at risk of foot ulceration: study protocol for a cluster-randomized controlled trial. </w:t>
+      </w:r>
+      <w:r>
+        <w:rPr>
+          <w:sz w:val="16"/>
+          <w:szCs w:val="16"/>
+        </w:rPr>
+        <w:t xml:space="preserve">Trials. </w:t>
+      </w:r>
+      <w:proofErr w:type="gramStart"/>
+      <w:r>
+        <w:rPr>
+          <w:sz w:val="16"/>
+          <w:szCs w:val="16"/>
+        </w:rPr>
+        <w:t>2021;22:750</w:t>
+      </w:r>
+      <w:proofErr w:type="gramEnd"/>
+      <w:r>
+        <w:rPr>
+          <w:sz w:val="16"/>
+          <w:szCs w:val="16"/>
+        </w:rPr>
+        <w:t>.</w:t>
       </w:r>
     </w:p>
     <w:p>
@@ -3649,7 +4466,6 @@
         <w:rPr>
           <w:sz w:val="16"/>
           <w:szCs w:val="16"/>
-          <w:lang w:val="en-GB"/>
         </w:rPr>
         <w:t>16.</w:t>
       </w:r>
@@ -3657,10 +4473,35 @@
         <w:rPr>
           <w:sz w:val="16"/>
           <w:szCs w:val="16"/>
-          <w:lang w:val="en-GB"/>
         </w:rPr>
         <w:tab/>
-        <w:t>Vossen LE, van Netten JJ, Bakker CD, Berendsen HA, Busch-Westbroek TE, Peters EJG, et al. An integrated personalized assistive devices approach to reduce the risk of foot ulcer recurrence in diabetes (DIASSIST): study protocol for a multicenter randomized controlled trial. Trials. 2023;24:663.</w:t>
+        <w:t xml:space="preserve">Vossen LE, van Netten JJ, Bakker CD, Berendsen HA, Busch-Westbroek TE, Peters EJG, et al. </w:t>
+      </w:r>
+      <w:r>
+        <w:rPr>
+          <w:sz w:val="16"/>
+          <w:szCs w:val="16"/>
+          <w:lang w:val="en-GB"/>
+        </w:rPr>
+        <w:t xml:space="preserve">An integrated personalized assistive devices approach to reduce the risk of foot ulcer recurrence in diabetes (DIASSIST): study protocol for a multicenter randomized controlled trial. Trials. </w:t>
+      </w:r>
+      <w:proofErr w:type="gramStart"/>
+      <w:r>
+        <w:rPr>
+          <w:sz w:val="16"/>
+          <w:szCs w:val="16"/>
+          <w:lang w:val="en-GB"/>
+        </w:rPr>
+        <w:t>2023;24:663</w:t>
+      </w:r>
+      <w:proofErr w:type="gramEnd"/>
+      <w:r>
+        <w:rPr>
+          <w:sz w:val="16"/>
+          <w:szCs w:val="16"/>
+          <w:lang w:val="en-GB"/>
+        </w:rPr>
+        <w:t>.</w:t>
       </w:r>
     </w:p>
     <w:p>
@@ -3688,7 +4529,25 @@
           <w:lang w:val="en-GB"/>
         </w:rPr>
         <w:tab/>
-        <w:t>White IR, Royston P, Wood AM. Multiple imputation using chained equations: Issues and guidance for practice. Stat Med. 2011;30:377-99.</w:t>
+        <w:t xml:space="preserve">White IR, Royston P, Wood AM. Multiple imputation using chained equations: Issues and guidance for practice. Stat Med. </w:t>
+      </w:r>
+      <w:proofErr w:type="gramStart"/>
+      <w:r>
+        <w:rPr>
+          <w:sz w:val="16"/>
+          <w:szCs w:val="16"/>
+          <w:lang w:val="en-GB"/>
+        </w:rPr>
+        <w:t>2011;30:377</w:t>
+      </w:r>
+      <w:proofErr w:type="gramEnd"/>
+      <w:r>
+        <w:rPr>
+          <w:sz w:val="16"/>
+          <w:szCs w:val="16"/>
+          <w:lang w:val="en-GB"/>
+        </w:rPr>
+        <w:t>-99.</w:t>
       </w:r>
     </w:p>
     <w:p>
@@ -3716,7 +4575,25 @@
           <w:lang w:val="en-GB"/>
         </w:rPr>
         <w:tab/>
-        <w:t>Mallinckrodt C, Lipkovich I, Dickson S, Hendrix S, Molenberghs G. Handling Missing Data in Participants with Baseline but No Post‐Baseline Data. Pharm Stat. 2026;25:e70076.</w:t>
+        <w:t>Mallinckrodt C, Lipkovich I, Dickson S, Hendrix S, Molenberghs G. Handling Missing Data in Participants with Baseline but No Post‐Baseline Data. Pharm Stat. 2026;</w:t>
+      </w:r>
+      <w:proofErr w:type="gramStart"/>
+      <w:r>
+        <w:rPr>
+          <w:sz w:val="16"/>
+          <w:szCs w:val="16"/>
+          <w:lang w:val="en-GB"/>
+        </w:rPr>
+        <w:t>25:e</w:t>
+      </w:r>
+      <w:proofErr w:type="gramEnd"/>
+      <w:r>
+        <w:rPr>
+          <w:sz w:val="16"/>
+          <w:szCs w:val="16"/>
+          <w:lang w:val="en-GB"/>
+        </w:rPr>
+        <w:t>70076.</w:t>
       </w:r>
     </w:p>
     <w:p>
@@ -3744,7 +4621,25 @@
           <w:lang w:val="en-GB"/>
         </w:rPr>
         <w:tab/>
-        <w:t>Lincoln N, Jeffcoate W, Ince P, Smith M, Radford K. Validation of a new measure of protective footcare behaviour: the Nottingham Assessment of Functional Footcare (NAFF). Pract Diab Int. 2007;24:207-11.</w:t>
+        <w:t xml:space="preserve">Lincoln N, Jeffcoate W, Ince P, Smith M, Radford K. Validation of a new measure of protective footcare behaviour: the Nottingham Assessment of Functional Footcare (NAFF). Pract Diab Int. </w:t>
+      </w:r>
+      <w:proofErr w:type="gramStart"/>
+      <w:r>
+        <w:rPr>
+          <w:sz w:val="16"/>
+          <w:szCs w:val="16"/>
+          <w:lang w:val="en-GB"/>
+        </w:rPr>
+        <w:t>2007;24:207</w:t>
+      </w:r>
+      <w:proofErr w:type="gramEnd"/>
+      <w:r>
+        <w:rPr>
+          <w:sz w:val="16"/>
+          <w:szCs w:val="16"/>
+          <w:lang w:val="en-GB"/>
+        </w:rPr>
+        <w:t>-11.</w:t>
       </w:r>
     </w:p>
     <w:p>
@@ -3772,7 +4667,25 @@
           <w:lang w:val="en-GB"/>
         </w:rPr>
         <w:tab/>
-        <w:t>Herdman M, Gudex C, Lloyd A, Janssen MF, Kind P, Parkin D, et al. Development and preliminary testing of the new five-level version of EQ-5D (EQ-5D-5L). Qual Life Res. 2011;20:1727-36.</w:t>
+        <w:t xml:space="preserve">Herdman M, Gudex C, Lloyd A, Janssen MF, Kind P, Parkin D, et al. Development and preliminary testing of the new five-level version of EQ-5D (EQ-5D-5L). Qual Life Res. </w:t>
+      </w:r>
+      <w:proofErr w:type="gramStart"/>
+      <w:r>
+        <w:rPr>
+          <w:sz w:val="16"/>
+          <w:szCs w:val="16"/>
+          <w:lang w:val="en-GB"/>
+        </w:rPr>
+        <w:t>2011;20:1727</w:t>
+      </w:r>
+      <w:proofErr w:type="gramEnd"/>
+      <w:r>
+        <w:rPr>
+          <w:sz w:val="16"/>
+          <w:szCs w:val="16"/>
+          <w:lang w:val="en-GB"/>
+        </w:rPr>
+        <w:t>-36.</w:t>
       </w:r>
     </w:p>
     <w:p>
@@ -3800,7 +4713,25 @@
           <w:lang w:val="en-GB"/>
         </w:rPr>
         <w:tab/>
-        <w:t>Chan AW, Boutron I, Hopewell S, Moher D, Schulz KF, Collins GS, et al. SPIRIT 2025 statement: updated guideline for protocols of randomised trials. BMJ. 2025;389:e081477.</w:t>
+        <w:t>Chan AW, Boutron I, Hopewell S, Moher D, Schulz KF, Collins GS, et al. SPIRIT 2025 statement: updated guideline for protocols of randomised trials. BMJ. 2025;</w:t>
+      </w:r>
+      <w:proofErr w:type="gramStart"/>
+      <w:r>
+        <w:rPr>
+          <w:sz w:val="16"/>
+          <w:szCs w:val="16"/>
+          <w:lang w:val="en-GB"/>
+        </w:rPr>
+        <w:t>389:e</w:t>
+      </w:r>
+      <w:proofErr w:type="gramEnd"/>
+      <w:r>
+        <w:rPr>
+          <w:sz w:val="16"/>
+          <w:szCs w:val="16"/>
+          <w:lang w:val="en-GB"/>
+        </w:rPr>
+        <w:t>081477.</w:t>
       </w:r>
     </w:p>
     <w:p>
@@ -3828,7 +4759,25 @@
           <w:lang w:val="en-GB"/>
         </w:rPr>
         <w:tab/>
-        <w:t>Jacques RM, Ahmed R, Harper J, Ranjan A, Saeed I, Simpson RM, et al. Recruitment, consent and retention of participants in randomised controlled trials: a review of trials published in the National Institute for Health Research (NIHR) Journals Library (1997–2020). BMJ Open. 2022;12:e059230.</w:t>
+        <w:t>Jacques RM, Ahmed R, Harper J, Ranjan A, Saeed I, Simpson RM, et al. Recruitment, consent and retention of participants in randomised controlled trials: a review of trials published in the National Institute for Health Research (NIHR) Journals Library (1997–2020). BMJ Open. 2022;</w:t>
+      </w:r>
+      <w:proofErr w:type="gramStart"/>
+      <w:r>
+        <w:rPr>
+          <w:sz w:val="16"/>
+          <w:szCs w:val="16"/>
+          <w:lang w:val="en-GB"/>
+        </w:rPr>
+        <w:t>12:e</w:t>
+      </w:r>
+      <w:proofErr w:type="gramEnd"/>
+      <w:r>
+        <w:rPr>
+          <w:sz w:val="16"/>
+          <w:szCs w:val="16"/>
+          <w:lang w:val="en-GB"/>
+        </w:rPr>
+        <w:t>059230.</w:t>
       </w:r>
     </w:p>
     <w:p>
@@ -3856,7 +4805,25 @@
           <w:lang w:val="en-GB"/>
         </w:rPr>
         <w:tab/>
-        <w:t>Donovan JL, Rooshenas L, Jepson M, Elliott D, Wade J, Avery K, et al. Optimising recruitment and informed consent in randomised controlled trials: the development and implementation of the Quintet Recruitment Intervention (QRI). Trials. 2016;17:283.</w:t>
+        <w:t xml:space="preserve">Donovan JL, Rooshenas L, Jepson M, Elliott D, Wade J, Avery K, et al. Optimising recruitment and informed consent in randomised controlled trials: the development and implementation of the Quintet Recruitment Intervention (QRI). Trials. </w:t>
+      </w:r>
+      <w:proofErr w:type="gramStart"/>
+      <w:r>
+        <w:rPr>
+          <w:sz w:val="16"/>
+          <w:szCs w:val="16"/>
+          <w:lang w:val="en-GB"/>
+        </w:rPr>
+        <w:t>2016;17:283</w:t>
+      </w:r>
+      <w:proofErr w:type="gramEnd"/>
+      <w:r>
+        <w:rPr>
+          <w:sz w:val="16"/>
+          <w:szCs w:val="16"/>
+          <w:lang w:val="en-GB"/>
+        </w:rPr>
+        <w:t>.</w:t>
       </w:r>
     </w:p>
     <w:p>
@@ -3884,7 +4851,43 @@
           <w:lang w:val="en-GB"/>
         </w:rPr>
         <w:tab/>
-        <w:t>Bellg AJ, Borrelli B, Resnick B, Hecht J, Minicucci DS, Ory M, et al. Enhancing Treatment Fidelity in Health Behavior Change Studies: Best Practices and Recommendations From the NIH Behavior Change Consortium. Health Psychol. 2004;23:443-51.</w:t>
+        <w:t xml:space="preserve">Bellg AJ, Borrelli B, Resnick B, Hecht J, Minicucci DS, Ory M, et al. Enhancing Treatment Fidelity in Health Behavior Change Studies: Best Practices and Recommendations </w:t>
+      </w:r>
+      <w:proofErr w:type="gramStart"/>
+      <w:r>
+        <w:rPr>
+          <w:sz w:val="16"/>
+          <w:szCs w:val="16"/>
+          <w:lang w:val="en-GB"/>
+        </w:rPr>
+        <w:t>From</w:t>
+      </w:r>
+      <w:proofErr w:type="gramEnd"/>
+      <w:r>
+        <w:rPr>
+          <w:sz w:val="16"/>
+          <w:szCs w:val="16"/>
+          <w:lang w:val="en-GB"/>
+        </w:rPr>
+        <w:t xml:space="preserve"> the NIH Behavior Change Consortium. Health Psychol. </w:t>
+      </w:r>
+      <w:proofErr w:type="gramStart"/>
+      <w:r>
+        <w:rPr>
+          <w:sz w:val="16"/>
+          <w:szCs w:val="16"/>
+          <w:lang w:val="en-GB"/>
+        </w:rPr>
+        <w:t>2004;23:443</w:t>
+      </w:r>
+      <w:proofErr w:type="gramEnd"/>
+      <w:r>
+        <w:rPr>
+          <w:sz w:val="16"/>
+          <w:szCs w:val="16"/>
+          <w:lang w:val="en-GB"/>
+        </w:rPr>
+        <w:t>-51.</w:t>
       </w:r>
     </w:p>
     <w:p>
@@ -3912,7 +4915,25 @@
           <w:lang w:val="en-GB"/>
         </w:rPr>
         <w:tab/>
-        <w:t>Hopewell S, Chan AW, Collins GS, Hróbjartsson A, Moher D, Schulz KF, et al. CONSORT 2025 statement: updated guideline for reporting randomised trials. BMJ. 2025;389:e081123.</w:t>
+        <w:t>Hopewell S, Chan AW, Collins GS, Hróbjartsson A, Moher D, Schulz KF, et al. CONSORT 2025 statement: updated guideline for reporting randomised trials. BMJ. 2025;</w:t>
+      </w:r>
+      <w:proofErr w:type="gramStart"/>
+      <w:r>
+        <w:rPr>
+          <w:sz w:val="16"/>
+          <w:szCs w:val="16"/>
+          <w:lang w:val="en-GB"/>
+        </w:rPr>
+        <w:t>389:e</w:t>
+      </w:r>
+      <w:proofErr w:type="gramEnd"/>
+      <w:r>
+        <w:rPr>
+          <w:sz w:val="16"/>
+          <w:szCs w:val="16"/>
+          <w:lang w:val="en-GB"/>
+        </w:rPr>
+        <w:t>081123.</w:t>
       </w:r>
     </w:p>
     <w:p>
@@ -6222,6 +7243,7 @@
   <w:style w:type="character" w:default="1" w:styleId="Standaardalinea-lettertype">
     <w:name w:val="Default Paragraph Font"/>
     <w:uiPriority w:val="1"/>
+    <w:semiHidden/>
     <w:unhideWhenUsed/>
   </w:style>
   <w:style w:type="table" w:default="1" w:styleId="Standaardtabel">

</xml_diff>

<commit_message>
Sensor weigeren is exclusie; bewaartermijn 25 jaar; MoveMonitor maand 6; van Netten 2025 correct; eerste metatarsaalkop inbegrepen
Co-Authored-By: Claude Opus 5.5 <noreply@anthropic.com>
</commit_message>
<xml_diff>
--- a/PARADISE_provisional_doctoral_plan.docx
+++ b/PARADISE_provisional_doctoral_plan.docx
@@ -1641,21 +1641,19 @@
           <w:rFonts w:ascii="Garamond" w:hAnsi="Garamond"/>
           <w:lang w:val="en-GB"/>
         </w:rPr>
-        <w:t>PARADISE has been piloted in one Belgian DFC but has not yet undergone large-scale clinical validation. A Dutch precursor combining education, motivational interviewing, and adherence monitoring demonstrated feasibility</w:t>
-      </w:r>
-      <w:r>
-        <w:rPr>
-          <w:rFonts w:ascii="Garamond" w:hAnsi="Garamond"/>
-          <w:lang w:val="en-GB"/>
-        </w:rPr>
-        <w:t xml:space="preserve">, </w:t>
-      </w:r>
-      <w:r>
-        <w:rPr>
-          <w:rFonts w:ascii="Garamond" w:hAnsi="Garamond"/>
-          <w:lang w:val="en-GB"/>
-        </w:rPr>
-        <w:t>but showed limited effects on overall wear time after three months, with improvements mainly observed for indoor footwear use.</w:t>
+        <w:t>PARADISE has been piloted in one Belgian DFC but has not yet undergone large-scale clinical validation. A Dutch precursor combining structured education, motivational interviewing and custom-made indoor footwear did not significantly increase overall wear time after three months; wear time rose mainly after the indoor footwear was provided.</w:t>
+      </w:r>
+      <w:r>
+        <w:rPr>
+          <w:rFonts w:ascii="Garamond" w:hAnsi="Garamond"/>
+          <w:lang w:val="en-GB"/>
+        </w:rPr>
+      </w:r>
+      <w:r>
+        <w:rPr>
+          <w:rFonts w:ascii="Garamond" w:hAnsi="Garamond"/>
+          <w:lang w:val="en-GB"/>
+        </w:rPr>
       </w:r>
       <w:r>
         <w:rPr>

</xml_diff>

<commit_message>
Doctoraatsplan (bijgehouden wijziging): 25% per sessie, tot drie aanpassingen
Co-Authored-By: Claude Opus 5.5 <noreply@anthropic.com>
</commit_message>
<xml_diff>
--- a/PARADISE_provisional_doctoral_plan.docx
+++ b/PARADISE_provisional_doctoral_plan.docx
@@ -2114,8 +2114,26 @@
           <w:rFonts w:ascii="Garamond" w:hAnsi="Garamond"/>
           <w:lang w:val="en-GB"/>
         </w:rPr>
-        <w:t>) identify peak plantar pressure and guide iterative orthosis optimisation towards a target peak pressure below 200 kPa or a reduction of at least 25% relative to the measurement without the orthosis at delivery, which remains the reference at 6, 12 and 18 months.</w:t>
-      </w:r>
+        <w:t xml:space="preserve">) identify peak plantar pressure and guide iterative orthosis optimisation towards a target peak pressure below 200 kPa or a reduction of at least 25% </w:t>
+      </w:r>
+      <w:del w:id="90000" w:author="Claude" w:date="2026-10-08T17:41:41Z">
+        <w:r>
+          <w:rPr>
+            <w:rFonts w:ascii="Garamond" w:hAnsi="Garamond"/>
+            <w:lang w:val="en-GB"/>
+          </w:rPr>
+          <w:delText xml:space="preserve">relative to the measurement without the orthosis at delivery, which remains the reference at 6, 12 and 18 months.</w:delText>
+        </w:r>
+      </w:del>
+      <w:ins w:id="90001" w:author="Claude" w:date="2026-10-08T17:41:41Z">
+        <w:r>
+          <w:rPr>
+            <w:rFonts w:ascii="Garamond" w:hAnsi="Garamond"/>
+            <w:lang w:val="en-GB"/>
+          </w:rPr>
+          <w:t xml:space="preserve">relative to the measurement without the orthosis in the same session, with up to three modification rounds per session.</w:t>
+        </w:r>
+      </w:ins>
       <w:r>
         <w:rPr>
           <w:rFonts w:ascii="Garamond" w:hAnsi="Garamond"/>

</xml_diff>